<commit_message>
Đối chiếu API anh Tune, anh Toàn trên máy demo-lao-api (gọi thử chỉ đọc 30/09)
- Bảng tổng hợp mới: mình đã có gì, anh Tune cần làm gì, anh Toàn cần làm gì,
  bên mình cần làm gì, anh cần quyết gì.
- Hợp đồng kế toán mục 12.7: token, mã đơn vị, kỳ, loại chứng từ, tiền tệ,
  phương thức, tài khoản tiền, danh mục tài khoản, nguồn DO — số thật.
- Hợp đồng kho mục 13.6: hai bản kho cùng lõi khác nhánh, kho, mặt hàng,
  loại chứng từ 65/44, trạng thái, tồn và giá vốn — số thật.

Co-Authored-By: Claude Opus 5.5 (1M context) <noreply@anthropic.com>
</commit_message>
<xml_diff>
--- a/DOCS/word/HOP_DONG_API_KE_TOAN_ANH_TUNE.docx
+++ b/DOCS/word/HOP_DONG_API_KE_TOAN_ANH_TUNE.docx
@@ -15994,16 +15994,35 @@
         <w:jc w:val="both"/>
       </w:pPr>
       <w:r>
-        <w:t xml:space="preserve">Bên em </w:t>
+        <w:t xml:space="preserve">Ngày 30/09 bên em đã </w:t>
       </w:r>
       <w:r>
         <w:rPr>
           <w:b/>
         </w:rPr>
-        <w:t>chưa gọi thử</w:t>
-      </w:r>
-      <w:r>
-        <w:t xml:space="preserve"> đường nào, vì chưa có địa chỉ và token.</w:t>
+        <w:t>gọi thử các đường chỉ đọc</w:t>
+      </w:r>
+      <w:r>
+        <w:t xml:space="preserve"> trên máy </w:t>
+      </w:r>
+      <w:r>
+        <w:rPr>
+          <w:rFonts w:ascii="Consolas" w:hAnsi="Consolas"/>
+          <w:sz w:val="19"/>
+        </w:rPr>
+        <w:t>demo-lao-api</w:t>
+      </w:r>
+      <w:r>
+        <w:t xml:space="preserve"> bằng token trong cấu hình. Kết quả và số thật ở </w:t>
+      </w:r>
+      <w:r>
+        <w:rPr>
+          <w:b/>
+        </w:rPr>
+        <w:t>mục 12.7</w:t>
+      </w:r>
+      <w:r>
+        <w:t>.</w:t>
       </w:r>
     </w:p>
     <w:p>
@@ -18763,6 +18782,1490 @@
       </w:r>
       <w:r>
         <w:t xml:space="preserve"> của hai tiền này)?</w:t>
+      </w:r>
+    </w:p>
+    <w:p>
+      <w:pPr>
+        <w:pStyle w:val="Heading2"/>
+      </w:pPr>
+      <w:r>
+        <w:t>12.7. Kết quả gọi thử máy `demo-lao-api` ngày 30/09 (chỉ đọc)</w:t>
+      </w:r>
+    </w:p>
+    <w:p>
+      <w:pPr>
+        <w:jc w:val="both"/>
+      </w:pPr>
+      <w:r>
+        <w:t>Bên em đã gọi thử bằng token cấu hình trong trang điều xe (</w:t>
+      </w:r>
+      <w:r>
+        <w:rPr>
+          <w:rFonts w:ascii="Consolas" w:hAnsi="Consolas"/>
+          <w:sz w:val="19"/>
+        </w:rPr>
+        <w:t>EPL_ACC_CODE_API</w:t>
+      </w:r>
+      <w:r>
+        <w:t xml:space="preserve">, </w:t>
+      </w:r>
+      <w:r>
+        <w:rPr>
+          <w:rFonts w:ascii="Consolas" w:hAnsi="Consolas"/>
+          <w:sz w:val="19"/>
+        </w:rPr>
+        <w:t>EPL_ACC_CODE_TOKEN</w:t>
+      </w:r>
+      <w:r>
+        <w:t>):</w:t>
+      </w:r>
+    </w:p>
+    <w:p>
+      <w:pPr>
+        <w:pStyle w:val="ListBullet"/>
+      </w:pPr>
+      <w:r>
+        <w:rPr>
+          <w:b/>
+        </w:rPr>
+        <w:t>chỉ gọi các đường xem, danh sách, tìm</w:t>
+      </w:r>
+      <w:r>
+        <w:t>;</w:t>
+      </w:r>
+    </w:p>
+    <w:p>
+      <w:pPr>
+        <w:pStyle w:val="ListBullet"/>
+      </w:pPr>
+      <w:r>
+        <w:rPr>
+          <w:b/>
+        </w:rPr>
+        <w:t>không gọi</w:t>
+      </w:r>
+      <w:r>
+        <w:t xml:space="preserve"> đường tạo, lưu, commit, ghi sổ, xoá nào;</w:t>
+      </w:r>
+    </w:p>
+    <w:p>
+      <w:pPr>
+        <w:pStyle w:val="ListBullet"/>
+      </w:pPr>
+      <w:r>
+        <w:t>không in token ra đâu.</w:t>
+      </w:r>
+    </w:p>
+    <w:p>
+      <w:pPr>
+        <w:jc w:val="both"/>
+      </w:pPr>
+      <w:r>
+        <w:t>#### 12.7.1. Token hiện có</w:t>
+      </w:r>
+    </w:p>
+    <w:tbl>
+      <w:tblPr>
+        <w:tblStyle w:val="LightGrid-Accent1"/>
+        <w:tblW w:type="auto" w:w="0"/>
+        <w:tblLook w:firstColumn="1" w:firstRow="1" w:lastColumn="0" w:lastRow="0" w:noHBand="0" w:noVBand="1" w:val="04A0"/>
+      </w:tblPr>
+      <w:tblGrid>
+        <w:gridCol w:w="4320"/>
+        <w:gridCol w:w="4320"/>
+      </w:tblGrid>
+      <w:tr>
+        <w:tc>
+          <w:tcPr>
+            <w:tcW w:type="dxa" w:w="4320"/>
+          </w:tcPr>
+          <w:p>
+            <w:r>
+              <w:rPr>
+                <w:b/>
+              </w:rPr>
+            </w:r>
+          </w:p>
+        </w:tc>
+        <w:tc>
+          <w:tcPr>
+            <w:tcW w:type="dxa" w:w="4320"/>
+          </w:tcPr>
+          <w:p>
+            <w:r>
+              <w:rPr>
+                <w:b/>
+              </w:rPr>
+            </w:r>
+          </w:p>
+        </w:tc>
+      </w:tr>
+      <w:tr>
+        <w:tc>
+          <w:tcPr>
+            <w:tcW w:type="dxa" w:w="4320"/>
+          </w:tcPr>
+          <w:p>
+            <w:r/>
+            <w:r>
+              <w:t>Người dùng</w:t>
+            </w:r>
+          </w:p>
+        </w:tc>
+        <w:tc>
+          <w:tcPr>
+            <w:tcW w:type="dxa" w:w="4320"/>
+          </w:tcPr>
+          <w:p>
+            <w:r/>
+            <w:r>
+              <w:rPr>
+                <w:rFonts w:ascii="Consolas" w:hAnsi="Consolas"/>
+                <w:sz w:val="19"/>
+              </w:rPr>
+              <w:t>tune</w:t>
+            </w:r>
+            <w:r>
+              <w:t xml:space="preserve"> (UserID 846, ObjectId 1503, nhóm "Nhân viên", OrgId 2) — </w:t>
+            </w:r>
+            <w:r>
+              <w:rPr>
+                <w:b/>
+              </w:rPr>
+              <w:t>tài khoản cá nhân của anh</w:t>
+            </w:r>
+          </w:p>
+        </w:tc>
+      </w:tr>
+      <w:tr>
+        <w:tc>
+          <w:tcPr>
+            <w:tcW w:type="dxa" w:w="4320"/>
+          </w:tcPr>
+          <w:p>
+            <w:r/>
+            <w:r>
+              <w:t>Hạn</w:t>
+            </w:r>
+          </w:p>
+        </w:tc>
+        <w:tc>
+          <w:tcPr>
+            <w:tcW w:type="dxa" w:w="4320"/>
+          </w:tcPr>
+          <w:p>
+            <w:r/>
+            <w:r>
+              <w:rPr>
+                <w:b/>
+              </w:rPr>
+              <w:t>10/10/2026 09:05 giờ Lào</w:t>
+            </w:r>
+            <w:r>
+              <w:t xml:space="preserve"> (02:05 UTC)</w:t>
+            </w:r>
+          </w:p>
+        </w:tc>
+      </w:tr>
+      <w:tr>
+        <w:tc>
+          <w:tcPr>
+            <w:tcW w:type="dxa" w:w="4320"/>
+          </w:tcPr>
+          <w:p>
+            <w:r/>
+            <w:r>
+              <w:t>Chi nhánh được vào (</w:t>
+            </w:r>
+            <w:r>
+              <w:rPr>
+                <w:rFonts w:ascii="Consolas" w:hAnsi="Consolas"/>
+                <w:sz w:val="19"/>
+              </w:rPr>
+              <w:t>auth/branches</w:t>
+            </w:r>
+            <w:r>
+              <w:t>)</w:t>
+            </w:r>
+          </w:p>
+        </w:tc>
+        <w:tc>
+          <w:tcPr>
+            <w:tcW w:type="dxa" w:w="4320"/>
+          </w:tcPr>
+          <w:p>
+            <w:r/>
+            <w:r>
+              <w:t>1368 "Demo EPL" · 5 "EPL 2" · 1369 "EPL 3"</w:t>
+            </w:r>
+          </w:p>
+        </w:tc>
+      </w:tr>
+    </w:tbl>
+    <w:p/>
+    <w:p>
+      <w:pPr>
+        <w:jc w:val="both"/>
+      </w:pPr>
+      <w:r>
+        <w:t xml:space="preserve">Xin anh cấp </w:t>
+      </w:r>
+      <w:r>
+        <w:rPr>
+          <w:b/>
+        </w:rPr>
+        <w:t>tài khoản dịch vụ</w:t>
+      </w:r>
+      <w:r>
+        <w:t xml:space="preserve"> cho trang điều xe (câu hỏi 12.6 (1)). Nếu dùng tài khoản cá nhân thì:</w:t>
+      </w:r>
+    </w:p>
+    <w:p>
+      <w:pPr>
+        <w:pStyle w:val="ListBullet"/>
+      </w:pPr>
+      <w:r>
+        <w:t>mọi phiếu bên em tạo sẽ ghi tên anh;</w:t>
+      </w:r>
+    </w:p>
+    <w:p>
+      <w:pPr>
+        <w:pStyle w:val="ListBullet"/>
+      </w:pPr>
+      <w:r>
+        <w:t>tới 10/10 là tắt.</w:t>
+      </w:r>
+    </w:p>
+    <w:p>
+      <w:pPr>
+        <w:jc w:val="both"/>
+      </w:pPr>
+      <w:r>
+        <w:t>#### 12.7.2. Bảng mã 12.4 — số đọc được</w:t>
+      </w:r>
+    </w:p>
+    <w:tbl>
+      <w:tblPr>
+        <w:tblStyle w:val="LightGrid-Accent1"/>
+        <w:tblW w:type="auto" w:w="0"/>
+        <w:tblLook w:firstColumn="1" w:firstRow="1" w:lastColumn="0" w:lastRow="0" w:noHBand="0" w:noVBand="1" w:val="04A0"/>
+      </w:tblPr>
+      <w:tblGrid>
+        <w:gridCol w:w="2880"/>
+        <w:gridCol w:w="2880"/>
+        <w:gridCol w:w="2880"/>
+      </w:tblGrid>
+      <w:tr>
+        <w:tc>
+          <w:tcPr>
+            <w:tcW w:type="dxa" w:w="2880"/>
+          </w:tcPr>
+          <w:p>
+            <w:r>
+              <w:rPr>
+                <w:b/>
+              </w:rPr>
+            </w:r>
+            <w:r>
+              <w:rPr>
+                <w:b/>
+              </w:rPr>
+              <w:t>Cần mã</w:t>
+            </w:r>
+          </w:p>
+        </w:tc>
+        <w:tc>
+          <w:tcPr>
+            <w:tcW w:type="dxa" w:w="2880"/>
+          </w:tcPr>
+          <w:p>
+            <w:r>
+              <w:rPr>
+                <w:b/>
+              </w:rPr>
+            </w:r>
+            <w:r>
+              <w:rPr>
+                <w:b/>
+              </w:rPr>
+              <w:t>Số thật trên máy Lào</w:t>
+            </w:r>
+          </w:p>
+        </w:tc>
+        <w:tc>
+          <w:tcPr>
+            <w:tcW w:type="dxa" w:w="2880"/>
+          </w:tcPr>
+          <w:p>
+            <w:r>
+              <w:rPr>
+                <w:b/>
+              </w:rPr>
+            </w:r>
+            <w:r>
+              <w:rPr>
+                <w:b/>
+              </w:rPr>
+              <w:t>Còn thiếu</w:t>
+            </w:r>
+          </w:p>
+        </w:tc>
+      </w:tr>
+      <w:tr>
+        <w:tc>
+          <w:tcPr>
+            <w:tcW w:type="dxa" w:w="2880"/>
+          </w:tcPr>
+          <w:p>
+            <w:r/>
+            <w:r>
+              <w:rPr>
+                <w:rFonts w:ascii="Consolas" w:hAnsi="Consolas"/>
+                <w:sz w:val="19"/>
+              </w:rPr>
+              <w:t>CountryId</w:t>
+            </w:r>
+          </w:p>
+        </w:tc>
+        <w:tc>
+          <w:tcPr>
+            <w:tcW w:type="dxa" w:w="2880"/>
+          </w:tcPr>
+          <w:p>
+            <w:r/>
+            <w:r>
+              <w:t>11</w:t>
+            </w:r>
+          </w:p>
+        </w:tc>
+        <w:tc>
+          <w:tcPr>
+            <w:tcW w:type="dxa" w:w="2880"/>
+          </w:tcPr>
+          <w:p>
+            <w:r/>
+            <w:r>
+              <w:t>—</w:t>
+            </w:r>
+          </w:p>
+        </w:tc>
+      </w:tr>
+      <w:tr>
+        <w:tc>
+          <w:tcPr>
+            <w:tcW w:type="dxa" w:w="2880"/>
+          </w:tcPr>
+          <w:p>
+            <w:r/>
+            <w:r>
+              <w:rPr>
+                <w:rFonts w:ascii="Consolas" w:hAnsi="Consolas"/>
+                <w:sz w:val="19"/>
+              </w:rPr>
+              <w:t>OrgId</w:t>
+            </w:r>
+          </w:p>
+        </w:tc>
+        <w:tc>
+          <w:tcPr>
+            <w:tcW w:type="dxa" w:w="2880"/>
+          </w:tcPr>
+          <w:p>
+            <w:r/>
+            <w:r>
+              <w:t>2 "EPL 1" · 1368 "Demo EPL" · 5 "EPL 2" · 1369 "EPL 3" (</w:t>
+            </w:r>
+            <w:r>
+              <w:rPr>
+                <w:rFonts w:ascii="Consolas" w:hAnsi="Consolas"/>
+                <w:sz w:val="19"/>
+              </w:rPr>
+              <w:t>common/GetCompanyAndBranch</w:t>
+            </w:r>
+            <w:r>
+              <w:t>)</w:t>
+            </w:r>
+          </w:p>
+        </w:tc>
+        <w:tc>
+          <w:tcPr>
+            <w:tcW w:type="dxa" w:w="2880"/>
+          </w:tcPr>
+          <w:p>
+            <w:r/>
+            <w:r>
+              <w:rPr>
+                <w:b/>
+              </w:rPr>
+              <w:t>cả bốn đều quốc gia Việt Nam, tiền VND (`CUR_AUTOID` 3)</w:t>
+            </w:r>
+            <w:r>
+              <w:t>. Xin anh tạo đơn vị EPL Lào (quốc gia Lào, tiền LAK)</w:t>
+            </w:r>
+          </w:p>
+        </w:tc>
+      </w:tr>
+      <w:tr>
+        <w:tc>
+          <w:tcPr>
+            <w:tcW w:type="dxa" w:w="2880"/>
+          </w:tcPr>
+          <w:p>
+            <w:r/>
+            <w:r>
+              <w:rPr>
+                <w:rFonts w:ascii="Consolas" w:hAnsi="Consolas"/>
+                <w:sz w:val="19"/>
+              </w:rPr>
+              <w:t>FiciAutoId</w:t>
+            </w:r>
+          </w:p>
+        </w:tc>
+        <w:tc>
+          <w:tcPr>
+            <w:tcW w:type="dxa" w:w="2880"/>
+          </w:tcPr>
+          <w:p>
+            <w:r/>
+            <w:r>
+              <w:t xml:space="preserve">22 kỳ, đều "Kỳ mở". </w:t>
+            </w:r>
+            <w:r>
+              <w:rPr>
+                <w:b/>
+              </w:rPr>
+              <w:t>ID không theo thứ tự tháng</w:t>
+            </w:r>
+            <w:r>
+              <w:t xml:space="preserve">: 9/2026 = </w:t>
+            </w:r>
+            <w:r>
+              <w:rPr>
+                <w:b/>
+              </w:rPr>
+              <w:t>20</w:t>
+            </w:r>
+            <w:r>
+              <w:t xml:space="preserve">, 10/2026 = </w:t>
+            </w:r>
+            <w:r>
+              <w:rPr>
+                <w:b/>
+              </w:rPr>
+              <w:t>19</w:t>
+            </w:r>
+            <w:r>
+              <w:t>, 11/2026 = 18, 12/2026 = 17, 10/2025 = 24, 1/2026 = 7</w:t>
+            </w:r>
+          </w:p>
+        </w:tc>
+        <w:tc>
+          <w:tcPr>
+            <w:tcW w:type="dxa" w:w="2880"/>
+          </w:tcPr>
+          <w:p>
+            <w:r/>
+            <w:r>
+              <w:t xml:space="preserve">bên em </w:t>
+            </w:r>
+            <w:r>
+              <w:rPr>
+                <w:b/>
+              </w:rPr>
+              <w:t>tra theo `FICI_DATEFROM` / `FICI_DATETO`</w:t>
+            </w:r>
+            <w:r>
+              <w:t>, không đoán ID</w:t>
+            </w:r>
+          </w:p>
+        </w:tc>
+      </w:tr>
+      <w:tr>
+        <w:tc>
+          <w:tcPr>
+            <w:tcW w:type="dxa" w:w="2880"/>
+          </w:tcPr>
+          <w:p>
+            <w:r/>
+            <w:r>
+              <w:rPr>
+                <w:rFonts w:ascii="Consolas" w:hAnsi="Consolas"/>
+                <w:sz w:val="19"/>
+              </w:rPr>
+              <w:t>DotyAutoId</w:t>
+            </w:r>
+            <w:r>
+              <w:t xml:space="preserve"> (thu chi)</w:t>
+            </w:r>
+          </w:p>
+        </w:tc>
+        <w:tc>
+          <w:tcPr>
+            <w:tcW w:type="dxa" w:w="2880"/>
+          </w:tcPr>
+          <w:p>
+            <w:r/>
+            <w:r>
+              <w:t>14 Thu hoá đơn · 15 Thu công nợ · 16 Thu trước · 17 Thu khác · 57 Chi hoá đơn · 58 Chi công nợ · 59 Chi trước · 60 Chi khác · 68 Chuyển tiền nội bộ</w:t>
+            </w:r>
+          </w:p>
+        </w:tc>
+        <w:tc>
+          <w:tcPr>
+            <w:tcW w:type="dxa" w:w="2880"/>
+          </w:tcPr>
+          <w:p>
+            <w:r/>
+            <w:r>
+              <w:rPr>
+                <w:b/>
+              </w:rPr>
+              <w:t>không có loại "chi tạm ứng"</w:t>
+            </w:r>
+            <w:r>
+              <w:t>. Xin anh chốt: 59 "Chi trước" hay 60 "Chi khác" kèm Nợ 1601</w:t>
+            </w:r>
+          </w:p>
+        </w:tc>
+      </w:tr>
+      <w:tr>
+        <w:tc>
+          <w:tcPr>
+            <w:tcW w:type="dxa" w:w="2880"/>
+          </w:tcPr>
+          <w:p>
+            <w:r/>
+            <w:r>
+              <w:rPr>
+                <w:rFonts w:ascii="Consolas" w:hAnsi="Consolas"/>
+                <w:sz w:val="19"/>
+              </w:rPr>
+              <w:t>CurrencyId</w:t>
+            </w:r>
+          </w:p>
+        </w:tc>
+        <w:tc>
+          <w:tcPr>
+            <w:tcW w:type="dxa" w:w="2880"/>
+          </w:tcPr>
+          <w:p>
+            <w:r/>
+            <w:r>
+              <w:rPr>
+                <w:b/>
+              </w:rPr>
+              <w:t>3 = VND, 26 = LAK</w:t>
+            </w:r>
+            <w:r>
+              <w:t xml:space="preserve"> (</w:t>
+            </w:r>
+            <w:r>
+              <w:rPr>
+                <w:rFonts w:ascii="Consolas" w:hAnsi="Consolas"/>
+                <w:sz w:val="19"/>
+              </w:rPr>
+              <w:t>common/GetAllCurrency</w:t>
+            </w:r>
+            <w:r>
+              <w:t>)</w:t>
+            </w:r>
+          </w:p>
+        </w:tc>
+        <w:tc>
+          <w:tcPr>
+            <w:tcW w:type="dxa" w:w="2880"/>
+          </w:tcPr>
+          <w:p>
+            <w:r/>
+            <w:r>
+              <w:rPr>
+                <w:b/>
+              </w:rPr>
+              <w:t>chưa có USD, THB, CNY</w:t>
+            </w:r>
+            <w:r>
+              <w:t>. Cước bên Lào thường là USD — xin anh thêm</w:t>
+            </w:r>
+          </w:p>
+        </w:tc>
+      </w:tr>
+      <w:tr>
+        <w:tc>
+          <w:tcPr>
+            <w:tcW w:type="dxa" w:w="2880"/>
+          </w:tcPr>
+          <w:p>
+            <w:r/>
+            <w:r>
+              <w:rPr>
+                <w:rFonts w:ascii="Consolas" w:hAnsi="Consolas"/>
+                <w:sz w:val="19"/>
+              </w:rPr>
+              <w:t>PaymentMethodId</w:t>
+            </w:r>
+          </w:p>
+        </w:tc>
+        <w:tc>
+          <w:tcPr>
+            <w:tcW w:type="dxa" w:w="2880"/>
+          </w:tcPr>
+          <w:p>
+            <w:r/>
+            <w:r>
+              <w:t>1 Tiền mặt · 3 Chuyển khoản · 6 Tiền mặt/Chuyển khoản</w:t>
+            </w:r>
+          </w:p>
+        </w:tc>
+        <w:tc>
+          <w:tcPr>
+            <w:tcW w:type="dxa" w:w="2880"/>
+          </w:tcPr>
+          <w:p>
+            <w:r/>
+            <w:r>
+              <w:rPr>
+                <w:b/>
+              </w:rPr>
+              <w:t>chưa có "cấn trừ"</w:t>
+            </w:r>
+            <w:r>
+              <w:t xml:space="preserve"> (mục 6.6)</w:t>
+            </w:r>
+          </w:p>
+        </w:tc>
+      </w:tr>
+      <w:tr>
+        <w:tc>
+          <w:tcPr>
+            <w:tcW w:type="dxa" w:w="2880"/>
+          </w:tcPr>
+          <w:p>
+            <w:r/>
+            <w:r>
+              <w:t>Vế tiền mặc định (</w:t>
+            </w:r>
+            <w:r>
+              <w:rPr>
+                <w:rFonts w:ascii="Consolas" w:hAnsi="Consolas"/>
+                <w:sz w:val="19"/>
+              </w:rPr>
+              <w:t>default-money-account</w:t>
+            </w:r>
+            <w:r>
+              <w:t>, quốc gia 11)</w:t>
+            </w:r>
+          </w:p>
+        </w:tc>
+        <w:tc>
+          <w:tcPr>
+            <w:tcW w:type="dxa" w:w="2880"/>
+          </w:tcPr>
+          <w:p>
+            <w:r/>
+            <w:r>
+              <w:t xml:space="preserve">tiền mặt Kíp </w:t>
+            </w:r>
+            <w:r>
+              <w:rPr>
+                <w:b/>
+              </w:rPr>
+              <w:t>1011</w:t>
+            </w:r>
+            <w:r>
+              <w:t xml:space="preserve"> · tiền mặt ngoại tệ </w:t>
+            </w:r>
+            <w:r>
+              <w:rPr>
+                <w:b/>
+              </w:rPr>
+              <w:t>1012</w:t>
+            </w:r>
+            <w:r>
+              <w:t xml:space="preserve"> · ngân hàng Kíp </w:t>
+            </w:r>
+            <w:r>
+              <w:rPr>
+                <w:b/>
+              </w:rPr>
+              <w:t>1021</w:t>
+            </w:r>
+            <w:r>
+              <w:t xml:space="preserve"> · ngân hàng ngoại tệ </w:t>
+            </w:r>
+            <w:r>
+              <w:rPr>
+                <w:b/>
+              </w:rPr>
+              <w:t>1022</w:t>
+            </w:r>
+          </w:p>
+        </w:tc>
+        <w:tc>
+          <w:tcPr>
+            <w:tcW w:type="dxa" w:w="2880"/>
+          </w:tcPr>
+          <w:p>
+            <w:r/>
+            <w:r>
+              <w:t>khớp đúng bảng định khoản bên em (mục 7)</w:t>
+            </w:r>
+          </w:p>
+        </w:tc>
+      </w:tr>
+      <w:tr>
+        <w:tc>
+          <w:tcPr>
+            <w:tcW w:type="dxa" w:w="2880"/>
+          </w:tcPr>
+          <w:p>
+            <w:r/>
+            <w:r>
+              <w:rPr>
+                <w:rFonts w:ascii="Consolas" w:hAnsi="Consolas"/>
+                <w:sz w:val="19"/>
+              </w:rPr>
+              <w:t>ObjectId</w:t>
+            </w:r>
+          </w:p>
+        </w:tc>
+        <w:tc>
+          <w:tcPr>
+            <w:tcW w:type="dxa" w:w="2880"/>
+          </w:tcPr>
+          <w:p>
+            <w:r/>
+            <w:r>
+              <w:t xml:space="preserve">danh mục hiện có </w:t>
+            </w:r>
+            <w:r>
+              <w:rPr>
+                <w:b/>
+              </w:rPr>
+              <w:t>189 khách, 517 nhà cung cấp</w:t>
+            </w:r>
+            <w:r>
+              <w:t xml:space="preserve"> (trang 100 dòng), đều là dữ liệu bên khác</w:t>
+            </w:r>
+          </w:p>
+        </w:tc>
+        <w:tc>
+          <w:tcPr>
+            <w:tcW w:type="dxa" w:w="2880"/>
+          </w:tcPr>
+          <w:p>
+            <w:r/>
+            <w:r>
+              <w:t xml:space="preserve">xin anh tạo đối tượng cho khách, tài xế, chủ xe liên kết, nhà cung cấp của EPL Lào — hoặc cho bên em đồng bộ qua </w:t>
+            </w:r>
+            <w:r>
+              <w:rPr>
+                <w:rFonts w:ascii="Consolas" w:hAnsi="Consolas"/>
+                <w:sz w:val="19"/>
+              </w:rPr>
+              <w:t>master-data/customers/upsert</w:t>
+            </w:r>
+            <w:r>
+              <w:t xml:space="preserve">, </w:t>
+            </w:r>
+            <w:r>
+              <w:rPr>
+                <w:rFonts w:ascii="Consolas" w:hAnsi="Consolas"/>
+                <w:sz w:val="19"/>
+              </w:rPr>
+              <w:t>master-data/suppliers/upsert</w:t>
+            </w:r>
+          </w:p>
+        </w:tc>
+      </w:tr>
+    </w:tbl>
+    <w:p/>
+    <w:p>
+      <w:pPr>
+        <w:jc w:val="both"/>
+      </w:pPr>
+      <w:r>
+        <w:t>#### 12.7.3. Danh mục tài khoản</w:t>
+      </w:r>
+    </w:p>
+    <w:tbl>
+      <w:tblPr>
+        <w:tblStyle w:val="LightGrid-Accent1"/>
+        <w:tblW w:type="auto" w:w="0"/>
+        <w:tblLook w:firstColumn="1" w:firstRow="1" w:lastColumn="0" w:lastRow="0" w:noHBand="0" w:noVBand="1" w:val="04A0"/>
+      </w:tblPr>
+      <w:tblGrid>
+        <w:gridCol w:w="4320"/>
+        <w:gridCol w:w="4320"/>
+      </w:tblGrid>
+      <w:tr>
+        <w:tc>
+          <w:tcPr>
+            <w:tcW w:type="dxa" w:w="4320"/>
+          </w:tcPr>
+          <w:p>
+            <w:r>
+              <w:rPr>
+                <w:b/>
+              </w:rPr>
+            </w:r>
+            <w:r>
+              <w:rPr>
+                <w:b/>
+              </w:rPr>
+              <w:t>Đường</w:t>
+            </w:r>
+          </w:p>
+        </w:tc>
+        <w:tc>
+          <w:tcPr>
+            <w:tcW w:type="dxa" w:w="4320"/>
+          </w:tcPr>
+          <w:p>
+            <w:r>
+              <w:rPr>
+                <w:b/>
+              </w:rPr>
+            </w:r>
+            <w:r>
+              <w:rPr>
+                <w:b/>
+              </w:rPr>
+              <w:t>Kết quả</w:t>
+            </w:r>
+          </w:p>
+        </w:tc>
+      </w:tr>
+      <w:tr>
+        <w:tc>
+          <w:tcPr>
+            <w:tcW w:type="dxa" w:w="4320"/>
+          </w:tcPr>
+          <w:p>
+            <w:r/>
+            <w:r>
+              <w:rPr>
+                <w:rFonts w:ascii="Consolas" w:hAnsi="Consolas"/>
+                <w:sz w:val="19"/>
+              </w:rPr>
+              <w:t>GET /api/v1/accounting/lao-accounts</w:t>
+            </w:r>
+          </w:p>
+        </w:tc>
+        <w:tc>
+          <w:tcPr>
+            <w:tcW w:type="dxa" w:w="4320"/>
+          </w:tcPr>
+          <w:p>
+            <w:r/>
+            <w:r>
+              <w:rPr>
+                <w:b/>
+              </w:rPr>
+              <w:t>494 mã</w:t>
+            </w:r>
+            <w:r>
+              <w:t xml:space="preserve">, khớp bản bên em chụp ngày 30/09. Cột: </w:t>
+            </w:r>
+            <w:r>
+              <w:rPr>
+                <w:rFonts w:ascii="Consolas" w:hAnsi="Consolas"/>
+                <w:sz w:val="19"/>
+              </w:rPr>
+              <w:t>ACC_CODE</w:t>
+            </w:r>
+            <w:r>
+              <w:t xml:space="preserve">, </w:t>
+            </w:r>
+            <w:r>
+              <w:rPr>
+                <w:rFonts w:ascii="Consolas" w:hAnsi="Consolas"/>
+                <w:sz w:val="19"/>
+              </w:rPr>
+              <w:t>ACC_NAME</w:t>
+            </w:r>
+            <w:r>
+              <w:t xml:space="preserve">, </w:t>
+            </w:r>
+            <w:r>
+              <w:rPr>
+                <w:rFonts w:ascii="Consolas" w:hAnsi="Consolas"/>
+                <w:sz w:val="19"/>
+              </w:rPr>
+              <w:t>ACC_PARENTID</w:t>
+            </w:r>
+            <w:r>
+              <w:t xml:space="preserve">, </w:t>
+            </w:r>
+            <w:r>
+              <w:rPr>
+                <w:rFonts w:ascii="Consolas" w:hAnsi="Consolas"/>
+                <w:sz w:val="19"/>
+              </w:rPr>
+              <w:t>ACC_STRUCTURE</w:t>
+            </w:r>
+            <w:r>
+              <w:t xml:space="preserve">, </w:t>
+            </w:r>
+            <w:r>
+              <w:rPr>
+                <w:rFonts w:ascii="Consolas" w:hAnsi="Consolas"/>
+                <w:sz w:val="19"/>
+              </w:rPr>
+              <w:t>ACC_ISACTIVE</w:t>
+            </w:r>
+            <w:r>
+              <w:t xml:space="preserve">, </w:t>
+            </w:r>
+            <w:r>
+              <w:rPr>
+                <w:rFonts w:ascii="Consolas" w:hAnsi="Consolas"/>
+                <w:sz w:val="19"/>
+              </w:rPr>
+              <w:t>ACC_ISMONEYCURENTCY</w:t>
+            </w:r>
+            <w:r>
+              <w:t xml:space="preserve">, </w:t>
+            </w:r>
+            <w:r>
+              <w:rPr>
+                <w:rFonts w:ascii="Consolas" w:hAnsi="Consolas"/>
+                <w:sz w:val="19"/>
+              </w:rPr>
+              <w:t>TRY_AUTOID</w:t>
+            </w:r>
+            <w:r>
+              <w:t xml:space="preserve">, </w:t>
+            </w:r>
+            <w:r>
+              <w:rPr>
+                <w:rFonts w:ascii="Consolas" w:hAnsi="Consolas"/>
+                <w:sz w:val="19"/>
+              </w:rPr>
+              <w:t>Version</w:t>
+            </w:r>
+            <w:r>
+              <w:t xml:space="preserve">… Tài khoản </w:t>
+            </w:r>
+            <w:r>
+              <w:rPr>
+                <w:rFonts w:ascii="Consolas" w:hAnsi="Consolas"/>
+                <w:sz w:val="19"/>
+              </w:rPr>
+              <w:t>tune</w:t>
+            </w:r>
+            <w:r>
+              <w:t xml:space="preserve"> có </w:t>
+            </w:r>
+            <w:r>
+              <w:rPr>
+                <w:rFonts w:ascii="Consolas" w:hAnsi="Consolas"/>
+                <w:sz w:val="19"/>
+              </w:rPr>
+              <w:t>CanCreate</w:t>
+            </w:r>
+            <w:r>
+              <w:t xml:space="preserve">, </w:t>
+            </w:r>
+            <w:r>
+              <w:rPr>
+                <w:rFonts w:ascii="Consolas" w:hAnsi="Consolas"/>
+                <w:sz w:val="19"/>
+              </w:rPr>
+              <w:t>CanWrite</w:t>
+            </w:r>
+            <w:r>
+              <w:t xml:space="preserve">, </w:t>
+            </w:r>
+            <w:r>
+              <w:rPr>
+                <w:rFonts w:ascii="Consolas" w:hAnsi="Consolas"/>
+                <w:sz w:val="19"/>
+              </w:rPr>
+              <w:t>CanDelete</w:t>
+            </w:r>
+            <w:r>
+              <w:t xml:space="preserve"> = true</w:t>
+            </w:r>
+          </w:p>
+        </w:tc>
+      </w:tr>
+      <w:tr>
+        <w:tc>
+          <w:tcPr>
+            <w:tcW w:type="dxa" w:w="4320"/>
+          </w:tcPr>
+          <w:p>
+            <w:r/>
+            <w:r>
+              <w:rPr>
+                <w:rFonts w:ascii="Consolas" w:hAnsi="Consolas"/>
+                <w:sz w:val="19"/>
+              </w:rPr>
+              <w:t>GET …/cmpayment-receipt/country-accounts?countryId=11</w:t>
+            </w:r>
+          </w:p>
+        </w:tc>
+        <w:tc>
+          <w:tcPr>
+            <w:tcW w:type="dxa" w:w="4320"/>
+          </w:tcPr>
+          <w:p>
+            <w:r/>
+            <w:r>
+              <w:rPr>
+                <w:b/>
+              </w:rPr>
+              <w:t>405 mã</w:t>
+            </w:r>
+            <w:r>
+              <w:t xml:space="preserve"> cho hạch toán (cột viết PascalCase: </w:t>
+            </w:r>
+            <w:r>
+              <w:rPr>
+                <w:rFonts w:ascii="Consolas" w:hAnsi="Consolas"/>
+                <w:sz w:val="19"/>
+              </w:rPr>
+              <w:t>AccCode</w:t>
+            </w:r>
+            <w:r>
+              <w:t xml:space="preserve">, </w:t>
+            </w:r>
+            <w:r>
+              <w:rPr>
+                <w:rFonts w:ascii="Consolas" w:hAnsi="Consolas"/>
+                <w:sz w:val="19"/>
+              </w:rPr>
+              <w:t>AccName</w:t>
+            </w:r>
+            <w:r>
+              <w:t xml:space="preserve">, </w:t>
+            </w:r>
+            <w:r>
+              <w:rPr>
+                <w:rFonts w:ascii="Consolas" w:hAnsi="Consolas"/>
+                <w:sz w:val="19"/>
+              </w:rPr>
+              <w:t>AccParentId</w:t>
+            </w:r>
+            <w:r>
+              <w:t xml:space="preserve">…). </w:t>
+            </w:r>
+            <w:r>
+              <w:rPr>
+                <w:b/>
+              </w:rPr>
+              <w:t>Có đủ</w:t>
+            </w:r>
+            <w:r>
+              <w:t xml:space="preserve"> 1011, 1012, 1021, 1022, 1211, 137, 1601, 401, 402, 4201, 607, 614, 625, 707, 708</w:t>
+            </w:r>
+          </w:p>
+        </w:tc>
+      </w:tr>
+      <w:tr>
+        <w:tc>
+          <w:tcPr>
+            <w:tcW w:type="dxa" w:w="4320"/>
+          </w:tcPr>
+          <w:p>
+            <w:r/>
+            <w:r>
+              <w:t>Ba mã con bên em cần</w:t>
+            </w:r>
+          </w:p>
+        </w:tc>
+        <w:tc>
+          <w:tcPr>
+            <w:tcW w:type="dxa" w:w="4320"/>
+          </w:tcPr>
+          <w:p>
+            <w:r/>
+            <w:r>
+              <w:rPr>
+                <w:b/>
+              </w:rPr>
+              <w:t>1371, 4021, 4022 chưa có ở cả hai đường</w:t>
+            </w:r>
+            <w:r>
+              <w:t xml:space="preserve">. Xin anh mở theo mục 1.1: tạo trong </w:t>
+            </w:r>
+            <w:r>
+              <w:rPr>
+                <w:rFonts w:ascii="Consolas" w:hAnsi="Consolas"/>
+                <w:sz w:val="19"/>
+              </w:rPr>
+              <w:t>lao-accounts</w:t>
+            </w:r>
+            <w:r>
+              <w:t xml:space="preserve">, sau đó chúng phải hiện ở </w:t>
+            </w:r>
+            <w:r>
+              <w:rPr>
+                <w:rFonts w:ascii="Consolas" w:hAnsi="Consolas"/>
+                <w:sz w:val="19"/>
+              </w:rPr>
+              <w:t>country-accounts</w:t>
+            </w:r>
+          </w:p>
+        </w:tc>
+      </w:tr>
+    </w:tbl>
+    <w:p/>
+    <w:p>
+      <w:pPr>
+        <w:jc w:val="both"/>
+      </w:pPr>
+      <w:r>
+        <w:t>#### 12.7.4. Nguồn DO của phiếu thu chi</w:t>
+      </w:r>
+    </w:p>
+    <w:p>
+      <w:pPr>
+        <w:jc w:val="both"/>
+      </w:pPr>
+      <w:r>
+        <w:rPr>
+          <w:rFonts w:ascii="Consolas" w:hAnsi="Consolas"/>
+          <w:sz w:val="19"/>
+        </w:rPr>
+        <w:t>GET /api/v1/accounting/cash-voucher-references?type=DO</w:t>
+      </w:r>
+      <w:r>
+        <w:t xml:space="preserve"> chạy được, trả </w:t>
+      </w:r>
+      <w:r>
+        <w:rPr>
+          <w:b/>
+        </w:rPr>
+        <w:t>23 DO</w:t>
+      </w:r>
+      <w:r>
+        <w:t xml:space="preserve">. Nhưng đó là </w:t>
+      </w:r>
+      <w:r>
+        <w:rPr>
+          <w:b/>
+        </w:rPr>
+        <w:t>DO mẫu của EPL_System bên Việt Nam</w:t>
+      </w:r>
+      <w:r>
+        <w:t>:</w:t>
+      </w:r>
+    </w:p>
+    <w:p>
+      <w:pPr>
+        <w:pStyle w:val="ListBullet"/>
+      </w:pPr>
+      <w:r>
+        <w:t xml:space="preserve">khách </w:t>
+      </w:r>
+      <w:r>
+        <w:rPr>
+          <w:rFonts w:ascii="Consolas" w:hAnsi="Consolas"/>
+          <w:sz w:val="19"/>
+        </w:rPr>
+        <w:t>DEMO-CUS-…</w:t>
+      </w:r>
+      <w:r>
+        <w:t xml:space="preserve">, tuyến </w:t>
+      </w:r>
+      <w:r>
+        <w:rPr>
+          <w:rFonts w:ascii="Consolas" w:hAnsi="Consolas"/>
+          <w:sz w:val="19"/>
+        </w:rPr>
+        <w:t>DEMO-RT-…</w:t>
+      </w:r>
+      <w:r>
+        <w:t>;</w:t>
+      </w:r>
+    </w:p>
+    <w:p>
+      <w:pPr>
+        <w:pStyle w:val="ListBullet"/>
+      </w:pPr>
+      <w:r>
+        <w:t xml:space="preserve">ví dụ </w:t>
+      </w:r>
+      <w:r>
+        <w:rPr>
+          <w:rFonts w:ascii="Consolas" w:hAnsi="Consolas"/>
+          <w:sz w:val="19"/>
+        </w:rPr>
+        <w:t>DO-2026-0047-DO01</w:t>
+      </w:r>
+      <w:r>
+        <w:t xml:space="preserve">: </w:t>
+      </w:r>
+      <w:r>
+        <w:rPr>
+          <w:rFonts w:ascii="Consolas" w:hAnsi="Consolas"/>
+          <w:sz w:val="19"/>
+        </w:rPr>
+        <w:t>DEMO-CUS-DUCGIANG</w:t>
+      </w:r>
+      <w:r>
+        <w:t xml:space="preserve">, 3.829.000 LAK, </w:t>
+      </w:r>
+      <w:r>
+        <w:rPr>
+          <w:rFonts w:ascii="Consolas" w:hAnsi="Consolas"/>
+          <w:sz w:val="19"/>
+        </w:rPr>
+        <w:t>delivered</w:t>
+      </w:r>
+      <w:r>
+        <w:t>.</w:t>
+      </w:r>
+    </w:p>
+    <w:p>
+      <w:pPr>
+        <w:jc w:val="both"/>
+      </w:pPr>
+      <w:r>
+        <w:t>Mỗi dòng có khuôn:</w:t>
+      </w:r>
+    </w:p>
+    <w:p>
+      <w:pPr>
+        <w:spacing w:after="0"/>
+        <w:ind w:left="360"/>
+      </w:pPr>
+      <w:r>
+        <w:rPr>
+          <w:rFonts w:ascii="Consolas" w:hAnsi="Consolas"/>
+          <w:sz w:val="18"/>
+        </w:rPr>
+        <w:t>{"SourceSystem": "LOGISTICS", "SourceType": "DO", "SourceId": "&lt;do_id&gt;", "SourceCode": "&lt;do_id&gt;",</w:t>
+      </w:r>
+    </w:p>
+    <w:p>
+      <w:pPr>
+        <w:spacing w:after="0"/>
+        <w:ind w:left="360"/>
+      </w:pPr>
+      <w:r>
+        <w:rPr>
+          <w:rFonts w:ascii="Consolas" w:hAnsi="Consolas"/>
+          <w:sz w:val="18"/>
+        </w:rPr>
+        <w:t>"SourceName": "&lt;customer_id&gt;", "Status": "delivered",</w:t>
+      </w:r>
+    </w:p>
+    <w:p>
+      <w:pPr>
+        <w:spacing w:after="0"/>
+        <w:ind w:left="360"/>
+      </w:pPr>
+      <w:r>
+        <w:rPr>
+          <w:rFonts w:ascii="Consolas" w:hAnsi="Consolas"/>
+          <w:sz w:val="18"/>
+        </w:rPr>
+        <w:t>"Summary": {"do_id", "status", "customer_id", "quotation_id", "route_id", "vehicle_id", "driver_id",</w:t>
+      </w:r>
+    </w:p>
+    <w:p>
+      <w:pPr>
+        <w:spacing w:after="0"/>
+        <w:ind w:left="360"/>
+      </w:pPr>
+      <w:r>
+        <w:rPr>
+          <w:rFonts w:ascii="Consolas" w:hAnsi="Consolas"/>
+          <w:sz w:val="18"/>
+        </w:rPr>
+        <w:t>"selling_price", "customer_surcharge_total", "final_selling_price", "currency",</w:t>
+      </w:r>
+    </w:p>
+    <w:p>
+      <w:pPr>
+        <w:spacing w:after="0"/>
+        <w:ind w:left="360"/>
+      </w:pPr>
+      <w:r>
+        <w:rPr>
+          <w:rFonts w:ascii="Consolas" w:hAnsi="Consolas"/>
+          <w:sz w:val="18"/>
+        </w:rPr>
+        <w:t>"completed_at", "completed_by", "detail_url"}}</w:t>
+      </w:r>
+    </w:p>
+    <w:p/>
+    <w:p>
+      <w:pPr>
+        <w:jc w:val="both"/>
+      </w:pPr>
+      <w:r>
+        <w:rPr>
+          <w:rFonts w:ascii="Consolas" w:hAnsi="Consolas"/>
+          <w:sz w:val="19"/>
+        </w:rPr>
+        <w:t>Summary</w:t>
+      </w:r>
+      <w:r>
+        <w:t xml:space="preserve"> chính là một dòng của </w:t>
+      </w:r>
+      <w:r>
+        <w:rPr>
+          <w:rFonts w:ascii="Consolas" w:hAnsi="Consolas"/>
+          <w:sz w:val="19"/>
+        </w:rPr>
+        <w:t>GET /api/handover/delivery-orders</w:t>
+      </w:r>
+      <w:r>
+        <w:t xml:space="preserve">. Như vậy chỉ cần bên em dựng </w:t>
+      </w:r>
+      <w:r>
+        <w:rPr>
+          <w:b/>
+        </w:rPr>
+        <w:t>đúng khuôn đó</w:t>
+      </w:r>
+      <w:r>
+        <w:t xml:space="preserve"> ở trang điều xe Lào (mục 12.5), và anh </w:t>
+      </w:r>
+      <w:r>
+        <w:rPr>
+          <w:b/>
+        </w:rPr>
+        <w:t>trỏ nguồn Logistics của đơn vị EPL Lào</w:t>
+      </w:r>
+      <w:r>
+        <w:t xml:space="preserve"> sang trang điều xe Lào.</w:t>
+      </w:r>
+    </w:p>
+    <w:p>
+      <w:pPr>
+        <w:jc w:val="both"/>
+      </w:pPr>
+      <w:r>
+        <w:t>#### 12.7.5. Việc xin anh làm — xếp theo thứ tự cần trước</w:t>
+      </w:r>
+    </w:p>
+    <w:p>
+      <w:pPr>
+        <w:pStyle w:val="ListNumber"/>
+      </w:pPr>
+      <w:r>
+        <w:rPr>
+          <w:b/>
+        </w:rPr>
+        <w:t>Mở 1371, 4021, 4022</w:t>
+      </w:r>
+      <w:r>
+        <w:t xml:space="preserve"> (mục 1.1).</w:t>
+      </w:r>
+    </w:p>
+    <w:p>
+      <w:pPr>
+        <w:pStyle w:val="ListNumber"/>
+      </w:pPr>
+      <w:r>
+        <w:rPr>
+          <w:b/>
+        </w:rPr>
+        <w:t>Tạo đơn vị EPL Lào</w:t>
+      </w:r>
+      <w:r>
+        <w:t xml:space="preserve"> (quốc gia 11, tiền LAK). Trả lời luôn: Thà Bốc và Viêng Chăn là một đơn vị hay hai?</w:t>
+      </w:r>
+    </w:p>
+    <w:p>
+      <w:pPr>
+        <w:pStyle w:val="ListNumber"/>
+      </w:pPr>
+      <w:r>
+        <w:rPr>
+          <w:b/>
+        </w:rPr>
+        <w:t>Thêm tiền USD, THB</w:t>
+      </w:r>
+      <w:r>
+        <w:t xml:space="preserve"> (và CNY nếu bên Lào dùng), cho anh biết </w:t>
+      </w:r>
+      <w:r>
+        <w:rPr>
+          <w:rFonts w:ascii="Consolas" w:hAnsi="Consolas"/>
+          <w:sz w:val="19"/>
+        </w:rPr>
+        <w:t>CurrencyId</w:t>
+      </w:r>
+      <w:r>
+        <w:t>.</w:t>
+      </w:r>
+    </w:p>
+    <w:p>
+      <w:pPr>
+        <w:pStyle w:val="ListNumber"/>
+      </w:pPr>
+      <w:r>
+        <w:rPr>
+          <w:b/>
+        </w:rPr>
+        <w:t>Tài khoản dịch vụ</w:t>
+      </w:r>
+      <w:r>
+        <w:t xml:space="preserve"> cho trang điều xe, quyền trên đơn vị EPL Lào.</w:t>
+      </w:r>
+    </w:p>
+    <w:p>
+      <w:pPr>
+        <w:pStyle w:val="ListNumber"/>
+      </w:pPr>
+      <w:r>
+        <w:rPr>
+          <w:b/>
+        </w:rPr>
+        <w:t>Chốt `DotyAutoId` cho phiếu chi tạm ứng</w:t>
+      </w:r>
+      <w:r>
+        <w:t xml:space="preserve"> (59 hay 60).</w:t>
+      </w:r>
+    </w:p>
+    <w:p>
+      <w:pPr>
+        <w:pStyle w:val="ListNumber"/>
+      </w:pPr>
+      <w:r>
+        <w:rPr>
+          <w:b/>
+        </w:rPr>
+        <w:t>Đối tượng</w:t>
+      </w:r>
+      <w:r>
+        <w:t xml:space="preserve"> cho khách, tài xế, chủ xe, nhà cung cấp EPL Lào (hoặc cho bên em đồng bộ).</w:t>
+      </w:r>
+    </w:p>
+    <w:p>
+      <w:pPr>
+        <w:pStyle w:val="ListNumber"/>
+      </w:pPr>
+      <w:r>
+        <w:rPr>
+          <w:b/>
+        </w:rPr>
+        <w:t>Trỏ nguồn DO</w:t>
+      </w:r>
+      <w:r>
+        <w:t xml:space="preserve"> của đơn vị EPL Lào sang trang điều xe Lào, khi bên em báo đã dựng xong hai đường bàn giao.</w:t>
+      </w:r>
+    </w:p>
+    <w:p>
+      <w:pPr>
+        <w:pStyle w:val="ListNumber"/>
+      </w:pPr>
+      <w:r>
+        <w:t xml:space="preserve">Phương thức </w:t>
+      </w:r>
+      <w:r>
+        <w:rPr>
+          <w:b/>
+        </w:rPr>
+        <w:t>"cấn trừ"</w:t>
+      </w:r>
+      <w:r>
+        <w:t>, nếu anh muốn ghi cấn trừ cuối tháng bằng phiếu thu chi.</w:t>
       </w:r>
     </w:p>
     <w:sectPr>

</xml_diff>

<commit_message>
Khách hàng làm lại theo bản mẫu chủ dự án (Khach_Hang_new, 30/09); mã khách = mã bên kế toán
- Trái: danh sách khách (chữ đầu, số còn nợ, tình trạng hợp đồng, cách xuất
  hoá đơn), tìm tên / mã / điện thoại / số hợp đồng, lọc Sắp hết hạn · Chưa
  có hợp đồng · Còn nợ. Phải: hồ sơ, bốn ô số tháng, dải hợp đồng đang áp
  dụng (Sửa / Gia hạn, gợi số HDVC tiếp theo, thời hạn nhanh, kéo thả scan),
  tab Hợp đồng · Bảng giá · Chuyến & phiếu · Công nợ (chỉ xem).
- Giữ đủ chức năng cũ: sửa / xoá bảng giá, xoá hợp đồng chưa có phiếu, mở /
  xoá bản scan, hợp đồng không thời hạn, tiền theo tiền của chứng từ; Bãi
  không thấy tiền (máy chủ cũng không gửi).
- Khách có mã khách (= OBJ_OBJECTNO bên anh Tune, kiểm dạng và trùng) và
  loại khách; /api/customers-cong-no cho cột trái; gói bàn giao DO có
  customer_code, lọc được theo mã đó. Hợp đồng anh Tune mục 12.8.
- Bộ kiểm kiem/thu_khach_hang_moi.py (16 chỗ, đạt trên bản sao DB).

Co-Authored-By: Claude Opus 5.5 (1M context) <noreply@anthropic.com>
</commit_message>
<xml_diff>
--- a/DOCS/word/HOP_DONG_API_KE_TOAN_ANH_TUNE.docx
+++ b/DOCS/word/HOP_DONG_API_KE_TOAN_ANH_TUNE.docx
@@ -20710,7 +20710,26 @@
               <w:t>bên em</w:t>
             </w:r>
             <w:r>
-              <w:t xml:space="preserve"> (12 ký tự hex)</w:t>
+              <w:t xml:space="preserve"> (12 ký tự hex) </w:t>
+            </w:r>
+            <w:r>
+              <w:rPr>
+                <w:b/>
+              </w:rPr>
+              <w:t>hoặc mã khách bên anh</w:t>
+            </w:r>
+            <w:r>
+              <w:t xml:space="preserve"> (</w:t>
+            </w:r>
+            <w:r>
+              <w:rPr>
+                <w:rFonts w:ascii="Consolas" w:hAnsi="Consolas"/>
+                <w:sz w:val="19"/>
+              </w:rPr>
+              <w:t>OBJ_OBJECTNO</w:t>
+            </w:r>
+            <w:r>
+              <w:t>, ô "Mã khách" trên danh mục khách bên em)</w:t>
             </w:r>
           </w:p>
         </w:tc>
@@ -20993,7 +21012,7 @@
           <w:rFonts w:ascii="Consolas" w:hAnsi="Consolas"/>
           <w:sz w:val="18"/>
         </w:rPr>
-        <w:t>"customer_id": "&lt;mã khách bên em&gt;", "customer_name": "&lt;tên khách&gt;",</w:t>
+        <w:t>"customer_id": "&lt;mã khách bên em&gt;", "customer_code": "&lt;OBJ_OBJECTNO bên anh hoặc null&gt;", "customer_name": "&lt;tên khách&gt;",</w:t>
       </w:r>
     </w:p>
     <w:p>
@@ -21376,6 +21395,50 @@
           <w:sz w:val="19"/>
         </w:rPr>
         <w:t>final_selling_price_lak</w:t>
+      </w:r>
+      <w:r>
+        <w:t>.</w:t>
+      </w:r>
+    </w:p>
+    <w:p>
+      <w:pPr>
+        <w:pStyle w:val="ListBullet"/>
+      </w:pPr>
+      <w:r>
+        <w:rPr>
+          <w:rFonts w:ascii="Consolas" w:hAnsi="Consolas"/>
+          <w:sz w:val="19"/>
+        </w:rPr>
+        <w:t>customer_code</w:t>
+      </w:r>
+      <w:r>
+        <w:t xml:space="preserve"> = </w:t>
+      </w:r>
+      <w:r>
+        <w:rPr>
+          <w:b/>
+        </w:rPr>
+        <w:t>mã khách bên anh</w:t>
+      </w:r>
+      <w:r>
+        <w:t xml:space="preserve"> (</w:t>
+      </w:r>
+      <w:r>
+        <w:rPr>
+          <w:rFonts w:ascii="Consolas" w:hAnsi="Consolas"/>
+          <w:sz w:val="19"/>
+        </w:rPr>
+        <w:t>OBJ_OBJECTNO</w:t>
+      </w:r>
+      <w:r>
+        <w:t xml:space="preserve">) mà bên em ghi ở ô "Mã khách" của danh mục khách (thêm 30/09). Khách chưa ghi mã thì </w:t>
+      </w:r>
+      <w:r>
+        <w:rPr>
+          <w:rFonts w:ascii="Consolas" w:hAnsi="Consolas"/>
+          <w:sz w:val="19"/>
+        </w:rPr>
+        <w:t>null</w:t>
       </w:r>
       <w:r>
         <w:t>.</w:t>
@@ -21938,6 +22001,16 @@
                 <w:rFonts w:ascii="Consolas" w:hAnsi="Consolas"/>
                 <w:sz w:val="19"/>
               </w:rPr>
+              <w:t>customer_code</w:t>
+            </w:r>
+            <w:r>
+              <w:t xml:space="preserve">, </w:t>
+            </w:r>
+            <w:r>
+              <w:rPr>
+                <w:rFonts w:ascii="Consolas" w:hAnsi="Consolas"/>
+                <w:sz w:val="19"/>
+              </w:rPr>
               <w:t>customer_name</w:t>
             </w:r>
             <w:r>
@@ -21959,7 +22032,16 @@
           <w:p>
             <w:r/>
             <w:r>
-              <w:t>khách, hợp đồng vận chuyển</w:t>
+              <w:t xml:space="preserve">khách (mã bên em, </w:t>
+            </w:r>
+            <w:r>
+              <w:rPr>
+                <w:b/>
+              </w:rPr>
+              <w:t>mã bên anh</w:t>
+            </w:r>
+            <w:r>
+              <w:t>), hợp đồng vận chuyển</w:t>
             </w:r>
           </w:p>
         </w:tc>
@@ -24177,16 +24259,16 @@
         <w:pStyle w:val="ListNumber"/>
       </w:pPr>
       <w:r>
-        <w:t xml:space="preserve">(Anh Tune) Anh có cần lọc theo </w:t>
+        <w:t xml:space="preserve">~~Lọc theo mã khách bên anh~~ — </w:t>
       </w:r>
       <w:r>
         <w:rPr>
           <w:b/>
         </w:rPr>
-        <w:t>mã khách bên anh</w:t>
-      </w:r>
-      <w:r>
-        <w:t xml:space="preserve"> (</w:t>
+        <w:t>đã làm 30/09:</w:t>
+      </w:r>
+      <w:r>
+        <w:t xml:space="preserve"> danh mục khách bên em có ô "Mã khách" (= </w:t>
       </w:r>
       <w:r>
         <w:rPr>
@@ -24196,17 +24278,37 @@
         <w:t>OBJ_OBJECTNO</w:t>
       </w:r>
       <w:r>
-        <w:t xml:space="preserve">) không? Khi bên em thêm ô "Mã khách bên kế toán" (bước tiếp theo), bên em trả thêm </w:t>
+        <w:t xml:space="preserve"> bên anh, ≤ 50 ký tự Latinh / số / </w:t>
       </w:r>
       <w:r>
         <w:rPr>
           <w:rFonts w:ascii="Consolas" w:hAnsi="Consolas"/>
           <w:sz w:val="19"/>
         </w:rPr>
+        <w:t>- _ . /</w:t>
+      </w:r>
+      <w:r>
+        <w:t xml:space="preserve">, không trùng). Mỗi dòng và header trả </w:t>
+      </w:r>
+      <w:r>
+        <w:rPr>
+          <w:rFonts w:ascii="Consolas" w:hAnsi="Consolas"/>
+          <w:sz w:val="19"/>
+        </w:rPr>
         <w:t>customer_code</w:t>
       </w:r>
       <w:r>
-        <w:t xml:space="preserve"> trên mỗi dòng.</w:t>
+        <w:t xml:space="preserve">; tham số </w:t>
+      </w:r>
+      <w:r>
+        <w:rPr>
+          <w:rFonts w:ascii="Consolas" w:hAnsi="Consolas"/>
+          <w:sz w:val="19"/>
+        </w:rPr>
+        <w:t>customer_id</w:t>
+      </w:r>
+      <w:r>
+        <w:t xml:space="preserve"> nhận cả mã đó. Xin anh gửi danh sách mã khách của EPL Lào để bên em ghi vào.</w:t>
       </w:r>
     </w:p>
     <w:sectPr>

</xml_diff>

<commit_message>
Tài liệu nối API anh Tune (bản đồ) + hợp đồng kế toán v2 (01/10)
- DOCS/md/NOI_API_ANH_TUNE.md (+ Word): mình gọi gì bên anh (danh mục tài khoản, tạo SO,
  20 đường chỉ đọc đã thử, CMP / công nợ sắp làm), anh gọi gì bên mình (bàn giao DO, nhóm
  lien-thong), từng bước của một DO sinh tờ gì và tờ đi đâu, phiếu đề nghị đã sang anh chưa
  (mới có PDT → SO; phong bì chứng từ còn đi KT tạm), JSON thật, anh cho gì / còn chờ gì,
  thao tác bấm thử.
- Hợp đồng kế toán anh Tune lên v2: hộp "đổi từ v1", cấu hình tạo SO + hạn token 10/10,
  3.1 chưa tờ nào sang hệ anh, bảng 3.2 cập nhật trạng thái, 6.4 sửa đúng điều kiện mã
  kiểm, §9 việc đã làm, câu hỏi 10.12 (khách EPL Lào) · 10.13 (cách nhận tờ còn lại),
  §11 thêm bộ kiểm, 12.8.4 địa chỉ ra Internet host khi làm xong hết.
- tools/sinh_word.py: hiểu khối trích dẫn ">", tiêu đề "####", gạch đầu dòng con thụt
  2 dấu cách — trước đây hiện nguyên ký hiệu trong Word.

Co-Authored-By: Claude Opus 5.5 (1M context) <noreply@anthropic.com>
</commit_message>
<xml_diff>
--- a/DOCS/word/HOP_DONG_API_KE_TOAN_ANH_TUNE.docx
+++ b/DOCS/word/HOP_DONG_API_KE_TOAN_ANH_TUNE.docx
@@ -24,10 +24,10 @@
         <w:rPr>
           <w:b/>
         </w:rPr>
-        <w:t>v1 · 30/09/2026</w:t>
-      </w:r>
-      <w:r>
-        <w:t xml:space="preserve">. Bên soạn: trang điều xe </w:t>
+        <w:t>v2 · 01/10/2026</w:t>
+      </w:r>
+      <w:r>
+        <w:t xml:space="preserve"> (v1 ngày 30/09). Bên soạn: trang điều xe </w:t>
       </w:r>
       <w:r>
         <w:rPr>
@@ -46,6 +46,199 @@
       </w:r>
       <w:r>
         <w:t xml:space="preserve"> (công nợ, thu chi, sổ kế toán).</w:t>
+      </w:r>
+    </w:p>
+    <w:p>
+      <w:pPr>
+        <w:ind w:left="360"/>
+        <w:jc w:val="both"/>
+      </w:pPr>
+      <w:r>
+        <w:rPr>
+          <w:b/>
+        </w:rPr>
+        <w:t>Đổi từ v1 sang v2 (01/10/2026):</w:t>
+      </w:r>
+    </w:p>
+    <w:p>
+      <w:pPr>
+        <w:pStyle w:val="ListBullet"/>
+        <w:ind w:left="360"/>
+      </w:pPr>
+      <w:r>
+        <w:rPr>
+          <w:b/>
+        </w:rPr>
+        <w:t>3.2 / 3.2.1:</w:t>
+      </w:r>
+      <w:r>
+        <w:t xml:space="preserve"> bên em </w:t>
+      </w:r>
+      <w:r>
+        <w:rPr>
+          <w:b/>
+        </w:rPr>
+        <w:t>đã dựng</w:t>
+      </w:r>
+      <w:r>
+        <w:t xml:space="preserve"> gửi đề nghị thu → SO của anh (nút </w:t>
+      </w:r>
+      <w:r>
+        <w:rPr>
+          <w:i/>
+        </w:rPr>
+        <w:t>Tạo SO bên kế toán</w:t>
+      </w:r>
+      <w:r>
+        <w:t xml:space="preserve">) và </w:t>
+      </w:r>
+      <w:r>
+        <w:rPr>
+          <w:b/>
+        </w:rPr>
+        <w:t>đã gửi thử một DO</w:t>
+      </w:r>
+      <w:r>
+        <w:t xml:space="preserve">: hệ anh trả 422 </w:t>
+      </w:r>
+      <w:r>
+        <w:rPr>
+          <w:rFonts w:ascii="Consolas" w:hAnsi="Consolas"/>
+          <w:sz w:val="19"/>
+        </w:rPr>
+        <w:t>LOGISTICS_52905</w:t>
+      </w:r>
+      <w:r>
+        <w:t xml:space="preserve"> vì </w:t>
+      </w:r>
+      <w:r>
+        <w:rPr>
+          <w:b/>
+        </w:rPr>
+        <w:t>chưa có khách EPL Lào</w:t>
+      </w:r>
+      <w:r>
+        <w:t xml:space="preserve"> trong danh mục của anh. Không tạo gì.</w:t>
+      </w:r>
+    </w:p>
+    <w:p>
+      <w:pPr>
+        <w:pStyle w:val="ListBullet"/>
+        <w:ind w:left="360"/>
+      </w:pPr>
+      <w:r>
+        <w:rPr>
+          <w:b/>
+        </w:rPr>
+        <w:t>3.1:</w:t>
+      </w:r>
+      <w:r>
+        <w:t xml:space="preserve"> ghi rõ phong bì chứng từ hiện chỉ đi sang </w:t>
+      </w:r>
+      <w:r>
+        <w:rPr>
+          <w:b/>
+        </w:rPr>
+        <w:t>KT tạm</w:t>
+      </w:r>
+      <w:r>
+        <w:t xml:space="preserve">; </w:t>
+      </w:r>
+      <w:r>
+        <w:rPr>
+          <w:b/>
+        </w:rPr>
+        <w:t>chưa tờ nào</w:t>
+      </w:r>
+      <w:r>
+        <w:t xml:space="preserve"> sang hệ anh bằng đường này.</w:t>
+      </w:r>
+    </w:p>
+    <w:p>
+      <w:pPr>
+        <w:pStyle w:val="ListBullet"/>
+        <w:ind w:left="360"/>
+      </w:pPr>
+      <w:r>
+        <w:rPr>
+          <w:b/>
+        </w:rPr>
+        <w:t>6.4:</w:t>
+      </w:r>
+      <w:r>
+        <w:t xml:space="preserve"> sửa cho đúng các điều kiện mã đang kiểm.</w:t>
+      </w:r>
+    </w:p>
+    <w:p>
+      <w:pPr>
+        <w:pStyle w:val="ListBullet"/>
+        <w:ind w:left="360"/>
+      </w:pPr>
+      <w:r>
+        <w:rPr>
+          <w:b/>
+        </w:rPr>
+        <w:t>12.8.2:</w:t>
+      </w:r>
+      <w:r>
+        <w:t xml:space="preserve"> mã khách bên em chỉ KT Thu/Chi Viêng Chăn và Sếp gán (theo Excel của khách).</w:t>
+      </w:r>
+    </w:p>
+    <w:p>
+      <w:pPr>
+        <w:pStyle w:val="ListBullet"/>
+        <w:ind w:left="360"/>
+      </w:pPr>
+      <w:r>
+        <w:rPr>
+          <w:b/>
+        </w:rPr>
+        <w:t>12.8.4:</w:t>
+      </w:r>
+      <w:r>
+        <w:t xml:space="preserve"> địa chỉ ra Internet — chủ dự án host khi làm xong hết rồi mới gửi anh.</w:t>
+      </w:r>
+    </w:p>
+    <w:p>
+      <w:pPr>
+        <w:pStyle w:val="ListBullet"/>
+        <w:ind w:left="360"/>
+      </w:pPr>
+      <w:r>
+        <w:rPr>
+          <w:b/>
+        </w:rPr>
+        <w:t>10.12, 10.13:</w:t>
+      </w:r>
+      <w:r>
+        <w:t xml:space="preserve"> hai câu hỏi mới. </w:t>
+      </w:r>
+      <w:r>
+        <w:rPr>
+          <w:b/>
+        </w:rPr>
+        <w:t>§9</w:t>
+      </w:r>
+      <w:r>
+        <w:t xml:space="preserve"> đánh dấu việc đã làm.</w:t>
+      </w:r>
+    </w:p>
+    <w:p>
+      <w:pPr>
+        <w:pStyle w:val="ListBullet"/>
+        <w:ind w:left="360"/>
+      </w:pPr>
+      <w:r>
+        <w:t xml:space="preserve">Bản đồ gọn "mình gọi gì, anh gọi gì, chứng từ đi đâu" ở tài liệu riêng </w:t>
+      </w:r>
+      <w:r>
+        <w:rPr>
+          <w:b/>
+        </w:rPr>
+        <w:t>`NOI_API_ANH_TUNE`</w:t>
+      </w:r>
+      <w:r>
+        <w:t xml:space="preserve"> (cùng ngày).</w:t>
       </w:r>
     </w:p>
     <w:p>
@@ -295,7 +488,7 @@
         <w:t>chép từ mã đang chạy</w:t>
       </w:r>
       <w:r>
-        <w:t xml:space="preserve"> (đọc ngày 30/09/2026).</w:t>
+        <w:t xml:space="preserve"> (đọc ngày 30/09 và 01/10/2026).</w:t>
       </w:r>
     </w:p>
     <w:p>
@@ -338,11 +531,9 @@
     </w:p>
     <w:p>
       <w:pPr>
+        <w:ind w:left="360"/>
         <w:jc w:val="both"/>
       </w:pPr>
-      <w:r>
-        <w:t xml:space="preserve">&gt; </w:t>
-      </w:r>
       <w:r>
         <w:rPr>
           <w:b/>
@@ -374,11 +565,9 @@
     </w:p>
     <w:p>
       <w:pPr>
+        <w:ind w:left="360"/>
         <w:jc w:val="both"/>
       </w:pPr>
-      <w:r>
-        <w:t xml:space="preserve">&gt; </w:t>
-      </w:r>
       <w:r>
         <w:rPr>
           <w:rFonts w:ascii="Consolas" w:hAnsi="Consolas"/>
@@ -410,10 +599,11 @@
     </w:p>
     <w:p>
       <w:pPr>
+        <w:ind w:left="360"/>
         <w:jc w:val="both"/>
       </w:pPr>
       <w:r>
-        <w:t xml:space="preserve">&gt; tiền đi bằng phiếu </w:t>
+        <w:t xml:space="preserve">tiền đi bằng phiếu </w:t>
       </w:r>
       <w:r>
         <w:rPr>
@@ -537,11 +727,8 @@
     </w:p>
     <w:p>
       <w:pPr>
-        <w:jc w:val="both"/>
-      </w:pPr>
-      <w:r>
-        <w:t xml:space="preserve">- </w:t>
-      </w:r>
+        <w:pStyle w:val="ListBullet2"/>
+      </w:pPr>
       <w:r>
         <w:rPr>
           <w:b/>
@@ -554,11 +741,8 @@
     </w:p>
     <w:p>
       <w:pPr>
-        <w:jc w:val="both"/>
-      </w:pPr>
-      <w:r>
-        <w:t xml:space="preserve">- </w:t>
-      </w:r>
+        <w:pStyle w:val="ListBullet2"/>
+      </w:pPr>
       <w:r>
         <w:rPr>
           <w:b/>
@@ -582,10 +766,10 @@
     </w:p>
     <w:p>
       <w:pPr>
-        <w:jc w:val="both"/>
-      </w:pPr>
-      <w:r>
-        <w:t xml:space="preserve">- luôn là số JSON, đi kèm </w:t>
+        <w:pStyle w:val="ListBullet2"/>
+      </w:pPr>
+      <w:r>
+        <w:t xml:space="preserve">luôn là số JSON, đi kèm </w:t>
       </w:r>
       <w:r>
         <w:rPr>
@@ -649,11 +833,8 @@
     </w:p>
     <w:p>
       <w:pPr>
-        <w:jc w:val="both"/>
-      </w:pPr>
-      <w:r>
-        <w:t xml:space="preserve">- </w:t>
-      </w:r>
+        <w:pStyle w:val="ListBullet2"/>
+      </w:pPr>
       <w:r>
         <w:rPr>
           <w:b/>
@@ -666,10 +847,10 @@
     </w:p>
     <w:p>
       <w:pPr>
-        <w:jc w:val="both"/>
-      </w:pPr>
-      <w:r>
-        <w:t>- LAK là tiền gốc để ghi sổ.</w:t>
+        <w:pStyle w:val="ListBullet2"/>
+      </w:pPr>
+      <w:r>
+        <w:t>LAK là tiền gốc để ghi sổ.</w:t>
       </w:r>
     </w:p>
     <w:p>
@@ -2287,156 +2468,170 @@
     </w:p>
     <w:p>
       <w:pPr>
-        <w:pStyle w:val="Heading2"/>
-      </w:pPr>
-      <w:r>
-        <w:t>2.2. Đề nghị</w:t>
-      </w:r>
-    </w:p>
-    <w:p>
-      <w:pPr>
-        <w:pStyle w:val="ListNumber"/>
+        <w:jc w:val="both"/>
       </w:pPr>
       <w:r>
         <w:rPr>
           <w:b/>
         </w:rPr>
-        <w:t>Tách địa chỉ theo việc.</w:t>
-      </w:r>
-      <w:r>
-        <w:t xml:space="preserve"> Bên em thêm cấu hình riêng:</w:t>
-      </w:r>
-    </w:p>
-    <w:p>
-      <w:pPr>
-        <w:jc w:val="both"/>
-      </w:pPr>
-      <w:r>
-        <w:t>| Khoá | Env | Dùng cho |</w:t>
-      </w:r>
-    </w:p>
-    <w:p>
-      <w:pPr>
-        <w:jc w:val="both"/>
-      </w:pPr>
-      <w:r>
-        <w:t>|---|---|---|</w:t>
-      </w:r>
-    </w:p>
-    <w:p>
-      <w:pPr>
-        <w:jc w:val="both"/>
-      </w:pPr>
-      <w:r>
-        <w:t xml:space="preserve">| </w:t>
+        <w:t>Tạo SO (mục 3.2, từ 01/10):</w:t>
+      </w:r>
+    </w:p>
+    <w:p>
+      <w:pPr>
+        <w:pStyle w:val="ListBullet"/>
+      </w:pPr>
+      <w:r>
+        <w:t xml:space="preserve">Gốc: </w:t>
       </w:r>
       <w:r>
         <w:rPr>
           <w:rFonts w:ascii="Consolas" w:hAnsi="Consolas"/>
           <w:sz w:val="19"/>
         </w:rPr>
-        <w:t>qlsx_api</w:t>
-      </w:r>
-      <w:r>
-        <w:t xml:space="preserve"> | </w:t>
+        <w:t>QLSX_BASE_URL</w:t>
+      </w:r>
+      <w:r>
+        <w:t xml:space="preserve"> nếu đặt; không thì giao thức + tên máy của </w:t>
       </w:r>
       <w:r>
         <w:rPr>
           <w:rFonts w:ascii="Consolas" w:hAnsi="Consolas"/>
           <w:sz w:val="19"/>
         </w:rPr>
-        <w:t>EPL_QLSX_API</w:t>
-      </w:r>
-      <w:r>
-        <w:t xml:space="preserve"> | địa chỉ hệ của anh |</w:t>
-      </w:r>
-    </w:p>
-    <w:p>
-      <w:pPr>
-        <w:jc w:val="both"/>
-      </w:pPr>
-      <w:r>
-        <w:t xml:space="preserve">| </w:t>
+        <w:t>EPL_ACC_CODE_API</w:t>
+      </w:r>
+      <w:r>
+        <w:t xml:space="preserve"> (hiện là </w:t>
       </w:r>
       <w:r>
         <w:rPr>
           <w:rFonts w:ascii="Consolas" w:hAnsi="Consolas"/>
           <w:sz w:val="19"/>
         </w:rPr>
-        <w:t>qlsx_client_id</w:t>
-      </w:r>
-      <w:r>
-        <w:t xml:space="preserve"> | </w:t>
+        <w:t>https://demo-lao-api.goldensme.com</w:t>
+      </w:r>
+      <w:r>
+        <w:t>).</w:t>
+      </w:r>
+    </w:p>
+    <w:p>
+      <w:pPr>
+        <w:pStyle w:val="ListBullet"/>
+      </w:pPr>
+      <w:r>
+        <w:t xml:space="preserve">Token: </w:t>
       </w:r>
       <w:r>
         <w:rPr>
           <w:rFonts w:ascii="Consolas" w:hAnsi="Consolas"/>
           <w:sz w:val="19"/>
         </w:rPr>
-        <w:t>EPL_QLSX_CLIENT_ID</w:t>
-      </w:r>
-      <w:r>
-        <w:t xml:space="preserve"> | lấy và làm mới access token (câu hỏi 10.1) |</w:t>
-      </w:r>
-    </w:p>
-    <w:p>
-      <w:pPr>
-        <w:jc w:val="both"/>
-      </w:pPr>
-      <w:r>
-        <w:t xml:space="preserve">| </w:t>
+        <w:t>QLSX_ACCESS_TOKEN</w:t>
+      </w:r>
+      <w:r>
+        <w:t xml:space="preserve"> nếu đặt; không thì </w:t>
       </w:r>
       <w:r>
         <w:rPr>
           <w:rFonts w:ascii="Consolas" w:hAnsi="Consolas"/>
           <w:sz w:val="19"/>
         </w:rPr>
-        <w:t>qlsx_client_secret</w:t>
-      </w:r>
-      <w:r>
-        <w:t xml:space="preserve"> | </w:t>
+        <w:t>EPL_ACC_CODE_TOKEN</w:t>
+      </w:r>
+      <w:r>
+        <w:t>.</w:t>
+      </w:r>
+    </w:p>
+    <w:p>
+      <w:pPr>
+        <w:pStyle w:val="ListBullet"/>
+      </w:pPr>
+      <w:r>
+        <w:t xml:space="preserve">Token hiện có là </w:t>
+      </w:r>
+      <w:r>
+        <w:rPr>
+          <w:b/>
+        </w:rPr>
+        <w:t>tài khoản cá nhân `tune`, hết hạn 10/10/2026 09:05 giờ Lào</w:t>
+      </w:r>
+      <w:r>
+        <w:t>. Sau ngày đó danh mục tài khoản rơi về bản chụp, còn tạo SO thì không gửi được (câu hỏi 10.1).</w:t>
+      </w:r>
+    </w:p>
+    <w:p>
+      <w:pPr>
+        <w:pStyle w:val="ListBullet"/>
+      </w:pPr>
+      <w:r>
+        <w:t>Hết giờ 60 giây. Token chỉ nằm ở máy chủ bên em, không xuống trình duyệt.</w:t>
+      </w:r>
+    </w:p>
+    <w:p>
+      <w:pPr>
+        <w:pStyle w:val="Heading2"/>
+      </w:pPr>
+      <w:r>
+        <w:t>2.2. Đề nghị</w:t>
+      </w:r>
+    </w:p>
+    <w:p>
+      <w:pPr>
+        <w:pStyle w:val="ListNumber"/>
+      </w:pPr>
+      <w:r>
+        <w:rPr>
+          <w:b/>
+        </w:rPr>
+        <w:t>Tách địa chỉ theo việc.</w:t>
+      </w:r>
+      <w:r>
+        <w:t xml:space="preserve"> Bên em thêm cấu hình riêng:</w:t>
+      </w:r>
+    </w:p>
+    <w:p>
+      <w:pPr>
+        <w:jc w:val="both"/>
+      </w:pPr>
+      <w:r>
+        <w:t>| Khoá | Env | Dùng cho |</w:t>
+      </w:r>
+    </w:p>
+    <w:p>
+      <w:pPr>
+        <w:jc w:val="both"/>
+      </w:pPr>
+      <w:r>
+        <w:t>|---|---|---|</w:t>
+      </w:r>
+    </w:p>
+    <w:p>
+      <w:pPr>
+        <w:jc w:val="both"/>
+      </w:pPr>
+      <w:r>
+        <w:t xml:space="preserve">| </w:t>
       </w:r>
       <w:r>
         <w:rPr>
           <w:rFonts w:ascii="Consolas" w:hAnsi="Consolas"/>
           <w:sz w:val="19"/>
         </w:rPr>
-        <w:t>EPL_QLSX_CLIENT_SECRET</w:t>
-      </w:r>
-      <w:r>
-        <w:t xml:space="preserve"> | như trên |</w:t>
-      </w:r>
-    </w:p>
-    <w:p>
-      <w:pPr>
-        <w:jc w:val="both"/>
-      </w:pPr>
-      <w:r>
-        <w:t xml:space="preserve">Chiều anh gọi sang bên em thì dùng khoá </w:t>
+        <w:t>qlsx_api</w:t>
+      </w:r>
+      <w:r>
+        <w:t xml:space="preserve"> | </w:t>
       </w:r>
       <w:r>
         <w:rPr>
           <w:rFonts w:ascii="Consolas" w:hAnsi="Consolas"/>
           <w:sz w:val="19"/>
         </w:rPr>
-        <w:t>token_nhan_qlsx</w:t>
-      </w:r>
-      <w:r>
-        <w:t>.</w:t>
-      </w:r>
-    </w:p>
-    <w:p>
-      <w:pPr>
-        <w:pStyle w:val="ListNumber"/>
-      </w:pPr>
-      <w:r>
-        <w:rPr>
-          <w:b/>
-        </w:rPr>
-        <w:t>Danh tính máy có phạm vi.</w:t>
-      </w:r>
-      <w:r>
-        <w:t xml:space="preserve"> Hiện nay các đường LAO cho bên kế toán gọi chỉ kiểm khoá máy và một tên đăng nhập bất kỳ. Tên đó có thể là tài xế.</w:t>
+        <w:t>EPL_QLSX_API</w:t>
+      </w:r>
+      <w:r>
+        <w:t xml:space="preserve"> | địa chỉ hệ của anh |</w:t>
       </w:r>
     </w:p>
     <w:p>
@@ -2444,165 +2639,73 @@
         <w:jc w:val="both"/>
       </w:pPr>
       <w:r>
-        <w:t xml:space="preserve">Bên em sẽ thêm </w:t>
-      </w:r>
-      <w:r>
-        <w:rPr>
-          <w:b/>
-        </w:rPr>
-        <w:t>tài khoản dịch vụ</w:t>
-      </w:r>
-      <w:r>
-        <w:t xml:space="preserve"> </w:t>
+        <w:t xml:space="preserve">| </w:t>
       </w:r>
       <w:r>
         <w:rPr>
           <w:rFonts w:ascii="Consolas" w:hAnsi="Consolas"/>
           <w:sz w:val="19"/>
         </w:rPr>
-        <w:t>qlsx</w:t>
-      </w:r>
-      <w:r>
-        <w:t xml:space="preserve"> với danh sách đường được gọi, rồi kiểm cả hai. </w:t>
+        <w:t>qlsx_client_id</w:t>
+      </w:r>
+      <w:r>
+        <w:t xml:space="preserve"> | </w:t>
       </w:r>
       <w:r>
         <w:rPr>
           <w:rFonts w:ascii="Consolas" w:hAnsi="Consolas"/>
           <w:sz w:val="19"/>
         </w:rPr>
-        <w:t>X-Nguoi-Dung</w:t>
-      </w:r>
-      <w:r>
-        <w:t xml:space="preserve"> khi đó chỉ để ghi vết: ai bên anh bấm.</w:t>
-      </w:r>
-    </w:p>
-    <w:p>
-      <w:pPr>
-        <w:pStyle w:val="ListNumber"/>
-      </w:pPr>
-      <w:r>
-        <w:rPr>
-          <w:b/>
-        </w:rPr>
-        <w:t>Lỗi nghiệp vụ:</w:t>
-      </w:r>
-    </w:p>
-    <w:p>
-      <w:pPr>
-        <w:pStyle w:val="ListBullet2"/>
-      </w:pPr>
-      <w:r>
-        <w:t xml:space="preserve">Thân lỗi dạng </w:t>
+        <w:t>EPL_QLSX_CLIENT_ID</w:t>
+      </w:r>
+      <w:r>
+        <w:t xml:space="preserve"> | lấy và làm mới access token (câu hỏi 10.1) |</w:t>
+      </w:r>
+    </w:p>
+    <w:p>
+      <w:pPr>
+        <w:jc w:val="both"/>
+      </w:pPr>
+      <w:r>
+        <w:t xml:space="preserve">| </w:t>
       </w:r>
       <w:r>
         <w:rPr>
           <w:rFonts w:ascii="Consolas" w:hAnsi="Consolas"/>
           <w:sz w:val="19"/>
         </w:rPr>
-        <w:t>{"code" hoặc "ma", "message" hoặc "loi"}</w:t>
-      </w:r>
-      <w:r>
-        <w:t>, kèm mã HTTP đúng nghĩa.</w:t>
-      </w:r>
-    </w:p>
-    <w:p>
-      <w:pPr>
-        <w:pStyle w:val="ListBullet2"/>
-      </w:pPr>
-      <w:r>
-        <w:t xml:space="preserve">LAO </w:t>
-      </w:r>
-      <w:r>
-        <w:rPr>
-          <w:b/>
-        </w:rPr>
-        <w:t>in nguyên câu lỗi</w:t>
-      </w:r>
-      <w:r>
-        <w:t xml:space="preserve"> lên màn của kế toán bên em, nên xin anh viết câu người đọc hiểu.</w:t>
-      </w:r>
-    </w:p>
-    <w:p>
-      <w:pPr>
-        <w:pStyle w:val="ListBullet2"/>
-      </w:pPr>
-      <w:r>
-        <w:t>Tài liệu SO của anh đã theo đúng cách này.</w:t>
-      </w:r>
-    </w:p>
-    <w:p>
-      <w:pPr>
-        <w:pStyle w:val="ListNumber"/>
-      </w:pPr>
-      <w:r>
-        <w:rPr>
-          <w:b/>
-        </w:rPr>
-        <w:t>Chống trùng:</w:t>
-      </w:r>
-      <w:r>
-        <w:t xml:space="preserve"> mọi lời gọi GHI đều có khoá ổn định (mục 3.1 và 3.2). Gửi lại cùng khoá và cùng nội dung thì trả kết quả cũ.</w:t>
-      </w:r>
-    </w:p>
-    <w:p>
-      <w:pPr>
-        <w:pStyle w:val="Heading2"/>
-      </w:pPr>
-      <w:r>
-        <w:t>2.3. Luật "hai bên không bao giờ lệch số" (phải giữ)</w:t>
-      </w:r>
-    </w:p>
-    <w:p>
-      <w:pPr>
-        <w:jc w:val="both"/>
-      </w:pPr>
-      <w:r>
-        <w:t xml:space="preserve">Mọi thao tác tiền có bản chép sang phiếu bên LAO đều đi đúng thứ tự. Bản tạm làm ở </w:t>
+        <w:t>qlsx_client_secret</w:t>
+      </w:r>
+      <w:r>
+        <w:t xml:space="preserve"> | </w:t>
       </w:r>
       <w:r>
         <w:rPr>
           <w:rFonts w:ascii="Consolas" w:hAnsi="Consolas"/>
           <w:sz w:val="19"/>
         </w:rPr>
-        <w:t>services/doanh_thu.py:chot</w:t>
-      </w:r>
-      <w:r>
-        <w:t>, dòng 112:</w:t>
-      </w:r>
-    </w:p>
-    <w:p>
-      <w:pPr>
-        <w:pStyle w:val="ListNumber"/>
-      </w:pPr>
-      <w:r>
-        <w:t xml:space="preserve">Bên kế toán ghi dòng của mình và sinh chứng từ, </w:t>
-      </w:r>
-      <w:r>
-        <w:rPr>
-          <w:b/>
-        </w:rPr>
-        <w:t>chưa commit</w:t>
-      </w:r>
-      <w:r>
-        <w:t>.</w:t>
-      </w:r>
-    </w:p>
-    <w:p>
-      <w:pPr>
-        <w:pStyle w:val="ListNumber"/>
-      </w:pPr>
-      <w:r>
-        <w:t xml:space="preserve">Bên kế toán gọi đường ghi bên LAO (mục 4). LAO kiểm lại điều kiện với dòng phiếu bị khoá </w:t>
+        <w:t>EPL_QLSX_CLIENT_SECRET</w:t>
+      </w:r>
+      <w:r>
+        <w:t xml:space="preserve"> | như trên |</w:t>
+      </w:r>
+    </w:p>
+    <w:p>
+      <w:pPr>
+        <w:jc w:val="both"/>
+      </w:pPr>
+      <w:r>
+        <w:t xml:space="preserve">Chiều anh gọi sang bên em thì dùng khoá </w:t>
       </w:r>
       <w:r>
         <w:rPr>
           <w:rFonts w:ascii="Consolas" w:hAnsi="Consolas"/>
           <w:sz w:val="19"/>
         </w:rPr>
-        <w:t>FOR UPDATE</w:t>
-      </w:r>
-      <w:r>
-        <w:t>, rồi commit.</w:t>
+        <w:t>token_nhan_qlsx</w:t>
+      </w:r>
+      <w:r>
+        <w:t>.</w:t>
       </w:r>
     </w:p>
     <w:p>
@@ -2610,24 +2713,13 @@
         <w:pStyle w:val="ListNumber"/>
       </w:pPr>
       <w:r>
-        <w:t>Bên kế toán commit.</w:t>
-      </w:r>
-    </w:p>
-    <w:p>
-      <w:pPr>
-        <w:pStyle w:val="ListNumber"/>
-      </w:pPr>
-      <w:r>
-        <w:t xml:space="preserve">Nếu commit ở bước 3 hỏng: rollback, rồi gọi </w:t>
-      </w:r>
-      <w:r>
         <w:rPr>
           <w:b/>
         </w:rPr>
-        <w:t>đường bù</w:t>
-      </w:r>
-      <w:r>
-        <w:t xml:space="preserve"> để đưa bản chép bên LAO về đúng số đang lưu. Bù hỏng thì ghi log.</w:t>
+        <w:t>Danh tính máy có phạm vi.</w:t>
+      </w:r>
+      <w:r>
+        <w:t xml:space="preserve"> Hiện nay các đường LAO cho bên kế toán gọi chỉ kiểm khoá máy và một tên đăng nhập bất kỳ. Tên đó có thể là tài xế.</w:t>
       </w:r>
     </w:p>
     <w:p>
@@ -2635,119 +2727,304 @@
         <w:jc w:val="both"/>
       </w:pPr>
       <w:r>
-        <w:t xml:space="preserve">LAO tắt ở bước 2 thì bên kế toán báo 503 và </w:t>
+        <w:t xml:space="preserve">Bên em sẽ thêm </w:t>
       </w:r>
       <w:r>
         <w:rPr>
           <w:b/>
         </w:rPr>
-        <w:t>không lưu gì</w:t>
-      </w:r>
-      <w:r>
-        <w:t>.</w:t>
-      </w:r>
-    </w:p>
-    <w:p>
-      <w:pPr>
-        <w:jc w:val="both"/>
-      </w:pPr>
-      <w:r>
-        <w:t>---</w:t>
-      </w:r>
-    </w:p>
-    <w:p>
-      <w:pPr>
-        <w:pStyle w:val="Heading1"/>
-      </w:pPr>
-      <w:r>
-        <w:rPr>
-          <w:color w:val="145C4A"/>
-        </w:rPr>
-        <w:t>3. Đường LAO → hệ của anh</w:t>
-      </w:r>
-    </w:p>
-    <w:p>
-      <w:pPr>
-        <w:pStyle w:val="Heading2"/>
-      </w:pPr>
-      <w:r>
-        <w:t>3.1. Đẩy chứng từ — `POST /api/v1/epl-lao/vouchers`</w:t>
-      </w:r>
-    </w:p>
-    <w:p>
-      <w:pPr>
-        <w:jc w:val="both"/>
-      </w:pPr>
-      <w:r>
-        <w:rPr>
-          <w:b/>
-        </w:rPr>
-        <w:t>Hiện trạng.</w:t>
-      </w:r>
-    </w:p>
-    <w:p>
-      <w:pPr>
-        <w:pStyle w:val="ListBullet"/>
-      </w:pPr>
-      <w:r>
-        <w:rPr>
-          <w:b/>
-        </w:rPr>
-        <w:t>Không tự động.</w:t>
-      </w:r>
-      <w:r>
-        <w:t xml:space="preserve"> Mỗi bước nghiệp vụ ghi một tờ vào bảng </w:t>
+        <w:t>tài khoản dịch vụ</w:t>
+      </w:r>
+      <w:r>
+        <w:t xml:space="preserve"> </w:t>
       </w:r>
       <w:r>
         <w:rPr>
           <w:rFonts w:ascii="Consolas" w:hAnsi="Consolas"/>
           <w:sz w:val="19"/>
         </w:rPr>
-        <w:t>chung_tu</w:t>
-      </w:r>
-      <w:r>
-        <w:t xml:space="preserve"> của LAO. Kế toán bên em bấm </w:t>
-      </w:r>
-      <w:r>
-        <w:rPr>
-          <w:b/>
-        </w:rPr>
-        <w:t>Gửi bên công nợ</w:t>
-      </w:r>
-      <w:r>
-        <w:t xml:space="preserve"> để đẩy:</w:t>
-      </w:r>
-    </w:p>
-    <w:p>
-      <w:pPr>
-        <w:jc w:val="both"/>
-      </w:pPr>
-      <w:r>
-        <w:t xml:space="preserve">- </w:t>
+        <w:t>qlsx</w:t>
+      </w:r>
+      <w:r>
+        <w:t xml:space="preserve"> với danh sách đường được gọi, rồi kiểm cả hai. </w:t>
       </w:r>
       <w:r>
         <w:rPr>
           <w:rFonts w:ascii="Consolas" w:hAnsi="Consolas"/>
           <w:sz w:val="19"/>
         </w:rPr>
-        <w:t>POST /api/chung-tu/day</w:t>
-      </w:r>
-      <w:r>
-        <w:t>: tối đa 200 tờ mỗi lượt, tờ cũ trước;</w:t>
-      </w:r>
-    </w:p>
-    <w:p>
-      <w:pPr>
-        <w:jc w:val="both"/>
-      </w:pPr>
-      <w:r>
-        <w:t xml:space="preserve">- </w:t>
+        <w:t>X-Nguoi-Dung</w:t>
+      </w:r>
+      <w:r>
+        <w:t xml:space="preserve"> khi đó chỉ để ghi vết: ai bên anh bấm.</w:t>
+      </w:r>
+    </w:p>
+    <w:p>
+      <w:pPr>
+        <w:pStyle w:val="ListNumber"/>
+      </w:pPr>
+      <w:r>
+        <w:rPr>
+          <w:b/>
+        </w:rPr>
+        <w:t>Lỗi nghiệp vụ:</w:t>
+      </w:r>
+    </w:p>
+    <w:p>
+      <w:pPr>
+        <w:pStyle w:val="ListBullet2"/>
+      </w:pPr>
+      <w:r>
+        <w:t xml:space="preserve">Thân lỗi dạng </w:t>
       </w:r>
       <w:r>
         <w:rPr>
           <w:rFonts w:ascii="Consolas" w:hAnsi="Consolas"/>
           <w:sz w:val="19"/>
         </w:rPr>
+        <w:t>{"code" hoặc "ma", "message" hoặc "loi"}</w:t>
+      </w:r>
+      <w:r>
+        <w:t>, kèm mã HTTP đúng nghĩa.</w:t>
+      </w:r>
+    </w:p>
+    <w:p>
+      <w:pPr>
+        <w:pStyle w:val="ListBullet2"/>
+      </w:pPr>
+      <w:r>
+        <w:t xml:space="preserve">LAO </w:t>
+      </w:r>
+      <w:r>
+        <w:rPr>
+          <w:b/>
+        </w:rPr>
+        <w:t>in nguyên câu lỗi</w:t>
+      </w:r>
+      <w:r>
+        <w:t xml:space="preserve"> lên màn của kế toán bên em, nên xin anh viết câu người đọc hiểu.</w:t>
+      </w:r>
+    </w:p>
+    <w:p>
+      <w:pPr>
+        <w:pStyle w:val="ListBullet2"/>
+      </w:pPr>
+      <w:r>
+        <w:t>Tài liệu SO của anh đã theo đúng cách này.</w:t>
+      </w:r>
+    </w:p>
+    <w:p>
+      <w:pPr>
+        <w:pStyle w:val="ListNumber"/>
+      </w:pPr>
+      <w:r>
+        <w:rPr>
+          <w:b/>
+        </w:rPr>
+        <w:t>Chống trùng:</w:t>
+      </w:r>
+      <w:r>
+        <w:t xml:space="preserve"> mọi lời gọi GHI đều có khoá ổn định (mục 3.1 và 3.2). Gửi lại cùng khoá và cùng nội dung thì trả kết quả cũ.</w:t>
+      </w:r>
+    </w:p>
+    <w:p>
+      <w:pPr>
+        <w:pStyle w:val="Heading2"/>
+      </w:pPr>
+      <w:r>
+        <w:t>2.3. Luật "hai bên không bao giờ lệch số" (phải giữ)</w:t>
+      </w:r>
+    </w:p>
+    <w:p>
+      <w:pPr>
+        <w:jc w:val="both"/>
+      </w:pPr>
+      <w:r>
+        <w:t xml:space="preserve">Mọi thao tác tiền có bản chép sang phiếu bên LAO đều đi đúng thứ tự. Bản tạm làm ở </w:t>
+      </w:r>
+      <w:r>
+        <w:rPr>
+          <w:rFonts w:ascii="Consolas" w:hAnsi="Consolas"/>
+          <w:sz w:val="19"/>
+        </w:rPr>
+        <w:t>services/doanh_thu.py:chot</w:t>
+      </w:r>
+      <w:r>
+        <w:t>, dòng 112:</w:t>
+      </w:r>
+    </w:p>
+    <w:p>
+      <w:pPr>
+        <w:pStyle w:val="ListNumber"/>
+      </w:pPr>
+      <w:r>
+        <w:t xml:space="preserve">Bên kế toán ghi dòng của mình và sinh chứng từ, </w:t>
+      </w:r>
+      <w:r>
+        <w:rPr>
+          <w:b/>
+        </w:rPr>
+        <w:t>chưa commit</w:t>
+      </w:r>
+      <w:r>
+        <w:t>.</w:t>
+      </w:r>
+    </w:p>
+    <w:p>
+      <w:pPr>
+        <w:pStyle w:val="ListNumber"/>
+      </w:pPr>
+      <w:r>
+        <w:t xml:space="preserve">Bên kế toán gọi đường ghi bên LAO (mục 4). LAO kiểm lại điều kiện với dòng phiếu bị khoá </w:t>
+      </w:r>
+      <w:r>
+        <w:rPr>
+          <w:rFonts w:ascii="Consolas" w:hAnsi="Consolas"/>
+          <w:sz w:val="19"/>
+        </w:rPr>
+        <w:t>FOR UPDATE</w:t>
+      </w:r>
+      <w:r>
+        <w:t>, rồi commit.</w:t>
+      </w:r>
+    </w:p>
+    <w:p>
+      <w:pPr>
+        <w:pStyle w:val="ListNumber"/>
+      </w:pPr>
+      <w:r>
+        <w:t>Bên kế toán commit.</w:t>
+      </w:r>
+    </w:p>
+    <w:p>
+      <w:pPr>
+        <w:pStyle w:val="ListNumber"/>
+      </w:pPr>
+      <w:r>
+        <w:t xml:space="preserve">Nếu commit ở bước 3 hỏng: rollback, rồi gọi </w:t>
+      </w:r>
+      <w:r>
+        <w:rPr>
+          <w:b/>
+        </w:rPr>
+        <w:t>đường bù</w:t>
+      </w:r>
+      <w:r>
+        <w:t xml:space="preserve"> để đưa bản chép bên LAO về đúng số đang lưu. Bù hỏng thì ghi log.</w:t>
+      </w:r>
+    </w:p>
+    <w:p>
+      <w:pPr>
+        <w:jc w:val="both"/>
+      </w:pPr>
+      <w:r>
+        <w:t xml:space="preserve">LAO tắt ở bước 2 thì bên kế toán báo 503 và </w:t>
+      </w:r>
+      <w:r>
+        <w:rPr>
+          <w:b/>
+        </w:rPr>
+        <w:t>không lưu gì</w:t>
+      </w:r>
+      <w:r>
+        <w:t>.</w:t>
+      </w:r>
+    </w:p>
+    <w:p>
+      <w:pPr>
+        <w:jc w:val="both"/>
+      </w:pPr>
+      <w:r>
+        <w:t>---</w:t>
+      </w:r>
+    </w:p>
+    <w:p>
+      <w:pPr>
+        <w:pStyle w:val="Heading1"/>
+      </w:pPr>
+      <w:r>
+        <w:rPr>
+          <w:color w:val="145C4A"/>
+        </w:rPr>
+        <w:t>3. Đường LAO → hệ của anh</w:t>
+      </w:r>
+    </w:p>
+    <w:p>
+      <w:pPr>
+        <w:pStyle w:val="Heading2"/>
+      </w:pPr>
+      <w:r>
+        <w:t>3.1. Đẩy chứng từ — `POST /api/v1/epl-lao/vouchers`</w:t>
+      </w:r>
+    </w:p>
+    <w:p>
+      <w:pPr>
+        <w:jc w:val="both"/>
+      </w:pPr>
+      <w:r>
+        <w:rPr>
+          <w:b/>
+        </w:rPr>
+        <w:t>Hiện trạng.</w:t>
+      </w:r>
+    </w:p>
+    <w:p>
+      <w:pPr>
+        <w:pStyle w:val="ListBullet"/>
+      </w:pPr>
+      <w:r>
+        <w:rPr>
+          <w:b/>
+        </w:rPr>
+        <w:t>Không tự động.</w:t>
+      </w:r>
+      <w:r>
+        <w:t xml:space="preserve"> Mỗi bước nghiệp vụ ghi một tờ vào bảng </w:t>
+      </w:r>
+      <w:r>
+        <w:rPr>
+          <w:rFonts w:ascii="Consolas" w:hAnsi="Consolas"/>
+          <w:sz w:val="19"/>
+        </w:rPr>
+        <w:t>chung_tu</w:t>
+      </w:r>
+      <w:r>
+        <w:t xml:space="preserve"> của LAO. Kế toán bên em bấm </w:t>
+      </w:r>
+      <w:r>
+        <w:rPr>
+          <w:b/>
+        </w:rPr>
+        <w:t>Gửi bên công nợ</w:t>
+      </w:r>
+      <w:r>
+        <w:t xml:space="preserve"> để đẩy:</w:t>
+      </w:r>
+    </w:p>
+    <w:p>
+      <w:pPr>
+        <w:pStyle w:val="ListBullet2"/>
+      </w:pPr>
+      <w:r>
+        <w:rPr>
+          <w:rFonts w:ascii="Consolas" w:hAnsi="Consolas"/>
+          <w:sz w:val="19"/>
+        </w:rPr>
+        <w:t>POST /api/chung-tu/day</w:t>
+      </w:r>
+      <w:r>
+        <w:t>: tối đa 200 tờ mỗi lượt, tờ cũ trước;</w:t>
+      </w:r>
+    </w:p>
+    <w:p>
+      <w:pPr>
+        <w:pStyle w:val="ListBullet2"/>
+      </w:pPr>
+      <w:r>
+        <w:rPr>
+          <w:rFonts w:ascii="Consolas" w:hAnsi="Consolas"/>
+          <w:sz w:val="19"/>
+        </w:rPr>
         <w:t>POST /api/chung-tu/{cid}/day</w:t>
       </w:r>
       <w:r>
@@ -2769,6 +3046,58 @@
       </w:r>
       <w:r>
         <w:t>.</w:t>
+      </w:r>
+    </w:p>
+    <w:p>
+      <w:pPr>
+        <w:pStyle w:val="ListBullet"/>
+      </w:pPr>
+      <w:r>
+        <w:rPr>
+          <w:b/>
+        </w:rPr>
+        <w:t>Đích hiện nay là KT tạm</w:t>
+      </w:r>
+      <w:r>
+        <w:t xml:space="preserve"> (</w:t>
+      </w:r>
+      <w:r>
+        <w:rPr>
+          <w:rFonts w:ascii="Consolas" w:hAnsi="Consolas"/>
+          <w:sz w:val="19"/>
+        </w:rPr>
+        <w:t>ke_toan_api</w:t>
+      </w:r>
+      <w:r>
+        <w:t xml:space="preserve"> trỏ vào EPL_KETOAN). </w:t>
+      </w:r>
+      <w:r>
+        <w:rPr>
+          <w:b/>
+        </w:rPr>
+        <w:t>Hệ anh chưa có</w:t>
+      </w:r>
+      <w:r>
+        <w:t xml:space="preserve"> </w:t>
+      </w:r>
+      <w:r>
+        <w:rPr>
+          <w:rFonts w:ascii="Consolas" w:hAnsi="Consolas"/>
+          <w:sz w:val="19"/>
+        </w:rPr>
+        <w:t>/api/v1/epl-lao/vouchers</w:t>
+      </w:r>
+      <w:r>
+        <w:t xml:space="preserve">, nên </w:t>
+      </w:r>
+      <w:r>
+        <w:rPr>
+          <w:b/>
+        </w:rPr>
+        <w:t>chưa tờ nào đi sang hệ anh bằng phong bì này</w:t>
+      </w:r>
+      <w:r>
+        <w:t>. Riêng đề nghị thu đã đi thẳng sang SO của anh (mục 3.2). Anh chọn cách nhận các tờ còn lại ở câu hỏi 10.13.</w:t>
       </w:r>
     </w:p>
     <w:p>
@@ -4747,10 +5076,10 @@
     </w:p>
     <w:p>
       <w:pPr>
-        <w:jc w:val="both"/>
-      </w:pPr>
-      <w:r>
-        <w:t xml:space="preserve">- phiếu đã xuất hoá đơn thì 409 </w:t>
+        <w:pStyle w:val="ListBullet2"/>
+      </w:pPr>
+      <w:r>
+        <w:t xml:space="preserve">phiếu đã xuất hoá đơn thì 409 </w:t>
       </w:r>
       <w:r>
         <w:rPr>
@@ -4765,10 +5094,10 @@
     </w:p>
     <w:p>
       <w:pPr>
-        <w:jc w:val="both"/>
-      </w:pPr>
-      <w:r>
-        <w:t xml:space="preserve">- PDT đã gửi thì 409 </w:t>
+        <w:pStyle w:val="ListBullet2"/>
+      </w:pPr>
+      <w:r>
+        <w:t xml:space="preserve">PDT đã gửi thì 409 </w:t>
       </w:r>
       <w:r>
         <w:rPr>
@@ -5029,7 +5358,7 @@
           <w:p>
             <w:r/>
             <w:r>
-              <w:t>bên em sẽ dựng gói riêng cho PDT (không dùng phong bì 3.1)</w:t>
+              <w:t>gói riêng cho PDT, dựng từ gói bàn giao DO (không dùng phong bì 3.1)</w:t>
             </w:r>
           </w:p>
         </w:tc>
@@ -5040,7 +5369,10 @@
           <w:p>
             <w:r/>
             <w:r>
-              <w:t>bên em làm</w:t>
+              <w:rPr>
+                <w:b/>
+              </w:rPr>
+              <w:t>đã làm 01/10</w:t>
             </w:r>
           </w:p>
         </w:tc>
@@ -5235,33 +5567,52 @@
           <w:p>
             <w:r/>
             <w:r>
+              <w:t xml:space="preserve">ô </w:t>
+            </w:r>
+            <w:r>
               <w:rPr>
                 <w:b/>
               </w:rPr>
-              <w:t>chưa có</w:t>
-            </w:r>
-            <w:r>
-              <w:t xml:space="preserve">: danh mục khách bên em chỉ có mã nội bộ. Bên em thêm ô </w:t>
-            </w:r>
+              <w:t>"Mã khách (bên kế toán)"</w:t>
+            </w:r>
+            <w:r>
+              <w:t xml:space="preserve"> trên danh mục khách (có từ 30/09; chỉ </w:t>
+            </w:r>
+            <w:r>
+              <w:rPr>
+                <w:rFonts w:ascii="Consolas" w:hAnsi="Consolas"/>
+                <w:sz w:val="19"/>
+              </w:rPr>
+              <w:t>acct</w:t>
+            </w:r>
+            <w:r>
+              <w:t xml:space="preserve"> và Sếp gán). Thiếu thì chặn gửi và báo rõ</w:t>
+            </w:r>
+          </w:p>
+        </w:tc>
+        <w:tc>
+          <w:tcPr>
+            <w:tcW w:type="dxa" w:w="2160"/>
+          </w:tcPr>
+          <w:p>
+            <w:r/>
             <w:r>
               <w:rPr>
                 <w:b/>
               </w:rPr>
-              <w:t>"Mã khách bên kế toán"</w:t>
-            </w:r>
-            <w:r>
-              <w:t xml:space="preserve"> vào danh mục khách, bắt buộc có trước khi gửi</w:t>
-            </w:r>
-          </w:p>
-        </w:tc>
-        <w:tc>
-          <w:tcPr>
-            <w:tcW w:type="dxa" w:w="2160"/>
-          </w:tcPr>
-          <w:p>
-            <w:r/>
-            <w:r>
-              <w:t>bên em làm; anh cho danh sách mã</w:t>
+              <w:t>đã làm</w:t>
+            </w:r>
+            <w:r>
+              <w:t xml:space="preserve">; </w:t>
+            </w:r>
+            <w:r>
+              <w:rPr>
+                <w:b/>
+              </w:rPr>
+              <w:t>chờ anh tạo khách EPL Lào</w:t>
+            </w:r>
+            <w:r>
+              <w:t xml:space="preserve"> (3.2.1)</w:t>
             </w:r>
           </w:p>
         </w:tc>
@@ -5348,7 +5699,10 @@
           <w:p>
             <w:r/>
             <w:r>
-              <w:t>bên em làm</w:t>
+              <w:rPr>
+                <w:b/>
+              </w:rPr>
+              <w:t>đã làm</w:t>
             </w:r>
           </w:p>
         </w:tc>
@@ -5515,13 +5869,13 @@
           <w:p>
             <w:r/>
             <w:r>
-              <w:t xml:space="preserve">bên em </w:t>
-            </w:r>
-            <w:r>
               <w:rPr>
                 <w:b/>
               </w:rPr>
-              <w:t>chặn gửi khi doanh thu = 0</w:t>
+              <w:t>đã làm</w:t>
+            </w:r>
+            <w:r>
+              <w:t>: chặn khi ≤ 0,01; tổng khớp bằng Decimal</w:t>
             </w:r>
           </w:p>
         </w:tc>
@@ -5909,7 +6263,17 @@
               <w:t>lưu nguyên gói đã gửi</w:t>
             </w:r>
             <w:r>
-              <w:t xml:space="preserve"> để thử lại đúng gói</w:t>
+              <w:t xml:space="preserve"> (bảng </w:t>
+            </w:r>
+            <w:r>
+              <w:rPr>
+                <w:rFonts w:ascii="Consolas" w:hAnsi="Consolas"/>
+                <w:sz w:val="19"/>
+              </w:rPr>
+              <w:t>gui_so_tune</w:t>
+            </w:r>
+            <w:r>
+              <w:t>) để thử lại đúng gói</w:t>
             </w:r>
           </w:p>
         </w:tc>
@@ -5920,7 +6284,10 @@
           <w:p>
             <w:r/>
             <w:r>
-              <w:t>bên em làm</w:t>
+              <w:rPr>
+                <w:b/>
+              </w:rPr>
+              <w:t>đã làm</w:t>
             </w:r>
           </w:p>
         </w:tc>
@@ -5959,7 +6326,27 @@
           <w:p>
             <w:r/>
             <w:r>
-              <w:t>cần cơ chế lấy token (câu hỏi 10.1)</w:t>
+              <w:t xml:space="preserve">tạm dùng </w:t>
+            </w:r>
+            <w:r>
+              <w:rPr>
+                <w:rFonts w:ascii="Consolas" w:hAnsi="Consolas"/>
+                <w:sz w:val="19"/>
+              </w:rPr>
+              <w:t>EPL_ACC_CODE_TOKEN</w:t>
+            </w:r>
+            <w:r>
+              <w:t xml:space="preserve"> (tài khoản </w:t>
+            </w:r>
+            <w:r>
+              <w:rPr>
+                <w:rFonts w:ascii="Consolas" w:hAnsi="Consolas"/>
+                <w:sz w:val="19"/>
+              </w:rPr>
+              <w:t>tune</w:t>
+            </w:r>
+            <w:r>
+              <w:t>, hết hạn 10/10/2026) — đã qua cửa xác thực khi gửi thử</w:t>
             </w:r>
           </w:p>
         </w:tc>
@@ -5970,7 +6357,13 @@
           <w:p>
             <w:r/>
             <w:r>
-              <w:t>chờ anh</w:t>
+              <w:rPr>
+                <w:b/>
+              </w:rPr>
+              <w:t>chờ tài khoản dịch vụ</w:t>
+            </w:r>
+            <w:r>
+              <w:t xml:space="preserve"> (câu hỏi 10.1)</w:t>
             </w:r>
           </w:p>
         </w:tc>
@@ -6447,10 +6840,10 @@
     <w:p/>
     <w:p>
       <w:pPr>
-        <w:jc w:val="both"/>
-      </w:pPr>
-      <w:r>
-        <w:t>#### 3.2.1. Đã dựng và gửi thử (01/10/2026)</w:t>
+        <w:pStyle w:val="Heading3"/>
+      </w:pPr>
+      <w:r>
+        <w:t>3.2.1. Đã dựng và gửi thử (01/10/2026)</w:t>
       </w:r>
     </w:p>
     <w:p>
@@ -6530,11 +6923,8 @@
     </w:p>
     <w:p>
       <w:pPr>
-        <w:jc w:val="both"/>
-      </w:pPr>
-      <w:r>
-        <w:t xml:space="preserve">- </w:t>
-      </w:r>
+        <w:pStyle w:val="ListBullet2"/>
+      </w:pPr>
       <w:r>
         <w:rPr>
           <w:rFonts w:ascii="Consolas" w:hAnsi="Consolas"/>
@@ -6567,11 +6957,8 @@
     </w:p>
     <w:p>
       <w:pPr>
-        <w:jc w:val="both"/>
-      </w:pPr>
-      <w:r>
-        <w:t xml:space="preserve">- </w:t>
-      </w:r>
+        <w:pStyle w:val="ListBullet2"/>
+      </w:pPr>
       <w:r>
         <w:rPr>
           <w:rFonts w:ascii="Consolas" w:hAnsi="Consolas"/>
@@ -6631,10 +7018,10 @@
     </w:p>
     <w:p>
       <w:pPr>
-        <w:jc w:val="both"/>
-      </w:pPr>
-      <w:r>
-        <w:t xml:space="preserve">- ba khoá gốc </w:t>
+        <w:pStyle w:val="ListBullet2"/>
+      </w:pPr>
+      <w:r>
+        <w:t xml:space="preserve">ba khoá gốc </w:t>
       </w:r>
       <w:r>
         <w:rPr>
@@ -6669,11 +7056,8 @@
     </w:p>
     <w:p>
       <w:pPr>
-        <w:jc w:val="both"/>
-      </w:pPr>
-      <w:r>
-        <w:t xml:space="preserve">- </w:t>
-      </w:r>
+        <w:pStyle w:val="ListBullet2"/>
+      </w:pPr>
       <w:r>
         <w:rPr>
           <w:rFonts w:ascii="Consolas" w:hAnsi="Consolas"/>
@@ -6696,11 +7080,8 @@
     </w:p>
     <w:p>
       <w:pPr>
-        <w:jc w:val="both"/>
-      </w:pPr>
-      <w:r>
-        <w:t xml:space="preserve">- </w:t>
-      </w:r>
+        <w:pStyle w:val="ListBullet2"/>
+      </w:pPr>
       <w:r>
         <w:rPr>
           <w:b/>
@@ -6713,10 +7094,10 @@
     </w:p>
     <w:p>
       <w:pPr>
-        <w:jc w:val="both"/>
-      </w:pPr>
-      <w:r>
-        <w:t xml:space="preserve">- không gửi các khối </w:t>
+        <w:pStyle w:val="ListBullet2"/>
+      </w:pPr>
+      <w:r>
+        <w:t xml:space="preserve">không gửi các khối </w:t>
       </w:r>
       <w:r>
         <w:rPr>
@@ -6759,34 +7140,34 @@
     </w:p>
     <w:p>
       <w:pPr>
-        <w:jc w:val="both"/>
-      </w:pPr>
-      <w:r>
-        <w:t>- DO đã về và đã khoá;</w:t>
-      </w:r>
-    </w:p>
-    <w:p>
-      <w:pPr>
-        <w:jc w:val="both"/>
-      </w:pPr>
-      <w:r>
-        <w:t>- khách đã có mã;</w:t>
-      </w:r>
-    </w:p>
-    <w:p>
-      <w:pPr>
-        <w:jc w:val="both"/>
-      </w:pPr>
-      <w:r>
-        <w:t>- có tuyến;</w:t>
-      </w:r>
-    </w:p>
-    <w:p>
-      <w:pPr>
-        <w:jc w:val="both"/>
-      </w:pPr>
-      <w:r>
-        <w:t xml:space="preserve">- mã ghép </w:t>
+        <w:pStyle w:val="ListBullet2"/>
+      </w:pPr>
+      <w:r>
+        <w:t>DO đã về và đã khoá;</w:t>
+      </w:r>
+    </w:p>
+    <w:p>
+      <w:pPr>
+        <w:pStyle w:val="ListBullet2"/>
+      </w:pPr>
+      <w:r>
+        <w:t>khách đã có mã;</w:t>
+      </w:r>
+    </w:p>
+    <w:p>
+      <w:pPr>
+        <w:pStyle w:val="ListBullet2"/>
+      </w:pPr>
+      <w:r>
+        <w:t>có tuyến;</w:t>
+      </w:r>
+    </w:p>
+    <w:p>
+      <w:pPr>
+        <w:pStyle w:val="ListBullet2"/>
+      </w:pPr>
+      <w:r>
+        <w:t xml:space="preserve">mã ghép </w:t>
       </w:r>
       <w:r>
         <w:rPr>
@@ -6801,18 +7182,18 @@
     </w:p>
     <w:p>
       <w:pPr>
-        <w:jc w:val="both"/>
-      </w:pPr>
-      <w:r>
-        <w:t>- tiền là VND / LAK / USD;</w:t>
-      </w:r>
-    </w:p>
-    <w:p>
-      <w:pPr>
-        <w:jc w:val="both"/>
-      </w:pPr>
-      <w:r>
-        <w:t>- tổng khớp chính xác bằng Decimal.</w:t>
+        <w:pStyle w:val="ListBullet2"/>
+      </w:pPr>
+      <w:r>
+        <w:t>tiền là VND / LAK / USD;</w:t>
+      </w:r>
+    </w:p>
+    <w:p>
+      <w:pPr>
+        <w:pStyle w:val="ListBullet2"/>
+      </w:pPr>
+      <w:r>
+        <w:t>tổng khớp chính xác bằng Decimal.</w:t>
       </w:r>
     </w:p>
     <w:p>
@@ -6844,10 +7225,10 @@
     </w:p>
     <w:p>
       <w:pPr>
-        <w:jc w:val="both"/>
-      </w:pPr>
-      <w:r>
-        <w:t xml:space="preserve">- nguyên gói đã gửi, khoá </w:t>
+        <w:pStyle w:val="ListBullet2"/>
+      </w:pPr>
+      <w:r>
+        <w:t xml:space="preserve">nguyên gói đã gửi, khoá </w:t>
       </w:r>
       <w:r>
         <w:rPr>
@@ -6862,19 +7243,16 @@
     </w:p>
     <w:p>
       <w:pPr>
-        <w:jc w:val="both"/>
-      </w:pPr>
-      <w:r>
-        <w:t>- mã HTTP và thân trả về;</w:t>
-      </w:r>
-    </w:p>
-    <w:p>
-      <w:pPr>
-        <w:jc w:val="both"/>
-      </w:pPr>
-      <w:r>
-        <w:t xml:space="preserve">- </w:t>
-      </w:r>
+        <w:pStyle w:val="ListBullet2"/>
+      </w:pPr>
+      <w:r>
+        <w:t>mã HTTP và thân trả về;</w:t>
+      </w:r>
+    </w:p>
+    <w:p>
+      <w:pPr>
+        <w:pStyle w:val="ListBullet2"/>
+      </w:pPr>
       <w:r>
         <w:rPr>
           <w:rFonts w:ascii="Consolas" w:hAnsi="Consolas"/>
@@ -7977,11 +8355,8 @@
     </w:p>
     <w:p>
       <w:pPr>
-        <w:jc w:val="both"/>
-      </w:pPr>
-      <w:r>
-        <w:t xml:space="preserve">- </w:t>
-      </w:r>
+        <w:pStyle w:val="ListBullet2"/>
+      </w:pPr>
       <w:r>
         <w:rPr>
           <w:b/>
@@ -7994,11 +8369,8 @@
     </w:p>
     <w:p>
       <w:pPr>
-        <w:jc w:val="both"/>
-      </w:pPr>
-      <w:r>
-        <w:t xml:space="preserve">- </w:t>
-      </w:r>
+        <w:pStyle w:val="ListBullet2"/>
+      </w:pPr>
       <w:r>
         <w:rPr>
           <w:b/>
@@ -8377,10 +8749,10 @@
     </w:p>
     <w:p>
       <w:pPr>
-        <w:jc w:val="both"/>
-      </w:pPr>
-      <w:r>
-        <w:t>1. Khoá dòng các phiếu (</w:t>
+        <w:pStyle w:val="ListNumber2"/>
+      </w:pPr>
+      <w:r>
+        <w:t>Khoá dòng các phiếu (</w:t>
       </w:r>
       <w:r>
         <w:rPr>
@@ -8395,10 +8767,10 @@
     </w:p>
     <w:p>
       <w:pPr>
-        <w:jc w:val="both"/>
-      </w:pPr>
-      <w:r>
-        <w:t xml:space="preserve">2. Kiểm lại </w:t>
+        <w:pStyle w:val="ListNumber2"/>
+      </w:pPr>
+      <w:r>
+        <w:t xml:space="preserve">Kiểm lại </w:t>
       </w:r>
       <w:r>
         <w:rPr>
@@ -8412,10 +8784,10 @@
     </w:p>
     <w:p>
       <w:pPr>
-        <w:jc w:val="both"/>
-      </w:pPr>
-      <w:r>
-        <w:t xml:space="preserve">3. Đặt </w:t>
+        <w:pStyle w:val="ListNumber2"/>
+      </w:pPr>
+      <w:r>
+        <w:t xml:space="preserve">Đặt </w:t>
       </w:r>
       <w:r>
         <w:rPr>
@@ -8485,10 +8857,10 @@
     </w:p>
     <w:p>
       <w:pPr>
-        <w:jc w:val="both"/>
-      </w:pPr>
-      <w:r>
-        <w:t xml:space="preserve">- 422 </w:t>
+        <w:pStyle w:val="ListBullet2"/>
+      </w:pPr>
+      <w:r>
+        <w:t xml:space="preserve">422 </w:t>
       </w:r>
       <w:r>
         <w:rPr>
@@ -8513,10 +8885,10 @@
     </w:p>
     <w:p>
       <w:pPr>
-        <w:jc w:val="both"/>
-      </w:pPr>
-      <w:r>
-        <w:t xml:space="preserve">- 404 </w:t>
+        <w:pStyle w:val="ListBullet2"/>
+      </w:pPr>
+      <w:r>
+        <w:t xml:space="preserve">404 </w:t>
       </w:r>
       <w:r>
         <w:rPr>
@@ -8531,10 +8903,10 @@
     </w:p>
     <w:p>
       <w:pPr>
-        <w:jc w:val="both"/>
-      </w:pPr>
-      <w:r>
-        <w:t xml:space="preserve">- 409 (kèm </w:t>
+        <w:pStyle w:val="ListBullet2"/>
+      </w:pPr>
+      <w:r>
+        <w:t xml:space="preserve">409 (kèm </w:t>
       </w:r>
       <w:r>
         <w:rPr>
@@ -9160,10 +9532,10 @@
     </w:p>
     <w:p>
       <w:pPr>
-        <w:jc w:val="both"/>
-      </w:pPr>
-      <w:r>
-        <w:t>- Nếu có: bên em chỉ gửi đề nghị tạm ứng (</w:t>
+        <w:pStyle w:val="ListBullet2"/>
+      </w:pPr>
+      <w:r>
+        <w:t>Nếu có: bên em chỉ gửi đề nghị tạm ứng (</w:t>
       </w:r>
       <w:r>
         <w:rPr>
@@ -9178,10 +9550,10 @@
     </w:p>
     <w:p>
       <w:pPr>
-        <w:jc w:val="both"/>
-      </w:pPr>
-      <w:r>
-        <w:t>- Nếu không: giữ như hiện nay.</w:t>
+        <w:pStyle w:val="ListBullet2"/>
+      </w:pPr>
+      <w:r>
+        <w:t>Nếu không: giữ như hiện nay.</w:t>
       </w:r>
     </w:p>
     <w:p>
@@ -11379,10 +11751,10 @@
     </w:p>
     <w:p>
       <w:pPr>
-        <w:jc w:val="both"/>
-      </w:pPr>
-      <w:r>
-        <w:t xml:space="preserve">- Cước tính theo </w:t>
+        <w:pStyle w:val="ListBullet2"/>
+      </w:pPr>
+      <w:r>
+        <w:t xml:space="preserve">Cước tính theo </w:t>
       </w:r>
       <w:r>
         <w:rPr>
@@ -11397,10 +11769,10 @@
     </w:p>
     <w:p>
       <w:pPr>
-        <w:jc w:val="both"/>
-      </w:pPr>
-      <w:r>
-        <w:t xml:space="preserve">- Tiền thuê chủ xe tính theo </w:t>
+        <w:pStyle w:val="ListBullet2"/>
+      </w:pPr>
+      <w:r>
+        <w:t xml:space="preserve">Tiền thuê chủ xe tính theo </w:t>
       </w:r>
       <w:r>
         <w:rPr>
@@ -11415,10 +11787,10 @@
     </w:p>
     <w:p>
       <w:pPr>
-        <w:jc w:val="both"/>
-      </w:pPr>
-      <w:r>
-        <w:t xml:space="preserve">- Mỗi dòng chi mang </w:t>
+        <w:pStyle w:val="ListBullet2"/>
+      </w:pPr>
+      <w:r>
+        <w:t xml:space="preserve">Mỗi dòng chi mang </w:t>
       </w:r>
       <w:r>
         <w:rPr>
@@ -11497,11 +11869,8 @@
     </w:p>
     <w:p>
       <w:pPr>
-        <w:jc w:val="both"/>
-      </w:pPr>
-      <w:r>
-        <w:t xml:space="preserve">- </w:t>
-      </w:r>
+        <w:pStyle w:val="ListBullet2"/>
+      </w:pPr>
       <w:r>
         <w:rPr>
           <w:rFonts w:ascii="Consolas" w:hAnsi="Consolas"/>
@@ -11515,11 +11884,8 @@
     </w:p>
     <w:p>
       <w:pPr>
-        <w:jc w:val="both"/>
-      </w:pPr>
-      <w:r>
-        <w:t xml:space="preserve">- </w:t>
-      </w:r>
+        <w:pStyle w:val="ListBullet2"/>
+      </w:pPr>
       <w:r>
         <w:rPr>
           <w:rFonts w:ascii="Consolas" w:hAnsi="Consolas"/>
@@ -12234,34 +12600,34 @@
     </w:p>
     <w:p>
       <w:pPr>
-        <w:jc w:val="both"/>
-      </w:pPr>
-      <w:r>
-        <w:t>- EPL ứng, không lấy kho;</w:t>
-      </w:r>
-    </w:p>
-    <w:p>
-      <w:pPr>
-        <w:jc w:val="both"/>
-      </w:pPr>
-      <w:r>
-        <w:t>- thuộc mục III, IV hoặc VI;</w:t>
-      </w:r>
-    </w:p>
-    <w:p>
-      <w:pPr>
-        <w:jc w:val="both"/>
-      </w:pPr>
-      <w:r>
-        <w:t>- không ghi nợ trạm, không trừ thẻ cao tốc;</w:t>
-      </w:r>
-    </w:p>
-    <w:p>
-      <w:pPr>
-        <w:jc w:val="both"/>
-      </w:pPr>
-      <w:r>
-        <w:t xml:space="preserve">- với mục IV và VI: cách trả là </w:t>
+        <w:pStyle w:val="ListBullet2"/>
+      </w:pPr>
+      <w:r>
+        <w:t>EPL ứng, không lấy kho;</w:t>
+      </w:r>
+    </w:p>
+    <w:p>
+      <w:pPr>
+        <w:pStyle w:val="ListBullet2"/>
+      </w:pPr>
+      <w:r>
+        <w:t>thuộc mục III, IV hoặc VI;</w:t>
+      </w:r>
+    </w:p>
+    <w:p>
+      <w:pPr>
+        <w:pStyle w:val="ListBullet2"/>
+      </w:pPr>
+      <w:r>
+        <w:t>không ghi nợ trạm, không trừ thẻ cao tốc;</w:t>
+      </w:r>
+    </w:p>
+    <w:p>
+      <w:pPr>
+        <w:pStyle w:val="ListBullet2"/>
+      </w:pPr>
+      <w:r>
+        <w:t xml:space="preserve">với mục IV và VI: cách trả là </w:t>
       </w:r>
       <w:r>
         <w:rPr>
@@ -12298,10 +12664,10 @@
     </w:p>
     <w:p>
       <w:pPr>
-        <w:jc w:val="both"/>
-      </w:pPr>
-      <w:r>
-        <w:t xml:space="preserve">- quỹ chi → </w:t>
+        <w:pStyle w:val="ListBullet2"/>
+      </w:pPr>
+      <w:r>
+        <w:t xml:space="preserve">quỹ chi → </w:t>
       </w:r>
       <w:r>
         <w:rPr>
@@ -12325,10 +12691,10 @@
     </w:p>
     <w:p>
       <w:pPr>
-        <w:jc w:val="both"/>
-      </w:pPr>
-      <w:r>
-        <w:t xml:space="preserve">- cuối tháng tất toán → </w:t>
+        <w:pStyle w:val="ListBullet2"/>
+      </w:pPr>
+      <w:r>
+        <w:t xml:space="preserve">cuối tháng tất toán → </w:t>
       </w:r>
       <w:r>
         <w:rPr>
@@ -12370,10 +12736,10 @@
     </w:p>
     <w:p>
       <w:pPr>
-        <w:jc w:val="both"/>
-      </w:pPr>
-      <w:r>
-        <w:t xml:space="preserve">- chi thật &gt; ứng → </w:t>
+        <w:pStyle w:val="ListBullet2"/>
+      </w:pPr>
+      <w:r>
+        <w:t xml:space="preserve">chi thật &gt; ứng → </w:t>
       </w:r>
       <w:r>
         <w:rPr>
@@ -12388,10 +12754,10 @@
     </w:p>
     <w:p>
       <w:pPr>
-        <w:jc w:val="both"/>
-      </w:pPr>
-      <w:r>
-        <w:t xml:space="preserve">- chi thật &lt; ứng → </w:t>
+        <w:pStyle w:val="ListBullet2"/>
+      </w:pPr>
+      <w:r>
+        <w:t xml:space="preserve">chi thật &lt; ứng → </w:t>
       </w:r>
       <w:r>
         <w:rPr>
@@ -12499,52 +12865,78 @@
         <w:jc w:val="both"/>
       </w:pPr>
       <w:r>
-        <w:t>Xem mục 3.2. Chỉ gửi khi đủ bốn điều kiện: phiếu đã khoá, mục II đã kiểm, doanh thu &gt; 0, và khách đã có mã bên kế toán.</w:t>
-      </w:r>
-    </w:p>
-    <w:p>
-      <w:pPr>
-        <w:pStyle w:val="Heading2"/>
-      </w:pPr>
-      <w:r>
-        <w:t>6.5. Hoá đơn gộp tháng</w:t>
-      </w:r>
-    </w:p>
-    <w:p>
-      <w:pPr>
-        <w:pStyle w:val="ListBullet"/>
-      </w:pPr>
-      <w:r>
-        <w:t xml:space="preserve">Khách có </w:t>
+        <w:t>Xem mục 3.2 và 3.2.1. Mã bên em (</w:t>
       </w:r>
       <w:r>
         <w:rPr>
           <w:rFonts w:ascii="Consolas" w:hAnsi="Consolas"/>
           <w:sz w:val="19"/>
         </w:rPr>
-        <w:t>invoice_mode = "thang"</w:t>
-      </w:r>
-      <w:r>
-        <w:t xml:space="preserve"> nhận </w:t>
+        <w:t>services/gui_tune.py:dung_goi</w:t>
+      </w:r>
+      <w:r>
+        <w:t>) chỉ gửi khi đủ các điều kiện sau:</w:t>
+      </w:r>
+    </w:p>
+    <w:p>
+      <w:pPr>
+        <w:pStyle w:val="ListBullet"/>
+      </w:pPr>
+      <w:r>
+        <w:t xml:space="preserve">phiếu </w:t>
       </w:r>
       <w:r>
         <w:rPr>
           <w:b/>
         </w:rPr>
-        <w:t>một hoá đơn cả tháng</w:t>
-      </w:r>
-      <w:r>
-        <w:t xml:space="preserve">. Khách </w:t>
+        <w:t>đã về và đã khoá</w:t>
+      </w:r>
+      <w:r>
+        <w:t>;</w:t>
+      </w:r>
+    </w:p>
+    <w:p>
+      <w:pPr>
+        <w:pStyle w:val="ListBullet"/>
+      </w:pPr>
+      <w:r>
+        <w:t xml:space="preserve">khách </w:t>
+      </w:r>
+      <w:r>
+        <w:rPr>
+          <w:b/>
+        </w:rPr>
+        <w:t>có mã bên kế toán</w:t>
+      </w:r>
+      <w:r>
+        <w:t>, mã hợp lệ;</w:t>
+      </w:r>
+    </w:p>
+    <w:p>
+      <w:pPr>
+        <w:pStyle w:val="ListBullet"/>
+      </w:pPr>
+      <w:r>
+        <w:t xml:space="preserve">phiếu </w:t>
+      </w:r>
+      <w:r>
+        <w:rPr>
+          <w:b/>
+        </w:rPr>
+        <w:t>có tuyến</w:t>
+      </w:r>
+      <w:r>
+        <w:t xml:space="preserve">; mã ghép </w:t>
       </w:r>
       <w:r>
         <w:rPr>
           <w:rFonts w:ascii="Consolas" w:hAnsi="Consolas"/>
           <w:sz w:val="19"/>
         </w:rPr>
-        <w:t>phieu</w:t>
-      </w:r>
-      <w:r>
-        <w:t xml:space="preserve"> nhận hoá đơn từng phiếu.</w:t>
+        <w:t>khách_tuyến</w:t>
+      </w:r>
+      <w:r>
+        <w:t xml:space="preserve"> ≤ 50 ký tự;</w:t>
       </w:r>
     </w:p>
     <w:p>
@@ -12552,22 +12944,119 @@
         <w:pStyle w:val="ListBullet"/>
       </w:pPr>
       <w:r>
-        <w:t xml:space="preserve">Một tờ gộp = </w:t>
+        <w:t xml:space="preserve">cước là </w:t>
       </w:r>
       <w:r>
         <w:rPr>
           <w:b/>
         </w:rPr>
-        <w:t>một khách × một tháng × một tiền cước</w:t>
-      </w:r>
-      <w:r>
-        <w:t xml:space="preserve">. Số tờ dạng </w:t>
+        <w:t>VND, LAK hoặc USD</w:t>
+      </w:r>
+      <w:r>
+        <w:t xml:space="preserve"> và </w:t>
+      </w:r>
+      <w:r>
+        <w:rPr>
+          <w:b/>
+        </w:rPr>
+        <w:t>&gt; 0,01</w:t>
+      </w:r>
+      <w:r>
+        <w:t>.</w:t>
+      </w:r>
+    </w:p>
+    <w:p>
+      <w:pPr>
+        <w:jc w:val="both"/>
+      </w:pPr>
+      <w:r>
+        <w:t xml:space="preserve">Khoá phiếu hiện chỉ </w:t>
+      </w:r>
+      <w:r>
+        <w:rPr>
+          <w:b/>
+        </w:rPr>
+        <w:t>cảnh báo</w:t>
+      </w:r>
+      <w:r>
+        <w:t xml:space="preserve"> (người khoá xem rồi xác nhận) chứ không bắt buộc mục II đã kiểm. Bên em </w:t>
+      </w:r>
+      <w:r>
+        <w:rPr>
+          <w:b/>
+        </w:rPr>
+        <w:t>chưa chặn</w:t>
+      </w:r>
+      <w:r>
+        <w:t xml:space="preserve"> gửi SO theo mục II. Anh cần chặn thì bên em thêm.</w:t>
+      </w:r>
+    </w:p>
+    <w:p>
+      <w:pPr>
+        <w:pStyle w:val="Heading2"/>
+      </w:pPr>
+      <w:r>
+        <w:t>6.5. Hoá đơn gộp tháng</w:t>
+      </w:r>
+    </w:p>
+    <w:p>
+      <w:pPr>
+        <w:pStyle w:val="ListBullet"/>
+      </w:pPr>
+      <w:r>
+        <w:t xml:space="preserve">Khách có </w:t>
       </w:r>
       <w:r>
         <w:rPr>
           <w:rFonts w:ascii="Consolas" w:hAnsi="Consolas"/>
           <w:sz w:val="19"/>
         </w:rPr>
+        <w:t>invoice_mode = "thang"</w:t>
+      </w:r>
+      <w:r>
+        <w:t xml:space="preserve"> nhận </w:t>
+      </w:r>
+      <w:r>
+        <w:rPr>
+          <w:b/>
+        </w:rPr>
+        <w:t>một hoá đơn cả tháng</w:t>
+      </w:r>
+      <w:r>
+        <w:t xml:space="preserve">. Khách </w:t>
+      </w:r>
+      <w:r>
+        <w:rPr>
+          <w:rFonts w:ascii="Consolas" w:hAnsi="Consolas"/>
+          <w:sz w:val="19"/>
+        </w:rPr>
+        <w:t>phieu</w:t>
+      </w:r>
+      <w:r>
+        <w:t xml:space="preserve"> nhận hoá đơn từng phiếu.</w:t>
+      </w:r>
+    </w:p>
+    <w:p>
+      <w:pPr>
+        <w:pStyle w:val="ListBullet"/>
+      </w:pPr>
+      <w:r>
+        <w:t xml:space="preserve">Một tờ gộp = </w:t>
+      </w:r>
+      <w:r>
+        <w:rPr>
+          <w:b/>
+        </w:rPr>
+        <w:t>một khách × một tháng × một tiền cước</w:t>
+      </w:r>
+      <w:r>
+        <w:t xml:space="preserve">. Số tờ dạng </w:t>
+      </w:r>
+      <w:r>
+        <w:rPr>
+          <w:rFonts w:ascii="Consolas" w:hAnsi="Consolas"/>
+          <w:sz w:val="19"/>
+        </w:rPr>
         <w:t>HDT-YYYYMM-NN</w:t>
       </w:r>
       <w:r>
@@ -12609,10 +13098,10 @@
     </w:p>
     <w:p>
       <w:pPr>
-        <w:jc w:val="both"/>
-      </w:pPr>
-      <w:r>
-        <w:t xml:space="preserve">- (a) EPL quẹt thẻ cao tốc </w:t>
+        <w:pStyle w:val="ListBullet2"/>
+      </w:pPr>
+      <w:r>
+        <w:t xml:space="preserve">(a) EPL quẹt thẻ cao tốc </w:t>
       </w:r>
       <w:r>
         <w:rPr>
@@ -12626,10 +13115,10 @@
     </w:p>
     <w:p>
       <w:pPr>
-        <w:jc w:val="both"/>
-      </w:pPr>
-      <w:r>
-        <w:t xml:space="preserve">- (b) dầu </w:t>
+        <w:pStyle w:val="ListBullet2"/>
+      </w:pPr>
+      <w:r>
+        <w:t xml:space="preserve">(b) dầu </w:t>
       </w:r>
       <w:r>
         <w:rPr>
@@ -16270,7 +16759,13 @@
           <w:p>
             <w:r/>
             <w:r>
-              <w:t>khi anh cho danh sách mã khách</w:t>
+              <w:rPr>
+                <w:b/>
+              </w:rPr>
+              <w:t>đã làm 30/09</w:t>
+            </w:r>
+            <w:r>
+              <w:t>; từ tối 30/09 chỉ KT Thu/Chi VC và Sếp gán</w:t>
             </w:r>
           </w:p>
         </w:tc>
@@ -16294,7 +16789,13 @@
           <w:p>
             <w:r/>
             <w:r>
-              <w:t>khi anh cho địa chỉ và cách lấy token</w:t>
+              <w:rPr>
+                <w:b/>
+              </w:rPr>
+              <w:t>đã làm 01/10</w:t>
+            </w:r>
+            <w:r>
+              <w:t>, đã gửi thử một DO (3.2.1)</w:t>
             </w:r>
           </w:p>
         </w:tc>
@@ -16307,7 +16808,7 @@
           <w:p>
             <w:r/>
             <w:r>
-              <w:t>Chặn gửi PDT khi doanh thu = 0, mục II chưa kiểm, phiếu không tuyến, cước THB / CNY (nếu anh chưa nhận)</w:t>
+              <w:t>Chặn gửi PDT khi doanh thu = 0, phiếu không tuyến, cước THB / CNY (nếu anh chưa nhận)</w:t>
             </w:r>
           </w:p>
         </w:tc>
@@ -16318,7 +16819,124 @@
           <w:p>
             <w:r/>
             <w:r>
-              <w:t>cùng lúc</w:t>
+              <w:rPr>
+                <w:b/>
+              </w:rPr>
+              <w:t>đã làm 01/10</w:t>
+            </w:r>
+            <w:r>
+              <w:t xml:space="preserve"> (mục II chưa kiểm: xem 6.4)</w:t>
+            </w:r>
+          </w:p>
+        </w:tc>
+      </w:tr>
+      <w:tr>
+        <w:tc>
+          <w:tcPr>
+            <w:tcW w:type="dxa" w:w="4320"/>
+          </w:tcPr>
+          <w:p>
+            <w:r/>
+            <w:r>
+              <w:t xml:space="preserve">Ghi mã khách anh cấp, gửi SO thật một DO, đối chiếu </w:t>
+            </w:r>
+            <w:r>
+              <w:rPr>
+                <w:rFonts w:ascii="Consolas" w:hAnsi="Consolas"/>
+                <w:sz w:val="19"/>
+              </w:rPr>
+              <w:t>orderCode</w:t>
+            </w:r>
+            <w:r>
+              <w:t xml:space="preserve">, </w:t>
+            </w:r>
+            <w:r>
+              <w:rPr>
+                <w:rFonts w:ascii="Consolas" w:hAnsi="Consolas"/>
+                <w:sz w:val="19"/>
+              </w:rPr>
+              <w:t>totalAmount</w:t>
+            </w:r>
+            <w:r>
+              <w:t xml:space="preserve"> với tờ đề nghị thu</w:t>
+            </w:r>
+          </w:p>
+        </w:tc>
+        <w:tc>
+          <w:tcPr>
+            <w:tcW w:type="dxa" w:w="4320"/>
+          </w:tcPr>
+          <w:p>
+            <w:r/>
+            <w:r>
+              <w:t>khi anh tạo khách EPL Lào (câu hỏi 10.12)</w:t>
+            </w:r>
+          </w:p>
+        </w:tc>
+      </w:tr>
+      <w:tr>
+        <w:tc>
+          <w:tcPr>
+            <w:tcW w:type="dxa" w:w="4320"/>
+          </w:tcPr>
+          <w:p>
+            <w:r/>
+            <w:r>
+              <w:t>Phiếu chi tạm ứng CMP (12.3)</w:t>
+            </w:r>
+          </w:p>
+        </w:tc>
+        <w:tc>
+          <w:tcPr>
+            <w:tcW w:type="dxa" w:w="4320"/>
+          </w:tcPr>
+          <w:p>
+            <w:r/>
+            <w:r>
+              <w:t>khi anh cấp mã số ở 12.7.5 và trả lời 10.6</w:t>
+            </w:r>
+          </w:p>
+        </w:tc>
+      </w:tr>
+      <w:tr>
+        <w:tc>
+          <w:tcPr>
+            <w:tcW w:type="dxa" w:w="4320"/>
+          </w:tcPr>
+          <w:p>
+            <w:r/>
+            <w:r>
+              <w:t xml:space="preserve">Nút tạo </w:t>
+            </w:r>
+            <w:r>
+              <w:rPr>
+                <w:b/>
+              </w:rPr>
+              <w:t>khoá bàn giao</w:t>
+            </w:r>
+            <w:r>
+              <w:t xml:space="preserve"> cho hệ anh ở màn Tài khoản (hiện chỉ có đường </w:t>
+            </w:r>
+            <w:r>
+              <w:rPr>
+                <w:rFonts w:ascii="Consolas" w:hAnsi="Consolas"/>
+                <w:sz w:val="19"/>
+              </w:rPr>
+              <w:t>POST /api/handover/tao-khoa</w:t>
+            </w:r>
+            <w:r>
+              <w:t>)</w:t>
+            </w:r>
+          </w:p>
+        </w:tc>
+        <w:tc>
+          <w:tcPr>
+            <w:tcW w:type="dxa" w:w="4320"/>
+          </w:tcPr>
+          <w:p>
+            <w:r/>
+            <w:r>
+              <w:t>khi có địa chỉ ra Internet</w:t>
             </w:r>
           </w:p>
         </w:tc>
@@ -16543,7 +17161,7 @@
         <w:t>UserId</w:t>
       </w:r>
       <w:r>
-        <w:t xml:space="preserve"> nào đưa vào allowlist?</w:t>
+        <w:t xml:space="preserve"> nào đưa vào allowlist? Hiện bên em tạm dùng token cá nhân của anh (hết hạn 10/10/2026).</w:t>
       </w:r>
     </w:p>
     <w:p>
@@ -16756,91 +17374,295 @@
     </w:p>
     <w:p>
       <w:pPr>
-        <w:pStyle w:val="Heading1"/>
-      </w:pPr>
-      <w:r>
-        <w:rPr>
-          <w:color w:val="145C4A"/>
-        </w:rPr>
-        <w:t>11. Thử với nhau</w:t>
-      </w:r>
-    </w:p>
-    <w:p>
-      <w:pPr>
-        <w:jc w:val="both"/>
-      </w:pPr>
-      <w:r>
-        <w:t>Bên em có các bộ kiểm tự động chạy trên máy thử (bản sao DB), không đụng dữ liệu thật:</w:t>
-      </w:r>
-    </w:p>
-    <w:p>
-      <w:pPr>
-        <w:pStyle w:val="ListBullet"/>
-      </w:pPr>
+        <w:pStyle w:val="ListNumber"/>
+      </w:pPr>
+      <w:r>
+        <w:rPr>
+          <w:b/>
+        </w:rPr>
+        <w:t>Khách EPL Lào</w:t>
+      </w:r>
+      <w:r>
+        <w:t xml:space="preserve"> (mới, 01/10): anh tạo trong PUBOBJECT rồi gửi bên em </w:t>
+      </w:r>
       <w:r>
         <w:rPr>
           <w:rFonts w:ascii="Consolas" w:hAnsi="Consolas"/>
           <w:sz w:val="19"/>
         </w:rPr>
-        <w:t>kiem/thu_dinh_khoan.py</w:t>
-      </w:r>
-      <w:r>
-        <w:t xml:space="preserve"> — mọi mã in ra đều có trong danh mục của anh (trừ ba mã con), bảng dòng chi 18 trường hợp, tạm ứng 1601, </w:t>
+        <w:t>OBJ_OBJECTNO</w:t>
+      </w:r>
+      <w:r>
+        <w:t xml:space="preserve"> từng khách, hay cho bên em tự tạo qua </w:t>
       </w:r>
       <w:r>
         <w:rPr>
           <w:rFonts w:ascii="Consolas" w:hAnsi="Consolas"/>
           <w:sz w:val="19"/>
         </w:rPr>
-        <w:t>PC_SC</w:t>
-      </w:r>
-      <w:r>
-        <w:t xml:space="preserve"> không trả tiền mặt nợ nhà cung cấp.</w:t>
-      </w:r>
-    </w:p>
-    <w:p>
-      <w:pPr>
-        <w:pStyle w:val="ListBullet"/>
-      </w:pPr>
+        <w:t>POST /api/v1/master-data/customers/upsert</w:t>
+      </w:r>
+      <w:r>
+        <w:t xml:space="preserve">? Đây là việc </w:t>
+      </w:r>
+      <w:r>
+        <w:rPr>
+          <w:b/>
+        </w:rPr>
+        <w:t>đang chặn</w:t>
+      </w:r>
+      <w:r>
+        <w:t xml:space="preserve"> tạo SO (3.2.1).</w:t>
+      </w:r>
+    </w:p>
+    <w:p>
+      <w:pPr>
+        <w:pStyle w:val="ListNumber"/>
+      </w:pPr>
+      <w:r>
+        <w:rPr>
+          <w:b/>
+        </w:rPr>
+        <w:t>Cách nhận các tờ còn lại</w:t>
+      </w:r>
+      <w:r>
+        <w:t xml:space="preserve"> (mới, 01/10) — </w:t>
+      </w:r>
       <w:r>
         <w:rPr>
           <w:rFonts w:ascii="Consolas" w:hAnsi="Consolas"/>
           <w:sz w:val="19"/>
         </w:rPr>
-        <w:t>kiem/thu_de_nghi.py</w:t>
-      </w:r>
-      <w:r>
-        <w:t xml:space="preserve"> — khoá phiếu sinh đề nghị thu đúng tiền tệ; mở khoá rút tờ chưa gửi; tờ đã gửi thì chặn mở khoá.</w:t>
-      </w:r>
-    </w:p>
-    <w:p>
-      <w:pPr>
-        <w:pStyle w:val="ListBullet"/>
-      </w:pPr>
+        <w:t>PTU</w:t>
+      </w:r>
+      <w:r>
+        <w:t xml:space="preserve">, </w:t>
+      </w:r>
       <w:r>
         <w:rPr>
           <w:rFonts w:ascii="Consolas" w:hAnsi="Consolas"/>
           <w:sz w:val="19"/>
         </w:rPr>
-        <w:t>kiem/thu_cach_tra.py</w:t>
-      </w:r>
-      <w:r>
-        <w:t xml:space="preserve"> — cách trả theo Excel, tạm ứng chỉ gồm khoản chi ngay khi xe đi.</w:t>
-      </w:r>
-    </w:p>
-    <w:p>
-      <w:pPr>
-        <w:pStyle w:val="ListBullet"/>
-      </w:pPr>
+        <w:t>PC_TU</w:t>
+      </w:r>
+      <w:r>
+        <w:t xml:space="preserve">, </w:t>
+      </w:r>
       <w:r>
         <w:rPr>
           <w:rFonts w:ascii="Consolas" w:hAnsi="Consolas"/>
           <w:sz w:val="19"/>
         </w:rPr>
+        <w:t>PC_SC</w:t>
+      </w:r>
+      <w:r>
+        <w:t>…:</w:t>
+      </w:r>
+    </w:p>
+    <w:p>
+      <w:pPr>
+        <w:pStyle w:val="ListBullet2"/>
+      </w:pPr>
+      <w:r>
+        <w:t xml:space="preserve">(1) anh dựng một cửa </w:t>
+      </w:r>
+      <w:r>
+        <w:rPr>
+          <w:rFonts w:ascii="Consolas" w:hAnsi="Consolas"/>
+          <w:sz w:val="19"/>
+        </w:rPr>
+        <w:t>POST /api/v1/epl-lao/vouchers</w:t>
+      </w:r>
+      <w:r>
+        <w:t xml:space="preserve"> nhận đúng phong bì 3.1, tự rẽ vào CMP / CMR theo </w:t>
+      </w:r>
+      <w:r>
+        <w:rPr>
+          <w:rFonts w:ascii="Consolas" w:hAnsi="Consolas"/>
+          <w:sz w:val="19"/>
+        </w:rPr>
+        <w:t>type</w:t>
+      </w:r>
+      <w:r>
+        <w:t>; bên em chỉ đổi địa chỉ; hay</w:t>
+      </w:r>
+    </w:p>
+    <w:p>
+      <w:pPr>
+        <w:pStyle w:val="ListBullet2"/>
+      </w:pPr>
+      <w:r>
+        <w:t>(2) mỗi loại đi đường riêng của anh (SO đã làm, CMP cho tạm ứng…); bên em gọi từng đường.</w:t>
+      </w:r>
+    </w:p>
+    <w:p>
+      <w:pPr>
+        <w:pStyle w:val="Heading1"/>
+      </w:pPr>
+      <w:r>
+        <w:rPr>
+          <w:color w:val="145C4A"/>
+        </w:rPr>
+        <w:t>11. Thử với nhau</w:t>
+      </w:r>
+    </w:p>
+    <w:p>
+      <w:pPr>
+        <w:jc w:val="both"/>
+      </w:pPr>
+      <w:r>
+        <w:t>Bên em có các bộ kiểm tự động chạy trên máy thử (bản sao DB), không đụng dữ liệu thật:</w:t>
+      </w:r>
+    </w:p>
+    <w:p>
+      <w:pPr>
+        <w:pStyle w:val="ListBullet"/>
+      </w:pPr>
+      <w:r>
+        <w:rPr>
+          <w:rFonts w:ascii="Consolas" w:hAnsi="Consolas"/>
+          <w:sz w:val="19"/>
+        </w:rPr>
+        <w:t>kiem/thu_dinh_khoan.py</w:t>
+      </w:r>
+      <w:r>
+        <w:t xml:space="preserve"> — mọi mã in ra đều có trong danh mục của anh (trừ ba mã con), bảng dòng chi 18 trường hợp, tạm ứng 1601, </w:t>
+      </w:r>
+      <w:r>
+        <w:rPr>
+          <w:rFonts w:ascii="Consolas" w:hAnsi="Consolas"/>
+          <w:sz w:val="19"/>
+        </w:rPr>
+        <w:t>PC_SC</w:t>
+      </w:r>
+      <w:r>
+        <w:t xml:space="preserve"> không trả tiền mặt nợ nhà cung cấp.</w:t>
+      </w:r>
+    </w:p>
+    <w:p>
+      <w:pPr>
+        <w:pStyle w:val="ListBullet"/>
+      </w:pPr>
+      <w:r>
+        <w:rPr>
+          <w:rFonts w:ascii="Consolas" w:hAnsi="Consolas"/>
+          <w:sz w:val="19"/>
+        </w:rPr>
+        <w:t>kiem/thu_de_nghi.py</w:t>
+      </w:r>
+      <w:r>
+        <w:t xml:space="preserve"> — khoá phiếu sinh đề nghị thu đúng tiền tệ; mở khoá rút tờ chưa gửi; tờ đã gửi thì chặn mở khoá.</w:t>
+      </w:r>
+    </w:p>
+    <w:p>
+      <w:pPr>
+        <w:pStyle w:val="ListBullet"/>
+      </w:pPr>
+      <w:r>
+        <w:rPr>
+          <w:rFonts w:ascii="Consolas" w:hAnsi="Consolas"/>
+          <w:sz w:val="19"/>
+        </w:rPr>
+        <w:t>kiem/thu_cach_tra.py</w:t>
+      </w:r>
+      <w:r>
+        <w:t xml:space="preserve"> — cách trả theo Excel, tạm ứng chỉ gồm khoản chi ngay khi xe đi.</w:t>
+      </w:r>
+    </w:p>
+    <w:p>
+      <w:pPr>
+        <w:pStyle w:val="ListBullet"/>
+      </w:pPr>
+      <w:r>
+        <w:rPr>
+          <w:rFonts w:ascii="Consolas" w:hAnsi="Consolas"/>
+          <w:sz w:val="19"/>
+        </w:rPr>
         <w:t>kiem/thu_day_ke_toan.py</w:t>
       </w:r>
       <w:r>
         <w:t xml:space="preserve"> — dựng máy nhận giả đóng vai hệ anh, đẩy tờ mẫu, thử cả trả 500 và 409.</w:t>
+      </w:r>
+    </w:p>
+    <w:p>
+      <w:pPr>
+        <w:pStyle w:val="ListBullet"/>
+      </w:pPr>
+      <w:r>
+        <w:rPr>
+          <w:rFonts w:ascii="Consolas" w:hAnsi="Consolas"/>
+          <w:sz w:val="19"/>
+        </w:rPr>
+        <w:t>kiem/thu_tao_so.py</w:t>
+      </w:r>
+      <w:r>
+        <w:t xml:space="preserve"> (01/10) — 22 chỗ kiểm cho tạo SO: quyền (Bãi, tài xế, KT doanh thu không gửi được), luật chặn (DO chưa khoá, thiếu mã khách, mã ghép quá 50 ký tự), khuôn gói (ba khoá gốc, </w:t>
+      </w:r>
+      <w:r>
+        <w:rPr>
+          <w:rFonts w:ascii="Consolas" w:hAnsi="Consolas"/>
+          <w:sz w:val="19"/>
+        </w:rPr>
+        <w:t>customer_id</w:t>
+      </w:r>
+      <w:r>
+        <w:t xml:space="preserve"> = mã bên anh, một dòng thu, tổng khớp chính xác). </w:t>
+      </w:r>
+      <w:r>
+        <w:rPr>
+          <w:b/>
+        </w:rPr>
+        <w:t>Không gọi sang hệ anh.</w:t>
+      </w:r>
+    </w:p>
+    <w:p>
+      <w:pPr>
+        <w:pStyle w:val="ListBullet"/>
+      </w:pPr>
+      <w:r>
+        <w:rPr>
+          <w:rFonts w:ascii="Consolas" w:hAnsi="Consolas"/>
+          <w:sz w:val="19"/>
+        </w:rPr>
+        <w:t>kiem/thu_ban_giao.py</w:t>
+      </w:r>
+      <w:r>
+        <w:t xml:space="preserve"> — 31 chỗ kiểm cho hai đường bàn giao DO (12.8).</w:t>
+      </w:r>
+    </w:p>
+    <w:p>
+      <w:pPr>
+        <w:pStyle w:val="ListBullet"/>
+      </w:pPr>
+      <w:r>
+        <w:rPr>
+          <w:rFonts w:ascii="Consolas" w:hAnsi="Consolas"/>
+          <w:sz w:val="19"/>
+        </w:rPr>
+        <w:t>kiem/thu_khach_hang_moi.py</w:t>
+      </w:r>
+      <w:r>
+        <w:t xml:space="preserve"> — mã khách: chỉ </w:t>
+      </w:r>
+      <w:r>
+        <w:rPr>
+          <w:rFonts w:ascii="Consolas" w:hAnsi="Consolas"/>
+          <w:sz w:val="19"/>
+        </w:rPr>
+        <w:t>acct</w:t>
+      </w:r>
+      <w:r>
+        <w:t xml:space="preserve"> và Sếp gán, không trùng, đúng dạng; </w:t>
+      </w:r>
+      <w:r>
+        <w:rPr>
+          <w:rFonts w:ascii="Consolas" w:hAnsi="Consolas"/>
+          <w:sz w:val="19"/>
+        </w:rPr>
+        <w:t>customer_code</w:t>
+      </w:r>
+      <w:r>
+        <w:t xml:space="preserve"> trong gói bàn giao.</w:t>
       </w:r>
     </w:p>
     <w:p>
@@ -19892,10 +20714,10 @@
     </w:p>
     <w:p>
       <w:pPr>
-        <w:jc w:val="both"/>
-      </w:pPr>
-      <w:r>
-        <w:t>#### 12.7.1. Token hiện có</w:t>
+        <w:pStyle w:val="Heading3"/>
+      </w:pPr>
+      <w:r>
+        <w:t>12.7.1. Token hiện có</w:t>
       </w:r>
     </w:p>
     <w:tbl>
@@ -20072,10 +20894,10 @@
     </w:p>
     <w:p>
       <w:pPr>
-        <w:jc w:val="both"/>
-      </w:pPr>
-      <w:r>
-        <w:t>#### 12.7.2. Bảng mã 12.4 — số đọc được</w:t>
+        <w:pStyle w:val="Heading3"/>
+      </w:pPr>
+      <w:r>
+        <w:t>12.7.2. Bảng mã 12.4 — số đọc được</w:t>
       </w:r>
     </w:p>
     <w:tbl>
@@ -20615,10 +21437,10 @@
     <w:p/>
     <w:p>
       <w:pPr>
-        <w:jc w:val="both"/>
-      </w:pPr>
-      <w:r>
-        <w:t>#### 12.7.3. Danh mục tài khoản</w:t>
+        <w:pStyle w:val="Heading3"/>
+      </w:pPr>
+      <w:r>
+        <w:t>12.7.3. Danh mục tài khoản</w:t>
       </w:r>
     </w:p>
     <w:tbl>
@@ -20947,10 +21769,10 @@
     <w:p/>
     <w:p>
       <w:pPr>
-        <w:jc w:val="both"/>
-      </w:pPr>
-      <w:r>
-        <w:t>#### 12.7.4. Nguồn DO của phiếu thu chi</w:t>
+        <w:pStyle w:val="Heading3"/>
+      </w:pPr>
+      <w:r>
+        <w:t>12.7.4. Nguồn DO của phiếu thu chi</w:t>
       </w:r>
     </w:p>
     <w:p>
@@ -21171,10 +21993,10 @@
     </w:p>
     <w:p>
       <w:pPr>
-        <w:jc w:val="both"/>
-      </w:pPr>
-      <w:r>
-        <w:t>#### 12.7.5. Việc xin anh làm — xếp theo thứ tự cần trước</w:t>
+        <w:pStyle w:val="Heading3"/>
+      </w:pPr>
+      <w:r>
+        <w:t>12.7.5. Việc xin anh làm — xếp theo thứ tự cần trước</w:t>
       </w:r>
     </w:p>
     <w:p>
@@ -21268,7 +22090,16 @@
         <w:t>Đối tượng</w:t>
       </w:r>
       <w:r>
-        <w:t xml:space="preserve"> cho khách, tài xế, chủ xe, nhà cung cấp EPL Lào (hoặc cho bên em đồng bộ).</w:t>
+        <w:t xml:space="preserve"> cho khách, tài xế, chủ xe, nhà cung cấp EPL Lào (hoặc cho bên em đồng bộ). </w:t>
+      </w:r>
+      <w:r>
+        <w:rPr>
+          <w:b/>
+        </w:rPr>
+        <w:t>Từ 01/10 phần khách đang chặn tạo SO</w:t>
+      </w:r>
+      <w:r>
+        <w:t xml:space="preserve"> (3.2.1, câu hỏi 10.12).</w:t>
       </w:r>
     </w:p>
     <w:p>
@@ -21291,7 +22122,7 @@
         <w:t>đã dựng xong</w:t>
       </w:r>
       <w:r>
-        <w:t xml:space="preserve"> (mục 12.8); còn chờ địa chỉ ra Internet.</w:t>
+        <w:t xml:space="preserve"> (mục 12.8); còn chờ địa chỉ ra Internet (chủ dự án host khi làm xong hết, 12.8.4).</w:t>
       </w:r>
     </w:p>
     <w:p>
@@ -21356,10 +22187,10 @@
     </w:p>
     <w:p>
       <w:pPr>
-        <w:jc w:val="both"/>
-      </w:pPr>
-      <w:r>
-        <w:t>#### 12.8.1. Xác thực</w:t>
+        <w:pStyle w:val="Heading3"/>
+      </w:pPr>
+      <w:r>
+        <w:t>12.8.1. Xác thực</w:t>
       </w:r>
     </w:p>
     <w:p>
@@ -21610,20 +22441,10 @@
     </w:p>
     <w:p>
       <w:pPr>
-        <w:jc w:val="both"/>
-      </w:pPr>
-      <w:r>
-        <w:t xml:space="preserve">#### 12.8.2. </w:t>
-      </w:r>
-      <w:r>
-        <w:rPr>
-          <w:rFonts w:ascii="Consolas" w:hAnsi="Consolas"/>
-          <w:sz w:val="19"/>
-        </w:rPr>
-        <w:t>GET /api/handover/delivery-orders</w:t>
-      </w:r>
-      <w:r>
-        <w:t xml:space="preserve"> — danh sách</w:t>
+        <w:pStyle w:val="Heading3"/>
+      </w:pPr>
+      <w:r>
+        <w:t>12.8.2. `GET /api/handover/delivery-orders` — danh sách</w:t>
       </w:r>
     </w:p>
     <w:p>
@@ -22640,20 +23461,10 @@
     </w:p>
     <w:p>
       <w:pPr>
-        <w:jc w:val="both"/>
-      </w:pPr>
-      <w:r>
-        <w:t xml:space="preserve">#### 12.8.3. </w:t>
-      </w:r>
-      <w:r>
-        <w:rPr>
-          <w:rFonts w:ascii="Consolas" w:hAnsi="Consolas"/>
-          <w:sz w:val="19"/>
-        </w:rPr>
-        <w:t>GET /api/handover/delivery-orders/{do_id}</w:t>
-      </w:r>
-      <w:r>
-        <w:t xml:space="preserve"> — header + details</w:t>
+        <w:pStyle w:val="Heading3"/>
+      </w:pPr>
+      <w:r>
+        <w:t>12.8.3. `GET /api/handover/delivery-orders/{do_id}` — header + details</w:t>
       </w:r>
     </w:p>
     <w:p>
@@ -25218,10 +26029,10 @@
     </w:p>
     <w:p>
       <w:pPr>
-        <w:jc w:val="both"/>
-      </w:pPr>
-      <w:r>
-        <w:t>#### 12.8.4. Thử với nhau</w:t>
+        <w:pStyle w:val="Heading3"/>
+      </w:pPr>
+      <w:r>
+        <w:t>12.8.4. Thử với nhau</w:t>
       </w:r>
     </w:p>
     <w:p>
@@ -25274,7 +26085,16 @@
         <w:t>địa chỉ ra Internet</w:t>
       </w:r>
       <w:r>
-        <w:t>. Việc này chủ dự án chốt (câu hỏi 12.8 (1)).</w:t>
+        <w:t xml:space="preserve">. </w:t>
+      </w:r>
+      <w:r>
+        <w:rPr>
+          <w:b/>
+        </w:rPr>
+        <w:t>Chủ dự án chốt 01/10:</w:t>
+      </w:r>
+      <w:r>
+        <w:t xml:space="preserve"> làm xong hết rồi mới host, lúc đó bên em gửi anh địa chỉ gốc và khoá bàn giao.</w:t>
       </w:r>
     </w:p>
     <w:p>
@@ -25329,7 +26149,7 @@
         <w:pStyle w:val="ListNumber"/>
       </w:pPr>
       <w:r>
-        <w:t>(Chủ dự án) Trang điều xe Lào ra Internet ở địa chỉ nào?</w:t>
+        <w:t>~~(Chủ dự án) Trang điều xe Lào ra Internet ở địa chỉ nào?~~ — chủ dự án host khi làm xong hết (01/10), rồi gửi anh.</w:t>
       </w:r>
     </w:p>
     <w:p>

</xml_diff>

<commit_message>
Chốt tài khoản chi phí thuê xe liên kết: Nợ 621 / Có 4022
- tai_khoan: thêm CP_THUE_XE = 621 (ຄ່າຂົນສົ່ງ, khớp "ຄ່າຂົນສົ່ງນອກ" trong Excel)
- bàn giao DO xe thuê: hire.acc_code = "621/4022" thay cho null
- hợp đồng anh Tune mục 8 / 10 / 12.11: ghi chốt; hệ anh Tune chưa có API bút toán tổng hợp nên chưa gửi được

Co-Authored-By: Claude Opus 5.5 (1M context) <noreply@anthropic.com>
</commit_message>
<xml_diff>
--- a/DOCS/word/HOP_DONG_API_KE_TOAN_ANH_TUNE.docx
+++ b/DOCS/word/HOP_DONG_API_KE_TOAN_ANH_TUNE.docx
@@ -16665,16 +16665,148 @@
         <w:t>"ມູນຄ່າ THB 1211/402 ຄ່າຂົນສົ່ງນອກ"</w:t>
       </w:r>
       <w:r>
-        <w:t xml:space="preserve"> cho khoản này → </w:t>
-      </w:r>
+        <w:t xml:space="preserve"> cho khoản này.</w:t>
+      </w:r>
+    </w:p>
+    <w:p>
+      <w:pPr>
+        <w:pStyle w:val="ListBullet2"/>
+      </w:pPr>
       <w:r>
         <w:rPr>
           <w:b/>
         </w:rPr>
-        <w:t>cần anh Khampla chốt tài khoản</w:t>
-      </w:r>
-      <w:r>
-        <w:t>.</w:t>
+        <w:t>Đã chốt 01/10 (chủ dự án):</w:t>
+      </w:r>
+      <w:r>
+        <w:t xml:space="preserve"> </w:t>
+      </w:r>
+      <w:r>
+        <w:rPr>
+          <w:i/>
+        </w:rPr>
+        <w:t xml:space="preserve">Nợ </w:t>
+      </w:r>
+      <w:r>
+        <w:rPr>
+          <w:i/>
+        </w:rPr>
+        <w:t>621</w:t>
+      </w:r>
+      <w:r>
+        <w:t xml:space="preserve">* ຄ່າຂົນສົ່ງ – chi phí vận chuyển / Có </w:t>
+      </w:r>
+      <w:r>
+        <w:rPr>
+          <w:b/>
+        </w:rPr>
+        <w:t>4022</w:t>
+      </w:r>
+      <w:r>
+        <w:t xml:space="preserve"> phải trả chủ xe*, bằng </w:t>
+      </w:r>
+      <w:r>
+        <w:rPr>
+          <w:rFonts w:ascii="Consolas" w:hAnsi="Consolas"/>
+          <w:sz w:val="19"/>
+        </w:rPr>
+        <w:t>tien_thue</w:t>
+      </w:r>
+      <w:r>
+        <w:t xml:space="preserve">, lúc khoá phiếu. 621 khớp chữ "ຄ່າຂົນສົ່ງນອກ" của Excel; vế Có 402 trong Excel là mã cha của 4022. Bàn giao DO đưa cặp này ở </w:t>
+      </w:r>
+      <w:r>
+        <w:rPr>
+          <w:rFonts w:ascii="Consolas" w:hAnsi="Consolas"/>
+          <w:sz w:val="19"/>
+        </w:rPr>
+        <w:t>hire.acc_code</w:t>
+      </w:r>
+      <w:r>
+        <w:t xml:space="preserve"> (mục 10).</w:t>
+      </w:r>
+    </w:p>
+    <w:p>
+      <w:pPr>
+        <w:pStyle w:val="ListBullet2"/>
+      </w:pPr>
+      <w:r>
+        <w:rPr>
+          <w:b/>
+        </w:rPr>
+        <w:t>Chưa ghi sổ được:</w:t>
+      </w:r>
+      <w:r>
+        <w:t xml:space="preserve"> hệ anh chưa có API </w:t>
+      </w:r>
+      <w:r>
+        <w:rPr>
+          <w:b/>
+        </w:rPr>
+        <w:t>bút toán tổng hợp</w:t>
+      </w:r>
+      <w:r>
+        <w:t xml:space="preserve"> (không qua tiền). Các đường kế toán hiện có chỉ là </w:t>
+      </w:r>
+      <w:r>
+        <w:rPr>
+          <w:rFonts w:ascii="Consolas" w:hAnsi="Consolas"/>
+          <w:sz w:val="19"/>
+        </w:rPr>
+        <w:t>cmpayment-receipt/*</w:t>
+      </w:r>
+      <w:r>
+        <w:t xml:space="preserve"> (phiếu thu chi), </w:t>
+      </w:r>
+      <w:r>
+        <w:rPr>
+          <w:rFonts w:ascii="Consolas" w:hAnsi="Consolas"/>
+          <w:sz w:val="19"/>
+        </w:rPr>
+        <w:t>gl-report/*</w:t>
+      </w:r>
+      <w:r>
+        <w:t xml:space="preserve">, </w:t>
+      </w:r>
+      <w:r>
+        <w:rPr>
+          <w:rFonts w:ascii="Consolas" w:hAnsi="Consolas"/>
+          <w:sz w:val="19"/>
+        </w:rPr>
+        <w:t>lao-accounts</w:t>
+      </w:r>
+      <w:r>
+        <w:t xml:space="preserve">, </w:t>
+      </w:r>
+      <w:r>
+        <w:rPr>
+          <w:rFonts w:ascii="Consolas" w:hAnsi="Consolas"/>
+          <w:sz w:val="19"/>
+        </w:rPr>
+        <w:t>contracts</w:t>
+      </w:r>
+      <w:r>
+        <w:t xml:space="preserve">, </w:t>
+      </w:r>
+      <w:r>
+        <w:rPr>
+          <w:rFonts w:ascii="Consolas" w:hAnsi="Consolas"/>
+          <w:sz w:val="19"/>
+        </w:rPr>
+        <w:t>loan-agreements</w:t>
+      </w:r>
+      <w:r>
+        <w:t xml:space="preserve">, </w:t>
+      </w:r>
+      <w:r>
+        <w:rPr>
+          <w:rFonts w:ascii="Consolas" w:hAnsi="Consolas"/>
+          <w:sz w:val="19"/>
+        </w:rPr>
+        <w:t>cash-voucher-references</w:t>
+      </w:r>
+      <w:r>
+        <w:t>. Cần anh mở một đường ghi bút toán, hoặc ghi bút toán này từ màn "Vụ việc" khi đọc DO xe thuê.</w:t>
       </w:r>
     </w:p>
     <w:p>
@@ -25780,7 +25912,7 @@
                 <w:rFonts w:ascii="Consolas" w:hAnsi="Consolas"/>
                 <w:sz w:val="19"/>
               </w:rPr>
-              <w:t>{currency, unit_price, amount, amount_lak, fee_pct, fee, over_limit_t, over_t, over_deduction, advanced_by_epl, pay_owner, pay_owner_lak, owner_self_paid_lak, acc_code: null, acc_code_note}</w:t>
+              <w:t>{currency, unit_price, amount, amount_lak, fee_pct, fee, over_limit_t, over_t, over_deduction, advanced_by_epl, pay_owner, pay_owner_lak, owner_self_paid_lak, acc_code: "621/4022", acc_code_note}</w:t>
             </w:r>
           </w:p>
         </w:tc>
@@ -25854,16 +25986,26 @@
         <w:t>hire.acc_code</w:t>
       </w:r>
       <w:r>
-        <w:t xml:space="preserve"> </w:t>
+        <w:t xml:space="preserve"> = </w:t>
       </w:r>
       <w:r>
         <w:rPr>
           <w:b/>
         </w:rPr>
-        <w:t>cố ý để `null`</w:t>
-      </w:r>
-      <w:r>
-        <w:t>: tài khoản chi phí thuê xe còn chờ anh Khampla chốt (mục 8, lỗ hổng 1). Bên em không tự đặt mã.</w:t>
+        <w:t>`621/4022`</w:t>
+      </w:r>
+      <w:r>
+        <w:t xml:space="preserve"> (chốt 01/10): Nợ 621 chi phí vận chuyển / Có 4022 phải trả chủ xe, bằng </w:t>
+      </w:r>
+      <w:r>
+        <w:rPr>
+          <w:rFonts w:ascii="Consolas" w:hAnsi="Consolas"/>
+          <w:sz w:val="19"/>
+        </w:rPr>
+        <w:t>amount</w:t>
+      </w:r>
+      <w:r>
+        <w:t>, lúc khoá phiếu (mục 8, lỗ hổng 1). Phí và trừ quá tải chưa có bút toán riêng.</w:t>
       </w:r>
     </w:p>
     <w:p>
@@ -30901,19 +31043,47 @@
         <w:rPr>
           <w:b/>
         </w:rPr>
-        <w:t>Còn mở về kế toán:</w:t>
-      </w:r>
-      <w:r>
-        <w:t xml:space="preserve"> ghi nhận </w:t>
+        <w:t>Ghi nhận chi phí thuê xe:</w:t>
+      </w:r>
+      <w:r>
+        <w:t xml:space="preserve"> đã chốt </w:t>
+      </w:r>
+      <w:r>
+        <w:rPr>
+          <w:i/>
+        </w:rPr>
+        <w:t>Nợ 621 / Có 4022</w:t>
+      </w:r>
+      <w:r>
+        <w:t xml:space="preserve"> bằng tiền thuê, lúc khoá phiếu (mục 8, lỗ hổng 1). Bàn giao DO có </w:t>
+      </w:r>
+      <w:r>
+        <w:rPr>
+          <w:rFonts w:ascii="Consolas" w:hAnsi="Consolas"/>
+          <w:sz w:val="19"/>
+        </w:rPr>
+        <w:t>hire.acc_code = "621/4022"</w:t>
+      </w:r>
+      <w:r>
+        <w:t xml:space="preserve">. Hệ anh chưa có API bút toán tổng hợp nên bên em </w:t>
       </w:r>
       <w:r>
         <w:rPr>
           <w:b/>
         </w:rPr>
-        <w:t>chi phí thuê xe</w:t>
-      </w:r>
-      <w:r>
-        <w:t xml:space="preserve"> (Nợ chi phí / Có 4022 lúc khoá phiếu) chờ anh Khampla chốt tài khoản (mục 8, lỗ hổng 1). Hiện bên em chỉ ghi phần </w:t>
+        <w:t>chưa gửi được</w:t>
+      </w:r>
+      <w:r>
+        <w:t xml:space="preserve"> — hiện bên em chỉ gửi phần </w:t>
+      </w:r>
+      <w:r>
+        <w:rPr>
+          <w:b/>
+        </w:rPr>
+        <w:t>ứng</w:t>
+      </w:r>
+      <w:r>
+        <w:t xml:space="preserve"> và </w:t>
       </w:r>
       <w:r>
         <w:rPr>
@@ -31273,7 +31443,7 @@
           <w:p>
             <w:r/>
             <w:r>
-              <w:t xml:space="preserve">Tài khoản </w:t>
+              <w:t xml:space="preserve">Ghi </w:t>
             </w:r>
             <w:r>
               <w:rPr>
@@ -31282,7 +31452,16 @@
               <w:t>chi phí thuê xe</w:t>
             </w:r>
             <w:r>
-              <w:t xml:space="preserve"> liên kết</w:t>
+              <w:t xml:space="preserve"> liên kết (</w:t>
+            </w:r>
+            <w:r>
+              <w:rPr>
+                <w:i/>
+              </w:rPr>
+              <w:t>Nợ 621 / Có 4022</w:t>
+            </w:r>
+            <w:r>
+              <w:t>, đã chốt)</w:t>
             </w:r>
           </w:p>
         </w:tc>
@@ -31293,7 +31472,7 @@
           <w:p>
             <w:r/>
             <w:r>
-              <w:t>anh Khampla chốt</w:t>
+              <w:t>hệ anh chưa có API bút toán tổng hợp — chỉ có phiếu thu chi</w:t>
             </w:r>
           </w:p>
         </w:tc>
@@ -31304,7 +31483,7 @@
           <w:p>
             <w:r/>
             <w:r>
-              <w:t>anh Khampla</w:t>
+              <w:t>anh Tune (mở đường ghi bút toán)</w:t>
             </w:r>
           </w:p>
         </w:tc>

</xml_diff>

<commit_message>
Mở 1371/4021/4022 bên hệ kế toán anh Tune; tài liệu v2.4
- danh mục Lào chụp lại 01/10 (497 mã): 137, 402 thành tài khoản tổng hợp, ba mã con là tài khoản lá
- nhãn "chưa mở" xét theo từng danh mục (bản host còn thiếu ba mã): TK.ma_con_chua_mo; màn Quy trình chỉ liệt kê mã còn thiếu
- bài thử: mục IV do Sếp ghi chi (tạm ứng chi ở hệ kế toán); mở khoá phiếu đang đề nghị trả chủ xe thử bằng vai Sếp
- hợp đồng anh Tune 12.12: các lệnh mở mã và ảnh hưởng, bản host nối DB khác, tài khoản tích hợp từng bước, đề nghị API bút toán thuê xe

Co-Authored-By: Claude Opus 5.5 (1M context) <noreply@anthropic.com>
</commit_message>
<xml_diff>
--- a/DOCS/word/HOP_DONG_API_KE_TOAN_ANH_TUNE.docx
+++ b/DOCS/word/HOP_DONG_API_KE_TOAN_ANH_TUNE.docx
@@ -24,10 +24,10 @@
         <w:rPr>
           <w:b/>
         </w:rPr>
-        <w:t>v2.3 · 01/10/2026</w:t>
-      </w:r>
-      <w:r>
-        <w:t xml:space="preserve"> (v2.2 tối 01/10, v2.1 chiều 01/10, v2 sáng 01/10, v1 ngày 30/09). Bên soạn: trang điều xe </w:t>
+        <w:t>v2.4 · 01/10/2026</w:t>
+      </w:r>
+      <w:r>
+        <w:t xml:space="preserve"> (v2.3 trưa 01/10, v2.2 tối 01/10, v2.1 chiều 01/10, v2 sáng 01/10, v1 ngày 30/09). Bên soạn: trang điều xe </w:t>
       </w:r>
       <w:r>
         <w:rPr>
@@ -46,6 +46,97 @@
       </w:r>
       <w:r>
         <w:t xml:space="preserve"> (công nợ, thu chi, sổ kế toán).</w:t>
+      </w:r>
+    </w:p>
+    <w:p>
+      <w:pPr>
+        <w:ind w:left="360"/>
+        <w:jc w:val="both"/>
+      </w:pPr>
+      <w:r>
+        <w:rPr>
+          <w:b/>
+        </w:rPr>
+        <w:t>Đổi từ v2.3 sang v2.4 (chiều 01/10/2026) — mục 12.12:</w:t>
+      </w:r>
+    </w:p>
+    <w:p>
+      <w:pPr>
+        <w:pStyle w:val="ListBullet"/>
+        <w:ind w:left="360"/>
+      </w:pPr>
+      <w:r>
+        <w:rPr>
+          <w:b/>
+        </w:rPr>
+        <w:t>Đã mở 1371, 4021, 4022</w:t>
+      </w:r>
+      <w:r>
+        <w:t xml:space="preserve"> qua </w:t>
+      </w:r>
+      <w:r>
+        <w:rPr>
+          <w:rFonts w:ascii="Consolas" w:hAnsi="Consolas"/>
+          <w:sz w:val="19"/>
+        </w:rPr>
+        <w:t>lao-accounts</w:t>
+      </w:r>
+      <w:r>
+        <w:t xml:space="preserve"> (137, 402 thành tài khoản tổng hợp). Tạm ứng xe thuê và trả chủ xe đã chạy thật.</w:t>
+      </w:r>
+    </w:p>
+    <w:p>
+      <w:pPr>
+        <w:pStyle w:val="ListBullet"/>
+        <w:ind w:left="360"/>
+      </w:pPr>
+      <w:r>
+        <w:rPr>
+          <w:b/>
+        </w:rPr>
+        <w:t>Bản host không dùng chung DB</w:t>
+      </w:r>
+      <w:r>
+        <w:t xml:space="preserve"> với bản chạy ở máy: lúc đưa lên host phải mở lại ba mã trên DB đó.</w:t>
+      </w:r>
+    </w:p>
+    <w:p>
+      <w:pPr>
+        <w:pStyle w:val="ListBullet"/>
+        <w:ind w:left="360"/>
+      </w:pPr>
+      <w:r>
+        <w:rPr>
+          <w:b/>
+        </w:rPr>
+        <w:t>Tài khoản tích hợp:</w:t>
+      </w:r>
+      <w:r>
+        <w:t xml:space="preserve"> các bước làm cụ thể theo source bên anh.</w:t>
+      </w:r>
+    </w:p>
+    <w:p>
+      <w:pPr>
+        <w:pStyle w:val="ListBullet"/>
+        <w:ind w:left="360"/>
+      </w:pPr>
+      <w:r>
+        <w:rPr>
+          <w:b/>
+        </w:rPr>
+        <w:t>Bút toán chi phí thuê xe</w:t>
+      </w:r>
+      <w:r>
+        <w:t xml:space="preserve"> </w:t>
+      </w:r>
+      <w:r>
+        <w:rPr>
+          <w:i/>
+        </w:rPr>
+        <w:t>Nợ 621 / Có 4022</w:t>
+      </w:r>
+      <w:r>
+        <w:t>: chưa làm được, vì source chưa có chứng từ bút toán tổng hợp. Có đề nghị đường API.</w:t>
       </w:r>
     </w:p>
     <w:p>
@@ -31020,19 +31111,19 @@
         <w:rPr>
           <w:b/>
         </w:rPr>
-        <w:t>Còn chặn ở danh mục bên anh:</w:t>
-      </w:r>
-      <w:r>
-        <w:t xml:space="preserve"> chưa có mã </w:t>
+        <w:t>Mã 4022:</w:t>
+      </w:r>
+      <w:r>
+        <w:t xml:space="preserve"> trưa 01/10 chưa có nên hai loại phiếu chi trên bị từ chối ("Tài khoản không hợp lệ theo quốc gia của phiếu"). </w:t>
       </w:r>
       <w:r>
         <w:rPr>
           <w:b/>
         </w:rPr>
-        <w:t>4022</w:t>
-      </w:r>
-      <w:r>
-        <w:t xml:space="preserve"> nên hai loại phiếu chi trên đều bị từ chối ("Tài khoản không hợp lệ theo quốc gia của phiếu"). Màn bên em hiện rõ câu đó, kèm mã tài khoản đang dùng. Mở mã xong thì bấm gửi lại là chạy.</w:t>
+        <w:t>Chiều 01/10 đã mở</w:t>
+      </w:r>
+      <w:r>
+        <w:t xml:space="preserve"> (12.12.1), cả hai đã chạy thật. DB nào còn thiếu mã thì màn bên em vẫn hiện rõ câu từ chối, kèm mã đang dùng.</w:t>
       </w:r>
     </w:p>
     <w:p>
@@ -31147,7 +31238,7 @@
         <w:t>QLSX_ORG_ID</w:t>
       </w:r>
       <w:r>
-        <w:t xml:space="preserve">) thì bên em gọi </w:t>
+        <w:t xml:space="preserve">, mặc định 1368) thì bên em gọi </w:t>
       </w:r>
       <w:r>
         <w:rPr>
@@ -31157,7 +31248,7 @@
         <w:t>POST /api/v1/auth/login</w:t>
       </w:r>
       <w:r>
-        <w:t xml:space="preserve">, nhớ token và tự lấy token mới trước khi hết hạn 5 phút; bị 401 thì đăng nhập lại. Thứ tự ưu tiên: </w:t>
+        <w:t xml:space="preserve">, nhớ token và đăng nhập lại khi token còn dưới 5 phút (token bên anh sống 30 ngày); bị 401 thì đăng nhập lại. Thứ tự ưu tiên: </w:t>
       </w:r>
       <w:r>
         <w:rPr>
@@ -31191,27 +31282,16 @@
         <w:t>Cần anh (hoặc chủ dự án):</w:t>
       </w:r>
       <w:r>
-        <w:t xml:space="preserve"> tạo tài khoản đó (gắn nhân viên, thêm </w:t>
-      </w:r>
-      <w:r>
-        <w:rPr>
-          <w:rFonts w:ascii="Consolas" w:hAnsi="Consolas"/>
-          <w:sz w:val="19"/>
-        </w:rPr>
-        <w:t>UserId</w:t>
-      </w:r>
-      <w:r>
-        <w:t xml:space="preserve"> vào </w:t>
-      </w:r>
-      <w:r>
-        <w:rPr>
-          <w:rFonts w:ascii="Consolas" w:hAnsi="Consolas"/>
-          <w:sz w:val="19"/>
-        </w:rPr>
-        <w:t>LogisticsSalesPush.AllowedUserIds</w:t>
-      </w:r>
-      <w:r>
-        <w:t>). Việc tạo tài khoản đăng nhập bên em không tự làm.</w:t>
+        <w:t xml:space="preserve"> tạo tài khoản đó. Các bước cụ thể ở </w:t>
+      </w:r>
+      <w:r>
+        <w:rPr>
+          <w:b/>
+        </w:rPr>
+        <w:t>12.12.3</w:t>
+      </w:r>
+      <w:r>
+        <w:t>.</w:t>
       </w:r>
     </w:p>
     <w:p>
@@ -31297,7 +31377,7 @@
           <w:p>
             <w:r/>
             <w:r>
-              <w:t xml:space="preserve">Mở </w:t>
+              <w:t xml:space="preserve">~~Mở </w:t>
             </w:r>
             <w:r>
               <w:rPr>
@@ -31306,7 +31386,7 @@
               <w:t>1371, 4021, 4022</w:t>
             </w:r>
             <w:r>
-              <w:t xml:space="preserve"> trong danh mục tài khoản Lào bên anh</w:t>
+              <w:t>~~</w:t>
             </w:r>
           </w:p>
         </w:tc>
@@ -31317,7 +31397,13 @@
           <w:p>
             <w:r/>
             <w:r>
-              <w:t>phải chuyển 137 và 402 từ tài khoản hạch toán sang tổng hợp rồi thêm mã con; công cụ an toàn chặn bên em tự đổi cây tài khoản kế toán</w:t>
+              <w:rPr>
+                <w:b/>
+              </w:rPr>
+              <w:t>xong chiều 01/10</w:t>
+            </w:r>
+            <w:r>
+              <w:t xml:space="preserve"> trên DB của API chạy ở máy (12.12.1); DB của bản host còn thiếu (12.12.2)</w:t>
             </w:r>
           </w:p>
         </w:tc>
@@ -31328,7 +31414,7 @@
           <w:p>
             <w:r/>
             <w:r>
-              <w:t>anh Tune hoặc chủ dự án</w:t>
+              <w:t>bên em — mở lại trên DB host khi anh triển khai</w:t>
             </w:r>
           </w:p>
         </w:tc>
@@ -31408,7 +31494,7 @@
               <w:t>Tài khoản tích hợp</w:t>
             </w:r>
             <w:r>
-              <w:t xml:space="preserve"> (12.11.4)</w:t>
+              <w:t xml:space="preserve"> (12.11.4, các bước ở 12.12.3)</w:t>
             </w:r>
           </w:p>
         </w:tc>
@@ -31419,7 +31505,7 @@
           <w:p>
             <w:r/>
             <w:r>
-              <w:t>tạo tài khoản đăng nhập</w:t>
+              <w:t>tạo tài khoản đăng nhập, mật khẩu do bên anh giữ</w:t>
             </w:r>
           </w:p>
         </w:tc>
@@ -31472,7 +31558,7 @@
           <w:p>
             <w:r/>
             <w:r>
-              <w:t>hệ anh chưa có API bút toán tổng hợp — chỉ có phiếu thu chi</w:t>
+              <w:t>source chưa có chứng từ bút toán tổng hợp; đề nghị đường API ở 12.12.4</w:t>
             </w:r>
           </w:p>
         </w:tc>
@@ -31483,13 +31569,1937 @@
           <w:p>
             <w:r/>
             <w:r>
-              <w:t>anh Tune (mở đường ghi bút toán)</w:t>
+              <w:t>anh Tune duyệt, hoặc cho bên em thủ tục ghi chứng từ khác để bên em làm</w:t>
             </w:r>
           </w:p>
         </w:tc>
       </w:tr>
     </w:tbl>
     <w:p/>
+    <w:p>
+      <w:pPr>
+        <w:pStyle w:val="Heading2"/>
+      </w:pPr>
+      <w:r>
+        <w:t>12.12. Chiều 01/10/2026 — mở mã tài khoản, hai DB khác nhau, tài khoản tích hợp, bút toán thuê xe</w:t>
+      </w:r>
+    </w:p>
+    <w:p>
+      <w:pPr>
+        <w:pStyle w:val="Heading3"/>
+      </w:pPr>
+      <w:r>
+        <w:t>12.12.1. Đã mở 1371, 4021, 4022 (chủ dự án cho phép)</w:t>
+      </w:r>
+    </w:p>
+    <w:p>
+      <w:pPr>
+        <w:jc w:val="both"/>
+      </w:pPr>
+      <w:r>
+        <w:t xml:space="preserve">Làm qua chính API của anh, </w:t>
+      </w:r>
+      <w:r>
+        <w:rPr>
+          <w:rFonts w:ascii="Consolas" w:hAnsi="Consolas"/>
+          <w:sz w:val="19"/>
+        </w:rPr>
+        <w:t>accounting/lao-accounts</w:t>
+      </w:r>
+      <w:r>
+        <w:t xml:space="preserve"> (API chạy ở máy em, </w:t>
+      </w:r>
+      <w:r>
+        <w:rPr>
+          <w:rFonts w:ascii="Consolas" w:hAnsi="Consolas"/>
+          <w:sz w:val="19"/>
+        </w:rPr>
+        <w:t>Env=laos</w:t>
+      </w:r>
+      <w:r>
+        <w:t>). Không sửa thẳng DB.</w:t>
+      </w:r>
+    </w:p>
+    <w:tbl>
+      <w:tblPr>
+        <w:tblStyle w:val="LightGrid-Accent1"/>
+        <w:tblW w:type="auto" w:w="0"/>
+        <w:tblLook w:firstColumn="1" w:firstRow="1" w:lastColumn="0" w:lastRow="0" w:noHBand="0" w:noVBand="1" w:val="04A0"/>
+      </w:tblPr>
+      <w:tblGrid>
+        <w:gridCol w:w="2880"/>
+        <w:gridCol w:w="2880"/>
+        <w:gridCol w:w="2880"/>
+      </w:tblGrid>
+      <w:tr>
+        <w:tc>
+          <w:tcPr>
+            <w:tcW w:type="dxa" w:w="2880"/>
+          </w:tcPr>
+          <w:p>
+            <w:r>
+              <w:rPr>
+                <w:b/>
+              </w:rPr>
+            </w:r>
+            <w:r>
+              <w:rPr>
+                <w:b/>
+              </w:rPr>
+              <w:t>Bước</w:t>
+            </w:r>
+          </w:p>
+        </w:tc>
+        <w:tc>
+          <w:tcPr>
+            <w:tcW w:type="dxa" w:w="2880"/>
+          </w:tcPr>
+          <w:p>
+            <w:r>
+              <w:rPr>
+                <w:b/>
+              </w:rPr>
+            </w:r>
+            <w:r>
+              <w:rPr>
+                <w:b/>
+              </w:rPr>
+              <w:t>Gọi</w:t>
+            </w:r>
+          </w:p>
+        </w:tc>
+        <w:tc>
+          <w:tcPr>
+            <w:tcW w:type="dxa" w:w="2880"/>
+          </w:tcPr>
+          <w:p>
+            <w:r>
+              <w:rPr>
+                <w:b/>
+              </w:rPr>
+            </w:r>
+            <w:r>
+              <w:rPr>
+                <w:b/>
+              </w:rPr>
+              <w:t>Kết quả</w:t>
+            </w:r>
+          </w:p>
+        </w:tc>
+      </w:tr>
+      <w:tr>
+        <w:tc>
+          <w:tcPr>
+            <w:tcW w:type="dxa" w:w="2880"/>
+          </w:tcPr>
+          <w:p>
+            <w:r/>
+            <w:r>
+              <w:t>1</w:t>
+            </w:r>
+          </w:p>
+        </w:tc>
+        <w:tc>
+          <w:tcPr>
+            <w:tcW w:type="dxa" w:w="2880"/>
+          </w:tcPr>
+          <w:p>
+            <w:r/>
+            <w:r>
+              <w:rPr>
+                <w:rFonts w:ascii="Consolas" w:hAnsi="Consolas"/>
+                <w:sz w:val="19"/>
+              </w:rPr>
+              <w:t>POST lao-accounts/update</w:t>
+            </w:r>
+            <w:r>
+              <w:t xml:space="preserve"> mã </w:t>
+            </w:r>
+            <w:r>
+              <w:rPr>
+                <w:b/>
+              </w:rPr>
+              <w:t>137</w:t>
+            </w:r>
+            <w:r>
+              <w:t xml:space="preserve">, </w:t>
+            </w:r>
+            <w:r>
+              <w:rPr>
+                <w:rFonts w:ascii="Consolas" w:hAnsi="Consolas"/>
+                <w:sz w:val="19"/>
+              </w:rPr>
+              <w:t>Posting=false</w:t>
+            </w:r>
+            <w:r>
+              <w:t xml:space="preserve"> (giữ tên, cha 13, số dư, nhóm, loại, </w:t>
+            </w:r>
+            <w:r>
+              <w:rPr>
+                <w:rFonts w:ascii="Consolas" w:hAnsi="Consolas"/>
+                <w:sz w:val="19"/>
+              </w:rPr>
+              <w:t>Version</w:t>
+            </w:r>
+            <w:r>
+              <w:t>)</w:t>
+            </w:r>
+          </w:p>
+        </w:tc>
+        <w:tc>
+          <w:tcPr>
+            <w:tcW w:type="dxa" w:w="2880"/>
+          </w:tcPr>
+          <w:p>
+            <w:r/>
+            <w:r>
+              <w:t xml:space="preserve">137 thành tài khoản </w:t>
+            </w:r>
+            <w:r>
+              <w:rPr>
+                <w:b/>
+              </w:rPr>
+              <w:t>tổng hợp</w:t>
+            </w:r>
+          </w:p>
+        </w:tc>
+      </w:tr>
+      <w:tr>
+        <w:tc>
+          <w:tcPr>
+            <w:tcW w:type="dxa" w:w="2880"/>
+          </w:tcPr>
+          <w:p>
+            <w:r/>
+            <w:r>
+              <w:t>2</w:t>
+            </w:r>
+          </w:p>
+        </w:tc>
+        <w:tc>
+          <w:tcPr>
+            <w:tcW w:type="dxa" w:w="2880"/>
+          </w:tcPr>
+          <w:p>
+            <w:r/>
+            <w:r>
+              <w:rPr>
+                <w:rFonts w:ascii="Consolas" w:hAnsi="Consolas"/>
+                <w:sz w:val="19"/>
+              </w:rPr>
+              <w:t>POST lao-accounts</w:t>
+            </w:r>
+            <w:r>
+              <w:t xml:space="preserve"> mã </w:t>
+            </w:r>
+            <w:r>
+              <w:rPr>
+                <w:b/>
+              </w:rPr>
+              <w:t>1371</w:t>
+            </w:r>
+            <w:r>
+              <w:t xml:space="preserve">, cha 137, </w:t>
+            </w:r>
+            <w:r>
+              <w:rPr>
+                <w:rFonts w:ascii="Consolas" w:hAnsi="Consolas"/>
+                <w:sz w:val="19"/>
+              </w:rPr>
+              <w:t>Posting=true</w:t>
+            </w:r>
+            <w:r>
+              <w:t>, dư Nợ, tên ລາວ "ສາງສິນຄ້າ, ວັດຖຸ"</w:t>
+            </w:r>
+          </w:p>
+        </w:tc>
+        <w:tc>
+          <w:tcPr>
+            <w:tcW w:type="dxa" w:w="2880"/>
+          </w:tcPr>
+          <w:p>
+            <w:r/>
+            <w:r>
+              <w:t>tài khoản lá</w:t>
+            </w:r>
+          </w:p>
+        </w:tc>
+      </w:tr>
+      <w:tr>
+        <w:tc>
+          <w:tcPr>
+            <w:tcW w:type="dxa" w:w="2880"/>
+          </w:tcPr>
+          <w:p>
+            <w:r/>
+            <w:r>
+              <w:t>3</w:t>
+            </w:r>
+          </w:p>
+        </w:tc>
+        <w:tc>
+          <w:tcPr>
+            <w:tcW w:type="dxa" w:w="2880"/>
+          </w:tcPr>
+          <w:p>
+            <w:r/>
+            <w:r>
+              <w:rPr>
+                <w:rFonts w:ascii="Consolas" w:hAnsi="Consolas"/>
+                <w:sz w:val="19"/>
+              </w:rPr>
+              <w:t>POST lao-accounts/update</w:t>
+            </w:r>
+            <w:r>
+              <w:t xml:space="preserve"> mã </w:t>
+            </w:r>
+            <w:r>
+              <w:rPr>
+                <w:b/>
+              </w:rPr>
+              <w:t>402</w:t>
+            </w:r>
+            <w:r>
+              <w:t xml:space="preserve">, </w:t>
+            </w:r>
+            <w:r>
+              <w:rPr>
+                <w:rFonts w:ascii="Consolas" w:hAnsi="Consolas"/>
+                <w:sz w:val="19"/>
+              </w:rPr>
+              <w:t>Posting=false</w:t>
+            </w:r>
+          </w:p>
+        </w:tc>
+        <w:tc>
+          <w:tcPr>
+            <w:tcW w:type="dxa" w:w="2880"/>
+          </w:tcPr>
+          <w:p>
+            <w:r/>
+            <w:r>
+              <w:t xml:space="preserve">402 thành tài khoản </w:t>
+            </w:r>
+            <w:r>
+              <w:rPr>
+                <w:b/>
+              </w:rPr>
+              <w:t>tổng hợp</w:t>
+            </w:r>
+          </w:p>
+        </w:tc>
+      </w:tr>
+      <w:tr>
+        <w:tc>
+          <w:tcPr>
+            <w:tcW w:type="dxa" w:w="2880"/>
+          </w:tcPr>
+          <w:p>
+            <w:r/>
+            <w:r>
+              <w:t>4</w:t>
+            </w:r>
+          </w:p>
+        </w:tc>
+        <w:tc>
+          <w:tcPr>
+            <w:tcW w:type="dxa" w:w="2880"/>
+          </w:tcPr>
+          <w:p>
+            <w:r/>
+            <w:r>
+              <w:rPr>
+                <w:rFonts w:ascii="Consolas" w:hAnsi="Consolas"/>
+                <w:sz w:val="19"/>
+              </w:rPr>
+              <w:t>POST lao-accounts</w:t>
+            </w:r>
+            <w:r>
+              <w:t xml:space="preserve"> mã </w:t>
+            </w:r>
+            <w:r>
+              <w:rPr>
+                <w:b/>
+              </w:rPr>
+              <w:t>4021</w:t>
+            </w:r>
+            <w:r>
+              <w:t xml:space="preserve"> (ໜີ້ຕ້ອງສົ່ງ ຜູ້ສະໜອງ) và </w:t>
+            </w:r>
+            <w:r>
+              <w:rPr>
+                <w:b/>
+              </w:rPr>
+              <w:t>4022</w:t>
+            </w:r>
+            <w:r>
+              <w:t xml:space="preserve"> (ເຈົ້າໜີ້ເຈົ້າຂອງລົດຮ່ວມ), cha 402, </w:t>
+            </w:r>
+            <w:r>
+              <w:rPr>
+                <w:rFonts w:ascii="Consolas" w:hAnsi="Consolas"/>
+                <w:sz w:val="19"/>
+              </w:rPr>
+              <w:t>Posting=true</w:t>
+            </w:r>
+            <w:r>
+              <w:t>, dư Có</w:t>
+            </w:r>
+          </w:p>
+        </w:tc>
+        <w:tc>
+          <w:tcPr>
+            <w:tcW w:type="dxa" w:w="2880"/>
+          </w:tcPr>
+          <w:p>
+            <w:r/>
+            <w:r>
+              <w:t>tài khoản lá</w:t>
+            </w:r>
+          </w:p>
+        </w:tc>
+      </w:tr>
+    </w:tbl>
+    <w:p/>
+    <w:p>
+      <w:pPr>
+        <w:jc w:val="both"/>
+      </w:pPr>
+      <w:r>
+        <w:t>Kiểm lại:</w:t>
+      </w:r>
+    </w:p>
+    <w:p>
+      <w:pPr>
+        <w:pStyle w:val="ListBullet"/>
+      </w:pPr>
+      <w:r>
+        <w:rPr>
+          <w:rFonts w:ascii="Consolas" w:hAnsi="Consolas"/>
+          <w:sz w:val="19"/>
+        </w:rPr>
+        <w:t>GET cmpayment-receipt/country-accounts?countryId=11</w:t>
+      </w:r>
+      <w:r>
+        <w:t xml:space="preserve"> có đủ 1371, 4021, 4022; không còn 137, 402 (vì đã là tổng hợp).</w:t>
+      </w:r>
+    </w:p>
+    <w:p>
+      <w:pPr>
+        <w:pStyle w:val="ListBullet"/>
+      </w:pPr>
+      <w:r>
+        <w:rPr>
+          <w:rFonts w:ascii="Consolas" w:hAnsi="Consolas"/>
+          <w:sz w:val="19"/>
+        </w:rPr>
+        <w:t>common/country-accounts?tryAutoId=11</w:t>
+      </w:r>
+      <w:r>
+        <w:t xml:space="preserve"> trả </w:t>
+      </w:r>
+      <w:r>
+        <w:rPr>
+          <w:b/>
+        </w:rPr>
+        <w:t>497 mã</w:t>
+      </w:r>
+      <w:r>
+        <w:t xml:space="preserve"> (trước là 494). Bên em đã chụp lại bản dự phòng (</w:t>
+      </w:r>
+      <w:r>
+        <w:rPr>
+          <w:rFonts w:ascii="Consolas" w:hAnsi="Consolas"/>
+          <w:sz w:val="19"/>
+        </w:rPr>
+        <w:t>services/danh_muc_tai_khoan_lao.json</w:t>
+      </w:r>
+      <w:r>
+        <w:t>).</w:t>
+      </w:r>
+    </w:p>
+    <w:p>
+      <w:pPr>
+        <w:jc w:val="both"/>
+      </w:pPr>
+      <w:r>
+        <w:rPr>
+          <w:b/>
+        </w:rPr>
+        <w:t>Ảnh hưởng — anh xem giúp:</w:t>
+      </w:r>
+    </w:p>
+    <w:p>
+      <w:pPr>
+        <w:pStyle w:val="ListBullet"/>
+      </w:pPr>
+      <w:r>
+        <w:t xml:space="preserve">137 và 402 </w:t>
+      </w:r>
+      <w:r>
+        <w:rPr>
+          <w:b/>
+        </w:rPr>
+        <w:t>không ghi sổ trực tiếp được nữa</w:t>
+      </w:r>
+      <w:r>
+        <w:t xml:space="preserve">. Bên em đã tìm trong cả </w:t>
+      </w:r>
+      <w:r>
+        <w:rPr>
+          <w:rFonts w:ascii="Consolas" w:hAnsi="Consolas"/>
+          <w:sz w:val="19"/>
+        </w:rPr>
+        <w:t>GLS-QLSX-APIs</w:t>
+      </w:r>
+      <w:r>
+        <w:t xml:space="preserve"> lẫn </w:t>
+      </w:r>
+      <w:r>
+        <w:rPr>
+          <w:rFonts w:ascii="Consolas" w:hAnsi="Consolas"/>
+          <w:sz w:val="19"/>
+        </w:rPr>
+        <w:t>GLS-QLSX-Web</w:t>
+      </w:r>
+      <w:r>
+        <w:t xml:space="preserve">: không có chỗ nào ghi cứng 137 / 402, ngoài tệp nạp danh mục </w:t>
+      </w:r>
+      <w:r>
+        <w:rPr>
+          <w:rFonts w:ascii="Consolas" w:hAnsi="Consolas"/>
+          <w:sz w:val="19"/>
+        </w:rPr>
+        <w:t>20260909_country_account_import_lao.sql</w:t>
+      </w:r>
+      <w:r>
+        <w:t>. Nếu có thủ tục SQL hay màn cũ nào ghi thẳng 137 / 402 thì sẽ bị từ chối, phải đổi sang 1371 / 4021.</w:t>
+      </w:r>
+    </w:p>
+    <w:p>
+      <w:pPr>
+        <w:pStyle w:val="ListBullet"/>
+      </w:pPr>
+      <w:r>
+        <w:t xml:space="preserve">Muốn trả lại như cũ: xoá 1371, 4021, 4022 (khi chưa có bút toán), rồi </w:t>
+      </w:r>
+      <w:r>
+        <w:rPr>
+          <w:rFonts w:ascii="Consolas" w:hAnsi="Consolas"/>
+          <w:sz w:val="19"/>
+        </w:rPr>
+        <w:t>update</w:t>
+      </w:r>
+      <w:r>
+        <w:t xml:space="preserve"> 137 / 402 với </w:t>
+      </w:r>
+      <w:r>
+        <w:rPr>
+          <w:rFonts w:ascii="Consolas" w:hAnsi="Consolas"/>
+          <w:sz w:val="19"/>
+        </w:rPr>
+        <w:t>Posting=true</w:t>
+      </w:r>
+      <w:r>
+        <w:t>.</w:t>
+      </w:r>
+    </w:p>
+    <w:p>
+      <w:pPr>
+        <w:jc w:val="both"/>
+      </w:pPr>
+      <w:r>
+        <w:rPr>
+          <w:b/>
+        </w:rPr>
+        <w:t>Đã chạy thật</w:t>
+      </w:r>
+      <w:r>
+        <w:t xml:space="preserve"> qua API ở máy (bài thử tự rút phiếu sau khi kiểm):</w:t>
+      </w:r>
+    </w:p>
+    <w:p>
+      <w:pPr>
+        <w:pStyle w:val="ListBullet"/>
+      </w:pPr>
+      <w:r>
+        <w:t xml:space="preserve">tạm ứng xe thuê, phiếu chi "Chi trước" đứng tên chủ xe, Nợ 4022: </w:t>
+      </w:r>
+      <w:r>
+        <w:rPr>
+          <w:rFonts w:ascii="Consolas" w:hAnsi="Consolas"/>
+          <w:sz w:val="19"/>
+        </w:rPr>
+        <w:t>1368-CTR-261001-00013</w:t>
+      </w:r>
+      <w:r>
+        <w:t>;</w:t>
+      </w:r>
+    </w:p>
+    <w:p>
+      <w:pPr>
+        <w:pStyle w:val="ListBullet"/>
+      </w:pPr>
+      <w:r>
+        <w:t xml:space="preserve">trả chủ xe, phiếu chi "Chi khác" 28.359.600 LAK, Nợ 4022 / Có 1021: </w:t>
+      </w:r>
+      <w:r>
+        <w:rPr>
+          <w:rFonts w:ascii="Consolas" w:hAnsi="Consolas"/>
+          <w:sz w:val="19"/>
+        </w:rPr>
+        <w:t>1368-CKH-261001-00001</w:t>
+      </w:r>
+      <w:r>
+        <w:t xml:space="preserve"> và </w:t>
+      </w:r>
+      <w:r>
+        <w:rPr>
+          <w:rFonts w:ascii="Consolas" w:hAnsi="Consolas"/>
+          <w:sz w:val="19"/>
+        </w:rPr>
+        <w:t>…00002</w:t>
+      </w:r>
+      <w:r>
+        <w:t>;</w:t>
+      </w:r>
+    </w:p>
+    <w:p>
+      <w:pPr>
+        <w:pStyle w:val="ListBullet"/>
+      </w:pPr>
+      <w:r>
+        <w:t xml:space="preserve">tạm ứng xe nhà, Nợ 1601: </w:t>
+      </w:r>
+      <w:r>
+        <w:rPr>
+          <w:rFonts w:ascii="Consolas" w:hAnsi="Consolas"/>
+          <w:sz w:val="19"/>
+        </w:rPr>
+        <w:t>1368-CTR-261001-00016</w:t>
+      </w:r>
+      <w:r>
+        <w:t>.</w:t>
+      </w:r>
+    </w:p>
+    <w:p>
+      <w:pPr>
+        <w:pStyle w:val="Heading3"/>
+      </w:pPr>
+      <w:r>
+        <w:t>12.12.2. Bản API đang host KHÔNG dùng chung DB với bản chạy ở máy</w:t>
+      </w:r>
+    </w:p>
+    <w:p>
+      <w:pPr>
+        <w:jc w:val="both"/>
+      </w:pPr>
+      <w:r>
+        <w:t>So cùng một token, cùng ngày 01/10:</w:t>
+      </w:r>
+    </w:p>
+    <w:tbl>
+      <w:tblPr>
+        <w:tblStyle w:val="LightGrid-Accent1"/>
+        <w:tblW w:type="auto" w:w="0"/>
+        <w:tblLook w:firstColumn="1" w:firstRow="1" w:lastColumn="0" w:lastRow="0" w:noHBand="0" w:noVBand="1" w:val="04A0"/>
+      </w:tblPr>
+      <w:tblGrid>
+        <w:gridCol w:w="2880"/>
+        <w:gridCol w:w="2880"/>
+        <w:gridCol w:w="2880"/>
+      </w:tblGrid>
+      <w:tr>
+        <w:tc>
+          <w:tcPr>
+            <w:tcW w:type="dxa" w:w="2880"/>
+          </w:tcPr>
+          <w:p>
+            <w:r>
+              <w:rPr>
+                <w:b/>
+              </w:rPr>
+            </w:r>
+          </w:p>
+        </w:tc>
+        <w:tc>
+          <w:tcPr>
+            <w:tcW w:type="dxa" w:w="2880"/>
+          </w:tcPr>
+          <w:p>
+            <w:r>
+              <w:rPr>
+                <w:b/>
+              </w:rPr>
+            </w:r>
+            <w:r>
+              <w:rPr>
+                <w:b/>
+              </w:rPr>
+              <w:t>API ở máy (</w:t>
+            </w:r>
+            <w:r>
+              <w:rPr>
+                <w:rFonts w:ascii="Consolas" w:hAnsi="Consolas"/>
+                <w:b/>
+                <w:sz w:val="19"/>
+              </w:rPr>
+              <w:t>Env=laos</w:t>
+            </w:r>
+            <w:r>
+              <w:rPr>
+                <w:b/>
+              </w:rPr>
+              <w:t xml:space="preserve">, </w:t>
+            </w:r>
+            <w:r>
+              <w:rPr>
+                <w:rFonts w:ascii="Consolas" w:hAnsi="Consolas"/>
+                <w:b/>
+                <w:sz w:val="19"/>
+              </w:rPr>
+              <w:t>appsettings.laos.json</w:t>
+            </w:r>
+            <w:r>
+              <w:rPr>
+                <w:b/>
+              </w:rPr>
+              <w:t>)</w:t>
+            </w:r>
+          </w:p>
+        </w:tc>
+        <w:tc>
+          <w:tcPr>
+            <w:tcW w:type="dxa" w:w="2880"/>
+          </w:tcPr>
+          <w:p>
+            <w:r>
+              <w:rPr>
+                <w:b/>
+              </w:rPr>
+            </w:r>
+            <w:r>
+              <w:rPr>
+                <w:b/>
+              </w:rPr>
+              <w:t xml:space="preserve">API đang host </w:t>
+            </w:r>
+            <w:r>
+              <w:rPr>
+                <w:rFonts w:ascii="Consolas" w:hAnsi="Consolas"/>
+                <w:b/>
+                <w:sz w:val="19"/>
+              </w:rPr>
+              <w:t>demo-lao-api.goldensme.com</w:t>
+            </w:r>
+          </w:p>
+        </w:tc>
+      </w:tr>
+      <w:tr>
+        <w:tc>
+          <w:tcPr>
+            <w:tcW w:type="dxa" w:w="2880"/>
+          </w:tcPr>
+          <w:p>
+            <w:r/>
+            <w:r>
+              <w:t>Danh mục quốc gia 11</w:t>
+            </w:r>
+          </w:p>
+        </w:tc>
+        <w:tc>
+          <w:tcPr>
+            <w:tcW w:type="dxa" w:w="2880"/>
+          </w:tcPr>
+          <w:p>
+            <w:r/>
+            <w:r>
+              <w:t>497 mã, có 1371/4021/4022, 137 là tổng hợp</w:t>
+            </w:r>
+          </w:p>
+        </w:tc>
+        <w:tc>
+          <w:tcPr>
+            <w:tcW w:type="dxa" w:w="2880"/>
+          </w:tcPr>
+          <w:p>
+            <w:r/>
+            <w:r>
+              <w:t>494 mã, chưa có ba mã, 137 vẫn là tài khoản lá</w:t>
+            </w:r>
+          </w:p>
+        </w:tc>
+      </w:tr>
+      <w:tr>
+        <w:tc>
+          <w:tcPr>
+            <w:tcW w:type="dxa" w:w="2880"/>
+          </w:tcPr>
+          <w:p>
+            <w:r/>
+            <w:r>
+              <w:t xml:space="preserve">Khách </w:t>
+            </w:r>
+            <w:r>
+              <w:rPr>
+                <w:rFonts w:ascii="Consolas" w:hAnsi="Consolas"/>
+                <w:sz w:val="19"/>
+              </w:rPr>
+              <w:t>EPLKH-0834a9e9606b</w:t>
+            </w:r>
+            <w:r>
+              <w:t xml:space="preserve"> (tạo khi gửi SO hôm nay)</w:t>
+            </w:r>
+          </w:p>
+        </w:tc>
+        <w:tc>
+          <w:tcPr>
+            <w:tcW w:type="dxa" w:w="2880"/>
+          </w:tcPr>
+          <w:p>
+            <w:r/>
+            <w:r>
+              <w:t>có (ObjId 1608)</w:t>
+            </w:r>
+          </w:p>
+        </w:tc>
+        <w:tc>
+          <w:tcPr>
+            <w:tcW w:type="dxa" w:w="2880"/>
+          </w:tcPr>
+          <w:p>
+            <w:r/>
+            <w:r>
+              <w:t>không có</w:t>
+            </w:r>
+          </w:p>
+        </w:tc>
+      </w:tr>
+    </w:tbl>
+    <w:p/>
+    <w:p>
+      <w:pPr>
+        <w:jc w:val="both"/>
+      </w:pPr>
+      <w:r>
+        <w:t xml:space="preserve">Nghĩa là mọi thứ bên em thử hôm nay chỉ nằm trong DB mà </w:t>
+      </w:r>
+      <w:r>
+        <w:rPr>
+          <w:rFonts w:ascii="Consolas" w:hAnsi="Consolas"/>
+          <w:sz w:val="19"/>
+        </w:rPr>
+        <w:t>appsettings.laos.json</w:t>
+      </w:r>
+      <w:r>
+        <w:t xml:space="preserve"> trỏ tới:</w:t>
+      </w:r>
+    </w:p>
+    <w:p>
+      <w:pPr>
+        <w:pStyle w:val="ListBullet"/>
+      </w:pPr>
+      <w:r>
+        <w:t xml:space="preserve">SO </w:t>
+      </w:r>
+      <w:r>
+        <w:rPr>
+          <w:rFonts w:ascii="Consolas" w:hAnsi="Consolas"/>
+          <w:sz w:val="19"/>
+        </w:rPr>
+        <w:t>TK-20261001-000162</w:t>
+      </w:r>
+      <w:r>
+        <w:t xml:space="preserve"> và </w:t>
+      </w:r>
+      <w:r>
+        <w:rPr>
+          <w:rFonts w:ascii="Consolas" w:hAnsi="Consolas"/>
+          <w:sz w:val="19"/>
+        </w:rPr>
+        <w:t>…163</w:t>
+      </w:r>
+      <w:r>
+        <w:t>;</w:t>
+      </w:r>
+    </w:p>
+    <w:p>
+      <w:pPr>
+        <w:pStyle w:val="ListBullet"/>
+      </w:pPr>
+      <w:r>
+        <w:t xml:space="preserve">khách </w:t>
+      </w:r>
+      <w:r>
+        <w:rPr>
+          <w:rFonts w:ascii="Consolas" w:hAnsi="Consolas"/>
+          <w:sz w:val="19"/>
+        </w:rPr>
+        <w:t>EPLKH-…</w:t>
+      </w:r>
+      <w:r>
+        <w:t xml:space="preserve">, chủ xe </w:t>
+      </w:r>
+      <w:r>
+        <w:rPr>
+          <w:rFonts w:ascii="Consolas" w:hAnsi="Consolas"/>
+          <w:sz w:val="19"/>
+        </w:rPr>
+        <w:t>EPLCX-…</w:t>
+      </w:r>
+      <w:r>
+        <w:t xml:space="preserve">, tài xế </w:t>
+      </w:r>
+      <w:r>
+        <w:rPr>
+          <w:rFonts w:ascii="Consolas" w:hAnsi="Consolas"/>
+          <w:sz w:val="19"/>
+        </w:rPr>
+        <w:t>EPLTX-…</w:t>
+      </w:r>
+      <w:r>
+        <w:t>;</w:t>
+      </w:r>
+    </w:p>
+    <w:p>
+      <w:pPr>
+        <w:pStyle w:val="ListBullet"/>
+      </w:pPr>
+      <w:r>
+        <w:t>các phiếu chi thử;</w:t>
+      </w:r>
+    </w:p>
+    <w:p>
+      <w:pPr>
+        <w:pStyle w:val="ListBullet"/>
+      </w:pPr>
+      <w:r>
+        <w:t>ba mã tài khoản.</w:t>
+      </w:r>
+    </w:p>
+    <w:p>
+      <w:pPr>
+        <w:jc w:val="both"/>
+      </w:pPr>
+      <w:r>
+        <w:rPr>
+          <w:b/>
+        </w:rPr>
+        <w:t>Khi anh đưa bản mới lên host</w:t>
+      </w:r>
+      <w:r>
+        <w:t>, cần:</w:t>
+      </w:r>
+    </w:p>
+    <w:p>
+      <w:pPr>
+        <w:pStyle w:val="ListNumber"/>
+      </w:pPr>
+      <w:r>
+        <w:t xml:space="preserve">Triển khai code hai nhánh </w:t>
+      </w:r>
+      <w:r>
+        <w:rPr>
+          <w:rFonts w:ascii="Consolas" w:hAnsi="Consolas"/>
+          <w:sz w:val="19"/>
+        </w:rPr>
+        <w:t>feat/HonTunedaHai</w:t>
+      </w:r>
+      <w:r>
+        <w:t xml:space="preserve"> (API) và </w:t>
+      </w:r>
+      <w:r>
+        <w:rPr>
+          <w:rFonts w:ascii="Consolas" w:hAnsi="Consolas"/>
+          <w:sz w:val="19"/>
+        </w:rPr>
+        <w:t>feat/hontunedhai_Laos</w:t>
+      </w:r>
+      <w:r>
+        <w:t xml:space="preserve"> (Web).</w:t>
+      </w:r>
+    </w:p>
+    <w:p>
+      <w:pPr>
+        <w:pStyle w:val="ListNumber"/>
+      </w:pPr>
+      <w:r>
+        <w:t>Mở lại ba mã trên DB của bản host: 4 lệnh như 12.12.1. Bên em có sẵn tệp chạy, đổi địa chỉ là dùng được.</w:t>
+      </w:r>
+    </w:p>
+    <w:p>
+      <w:pPr>
+        <w:pStyle w:val="ListNumber"/>
+      </w:pPr>
+      <w:r>
+        <w:t xml:space="preserve">Đặt </w:t>
+      </w:r>
+      <w:r>
+        <w:rPr>
+          <w:rFonts w:ascii="Consolas" w:hAnsi="Consolas"/>
+          <w:sz w:val="19"/>
+        </w:rPr>
+        <w:t>LogisticsSource</w:t>
+      </w:r>
+      <w:r>
+        <w:t xml:space="preserve"> và </w:t>
+      </w:r>
+      <w:r>
+        <w:rPr>
+          <w:rFonts w:ascii="Consolas" w:hAnsi="Consolas"/>
+          <w:sz w:val="19"/>
+        </w:rPr>
+        <w:t>LogisticsSalesPush</w:t>
+      </w:r>
+      <w:r>
+        <w:t xml:space="preserve"> trong cấu hình của bản host (mục 12.12.3).</w:t>
+      </w:r>
+    </w:p>
+    <w:p>
+      <w:pPr>
+        <w:jc w:val="both"/>
+      </w:pPr>
+      <w:r>
+        <w:t xml:space="preserve">Khách </w:t>
+      </w:r>
+      <w:r>
+        <w:rPr>
+          <w:rFonts w:ascii="Consolas" w:hAnsi="Consolas"/>
+          <w:sz w:val="19"/>
+        </w:rPr>
+        <w:t>EPLKH-…</w:t>
+      </w:r>
+      <w:r>
+        <w:t xml:space="preserve"> không cần chép: lần gửi SO đầu tiên bên em tự tạo.</w:t>
+      </w:r>
+    </w:p>
+    <w:p>
+      <w:pPr>
+        <w:jc w:val="both"/>
+      </w:pPr>
+      <w:r>
+        <w:rPr>
+          <w:b/>
+        </w:rPr>
+        <w:t>Anh cho em biết:</w:t>
+      </w:r>
+      <w:r>
+        <w:t xml:space="preserve"> DB nào là DB chính thức cho Lào? Bản host đang trỏ DB nào?</w:t>
+      </w:r>
+    </w:p>
+    <w:p>
+      <w:pPr>
+        <w:pStyle w:val="Heading3"/>
+      </w:pPr>
+      <w:r>
+        <w:t>12.12.3. Tài khoản tích hợp — làm từng bước</w:t>
+      </w:r>
+    </w:p>
+    <w:p>
+      <w:pPr>
+        <w:jc w:val="both"/>
+      </w:pPr>
+      <w:r>
+        <w:t xml:space="preserve">Để làm gì: trang điều xe gọi API của anh bằng </w:t>
+      </w:r>
+      <w:r>
+        <w:rPr>
+          <w:b/>
+        </w:rPr>
+        <w:t>một tài khoản riêng của hệ thống</w:t>
+      </w:r>
+      <w:r>
+        <w:t>. Hiện bên em đang mượn token cá nhân (</w:t>
+      </w:r>
+      <w:r>
+        <w:rPr>
+          <w:rFonts w:ascii="Consolas" w:hAnsi="Consolas"/>
+          <w:sz w:val="19"/>
+        </w:rPr>
+        <w:t>EPL_ACC_CODE_TOKEN</w:t>
+      </w:r>
+      <w:r>
+        <w:t>). Người đó đổi mật khẩu hay nghỉ việc thì mọi lần gửi đều hỏng, và sổ của anh ghi người tạo phiếu là người đó.</w:t>
+      </w:r>
+    </w:p>
+    <w:p>
+      <w:pPr>
+        <w:jc w:val="both"/>
+      </w:pPr>
+      <w:r>
+        <w:t>Code bên anh làm thế này (bên em đọc từ source):</w:t>
+      </w:r>
+    </w:p>
+    <w:p>
+      <w:pPr>
+        <w:pStyle w:val="ListBullet"/>
+      </w:pPr>
+      <w:r>
+        <w:rPr>
+          <w:b/>
+        </w:rPr>
+        <w:t>Đăng nhập:</w:t>
+      </w:r>
+      <w:r>
+        <w:t xml:space="preserve"> </w:t>
+      </w:r>
+      <w:r>
+        <w:rPr>
+          <w:rFonts w:ascii="Consolas" w:hAnsi="Consolas"/>
+          <w:sz w:val="19"/>
+        </w:rPr>
+        <w:t>POST /api/v1/auth/login {Username, Password, OrgID}</w:t>
+      </w:r>
+      <w:r>
+        <w:t xml:space="preserve"> → thủ tục </w:t>
+      </w:r>
+      <w:r>
+        <w:rPr>
+          <w:rFonts w:ascii="Consolas" w:hAnsi="Consolas"/>
+          <w:sz w:val="19"/>
+        </w:rPr>
+        <w:t>proc_LoginWithUsAndPw</w:t>
+      </w:r>
+      <w:r>
+        <w:t>.</w:t>
+      </w:r>
+    </w:p>
+    <w:p>
+      <w:pPr>
+        <w:pStyle w:val="ListBullet2"/>
+      </w:pPr>
+      <w:r>
+        <w:t>Tên đăng nhập dài 3–20 ký tự.</w:t>
+      </w:r>
+    </w:p>
+    <w:p>
+      <w:pPr>
+        <w:pStyle w:val="ListBullet2"/>
+      </w:pPr>
+      <w:r>
+        <w:t xml:space="preserve">Token sống </w:t>
+      </w:r>
+      <w:r>
+        <w:rPr>
+          <w:b/>
+        </w:rPr>
+        <w:t>30 ngày</w:t>
+      </w:r>
+      <w:r>
+        <w:t xml:space="preserve"> (</w:t>
+      </w:r>
+      <w:r>
+        <w:rPr>
+          <w:rFonts w:ascii="Consolas" w:hAnsi="Consolas"/>
+          <w:sz w:val="19"/>
+        </w:rPr>
+        <w:t>Base/Jwt/JwtService.cs</w:t>
+      </w:r>
+      <w:r>
+        <w:t>), không có refresh token.</w:t>
+      </w:r>
+    </w:p>
+    <w:p>
+      <w:pPr>
+        <w:pStyle w:val="ListBullet2"/>
+      </w:pPr>
+      <w:r>
+        <w:t xml:space="preserve">Mã người dùng nằm ở claim </w:t>
+      </w:r>
+      <w:r>
+        <w:rPr>
+          <w:rFonts w:ascii="Consolas" w:hAnsi="Consolas"/>
+          <w:sz w:val="19"/>
+        </w:rPr>
+        <w:t>UserId</w:t>
+      </w:r>
+      <w:r>
+        <w:t xml:space="preserve"> (= </w:t>
+      </w:r>
+      <w:r>
+        <w:rPr>
+          <w:rFonts w:ascii="Consolas" w:hAnsi="Consolas"/>
+          <w:sz w:val="19"/>
+        </w:rPr>
+        <w:t>dbo.Users.UserID</w:t>
+      </w:r>
+      <w:r>
+        <w:t>).</w:t>
+      </w:r>
+    </w:p>
+    <w:p>
+      <w:pPr>
+        <w:pStyle w:val="ListBullet"/>
+      </w:pPr>
+      <w:r>
+        <w:rPr>
+          <w:b/>
+        </w:rPr>
+        <w:t>Tạo tài khoản:</w:t>
+      </w:r>
+      <w:r>
+        <w:t xml:space="preserve"> </w:t>
+      </w:r>
+      <w:r>
+        <w:rPr>
+          <w:rFonts w:ascii="Consolas" w:hAnsi="Consolas"/>
+          <w:sz w:val="19"/>
+        </w:rPr>
+        <w:t>POST /api/v1/master-data/object-auth/account/upsert</w:t>
+      </w:r>
+      <w:r>
+        <w:t xml:space="preserve"> (</w:t>
+      </w:r>
+      <w:r>
+        <w:rPr>
+          <w:rFonts w:ascii="Consolas" w:hAnsi="Consolas"/>
+          <w:sz w:val="19"/>
+        </w:rPr>
+        <w:t>ObjectAuthController</w:t>
+      </w:r>
+      <w:r>
+        <w:t xml:space="preserve">, thủ tục </w:t>
+      </w:r>
+      <w:r>
+        <w:rPr>
+          <w:rFonts w:ascii="Consolas" w:hAnsi="Consolas"/>
+          <w:sz w:val="19"/>
+        </w:rPr>
+        <w:t>sp_META_InsertUpdate_USERS</w:t>
+      </w:r>
+      <w:r>
+        <w:t>). Màn "Tài khoản" ở hồ sơ nhân viên bên Web chưa nối, nên phải gọi API này.</w:t>
+      </w:r>
+    </w:p>
+    <w:p>
+      <w:pPr>
+        <w:pStyle w:val="ListBullet2"/>
+      </w:pPr>
+      <w:r>
+        <w:rPr>
+          <w:rFonts w:ascii="Consolas" w:hAnsi="Consolas"/>
+          <w:sz w:val="19"/>
+        </w:rPr>
+        <w:t>UserId = null</w:t>
+      </w:r>
+      <w:r>
+        <w:t xml:space="preserve"> để tạo mới;</w:t>
+      </w:r>
+    </w:p>
+    <w:p>
+      <w:pPr>
+        <w:pStyle w:val="ListBullet2"/>
+      </w:pPr>
+      <w:r>
+        <w:rPr>
+          <w:rFonts w:ascii="Consolas" w:hAnsi="Consolas"/>
+          <w:sz w:val="19"/>
+        </w:rPr>
+        <w:t>ObjectAutoId</w:t>
+      </w:r>
+      <w:r>
+        <w:t>: mã nhân viên (</w:t>
+      </w:r>
+      <w:r>
+        <w:rPr>
+          <w:rFonts w:ascii="Consolas" w:hAnsi="Consolas"/>
+          <w:sz w:val="19"/>
+        </w:rPr>
+        <w:t>PUBOBJECT</w:t>
+      </w:r>
+      <w:r>
+        <w:t>), bắt buộc;</w:t>
+      </w:r>
+    </w:p>
+    <w:p>
+      <w:pPr>
+        <w:pStyle w:val="ListBullet2"/>
+      </w:pPr>
+      <w:r>
+        <w:rPr>
+          <w:rFonts w:ascii="Consolas" w:hAnsi="Consolas"/>
+          <w:sz w:val="19"/>
+        </w:rPr>
+        <w:t>UserName</w:t>
+      </w:r>
+      <w:r>
+        <w:t xml:space="preserve">, </w:t>
+      </w:r>
+      <w:r>
+        <w:rPr>
+          <w:rFonts w:ascii="Consolas" w:hAnsi="Consolas"/>
+          <w:sz w:val="19"/>
+        </w:rPr>
+        <w:t>Password</w:t>
+      </w:r>
+      <w:r>
+        <w:t xml:space="preserve">, </w:t>
+      </w:r>
+      <w:r>
+        <w:rPr>
+          <w:rFonts w:ascii="Consolas" w:hAnsi="Consolas"/>
+          <w:sz w:val="19"/>
+        </w:rPr>
+        <w:t>IsActive=true</w:t>
+      </w:r>
+      <w:r>
+        <w:t>;</w:t>
+      </w:r>
+    </w:p>
+    <w:p>
+      <w:pPr>
+        <w:pStyle w:val="ListBullet2"/>
+      </w:pPr>
+      <w:r>
+        <w:rPr>
+          <w:rFonts w:ascii="Consolas" w:hAnsi="Consolas"/>
+          <w:sz w:val="19"/>
+        </w:rPr>
+        <w:t>OrgAutoId</w:t>
+      </w:r>
+      <w:r>
+        <w:t>;</w:t>
+      </w:r>
+    </w:p>
+    <w:p>
+      <w:pPr>
+        <w:pStyle w:val="ListBullet2"/>
+      </w:pPr>
+      <w:r>
+        <w:rPr>
+          <w:rFonts w:ascii="Consolas" w:hAnsi="Consolas"/>
+          <w:sz w:val="19"/>
+        </w:rPr>
+        <w:t>GroupId</w:t>
+      </w:r>
+      <w:r>
+        <w:t xml:space="preserve">: nhóm trong </w:t>
+      </w:r>
+      <w:r>
+        <w:rPr>
+          <w:rFonts w:ascii="Consolas" w:hAnsi="Consolas"/>
+          <w:sz w:val="19"/>
+        </w:rPr>
+        <w:t>dbo.UserGroup</w:t>
+      </w:r>
+      <w:r>
+        <w:t>.</w:t>
+      </w:r>
+    </w:p>
+    <w:p>
+      <w:pPr>
+        <w:pStyle w:val="ListBullet"/>
+      </w:pPr>
+      <w:r>
+        <w:rPr>
+          <w:b/>
+        </w:rPr>
+        <w:t>Gửi SO:</w:t>
+      </w:r>
+      <w:r>
+        <w:t xml:space="preserve"> </w:t>
+      </w:r>
+      <w:r>
+        <w:rPr>
+          <w:rFonts w:ascii="Consolas" w:hAnsi="Consolas"/>
+          <w:sz w:val="19"/>
+        </w:rPr>
+        <w:t>LogisticsSalesPushController</w:t>
+      </w:r>
+      <w:r>
+        <w:t xml:space="preserve"> chỉ nhận người có </w:t>
+      </w:r>
+      <w:r>
+        <w:rPr>
+          <w:rFonts w:ascii="Consolas" w:hAnsi="Consolas"/>
+          <w:sz w:val="19"/>
+        </w:rPr>
+        <w:t>UserId</w:t>
+      </w:r>
+      <w:r>
+        <w:t xml:space="preserve"> nằm trong </w:t>
+      </w:r>
+      <w:r>
+        <w:rPr>
+          <w:rFonts w:ascii="Consolas" w:hAnsi="Consolas"/>
+          <w:sz w:val="19"/>
+        </w:rPr>
+        <w:t>LogisticsSalesPush:AllowedUserIds</w:t>
+      </w:r>
+      <w:r>
+        <w:t xml:space="preserve">. Danh sách rỗng thì ai cũng bị 403. Bản </w:t>
+      </w:r>
+      <w:r>
+        <w:rPr>
+          <w:rFonts w:ascii="Consolas" w:hAnsi="Consolas"/>
+          <w:sz w:val="19"/>
+        </w:rPr>
+        <w:t>laos</w:t>
+      </w:r>
+      <w:r>
+        <w:t xml:space="preserve"> hiện có </w:t>
+      </w:r>
+      <w:r>
+        <w:rPr>
+          <w:rFonts w:ascii="Consolas" w:hAnsi="Consolas"/>
+          <w:sz w:val="19"/>
+        </w:rPr>
+        <w:t>[846]</w:t>
+      </w:r>
+      <w:r>
+        <w:t>.</w:t>
+      </w:r>
+    </w:p>
+    <w:p>
+      <w:pPr>
+        <w:pStyle w:val="ListBullet"/>
+      </w:pPr>
+      <w:r>
+        <w:rPr>
+          <w:b/>
+        </w:rPr>
+        <w:t>Phiếu thu chi, tạo khách / nhà cung cấp / nhân viên, công nợ khách:</w:t>
+      </w:r>
+      <w:r>
+        <w:t xml:space="preserve"> chỉ cần token hợp lệ, không xét quyền theo chức năng. Phiếu ghi người lập là </w:t>
+      </w:r>
+      <w:r>
+        <w:rPr>
+          <w:rFonts w:ascii="Consolas" w:hAnsi="Consolas"/>
+          <w:sz w:val="19"/>
+        </w:rPr>
+        <w:t>ObjectId</w:t>
+      </w:r>
+      <w:r>
+        <w:t xml:space="preserve"> của token.</w:t>
+      </w:r>
+    </w:p>
+    <w:p>
+      <w:pPr>
+        <w:jc w:val="both"/>
+      </w:pPr>
+      <w:r>
+        <w:t>Các bước:</w:t>
+      </w:r>
+    </w:p>
+    <w:p>
+      <w:pPr>
+        <w:pStyle w:val="ListNumber"/>
+      </w:pPr>
+      <w:r>
+        <w:t xml:space="preserve">Tạo (hoặc chọn) một </w:t>
+      </w:r>
+      <w:r>
+        <w:rPr>
+          <w:b/>
+        </w:rPr>
+        <w:t>nhân viên</w:t>
+      </w:r>
+      <w:r>
+        <w:t xml:space="preserve"> tên ví dụ "EPL Logistics (tích hợp)", thuộc chi nhánh </w:t>
+      </w:r>
+      <w:r>
+        <w:rPr>
+          <w:b/>
+        </w:rPr>
+        <w:t>1368</w:t>
+      </w:r>
+      <w:r>
+        <w:t xml:space="preserve"> (Logistics).</w:t>
+      </w:r>
+    </w:p>
+    <w:p>
+      <w:pPr>
+        <w:pStyle w:val="ListNumber"/>
+      </w:pPr>
+      <w:r>
+        <w:t xml:space="preserve">Gọi </w:t>
+      </w:r>
+      <w:r>
+        <w:rPr>
+          <w:rFonts w:ascii="Consolas" w:hAnsi="Consolas"/>
+          <w:sz w:val="19"/>
+        </w:rPr>
+        <w:t>account/upsert</w:t>
+      </w:r>
+      <w:r>
+        <w:t xml:space="preserve"> tạo tài khoản cho nhân viên đó, ví dụ </w:t>
+      </w:r>
+      <w:r>
+        <w:rPr>
+          <w:rFonts w:ascii="Consolas" w:hAnsi="Consolas"/>
+          <w:sz w:val="19"/>
+        </w:rPr>
+        <w:t>UserName = epl_logistics</w:t>
+      </w:r>
+      <w:r>
+        <w:t>, mật khẩu dài.</w:t>
+      </w:r>
+    </w:p>
+    <w:p>
+      <w:pPr>
+        <w:pStyle w:val="ListNumber"/>
+      </w:pPr>
+      <w:r>
+        <w:t xml:space="preserve">Lấy </w:t>
+      </w:r>
+      <w:r>
+        <w:rPr>
+          <w:rFonts w:ascii="Consolas" w:hAnsi="Consolas"/>
+          <w:sz w:val="19"/>
+        </w:rPr>
+        <w:t>UserId</w:t>
+      </w:r>
+      <w:r>
+        <w:t xml:space="preserve">: </w:t>
+      </w:r>
+      <w:r>
+        <w:rPr>
+          <w:rFonts w:ascii="Consolas" w:hAnsi="Consolas"/>
+          <w:sz w:val="19"/>
+        </w:rPr>
+        <w:t>POST /api/v1/hr/employees/account-lookups {UserName}</w:t>
+      </w:r>
+      <w:r>
+        <w:t xml:space="preserve">, hoặc đọc claim </w:t>
+      </w:r>
+      <w:r>
+        <w:rPr>
+          <w:rFonts w:ascii="Consolas" w:hAnsi="Consolas"/>
+          <w:sz w:val="19"/>
+        </w:rPr>
+        <w:t>UserId</w:t>
+      </w:r>
+      <w:r>
+        <w:t xml:space="preserve"> trong token sau khi đăng nhập thử.</w:t>
+      </w:r>
+    </w:p>
+    <w:p>
+      <w:pPr>
+        <w:pStyle w:val="ListNumber"/>
+      </w:pPr>
+      <w:r>
+        <w:t>Trong cấu hình bản host (</w:t>
+      </w:r>
+      <w:r>
+        <w:rPr>
+          <w:rFonts w:ascii="Consolas" w:hAnsi="Consolas"/>
+          <w:sz w:val="19"/>
+        </w:rPr>
+        <w:t>appsettings.&lt;Env&gt;.json</w:t>
+      </w:r>
+      <w:r>
+        <w:t xml:space="preserve">, tệp không đưa lên git), thêm </w:t>
+      </w:r>
+      <w:r>
+        <w:rPr>
+          <w:rFonts w:ascii="Consolas" w:hAnsi="Consolas"/>
+          <w:sz w:val="19"/>
+        </w:rPr>
+        <w:t>UserId</w:t>
+      </w:r>
+      <w:r>
+        <w:t xml:space="preserve"> đó vào </w:t>
+      </w:r>
+      <w:r>
+        <w:rPr>
+          <w:rFonts w:ascii="Consolas" w:hAnsi="Consolas"/>
+          <w:sz w:val="19"/>
+        </w:rPr>
+        <w:t>LogisticsSalesPush:AllowedUserIds</w:t>
+      </w:r>
+      <w:r>
+        <w:t xml:space="preserve"> (giữ </w:t>
+      </w:r>
+      <w:r>
+        <w:rPr>
+          <w:rFonts w:ascii="Consolas" w:hAnsi="Consolas"/>
+          <w:sz w:val="19"/>
+        </w:rPr>
+        <w:t>846</w:t>
+      </w:r>
+      <w:r>
+        <w:t xml:space="preserve"> nếu còn cần), </w:t>
+      </w:r>
+      <w:r>
+        <w:rPr>
+          <w:rFonts w:ascii="Consolas" w:hAnsi="Consolas"/>
+          <w:sz w:val="19"/>
+        </w:rPr>
+        <w:t>Enabled=true</w:t>
+      </w:r>
+      <w:r>
+        <w:t>. Khởi động lại API.</w:t>
+      </w:r>
+    </w:p>
+    <w:p>
+      <w:pPr>
+        <w:pStyle w:val="ListNumber"/>
+      </w:pPr>
+      <w:r>
+        <w:t xml:space="preserve">Bên trang điều xe, trong tệp </w:t>
+      </w:r>
+      <w:r>
+        <w:rPr>
+          <w:rFonts w:ascii="Consolas" w:hAnsi="Consolas"/>
+          <w:sz w:val="19"/>
+        </w:rPr>
+        <w:t>.env</w:t>
+      </w:r>
+      <w:r>
+        <w:t xml:space="preserve"> của máy chủ (không đưa lên git):</w:t>
+      </w:r>
+    </w:p>
+    <w:p>
+      <w:pPr>
+        <w:pStyle w:val="ListBullet2"/>
+      </w:pPr>
+      <w:r>
+        <w:rPr>
+          <w:rFonts w:ascii="Consolas" w:hAnsi="Consolas"/>
+          <w:sz w:val="19"/>
+        </w:rPr>
+        <w:t>QLSX_USERNAME=epl_logistics</w:t>
+      </w:r>
+    </w:p>
+    <w:p>
+      <w:pPr>
+        <w:pStyle w:val="ListBullet2"/>
+      </w:pPr>
+      <w:r>
+        <w:rPr>
+          <w:rFonts w:ascii="Consolas" w:hAnsi="Consolas"/>
+          <w:sz w:val="19"/>
+        </w:rPr>
+        <w:t>QLSX_PASSWORD=&lt;mật khẩu&gt;</w:t>
+      </w:r>
+    </w:p>
+    <w:p>
+      <w:pPr>
+        <w:pStyle w:val="ListBullet2"/>
+      </w:pPr>
+      <w:r>
+        <w:rPr>
+          <w:rFonts w:ascii="Consolas" w:hAnsi="Consolas"/>
+          <w:sz w:val="19"/>
+        </w:rPr>
+        <w:t>QLSX_ORG_ID=1368</w:t>
+      </w:r>
+    </w:p>
+    <w:p>
+      <w:pPr>
+        <w:jc w:val="both"/>
+      </w:pPr>
+      <w:r>
+        <w:t xml:space="preserve">Xoá </w:t>
+      </w:r>
+      <w:r>
+        <w:rPr>
+          <w:rFonts w:ascii="Consolas" w:hAnsi="Consolas"/>
+          <w:sz w:val="19"/>
+        </w:rPr>
+        <w:t>QLSX_ACCESS_TOKEN</w:t>
+      </w:r>
+      <w:r>
+        <w:t xml:space="preserve"> nếu có, vì biến đó được ưu tiên trước. Khởi động lại.</w:t>
+      </w:r>
+    </w:p>
+    <w:p>
+      <w:pPr>
+        <w:pStyle w:val="ListNumber"/>
+      </w:pPr>
+      <w:r>
+        <w:t>Từ đó bên em tự đăng nhập, nhớ token, đăng nhập lại khi token còn dưới 5 phút. Bị 401 cũng đăng nhập lại ngay.</w:t>
+      </w:r>
+    </w:p>
+    <w:p>
+      <w:pPr>
+        <w:jc w:val="both"/>
+      </w:pPr>
+      <w:r>
+        <w:t>Bên em chưa tự tạo tài khoản: đây là tài khoản đăng nhập vào sổ kế toán của anh, mật khẩu phải do anh hoặc chủ dự án giữ.</w:t>
+      </w:r>
+    </w:p>
+    <w:p>
+      <w:pPr>
+        <w:pStyle w:val="Heading3"/>
+      </w:pPr>
+      <w:r>
+        <w:t>12.12.4. Bút toán chi phí thuê xe (*Nợ 621 / Có 4022*) — chưa làm được</w:t>
+      </w:r>
+    </w:p>
+    <w:p>
+      <w:pPr>
+        <w:jc w:val="both"/>
+      </w:pPr>
+      <w:r>
+        <w:t>Chủ dự án đã cho bên em làm. Bên em chưa làm được, vì:</w:t>
+      </w:r>
+    </w:p>
+    <w:p>
+      <w:pPr>
+        <w:pStyle w:val="ListBullet"/>
+      </w:pPr>
+      <w:r>
+        <w:t xml:space="preserve">Trong source </w:t>
+      </w:r>
+      <w:r>
+        <w:rPr>
+          <w:b/>
+        </w:rPr>
+        <w:t>chưa có chứng từ "bút toán tổng hợp"</w:t>
+      </w:r>
+      <w:r>
+        <w:t xml:space="preserve"> (không qua tiền), cả API lẫn Web.</w:t>
+      </w:r>
+    </w:p>
+    <w:p>
+      <w:pPr>
+        <w:pStyle w:val="ListBullet"/>
+      </w:pPr>
+      <w:r>
+        <w:t xml:space="preserve">Sổ cái bên anh đi qua </w:t>
+      </w:r>
+      <w:r>
+        <w:rPr>
+          <w:rFonts w:ascii="Consolas" w:hAnsi="Consolas"/>
+          <w:sz w:val="19"/>
+        </w:rPr>
+        <w:t>PUBDOCUMENT</w:t>
+      </w:r>
+      <w:r>
+        <w:t xml:space="preserve"> + </w:t>
+      </w:r>
+      <w:r>
+        <w:rPr>
+          <w:rFonts w:ascii="Consolas" w:hAnsi="Consolas"/>
+          <w:sz w:val="19"/>
+        </w:rPr>
+        <w:t>PUBENTRY</w:t>
+      </w:r>
+      <w:r>
+        <w:t xml:space="preserve"> rồi thủ tục </w:t>
+      </w:r>
+      <w:r>
+        <w:rPr>
+          <w:rFonts w:ascii="Consolas" w:hAnsi="Consolas"/>
+          <w:sz w:val="19"/>
+        </w:rPr>
+        <w:t>sp_PostTing_GeneralLedger</w:t>
+      </w:r>
+      <w:r>
+        <w:t>. Định nghĩa các thủ tục này chỉ nằm trong DB, không có trong repo.</w:t>
+      </w:r>
+    </w:p>
+    <w:p>
+      <w:pPr>
+        <w:pStyle w:val="ListBullet"/>
+      </w:pPr>
+      <w:r>
+        <w:t>Thủ tục chuyển phiếu tạm sang thật (</w:t>
+      </w:r>
+      <w:r>
+        <w:rPr>
+          <w:rFonts w:ascii="Consolas" w:hAnsi="Consolas"/>
+          <w:sz w:val="19"/>
+        </w:rPr>
+        <w:t>SP_CM_MOVETEMPTOREAL_*</w:t>
+      </w:r>
+      <w:r>
+        <w:t>) là riêng của phiếu thu chi.</w:t>
+      </w:r>
+    </w:p>
+    <w:p>
+      <w:pPr>
+        <w:pStyle w:val="ListBullet"/>
+      </w:pPr>
+      <w:r>
+        <w:t>Đoán cấu trúc để ghi thẳng vào sổ cái thì rủi ro sai sổ, nên bên em không làm.</w:t>
+      </w:r>
+    </w:p>
+    <w:p>
+      <w:pPr>
+        <w:jc w:val="both"/>
+      </w:pPr>
+      <w:r>
+        <w:rPr>
+          <w:b/>
+        </w:rPr>
+        <w:t>Đề nghị</w:t>
+      </w:r>
+      <w:r>
+        <w:t xml:space="preserve"> (anh duyệt, hoặc cho bên em định nghĩa thủ tục ghi chứng từ kế toán khác — </w:t>
+      </w:r>
+      <w:r>
+        <w:rPr>
+          <w:rFonts w:ascii="Consolas" w:hAnsi="Consolas"/>
+          <w:sz w:val="19"/>
+        </w:rPr>
+        <w:t>DOC_OFSYSTEM</w:t>
+      </w:r>
+      <w:r>
+        <w:t xml:space="preserve"> / loại chứng từ, thủ tục chuyển tạm sang thật — là bên em làm tiếp):</w:t>
+      </w:r>
+    </w:p>
+    <w:p>
+      <w:pPr>
+        <w:spacing w:after="0"/>
+        <w:ind w:left="360"/>
+      </w:pPr>
+      <w:r>
+        <w:rPr>
+          <w:rFonts w:ascii="Consolas" w:hAnsi="Consolas"/>
+          <w:sz w:val="18"/>
+        </w:rPr>
+        <w:t>POST /api/v1/integrations/logistics/journal-entries        (Idempotency-Key = SourceRef)</w:t>
+      </w:r>
+    </w:p>
+    <w:p>
+      <w:pPr>
+        <w:spacing w:after="0"/>
+        <w:ind w:left="360"/>
+      </w:pPr>
+      <w:r>
+        <w:rPr>
+          <w:rFonts w:ascii="Consolas" w:hAnsi="Consolas"/>
+          <w:sz w:val="18"/>
+        </w:rPr>
+        <w:t>{</w:t>
+      </w:r>
+    </w:p>
+    <w:p>
+      <w:pPr>
+        <w:spacing w:after="0"/>
+        <w:ind w:left="360"/>
+      </w:pPr>
+      <w:r>
+        <w:rPr>
+          <w:rFonts w:ascii="Consolas" w:hAnsi="Consolas"/>
+          <w:sz w:val="18"/>
+        </w:rPr>
+        <w:t>"SourceRef": "EPLLAO-HIRE-&lt;trip_id&gt;",        // một DO xe thuê một bút toán; gửi lại không ghi hai lần</w:t>
+      </w:r>
+    </w:p>
+    <w:p>
+      <w:pPr>
+        <w:spacing w:after="0"/>
+        <w:ind w:left="360"/>
+      </w:pPr>
+      <w:r>
+        <w:rPr>
+          <w:rFonts w:ascii="Consolas" w:hAnsi="Consolas"/>
+          <w:sz w:val="18"/>
+        </w:rPr>
+        <w:t>"DocumentDate": "2026-10-01", "CountryId": 11, "OrgId": 1368,</w:t>
+      </w:r>
+    </w:p>
+    <w:p>
+      <w:pPr>
+        <w:spacing w:after="0"/>
+        <w:ind w:left="360"/>
+      </w:pPr>
+      <w:r>
+        <w:rPr>
+          <w:rFonts w:ascii="Consolas" w:hAnsi="Consolas"/>
+          <w:sz w:val="18"/>
+        </w:rPr>
+        <w:t>"Description": "Chi phí thuê xe liên kết T4-0442-09/EPL",</w:t>
+      </w:r>
+    </w:p>
+    <w:p>
+      <w:pPr>
+        <w:spacing w:after="0"/>
+        <w:ind w:left="360"/>
+      </w:pPr>
+      <w:r>
+        <w:rPr>
+          <w:rFonts w:ascii="Consolas" w:hAnsi="Consolas"/>
+          <w:sz w:val="18"/>
+        </w:rPr>
+        <w:t>"Lines": [{ "DebitAccount": "621", "CreditAccount": "4022", "Amount": 28940400,</w:t>
+      </w:r>
+    </w:p>
+    <w:p>
+      <w:pPr>
+        <w:spacing w:after="0"/>
+        <w:ind w:left="360"/>
+      </w:pPr>
+      <w:r>
+        <w:rPr>
+          <w:rFonts w:ascii="Consolas" w:hAnsi="Consolas"/>
+          <w:sz w:val="18"/>
+        </w:rPr>
+        <w:t>"CurrencyId": 26, "ObjectId": &lt;nhà cung cấp EPLCX-…&gt;, "CostObject": "&lt;mã DO&gt;" }]</w:t>
+      </w:r>
+    </w:p>
+    <w:p>
+      <w:pPr>
+        <w:spacing w:after="0"/>
+        <w:ind w:left="360"/>
+      </w:pPr>
+      <w:r>
+        <w:rPr>
+          <w:rFonts w:ascii="Consolas" w:hAnsi="Consolas"/>
+          <w:sz w:val="18"/>
+        </w:rPr>
+        <w:t>}</w:t>
+      </w:r>
+    </w:p>
+    <w:p>
+      <w:pPr>
+        <w:spacing w:after="0"/>
+        <w:ind w:left="360"/>
+      </w:pPr>
+      <w:r>
+        <w:rPr>
+          <w:rFonts w:ascii="Consolas" w:hAnsi="Consolas"/>
+          <w:sz w:val="18"/>
+        </w:rPr>
+        <w:t>→ { "DocumentId", "DocumentNo", "Status": 12 }</w:t>
+      </w:r>
+    </w:p>
+    <w:p>
+      <w:pPr>
+        <w:spacing w:after="0"/>
+        <w:ind w:left="360"/>
+      </w:pPr>
+      <w:r>
+        <w:rPr>
+          <w:rFonts w:ascii="Consolas" w:hAnsi="Consolas"/>
+          <w:sz w:val="18"/>
+        </w:rPr>
+        <w:t>POST /api/v1/integrations/logistics/journal-entries/reverse  { "SourceRef" }   // khi bên em mở khoá phiếu</w:t>
+      </w:r>
+    </w:p>
+    <w:p/>
+    <w:p>
+      <w:pPr>
+        <w:jc w:val="both"/>
+      </w:pPr>
+      <w:r>
+        <w:t xml:space="preserve">Bên em đã có sẵn số liệu: </w:t>
+      </w:r>
+      <w:r>
+        <w:rPr>
+          <w:rFonts w:ascii="Consolas" w:hAnsi="Consolas"/>
+          <w:sz w:val="19"/>
+        </w:rPr>
+        <w:t>hire.amount</w:t>
+      </w:r>
+      <w:r>
+        <w:t xml:space="preserve"> và </w:t>
+      </w:r>
+      <w:r>
+        <w:rPr>
+          <w:rFonts w:ascii="Consolas" w:hAnsi="Consolas"/>
+          <w:sz w:val="19"/>
+        </w:rPr>
+        <w:t>hire.acc_code = "621/4022"</w:t>
+      </w:r>
+      <w:r>
+        <w:t xml:space="preserve"> trong gói bàn giao DO (mục 10). Có đường này thì lúc khoá phiếu xe thuê bên em gửi luôn, mở khoá thì gửi đảo.</w:t>
+      </w:r>
+    </w:p>
     <w:sectPr>
       <w:pgSz w:w="12240" w:h="15840"/>
       <w:pgMar w:top="1440" w:right="1800" w:bottom="1440" w:left="1800" w:header="720" w:footer="720" w:gutter="0"/>

</xml_diff>

<commit_message>
Tài liệu anh Tune: bản host chưa merge — làm ở máy, triển khai xong đổi link; tổng hợp bàn giao
- 12.12.2 viết lại: bảng đổi link hai bên, một lệnh kiểm lúc triển khai (497 / 494 mã)
- 12.12.3 / 12.12.4: trạng thái tài khoản tích hợp và bút toán thuê xe
- TONG_HOP_BAN_GIAO_ANH_TUNE (md + Word): một trang đọc trước
- tools/mo_ma_con_tune.py: mở 1371/4021/4022 qua lao-accounts, nhận địa chỉ API

Co-Authored-By: Claude Opus 5.5 (1M context) <noreply@anthropic.com>
</commit_message>
<xml_diff>
--- a/DOCS/word/HOP_DONG_API_KE_TOAN_ANH_TUNE.docx
+++ b/DOCS/word/HOP_DONG_API_KE_TOAN_ANH_TUNE.docx
@@ -94,10 +94,10 @@
         <w:rPr>
           <w:b/>
         </w:rPr>
-        <w:t>Bản host không dùng chung DB</w:t>
-      </w:r>
-      <w:r>
-        <w:t xml:space="preserve"> với bản chạy ở máy: lúc đưa lên host phải mở lại ba mã trên DB đó.</w:t>
+        <w:t>Bản host chưa merge code mới:</w:t>
+      </w:r>
+      <w:r>
+        <w:t xml:space="preserve"> bên em làm ở máy, anh triển khai xong thì đổi link (bảng ở 12.12.2) và kiểm một lệnh.</w:t>
       </w:r>
     </w:p>
     <w:p>
@@ -32187,7 +32187,7 @@
         <w:pStyle w:val="Heading3"/>
       </w:pPr>
       <w:r>
-        <w:t>12.12.2. Bản API đang host KHÔNG dùng chung DB với bản chạy ở máy</w:t>
+        <w:t>12.12.2. Bản host chưa có code mới — làm ở máy, triển khai xong đổi link</w:t>
       </w:r>
     </w:p>
     <w:p>
@@ -32195,7 +32195,43 @@
         <w:jc w:val="both"/>
       </w:pPr>
       <w:r>
-        <w:t>So cùng một token, cùng ngày 01/10:</w:t>
+        <w:t xml:space="preserve">Chủ dự án chốt 01/10: </w:t>
+      </w:r>
+      <w:r>
+        <w:rPr>
+          <w:rFonts w:ascii="Consolas" w:hAnsi="Consolas"/>
+          <w:sz w:val="19"/>
+        </w:rPr>
+        <w:t>demo-lao-api.goldensme.com</w:t>
+      </w:r>
+      <w:r>
+        <w:t xml:space="preserve"> </w:t>
+      </w:r>
+      <w:r>
+        <w:rPr>
+          <w:b/>
+        </w:rPr>
+        <w:t>chưa merge</w:t>
+      </w:r>
+      <w:r>
+        <w:t xml:space="preserve"> code hai nhánh. Bên em làm và thử mọi thứ trên API chạy ở máy; anh triển khai xong thì </w:t>
+      </w:r>
+      <w:r>
+        <w:rPr>
+          <w:b/>
+        </w:rPr>
+        <w:t>chỉ đổi link</w:t>
+      </w:r>
+      <w:r>
+        <w:t>.</w:t>
+      </w:r>
+    </w:p>
+    <w:p>
+      <w:pPr>
+        <w:jc w:val="both"/>
+      </w:pPr>
+      <w:r>
+        <w:t>Hôm nay gọi cùng một token, hai bản trả khác nhau:</w:t>
       </w:r>
     </w:p>
     <w:tbl>
@@ -32250,47 +32286,25 @@
               <w:rPr>
                 <w:b/>
               </w:rPr>
-              <w:t xml:space="preserve">, </w:t>
-            </w:r>
-            <w:r>
-              <w:rPr>
-                <w:rFonts w:ascii="Consolas" w:hAnsi="Consolas"/>
+              <w:t>)</w:t>
+            </w:r>
+          </w:p>
+        </w:tc>
+        <w:tc>
+          <w:tcPr>
+            <w:tcW w:type="dxa" w:w="2880"/>
+          </w:tcPr>
+          <w:p>
+            <w:r>
+              <w:rPr>
                 <w:b/>
-                <w:sz w:val="19"/>
-              </w:rPr>
-              <w:t>appsettings.laos.json</w:t>
+              </w:rPr>
             </w:r>
             <w:r>
               <w:rPr>
                 <w:b/>
               </w:rPr>
-              <w:t>)</w:t>
-            </w:r>
-          </w:p>
-        </w:tc>
-        <w:tc>
-          <w:tcPr>
-            <w:tcW w:type="dxa" w:w="2880"/>
-          </w:tcPr>
-          <w:p>
-            <w:r>
-              <w:rPr>
-                <w:b/>
-              </w:rPr>
-            </w:r>
-            <w:r>
-              <w:rPr>
-                <w:b/>
-              </w:rPr>
-              <w:t xml:space="preserve">API đang host </w:t>
-            </w:r>
-            <w:r>
-              <w:rPr>
-                <w:rFonts w:ascii="Consolas" w:hAnsi="Consolas"/>
-                <w:b/>
-                <w:sz w:val="19"/>
-              </w:rPr>
-              <w:t>demo-lao-api.goldensme.com</w:t>
+              <w:t>API đang host</w:t>
             </w:r>
           </w:p>
         </w:tc>
@@ -32325,7 +32339,7 @@
           <w:p>
             <w:r/>
             <w:r>
-              <w:t>494 mã, chưa có ba mã, 137 vẫn là tài khoản lá</w:t>
+              <w:t>494 mã, chưa có ba mã</w:t>
             </w:r>
           </w:p>
         </w:tc>
@@ -32348,7 +32362,14 @@
               <w:t>EPLKH-0834a9e9606b</w:t>
             </w:r>
             <w:r>
-              <w:t xml:space="preserve"> (tạo khi gửi SO hôm nay)</w:t>
+              <w:t xml:space="preserve"> (ObjId 1608) và SO </w:t>
+            </w:r>
+            <w:r>
+              <w:rPr>
+                <w:rFonts w:ascii="Consolas" w:hAnsi="Consolas"/>
+                <w:sz w:val="19"/>
+              </w:rPr>
+              <w:t>TK-20261001-000162</w:t>
             </w:r>
           </w:p>
         </w:tc>
@@ -32359,7 +32380,7 @@
           <w:p>
             <w:r/>
             <w:r>
-              <w:t>có (ObjId 1608)</w:t>
+              <w:t>có</w:t>
             </w:r>
           </w:p>
         </w:tc>
@@ -32370,7 +32391,7 @@
           <w:p>
             <w:r/>
             <w:r>
-              <w:t>không có</w:t>
+              <w:t>không thấy</w:t>
             </w:r>
           </w:p>
         </w:tc>
@@ -32382,17 +32403,504 @@
         <w:jc w:val="both"/>
       </w:pPr>
       <w:r>
-        <w:t xml:space="preserve">Nghĩa là mọi thứ bên em thử hôm nay chỉ nằm trong DB mà </w:t>
+        <w:t>Khác vì host chạy code cũ, hoặc host trỏ DB khác. Bên em không xem được cấu hình của host; lệnh kiểm ở dưới trả lời câu này.</w:t>
+      </w:r>
+    </w:p>
+    <w:tbl>
+      <w:tblPr>
+        <w:tblStyle w:val="LightGrid-Accent1"/>
+        <w:tblW w:type="auto" w:w="0"/>
+        <w:tblLook w:firstColumn="1" w:firstRow="1" w:lastColumn="0" w:lastRow="0" w:noHBand="0" w:noVBand="1" w:val="04A0"/>
+      </w:tblPr>
+      <w:tblGrid>
+        <w:gridCol w:w="2160"/>
+        <w:gridCol w:w="2160"/>
+        <w:gridCol w:w="2160"/>
+        <w:gridCol w:w="2160"/>
+      </w:tblGrid>
+      <w:tr>
+        <w:tc>
+          <w:tcPr>
+            <w:tcW w:type="dxa" w:w="2160"/>
+          </w:tcPr>
+          <w:p>
+            <w:r>
+              <w:rPr>
+                <w:b/>
+              </w:rPr>
+            </w:r>
+            <w:r>
+              <w:rPr>
+                <w:b/>
+              </w:rPr>
+              <w:t>Bên</w:t>
+            </w:r>
+          </w:p>
+        </w:tc>
+        <w:tc>
+          <w:tcPr>
+            <w:tcW w:type="dxa" w:w="2160"/>
+          </w:tcPr>
+          <w:p>
+            <w:r>
+              <w:rPr>
+                <w:b/>
+              </w:rPr>
+            </w:r>
+            <w:r>
+              <w:rPr>
+                <w:b/>
+              </w:rPr>
+              <w:t>Khoá</w:t>
+            </w:r>
+          </w:p>
+        </w:tc>
+        <w:tc>
+          <w:tcPr>
+            <w:tcW w:type="dxa" w:w="2160"/>
+          </w:tcPr>
+          <w:p>
+            <w:r>
+              <w:rPr>
+                <w:b/>
+              </w:rPr>
+            </w:r>
+            <w:r>
+              <w:rPr>
+                <w:b/>
+              </w:rPr>
+              <w:t>Lúc thử (bây giờ)</w:t>
+            </w:r>
+          </w:p>
+        </w:tc>
+        <w:tc>
+          <w:tcPr>
+            <w:tcW w:type="dxa" w:w="2160"/>
+          </w:tcPr>
+          <w:p>
+            <w:r>
+              <w:rPr>
+                <w:b/>
+              </w:rPr>
+            </w:r>
+            <w:r>
+              <w:rPr>
+                <w:b/>
+              </w:rPr>
+              <w:t>Sau khi anh triển khai</w:t>
+            </w:r>
+          </w:p>
+        </w:tc>
+      </w:tr>
+      <w:tr>
+        <w:tc>
+          <w:tcPr>
+            <w:tcW w:type="dxa" w:w="2160"/>
+          </w:tcPr>
+          <w:p>
+            <w:r/>
+            <w:r>
+              <w:t>Trang điều xe, máy thử 8011</w:t>
+            </w:r>
+          </w:p>
+        </w:tc>
+        <w:tc>
+          <w:tcPr>
+            <w:tcW w:type="dxa" w:w="2160"/>
+          </w:tcPr>
+          <w:p>
+            <w:r/>
+            <w:r>
+              <w:rPr>
+                <w:rFonts w:ascii="Consolas" w:hAnsi="Consolas"/>
+                <w:sz w:val="19"/>
+              </w:rPr>
+              <w:t>QLSX_BASE_URL</w:t>
+            </w:r>
+          </w:p>
+        </w:tc>
+        <w:tc>
+          <w:tcPr>
+            <w:tcW w:type="dxa" w:w="2160"/>
+          </w:tcPr>
+          <w:p>
+            <w:r/>
+            <w:r>
+              <w:rPr>
+                <w:rFonts w:ascii="Consolas" w:hAnsi="Consolas"/>
+                <w:sz w:val="19"/>
+              </w:rPr>
+              <w:t>http://127.0.0.1:5090</w:t>
+            </w:r>
+            <w:r>
+              <w:t xml:space="preserve"> (API ở máy)</w:t>
+            </w:r>
+          </w:p>
+        </w:tc>
+        <w:tc>
+          <w:tcPr>
+            <w:tcW w:type="dxa" w:w="2160"/>
+          </w:tcPr>
+          <w:p>
+            <w:r/>
+            <w:r>
+              <w:t>bỏ đi → về host</w:t>
+            </w:r>
+          </w:p>
+        </w:tc>
+      </w:tr>
+      <w:tr>
+        <w:tc>
+          <w:tcPr>
+            <w:tcW w:type="dxa" w:w="2160"/>
+          </w:tcPr>
+          <w:p>
+            <w:r/>
+            <w:r>
+              <w:t>Trang điều xe, máy thật 8020</w:t>
+            </w:r>
+          </w:p>
+        </w:tc>
+        <w:tc>
+          <w:tcPr>
+            <w:tcW w:type="dxa" w:w="2160"/>
+          </w:tcPr>
+          <w:p>
+            <w:r/>
+            <w:r>
+              <w:rPr>
+                <w:rFonts w:ascii="Consolas" w:hAnsi="Consolas"/>
+                <w:sz w:val="19"/>
+              </w:rPr>
+              <w:t>QLSX_BASE_URL</w:t>
+            </w:r>
+          </w:p>
+        </w:tc>
+        <w:tc>
+          <w:tcPr>
+            <w:tcW w:type="dxa" w:w="2160"/>
+          </w:tcPr>
+          <w:p>
+            <w:r/>
+            <w:r>
+              <w:t xml:space="preserve">không đặt → dùng máy của </w:t>
+            </w:r>
+            <w:r>
+              <w:rPr>
+                <w:rFonts w:ascii="Consolas" w:hAnsi="Consolas"/>
+                <w:sz w:val="19"/>
+              </w:rPr>
+              <w:t>EPL_ACC_CODE_API</w:t>
+            </w:r>
+            <w:r>
+              <w:t xml:space="preserve"> = </w:t>
+            </w:r>
+            <w:r>
+              <w:rPr>
+                <w:rFonts w:ascii="Consolas" w:hAnsi="Consolas"/>
+                <w:sz w:val="19"/>
+              </w:rPr>
+              <w:t>https://demo-lao-api.goldensme.com</w:t>
+            </w:r>
+          </w:p>
+        </w:tc>
+        <w:tc>
+          <w:tcPr>
+            <w:tcW w:type="dxa" w:w="2160"/>
+          </w:tcPr>
+          <w:p>
+            <w:r/>
+            <w:r>
+              <w:t>giữ nguyên — tự gọi bản mới</w:t>
+            </w:r>
+          </w:p>
+        </w:tc>
+      </w:tr>
+      <w:tr>
+        <w:tc>
+          <w:tcPr>
+            <w:tcW w:type="dxa" w:w="2160"/>
+          </w:tcPr>
+          <w:p>
+            <w:r/>
+            <w:r>
+              <w:t>API anh, cấu hình host</w:t>
+            </w:r>
+          </w:p>
+        </w:tc>
+        <w:tc>
+          <w:tcPr>
+            <w:tcW w:type="dxa" w:w="2160"/>
+          </w:tcPr>
+          <w:p>
+            <w:r/>
+            <w:r>
+              <w:rPr>
+                <w:rFonts w:ascii="Consolas" w:hAnsi="Consolas"/>
+                <w:sz w:val="19"/>
+              </w:rPr>
+              <w:t>LogisticsSource:BaseUrl</w:t>
+            </w:r>
+          </w:p>
+        </w:tc>
+        <w:tc>
+          <w:tcPr>
+            <w:tcW w:type="dxa" w:w="2160"/>
+          </w:tcPr>
+          <w:p>
+            <w:r/>
+            <w:r>
+              <w:t xml:space="preserve">máy thử </w:t>
+            </w:r>
+            <w:r>
+              <w:rPr>
+                <w:rFonts w:ascii="Consolas" w:hAnsi="Consolas"/>
+                <w:sz w:val="19"/>
+              </w:rPr>
+              <w:t>http://127.0.0.1:8011/api/</w:t>
+            </w:r>
+          </w:p>
+        </w:tc>
+        <w:tc>
+          <w:tcPr>
+            <w:tcW w:type="dxa" w:w="2160"/>
+          </w:tcPr>
+          <w:p>
+            <w:r/>
+            <w:r>
+              <w:t xml:space="preserve">địa chỉ </w:t>
+            </w:r>
+            <w:r>
+              <w:rPr>
+                <w:rFonts w:ascii="Consolas" w:hAnsi="Consolas"/>
+                <w:sz w:val="19"/>
+              </w:rPr>
+              <w:t>/api/</w:t>
+            </w:r>
+            <w:r>
+              <w:t xml:space="preserve"> của trang điều xe thật</w:t>
+            </w:r>
+          </w:p>
+        </w:tc>
+      </w:tr>
+      <w:tr>
+        <w:tc>
+          <w:tcPr>
+            <w:tcW w:type="dxa" w:w="2160"/>
+          </w:tcPr>
+          <w:p>
+            <w:r/>
+            <w:r>
+              <w:t>API anh, cấu hình host</w:t>
+            </w:r>
+          </w:p>
+        </w:tc>
+        <w:tc>
+          <w:tcPr>
+            <w:tcW w:type="dxa" w:w="2160"/>
+          </w:tcPr>
+          <w:p>
+            <w:r/>
+            <w:r>
+              <w:rPr>
+                <w:rFonts w:ascii="Consolas" w:hAnsi="Consolas"/>
+                <w:sz w:val="19"/>
+              </w:rPr>
+              <w:t>LogisticsSource:ApiKey</w:t>
+            </w:r>
+          </w:p>
+        </w:tc>
+        <w:tc>
+          <w:tcPr>
+            <w:tcW w:type="dxa" w:w="2160"/>
+          </w:tcPr>
+          <w:p>
+            <w:r/>
+            <w:r>
+              <w:t>khoá của máy thử</w:t>
+            </w:r>
+          </w:p>
+        </w:tc>
+        <w:tc>
+          <w:tcPr>
+            <w:tcW w:type="dxa" w:w="2160"/>
+          </w:tcPr>
+          <w:p>
+            <w:r/>
+            <w:r>
+              <w:t>khoá Sếp tạo ở trang điều xe thật (</w:t>
+            </w:r>
+            <w:r>
+              <w:rPr>
+                <w:rFonts w:ascii="Consolas" w:hAnsi="Consolas"/>
+                <w:sz w:val="19"/>
+              </w:rPr>
+              <w:t>POST /api/handover/tao-khoa</w:t>
+            </w:r>
+            <w:r>
+              <w:t>)</w:t>
+            </w:r>
+          </w:p>
+        </w:tc>
+      </w:tr>
+      <w:tr>
+        <w:tc>
+          <w:tcPr>
+            <w:tcW w:type="dxa" w:w="2160"/>
+          </w:tcPr>
+          <w:p>
+            <w:r/>
+            <w:r>
+              <w:t>API anh, cấu hình host</w:t>
+            </w:r>
+          </w:p>
+        </w:tc>
+        <w:tc>
+          <w:tcPr>
+            <w:tcW w:type="dxa" w:w="2160"/>
+          </w:tcPr>
+          <w:p>
+            <w:r/>
+            <w:r>
+              <w:rPr>
+                <w:rFonts w:ascii="Consolas" w:hAnsi="Consolas"/>
+                <w:sz w:val="19"/>
+              </w:rPr>
+              <w:t>LogisticsSalesPush:AllowedUserIds</w:t>
+            </w:r>
+          </w:p>
+        </w:tc>
+        <w:tc>
+          <w:tcPr>
+            <w:tcW w:type="dxa" w:w="2160"/>
+          </w:tcPr>
+          <w:p>
+            <w:r/>
+            <w:r>
+              <w:rPr>
+                <w:rFonts w:ascii="Consolas" w:hAnsi="Consolas"/>
+                <w:sz w:val="19"/>
+              </w:rPr>
+              <w:t>[846]</w:t>
+            </w:r>
+            <w:r>
+              <w:t xml:space="preserve"> (+ tài khoản tích hợp ở máy)</w:t>
+            </w:r>
+          </w:p>
+        </w:tc>
+        <w:tc>
+          <w:tcPr>
+            <w:tcW w:type="dxa" w:w="2160"/>
+          </w:tcPr>
+          <w:p>
+            <w:r/>
+            <w:r>
+              <w:t xml:space="preserve">thêm </w:t>
+            </w:r>
+            <w:r>
+              <w:rPr>
+                <w:rFonts w:ascii="Consolas" w:hAnsi="Consolas"/>
+                <w:sz w:val="19"/>
+              </w:rPr>
+              <w:t>UserId</w:t>
+            </w:r>
+            <w:r>
+              <w:t xml:space="preserve"> tài khoản tích hợp trên host</w:t>
+            </w:r>
+          </w:p>
+        </w:tc>
+      </w:tr>
+      <w:tr>
+        <w:tc>
+          <w:tcPr>
+            <w:tcW w:type="dxa" w:w="2160"/>
+          </w:tcPr>
+          <w:p>
+            <w:r/>
+            <w:r>
+              <w:t>WEB anh</w:t>
+            </w:r>
+          </w:p>
+        </w:tc>
+        <w:tc>
+          <w:tcPr>
+            <w:tcW w:type="dxa" w:w="2160"/>
+          </w:tcPr>
+          <w:p>
+            <w:r/>
+            <w:r>
+              <w:rPr>
+                <w:rFonts w:ascii="Consolas" w:hAnsi="Consolas"/>
+                <w:sz w:val="19"/>
+              </w:rPr>
+              <w:t>BACKOFFICE_API_URL</w:t>
+            </w:r>
+          </w:p>
+        </w:tc>
+        <w:tc>
+          <w:tcPr>
+            <w:tcW w:type="dxa" w:w="2160"/>
+          </w:tcPr>
+          <w:p>
+            <w:r/>
+            <w:r>
+              <w:t xml:space="preserve">bản ở máy dùng </w:t>
+            </w:r>
+            <w:r>
+              <w:rPr>
+                <w:rFonts w:ascii="Consolas" w:hAnsi="Consolas"/>
+                <w:sz w:val="19"/>
+              </w:rPr>
+              <w:t>Env=laoslocal</w:t>
+            </w:r>
+            <w:r>
+              <w:t xml:space="preserve"> trỏ 5090</w:t>
+            </w:r>
+          </w:p>
+        </w:tc>
+        <w:tc>
+          <w:tcPr>
+            <w:tcW w:type="dxa" w:w="2160"/>
+          </w:tcPr>
+          <w:p>
+            <w:r/>
+            <w:r>
+              <w:rPr>
+                <w:rFonts w:ascii="Consolas" w:hAnsi="Consolas"/>
+                <w:sz w:val="19"/>
+              </w:rPr>
+              <w:t>Env=laos</w:t>
+            </w:r>
+            <w:r>
+              <w:t xml:space="preserve"> trỏ API host (đã đúng sẵn)</w:t>
+            </w:r>
+          </w:p>
+        </w:tc>
+      </w:tr>
+    </w:tbl>
+    <w:p/>
+    <w:p>
+      <w:pPr>
+        <w:jc w:val="both"/>
+      </w:pPr>
+      <w:r>
+        <w:rPr>
+          <w:b/>
+        </w:rPr>
+        <w:t>Kiểm một lệnh lúc triển khai:</w:t>
+      </w:r>
+      <w:r>
+        <w:t xml:space="preserve"> </w:t>
       </w:r>
       <w:r>
         <w:rPr>
           <w:rFonts w:ascii="Consolas" w:hAnsi="Consolas"/>
           <w:sz w:val="19"/>
         </w:rPr>
-        <w:t>appsettings.laos.json</w:t>
-      </w:r>
-      <w:r>
-        <w:t xml:space="preserve"> trỏ tới:</w:t>
+        <w:t>GET &lt;host&gt;/api/v1/common/country-accounts?tryAutoId=11&amp;onlyActive=true</w:t>
+      </w:r>
+      <w:r>
+        <w:t>:</w:t>
       </w:r>
     </w:p>
     <w:p>
@@ -32400,24 +32908,299 @@
         <w:pStyle w:val="ListBullet"/>
       </w:pPr>
       <w:r>
-        <w:t xml:space="preserve">SO </w:t>
+        <w:t xml:space="preserve">trả </w:t>
+      </w:r>
+      <w:r>
+        <w:rPr>
+          <w:b/>
+        </w:rPr>
+        <w:t>497 mã</w:t>
+      </w:r>
+      <w:r>
+        <w:t xml:space="preserve"> (có 1371 / 4021 / 4022): host cùng DB với bản ở máy, dữ liệu đã có, không làm gì thêm;</w:t>
+      </w:r>
+    </w:p>
+    <w:p>
+      <w:pPr>
+        <w:pStyle w:val="ListBullet"/>
+      </w:pPr>
+      <w:r>
+        <w:t xml:space="preserve">trả </w:t>
+      </w:r>
+      <w:r>
+        <w:rPr>
+          <w:b/>
+        </w:rPr>
+        <w:t>494 mã</w:t>
+      </w:r>
+      <w:r>
+        <w:t xml:space="preserve">: host trỏ DB khác. Chạy </w:t>
       </w:r>
       <w:r>
         <w:rPr>
           <w:rFonts w:ascii="Consolas" w:hAnsi="Consolas"/>
           <w:sz w:val="19"/>
         </w:rPr>
-        <w:t>TK-20261001-000162</w:t>
-      </w:r>
-      <w:r>
-        <w:t xml:space="preserve"> và </w:t>
+        <w:t>python tools/mo_ma_con_tune.py https://&lt;API host&gt;</w:t>
+      </w:r>
+      <w:r>
+        <w:t xml:space="preserve"> (bên em chạy được). Khách, chủ xe, tài xế không cần chép: lần gửi đầu bên em tự tạo.</w:t>
+      </w:r>
+    </w:p>
+    <w:p>
+      <w:pPr>
+        <w:pStyle w:val="Heading3"/>
+      </w:pPr>
+      <w:r>
+        <w:t>12.12.3. Tài khoản tích hợp — làm từng bước</w:t>
+      </w:r>
+    </w:p>
+    <w:p>
+      <w:pPr>
+        <w:jc w:val="both"/>
+      </w:pPr>
+      <w:r>
+        <w:t xml:space="preserve">Để làm gì: trang điều xe gọi API của anh bằng </w:t>
+      </w:r>
+      <w:r>
+        <w:rPr>
+          <w:b/>
+        </w:rPr>
+        <w:t>một tài khoản riêng của hệ thống</w:t>
+      </w:r>
+      <w:r>
+        <w:t>. Hiện bên em đang mượn token cá nhân (</w:t>
       </w:r>
       <w:r>
         <w:rPr>
           <w:rFonts w:ascii="Consolas" w:hAnsi="Consolas"/>
           <w:sz w:val="19"/>
         </w:rPr>
-        <w:t>…163</w:t>
+        <w:t>EPL_ACC_CODE_TOKEN</w:t>
+      </w:r>
+      <w:r>
+        <w:t>). Người đó đổi mật khẩu hay nghỉ việc thì mọi lần gửi đều hỏng, và sổ của anh ghi người tạo phiếu là người đó.</w:t>
+      </w:r>
+    </w:p>
+    <w:p>
+      <w:pPr>
+        <w:jc w:val="both"/>
+      </w:pPr>
+      <w:r>
+        <w:t>Code bên anh làm thế này (bên em đọc từ source):</w:t>
+      </w:r>
+    </w:p>
+    <w:p>
+      <w:pPr>
+        <w:pStyle w:val="ListBullet"/>
+      </w:pPr>
+      <w:r>
+        <w:rPr>
+          <w:b/>
+        </w:rPr>
+        <w:t>Đăng nhập:</w:t>
+      </w:r>
+      <w:r>
+        <w:t xml:space="preserve"> </w:t>
+      </w:r>
+      <w:r>
+        <w:rPr>
+          <w:rFonts w:ascii="Consolas" w:hAnsi="Consolas"/>
+          <w:sz w:val="19"/>
+        </w:rPr>
+        <w:t>POST /api/v1/auth/login {Username, Password, OrgID}</w:t>
+      </w:r>
+      <w:r>
+        <w:t xml:space="preserve"> → thủ tục </w:t>
+      </w:r>
+      <w:r>
+        <w:rPr>
+          <w:rFonts w:ascii="Consolas" w:hAnsi="Consolas"/>
+          <w:sz w:val="19"/>
+        </w:rPr>
+        <w:t>proc_LoginWithUsAndPw</w:t>
+      </w:r>
+      <w:r>
+        <w:t>.</w:t>
+      </w:r>
+    </w:p>
+    <w:p>
+      <w:pPr>
+        <w:pStyle w:val="ListBullet2"/>
+      </w:pPr>
+      <w:r>
+        <w:t>Tên đăng nhập dài 3–20 ký tự.</w:t>
+      </w:r>
+    </w:p>
+    <w:p>
+      <w:pPr>
+        <w:pStyle w:val="ListBullet2"/>
+      </w:pPr>
+      <w:r>
+        <w:t xml:space="preserve">Token sống </w:t>
+      </w:r>
+      <w:r>
+        <w:rPr>
+          <w:b/>
+        </w:rPr>
+        <w:t>30 ngày</w:t>
+      </w:r>
+      <w:r>
+        <w:t xml:space="preserve"> (</w:t>
+      </w:r>
+      <w:r>
+        <w:rPr>
+          <w:rFonts w:ascii="Consolas" w:hAnsi="Consolas"/>
+          <w:sz w:val="19"/>
+        </w:rPr>
+        <w:t>Base/Jwt/JwtService.cs</w:t>
+      </w:r>
+      <w:r>
+        <w:t>), không có refresh token.</w:t>
+      </w:r>
+    </w:p>
+    <w:p>
+      <w:pPr>
+        <w:pStyle w:val="ListBullet2"/>
+      </w:pPr>
+      <w:r>
+        <w:t xml:space="preserve">Mã người dùng nằm ở claim </w:t>
+      </w:r>
+      <w:r>
+        <w:rPr>
+          <w:rFonts w:ascii="Consolas" w:hAnsi="Consolas"/>
+          <w:sz w:val="19"/>
+        </w:rPr>
+        <w:t>UserId</w:t>
+      </w:r>
+      <w:r>
+        <w:t xml:space="preserve"> (= </w:t>
+      </w:r>
+      <w:r>
+        <w:rPr>
+          <w:rFonts w:ascii="Consolas" w:hAnsi="Consolas"/>
+          <w:sz w:val="19"/>
+        </w:rPr>
+        <w:t>dbo.Users.UserID</w:t>
+      </w:r>
+      <w:r>
+        <w:t>).</w:t>
+      </w:r>
+    </w:p>
+    <w:p>
+      <w:pPr>
+        <w:pStyle w:val="ListBullet"/>
+      </w:pPr>
+      <w:r>
+        <w:rPr>
+          <w:b/>
+        </w:rPr>
+        <w:t>Tạo tài khoản:</w:t>
+      </w:r>
+      <w:r>
+        <w:t xml:space="preserve"> </w:t>
+      </w:r>
+      <w:r>
+        <w:rPr>
+          <w:rFonts w:ascii="Consolas" w:hAnsi="Consolas"/>
+          <w:sz w:val="19"/>
+        </w:rPr>
+        <w:t>POST /api/v1/master-data/object-auth/account/upsert</w:t>
+      </w:r>
+      <w:r>
+        <w:t xml:space="preserve"> (</w:t>
+      </w:r>
+      <w:r>
+        <w:rPr>
+          <w:rFonts w:ascii="Consolas" w:hAnsi="Consolas"/>
+          <w:sz w:val="19"/>
+        </w:rPr>
+        <w:t>ObjectAuthController</w:t>
+      </w:r>
+      <w:r>
+        <w:t xml:space="preserve">, thủ tục </w:t>
+      </w:r>
+      <w:r>
+        <w:rPr>
+          <w:rFonts w:ascii="Consolas" w:hAnsi="Consolas"/>
+          <w:sz w:val="19"/>
+        </w:rPr>
+        <w:t>sp_META_InsertUpdate_USERS</w:t>
+      </w:r>
+      <w:r>
+        <w:t>). Màn "Tài khoản" ở hồ sơ nhân viên bên Web chưa nối, nên phải gọi API này.</w:t>
+      </w:r>
+    </w:p>
+    <w:p>
+      <w:pPr>
+        <w:pStyle w:val="ListBullet2"/>
+      </w:pPr>
+      <w:r>
+        <w:rPr>
+          <w:rFonts w:ascii="Consolas" w:hAnsi="Consolas"/>
+          <w:sz w:val="19"/>
+        </w:rPr>
+        <w:t>UserId = null</w:t>
+      </w:r>
+      <w:r>
+        <w:t xml:space="preserve"> để tạo mới;</w:t>
+      </w:r>
+    </w:p>
+    <w:p>
+      <w:pPr>
+        <w:pStyle w:val="ListBullet2"/>
+      </w:pPr>
+      <w:r>
+        <w:rPr>
+          <w:rFonts w:ascii="Consolas" w:hAnsi="Consolas"/>
+          <w:sz w:val="19"/>
+        </w:rPr>
+        <w:t>ObjectAutoId</w:t>
+      </w:r>
+      <w:r>
+        <w:t>: mã nhân viên (</w:t>
+      </w:r>
+      <w:r>
+        <w:rPr>
+          <w:rFonts w:ascii="Consolas" w:hAnsi="Consolas"/>
+          <w:sz w:val="19"/>
+        </w:rPr>
+        <w:t>PUBOBJECT</w:t>
+      </w:r>
+      <w:r>
+        <w:t>), bắt buộc;</w:t>
+      </w:r>
+    </w:p>
+    <w:p>
+      <w:pPr>
+        <w:pStyle w:val="ListBullet2"/>
+      </w:pPr>
+      <w:r>
+        <w:rPr>
+          <w:rFonts w:ascii="Consolas" w:hAnsi="Consolas"/>
+          <w:sz w:val="19"/>
+        </w:rPr>
+        <w:t>UserName</w:t>
+      </w:r>
+      <w:r>
+        <w:t xml:space="preserve">, </w:t>
+      </w:r>
+      <w:r>
+        <w:rPr>
+          <w:rFonts w:ascii="Consolas" w:hAnsi="Consolas"/>
+          <w:sz w:val="19"/>
+        </w:rPr>
+        <w:t>Password</w:t>
+      </w:r>
+      <w:r>
+        <w:t xml:space="preserve">, </w:t>
+      </w:r>
+      <w:r>
+        <w:rPr>
+          <w:rFonts w:ascii="Consolas" w:hAnsi="Consolas"/>
+          <w:sz w:val="19"/>
+        </w:rPr>
+        <w:t>IsActive=true</w:t>
       </w:r>
       <w:r>
         <w:t>;</w:t>
@@ -32425,40 +33208,106 @@
     </w:p>
     <w:p>
       <w:pPr>
+        <w:pStyle w:val="ListBullet2"/>
+      </w:pPr>
+      <w:r>
+        <w:rPr>
+          <w:rFonts w:ascii="Consolas" w:hAnsi="Consolas"/>
+          <w:sz w:val="19"/>
+        </w:rPr>
+        <w:t>OrgAutoId</w:t>
+      </w:r>
+      <w:r>
+        <w:t>;</w:t>
+      </w:r>
+    </w:p>
+    <w:p>
+      <w:pPr>
+        <w:pStyle w:val="ListBullet2"/>
+      </w:pPr>
+      <w:r>
+        <w:rPr>
+          <w:rFonts w:ascii="Consolas" w:hAnsi="Consolas"/>
+          <w:sz w:val="19"/>
+        </w:rPr>
+        <w:t>GroupId</w:t>
+      </w:r>
+      <w:r>
+        <w:t xml:space="preserve">: nhóm trong </w:t>
+      </w:r>
+      <w:r>
+        <w:rPr>
+          <w:rFonts w:ascii="Consolas" w:hAnsi="Consolas"/>
+          <w:sz w:val="19"/>
+        </w:rPr>
+        <w:t>dbo.UserGroup</w:t>
+      </w:r>
+      <w:r>
+        <w:t>.</w:t>
+      </w:r>
+    </w:p>
+    <w:p>
+      <w:pPr>
         <w:pStyle w:val="ListBullet"/>
       </w:pPr>
       <w:r>
-        <w:t xml:space="preserve">khách </w:t>
+        <w:rPr>
+          <w:b/>
+        </w:rPr>
+        <w:t>Gửi SO:</w:t>
+      </w:r>
+      <w:r>
+        <w:t xml:space="preserve"> </w:t>
       </w:r>
       <w:r>
         <w:rPr>
           <w:rFonts w:ascii="Consolas" w:hAnsi="Consolas"/>
           <w:sz w:val="19"/>
         </w:rPr>
-        <w:t>EPLKH-…</w:t>
-      </w:r>
-      <w:r>
-        <w:t xml:space="preserve">, chủ xe </w:t>
+        <w:t>LogisticsSalesPushController</w:t>
+      </w:r>
+      <w:r>
+        <w:t xml:space="preserve"> chỉ nhận người có </w:t>
       </w:r>
       <w:r>
         <w:rPr>
           <w:rFonts w:ascii="Consolas" w:hAnsi="Consolas"/>
           <w:sz w:val="19"/>
         </w:rPr>
-        <w:t>EPLCX-…</w:t>
-      </w:r>
-      <w:r>
-        <w:t xml:space="preserve">, tài xế </w:t>
+        <w:t>UserId</w:t>
+      </w:r>
+      <w:r>
+        <w:t xml:space="preserve"> nằm trong </w:t>
       </w:r>
       <w:r>
         <w:rPr>
           <w:rFonts w:ascii="Consolas" w:hAnsi="Consolas"/>
           <w:sz w:val="19"/>
         </w:rPr>
-        <w:t>EPLTX-…</w:t>
-      </w:r>
-      <w:r>
-        <w:t>;</w:t>
+        <w:t>LogisticsSalesPush:AllowedUserIds</w:t>
+      </w:r>
+      <w:r>
+        <w:t xml:space="preserve">. Danh sách rỗng thì ai cũng bị 403. Bản </w:t>
+      </w:r>
+      <w:r>
+        <w:rPr>
+          <w:rFonts w:ascii="Consolas" w:hAnsi="Consolas"/>
+          <w:sz w:val="19"/>
+        </w:rPr>
+        <w:t>laos</w:t>
+      </w:r>
+      <w:r>
+        <w:t xml:space="preserve"> hiện có </w:t>
+      </w:r>
+      <w:r>
+        <w:rPr>
+          <w:rFonts w:ascii="Consolas" w:hAnsi="Consolas"/>
+          <w:sz w:val="19"/>
+        </w:rPr>
+        <w:t>[846]</w:t>
+      </w:r>
+      <w:r>
+        <w:t>.</w:t>
       </w:r>
     </w:p>
     <w:p>
@@ -32466,7 +33315,275 @@
         <w:pStyle w:val="ListBullet"/>
       </w:pPr>
       <w:r>
-        <w:t>các phiếu chi thử;</w:t>
+        <w:rPr>
+          <w:b/>
+        </w:rPr>
+        <w:t>Phiếu thu chi, tạo khách / nhà cung cấp / nhân viên, công nợ khách:</w:t>
+      </w:r>
+      <w:r>
+        <w:t xml:space="preserve"> chỉ cần token hợp lệ, không xét quyền theo chức năng. Phiếu ghi người lập là </w:t>
+      </w:r>
+      <w:r>
+        <w:rPr>
+          <w:rFonts w:ascii="Consolas" w:hAnsi="Consolas"/>
+          <w:sz w:val="19"/>
+        </w:rPr>
+        <w:t>ObjectId</w:t>
+      </w:r>
+      <w:r>
+        <w:t xml:space="preserve"> của token.</w:t>
+      </w:r>
+    </w:p>
+    <w:p>
+      <w:pPr>
+        <w:jc w:val="both"/>
+      </w:pPr>
+      <w:r>
+        <w:t>Các bước:</w:t>
+      </w:r>
+    </w:p>
+    <w:p>
+      <w:pPr>
+        <w:pStyle w:val="ListNumber"/>
+      </w:pPr>
+      <w:r>
+        <w:t xml:space="preserve">Tạo (hoặc chọn) một </w:t>
+      </w:r>
+      <w:r>
+        <w:rPr>
+          <w:b/>
+        </w:rPr>
+        <w:t>nhân viên</w:t>
+      </w:r>
+      <w:r>
+        <w:t xml:space="preserve"> tên ví dụ "EPL Logistics (tích hợp)", thuộc chi nhánh </w:t>
+      </w:r>
+      <w:r>
+        <w:rPr>
+          <w:b/>
+        </w:rPr>
+        <w:t>1368</w:t>
+      </w:r>
+      <w:r>
+        <w:t xml:space="preserve"> (Logistics).</w:t>
+      </w:r>
+    </w:p>
+    <w:p>
+      <w:pPr>
+        <w:pStyle w:val="ListNumber"/>
+      </w:pPr>
+      <w:r>
+        <w:t xml:space="preserve">Gọi </w:t>
+      </w:r>
+      <w:r>
+        <w:rPr>
+          <w:rFonts w:ascii="Consolas" w:hAnsi="Consolas"/>
+          <w:sz w:val="19"/>
+        </w:rPr>
+        <w:t>account/upsert</w:t>
+      </w:r>
+      <w:r>
+        <w:t xml:space="preserve"> tạo tài khoản cho nhân viên đó, ví dụ </w:t>
+      </w:r>
+      <w:r>
+        <w:rPr>
+          <w:rFonts w:ascii="Consolas" w:hAnsi="Consolas"/>
+          <w:sz w:val="19"/>
+        </w:rPr>
+        <w:t>UserName = epl_logistics</w:t>
+      </w:r>
+      <w:r>
+        <w:t>, mật khẩu dài.</w:t>
+      </w:r>
+    </w:p>
+    <w:p>
+      <w:pPr>
+        <w:pStyle w:val="ListNumber"/>
+      </w:pPr>
+      <w:r>
+        <w:t xml:space="preserve">Lấy </w:t>
+      </w:r>
+      <w:r>
+        <w:rPr>
+          <w:rFonts w:ascii="Consolas" w:hAnsi="Consolas"/>
+          <w:sz w:val="19"/>
+        </w:rPr>
+        <w:t>UserId</w:t>
+      </w:r>
+      <w:r>
+        <w:t xml:space="preserve">: </w:t>
+      </w:r>
+      <w:r>
+        <w:rPr>
+          <w:rFonts w:ascii="Consolas" w:hAnsi="Consolas"/>
+          <w:sz w:val="19"/>
+        </w:rPr>
+        <w:t>POST /api/v1/hr/employees/account-lookups {UserName}</w:t>
+      </w:r>
+      <w:r>
+        <w:t xml:space="preserve">, hoặc đọc claim </w:t>
+      </w:r>
+      <w:r>
+        <w:rPr>
+          <w:rFonts w:ascii="Consolas" w:hAnsi="Consolas"/>
+          <w:sz w:val="19"/>
+        </w:rPr>
+        <w:t>UserId</w:t>
+      </w:r>
+      <w:r>
+        <w:t xml:space="preserve"> trong token sau khi đăng nhập thử.</w:t>
+      </w:r>
+    </w:p>
+    <w:p>
+      <w:pPr>
+        <w:pStyle w:val="ListNumber"/>
+      </w:pPr>
+      <w:r>
+        <w:t>Trong cấu hình bản host (</w:t>
+      </w:r>
+      <w:r>
+        <w:rPr>
+          <w:rFonts w:ascii="Consolas" w:hAnsi="Consolas"/>
+          <w:sz w:val="19"/>
+        </w:rPr>
+        <w:t>appsettings.&lt;Env&gt;.json</w:t>
+      </w:r>
+      <w:r>
+        <w:t xml:space="preserve">, tệp không đưa lên git), thêm </w:t>
+      </w:r>
+      <w:r>
+        <w:rPr>
+          <w:rFonts w:ascii="Consolas" w:hAnsi="Consolas"/>
+          <w:sz w:val="19"/>
+        </w:rPr>
+        <w:t>UserId</w:t>
+      </w:r>
+      <w:r>
+        <w:t xml:space="preserve"> đó vào </w:t>
+      </w:r>
+      <w:r>
+        <w:rPr>
+          <w:rFonts w:ascii="Consolas" w:hAnsi="Consolas"/>
+          <w:sz w:val="19"/>
+        </w:rPr>
+        <w:t>LogisticsSalesPush:AllowedUserIds</w:t>
+      </w:r>
+      <w:r>
+        <w:t xml:space="preserve"> (giữ </w:t>
+      </w:r>
+      <w:r>
+        <w:rPr>
+          <w:rFonts w:ascii="Consolas" w:hAnsi="Consolas"/>
+          <w:sz w:val="19"/>
+        </w:rPr>
+        <w:t>846</w:t>
+      </w:r>
+      <w:r>
+        <w:t xml:space="preserve"> nếu còn cần), </w:t>
+      </w:r>
+      <w:r>
+        <w:rPr>
+          <w:rFonts w:ascii="Consolas" w:hAnsi="Consolas"/>
+          <w:sz w:val="19"/>
+        </w:rPr>
+        <w:t>Enabled=true</w:t>
+      </w:r>
+      <w:r>
+        <w:t>. Khởi động lại API.</w:t>
+      </w:r>
+    </w:p>
+    <w:p>
+      <w:pPr>
+        <w:pStyle w:val="ListNumber"/>
+      </w:pPr>
+      <w:r>
+        <w:t xml:space="preserve">Bên trang điều xe, trong tệp </w:t>
+      </w:r>
+      <w:r>
+        <w:rPr>
+          <w:rFonts w:ascii="Consolas" w:hAnsi="Consolas"/>
+          <w:sz w:val="19"/>
+        </w:rPr>
+        <w:t>.env</w:t>
+      </w:r>
+      <w:r>
+        <w:t xml:space="preserve"> của máy chủ (không đưa lên git):</w:t>
+      </w:r>
+    </w:p>
+    <w:p>
+      <w:pPr>
+        <w:pStyle w:val="ListBullet2"/>
+      </w:pPr>
+      <w:r>
+        <w:rPr>
+          <w:rFonts w:ascii="Consolas" w:hAnsi="Consolas"/>
+          <w:sz w:val="19"/>
+        </w:rPr>
+        <w:t>QLSX_USERNAME=epl_logistics</w:t>
+      </w:r>
+    </w:p>
+    <w:p>
+      <w:pPr>
+        <w:pStyle w:val="ListBullet2"/>
+      </w:pPr>
+      <w:r>
+        <w:rPr>
+          <w:rFonts w:ascii="Consolas" w:hAnsi="Consolas"/>
+          <w:sz w:val="19"/>
+        </w:rPr>
+        <w:t>QLSX_PASSWORD=&lt;mật khẩu&gt;</w:t>
+      </w:r>
+    </w:p>
+    <w:p>
+      <w:pPr>
+        <w:pStyle w:val="ListBullet2"/>
+      </w:pPr>
+      <w:r>
+        <w:rPr>
+          <w:rFonts w:ascii="Consolas" w:hAnsi="Consolas"/>
+          <w:sz w:val="19"/>
+        </w:rPr>
+        <w:t>QLSX_ORG_ID=1368</w:t>
+      </w:r>
+    </w:p>
+    <w:p>
+      <w:pPr>
+        <w:jc w:val="both"/>
+      </w:pPr>
+      <w:r>
+        <w:t xml:space="preserve">Xoá </w:t>
+      </w:r>
+      <w:r>
+        <w:rPr>
+          <w:rFonts w:ascii="Consolas" w:hAnsi="Consolas"/>
+          <w:sz w:val="19"/>
+        </w:rPr>
+        <w:t>QLSX_ACCESS_TOKEN</w:t>
+      </w:r>
+      <w:r>
+        <w:t xml:space="preserve"> nếu có, vì biến đó được ưu tiên trước. Khởi động lại.</w:t>
+      </w:r>
+    </w:p>
+    <w:p>
+      <w:pPr>
+        <w:pStyle w:val="ListNumber"/>
+      </w:pPr>
+      <w:r>
+        <w:t>Từ đó bên em tự đăng nhập, nhớ token, đăng nhập lại khi token còn dưới 5 phút. Bị 401 cũng đăng nhập lại ngay.</w:t>
+      </w:r>
+    </w:p>
+    <w:p>
+      <w:pPr>
+        <w:jc w:val="both"/>
+      </w:pPr>
+      <w:r>
+        <w:rPr>
+          <w:b/>
+        </w:rPr>
+        <w:t>Trạng thái 01/10.</w:t>
+      </w:r>
+      <w:r>
+        <w:t xml:space="preserve"> Chủ dự án giao bên em làm. Bên em đã viết sẵn một tệp làm đủ bước 1–5 trên API ở máy:</w:t>
       </w:r>
     </w:p>
     <w:p>
@@ -32474,7 +33591,98 @@
         <w:pStyle w:val="ListBullet"/>
       </w:pPr>
       <w:r>
-        <w:t>ba mã tài khoản.</w:t>
+        <w:t xml:space="preserve">tạo nhân viên </w:t>
+      </w:r>
+      <w:r>
+        <w:rPr>
+          <w:rFonts w:ascii="Consolas" w:hAnsi="Consolas"/>
+          <w:sz w:val="19"/>
+        </w:rPr>
+        <w:t>EPL-TICHHOP</w:t>
+      </w:r>
+      <w:r>
+        <w:t xml:space="preserve"> "EPL Logistics (tích hợp)" thuộc chi nhánh 1368;</w:t>
+      </w:r>
+    </w:p>
+    <w:p>
+      <w:pPr>
+        <w:pStyle w:val="ListBullet"/>
+      </w:pPr>
+      <w:r>
+        <w:t xml:space="preserve">tạo tài khoản </w:t>
+      </w:r>
+      <w:r>
+        <w:rPr>
+          <w:rFonts w:ascii="Consolas" w:hAnsi="Consolas"/>
+          <w:sz w:val="19"/>
+        </w:rPr>
+        <w:t>epl_logistics</w:t>
+      </w:r>
+      <w:r>
+        <w:t xml:space="preserve">, </w:t>
+      </w:r>
+      <w:r>
+        <w:rPr>
+          <w:b/>
+        </w:rPr>
+        <w:t>cùng nhóm quyền</w:t>
+      </w:r>
+      <w:r>
+        <w:t xml:space="preserve"> với người đang gửi hiện nay; mật khẩu ngẫu nhiên, chỉ ghi vào </w:t>
+      </w:r>
+      <w:r>
+        <w:rPr>
+          <w:rFonts w:ascii="Consolas" w:hAnsi="Consolas"/>
+          <w:sz w:val="19"/>
+        </w:rPr>
+        <w:t>.env</w:t>
+      </w:r>
+      <w:r>
+        <w:t>, không in ra;</w:t>
+      </w:r>
+    </w:p>
+    <w:p>
+      <w:pPr>
+        <w:pStyle w:val="ListBullet"/>
+      </w:pPr>
+      <w:r>
+        <w:t>đăng nhập thử;</w:t>
+      </w:r>
+    </w:p>
+    <w:p>
+      <w:pPr>
+        <w:pStyle w:val="ListBullet"/>
+      </w:pPr>
+      <w:r>
+        <w:t xml:space="preserve">thêm </w:t>
+      </w:r>
+      <w:r>
+        <w:rPr>
+          <w:rFonts w:ascii="Consolas" w:hAnsi="Consolas"/>
+          <w:sz w:val="19"/>
+        </w:rPr>
+        <w:t>UserId</w:t>
+      </w:r>
+      <w:r>
+        <w:t xml:space="preserve"> vào </w:t>
+      </w:r>
+      <w:r>
+        <w:rPr>
+          <w:rFonts w:ascii="Consolas" w:hAnsi="Consolas"/>
+          <w:sz w:val="19"/>
+        </w:rPr>
+        <w:t>AllowedUserIds</w:t>
+      </w:r>
+      <w:r>
+        <w:t xml:space="preserve"> của bản ở máy, khởi động lại;</w:t>
+      </w:r>
+    </w:p>
+    <w:p>
+      <w:pPr>
+        <w:pStyle w:val="ListBullet"/>
+      </w:pPr>
+      <w:r>
+        <w:t>gửi thử một gói rỗng vào cổng SO: không tạo gì, chỉ xem còn bị 403 không.</w:t>
       </w:r>
     </w:p>
     <w:p>
@@ -32482,742 +33690,35 @@
         <w:jc w:val="both"/>
       </w:pPr>
       <w:r>
-        <w:rPr>
-          <w:b/>
-        </w:rPr>
-        <w:t>Khi anh đưa bản mới lên host</w:t>
-      </w:r>
-      <w:r>
-        <w:t>, cần:</w:t>
-      </w:r>
-    </w:p>
-    <w:p>
-      <w:pPr>
-        <w:pStyle w:val="ListNumber"/>
-      </w:pPr>
-      <w:r>
-        <w:t xml:space="preserve">Triển khai code hai nhánh </w:t>
+        <w:t>Công cụ an toàn của bên em không cho tự tạo tài khoản đăng nhập, nên chủ dự án chạy tệp này.</w:t>
+      </w:r>
+    </w:p>
+    <w:p>
+      <w:pPr>
+        <w:jc w:val="both"/>
+      </w:pPr>
+      <w:r>
+        <w:t xml:space="preserve">Trên host: nếu host cùng DB (lệnh kiểm 12.12.2 trả 497 mã) thì tài khoản đã có, anh chỉ thêm </w:t>
       </w:r>
       <w:r>
         <w:rPr>
           <w:rFonts w:ascii="Consolas" w:hAnsi="Consolas"/>
           <w:sz w:val="19"/>
         </w:rPr>
-        <w:t>feat/HonTunedaHai</w:t>
-      </w:r>
-      <w:r>
-        <w:t xml:space="preserve"> (API) và </w:t>
+        <w:t>UserId</w:t>
+      </w:r>
+      <w:r>
+        <w:t xml:space="preserve"> vào </w:t>
       </w:r>
       <w:r>
         <w:rPr>
           <w:rFonts w:ascii="Consolas" w:hAnsi="Consolas"/>
           <w:sz w:val="19"/>
         </w:rPr>
-        <w:t>feat/hontunedhai_Laos</w:t>
-      </w:r>
-      <w:r>
-        <w:t xml:space="preserve"> (Web).</w:t>
-      </w:r>
-    </w:p>
-    <w:p>
-      <w:pPr>
-        <w:pStyle w:val="ListNumber"/>
-      </w:pPr>
-      <w:r>
-        <w:t>Mở lại ba mã trên DB của bản host: 4 lệnh như 12.12.1. Bên em có sẵn tệp chạy, đổi địa chỉ là dùng được.</w:t>
-      </w:r>
-    </w:p>
-    <w:p>
-      <w:pPr>
-        <w:pStyle w:val="ListNumber"/>
-      </w:pPr>
-      <w:r>
-        <w:t xml:space="preserve">Đặt </w:t>
-      </w:r>
-      <w:r>
-        <w:rPr>
-          <w:rFonts w:ascii="Consolas" w:hAnsi="Consolas"/>
-          <w:sz w:val="19"/>
-        </w:rPr>
-        <w:t>LogisticsSource</w:t>
-      </w:r>
-      <w:r>
-        <w:t xml:space="preserve"> và </w:t>
-      </w:r>
-      <w:r>
-        <w:rPr>
-          <w:rFonts w:ascii="Consolas" w:hAnsi="Consolas"/>
-          <w:sz w:val="19"/>
-        </w:rPr>
-        <w:t>LogisticsSalesPush</w:t>
-      </w:r>
-      <w:r>
-        <w:t xml:space="preserve"> trong cấu hình của bản host (mục 12.12.3).</w:t>
-      </w:r>
-    </w:p>
-    <w:p>
-      <w:pPr>
-        <w:jc w:val="both"/>
-      </w:pPr>
-      <w:r>
-        <w:t xml:space="preserve">Khách </w:t>
-      </w:r>
-      <w:r>
-        <w:rPr>
-          <w:rFonts w:ascii="Consolas" w:hAnsi="Consolas"/>
-          <w:sz w:val="19"/>
-        </w:rPr>
-        <w:t>EPLKH-…</w:t>
-      </w:r>
-      <w:r>
-        <w:t xml:space="preserve"> không cần chép: lần gửi SO đầu tiên bên em tự tạo.</w:t>
-      </w:r>
-    </w:p>
-    <w:p>
-      <w:pPr>
-        <w:jc w:val="both"/>
-      </w:pPr>
-      <w:r>
-        <w:rPr>
-          <w:b/>
-        </w:rPr>
-        <w:t>Anh cho em biết:</w:t>
-      </w:r>
-      <w:r>
-        <w:t xml:space="preserve"> DB nào là DB chính thức cho Lào? Bản host đang trỏ DB nào?</w:t>
-      </w:r>
-    </w:p>
-    <w:p>
-      <w:pPr>
-        <w:pStyle w:val="Heading3"/>
-      </w:pPr>
-      <w:r>
-        <w:t>12.12.3. Tài khoản tích hợp — làm từng bước</w:t>
-      </w:r>
-    </w:p>
-    <w:p>
-      <w:pPr>
-        <w:jc w:val="both"/>
-      </w:pPr>
-      <w:r>
-        <w:t xml:space="preserve">Để làm gì: trang điều xe gọi API của anh bằng </w:t>
-      </w:r>
-      <w:r>
-        <w:rPr>
-          <w:b/>
-        </w:rPr>
-        <w:t>một tài khoản riêng của hệ thống</w:t>
-      </w:r>
-      <w:r>
-        <w:t>. Hiện bên em đang mượn token cá nhân (</w:t>
-      </w:r>
-      <w:r>
-        <w:rPr>
-          <w:rFonts w:ascii="Consolas" w:hAnsi="Consolas"/>
-          <w:sz w:val="19"/>
-        </w:rPr>
-        <w:t>EPL_ACC_CODE_TOKEN</w:t>
-      </w:r>
-      <w:r>
-        <w:t>). Người đó đổi mật khẩu hay nghỉ việc thì mọi lần gửi đều hỏng, và sổ của anh ghi người tạo phiếu là người đó.</w:t>
-      </w:r>
-    </w:p>
-    <w:p>
-      <w:pPr>
-        <w:jc w:val="both"/>
-      </w:pPr>
-      <w:r>
-        <w:t>Code bên anh làm thế này (bên em đọc từ source):</w:t>
-      </w:r>
-    </w:p>
-    <w:p>
-      <w:pPr>
-        <w:pStyle w:val="ListBullet"/>
-      </w:pPr>
-      <w:r>
-        <w:rPr>
-          <w:b/>
-        </w:rPr>
-        <w:t>Đăng nhập:</w:t>
-      </w:r>
-      <w:r>
-        <w:t xml:space="preserve"> </w:t>
-      </w:r>
-      <w:r>
-        <w:rPr>
-          <w:rFonts w:ascii="Consolas" w:hAnsi="Consolas"/>
-          <w:sz w:val="19"/>
-        </w:rPr>
-        <w:t>POST /api/v1/auth/login {Username, Password, OrgID}</w:t>
-      </w:r>
-      <w:r>
-        <w:t xml:space="preserve"> → thủ tục </w:t>
-      </w:r>
-      <w:r>
-        <w:rPr>
-          <w:rFonts w:ascii="Consolas" w:hAnsi="Consolas"/>
-          <w:sz w:val="19"/>
-        </w:rPr>
-        <w:t>proc_LoginWithUsAndPw</w:t>
-      </w:r>
-      <w:r>
-        <w:t>.</w:t>
-      </w:r>
-    </w:p>
-    <w:p>
-      <w:pPr>
-        <w:pStyle w:val="ListBullet2"/>
-      </w:pPr>
-      <w:r>
-        <w:t>Tên đăng nhập dài 3–20 ký tự.</w:t>
-      </w:r>
-    </w:p>
-    <w:p>
-      <w:pPr>
-        <w:pStyle w:val="ListBullet2"/>
-      </w:pPr>
-      <w:r>
-        <w:t xml:space="preserve">Token sống </w:t>
-      </w:r>
-      <w:r>
-        <w:rPr>
-          <w:b/>
-        </w:rPr>
-        <w:t>30 ngày</w:t>
-      </w:r>
-      <w:r>
-        <w:t xml:space="preserve"> (</w:t>
-      </w:r>
-      <w:r>
-        <w:rPr>
-          <w:rFonts w:ascii="Consolas" w:hAnsi="Consolas"/>
-          <w:sz w:val="19"/>
-        </w:rPr>
-        <w:t>Base/Jwt/JwtService.cs</w:t>
-      </w:r>
-      <w:r>
-        <w:t>), không có refresh token.</w:t>
-      </w:r>
-    </w:p>
-    <w:p>
-      <w:pPr>
-        <w:pStyle w:val="ListBullet2"/>
-      </w:pPr>
-      <w:r>
-        <w:t xml:space="preserve">Mã người dùng nằm ở claim </w:t>
-      </w:r>
-      <w:r>
-        <w:rPr>
-          <w:rFonts w:ascii="Consolas" w:hAnsi="Consolas"/>
-          <w:sz w:val="19"/>
-        </w:rPr>
-        <w:t>UserId</w:t>
-      </w:r>
-      <w:r>
-        <w:t xml:space="preserve"> (= </w:t>
-      </w:r>
-      <w:r>
-        <w:rPr>
-          <w:rFonts w:ascii="Consolas" w:hAnsi="Consolas"/>
-          <w:sz w:val="19"/>
-        </w:rPr>
-        <w:t>dbo.Users.UserID</w:t>
-      </w:r>
-      <w:r>
-        <w:t>).</w:t>
-      </w:r>
-    </w:p>
-    <w:p>
-      <w:pPr>
-        <w:pStyle w:val="ListBullet"/>
-      </w:pPr>
-      <w:r>
-        <w:rPr>
-          <w:b/>
-        </w:rPr>
-        <w:t>Tạo tài khoản:</w:t>
-      </w:r>
-      <w:r>
-        <w:t xml:space="preserve"> </w:t>
-      </w:r>
-      <w:r>
-        <w:rPr>
-          <w:rFonts w:ascii="Consolas" w:hAnsi="Consolas"/>
-          <w:sz w:val="19"/>
-        </w:rPr>
-        <w:t>POST /api/v1/master-data/object-auth/account/upsert</w:t>
-      </w:r>
-      <w:r>
-        <w:t xml:space="preserve"> (</w:t>
-      </w:r>
-      <w:r>
-        <w:rPr>
-          <w:rFonts w:ascii="Consolas" w:hAnsi="Consolas"/>
-          <w:sz w:val="19"/>
-        </w:rPr>
-        <w:t>ObjectAuthController</w:t>
-      </w:r>
-      <w:r>
-        <w:t xml:space="preserve">, thủ tục </w:t>
-      </w:r>
-      <w:r>
-        <w:rPr>
-          <w:rFonts w:ascii="Consolas" w:hAnsi="Consolas"/>
-          <w:sz w:val="19"/>
-        </w:rPr>
-        <w:t>sp_META_InsertUpdate_USERS</w:t>
-      </w:r>
-      <w:r>
-        <w:t>). Màn "Tài khoản" ở hồ sơ nhân viên bên Web chưa nối, nên phải gọi API này.</w:t>
-      </w:r>
-    </w:p>
-    <w:p>
-      <w:pPr>
-        <w:pStyle w:val="ListBullet2"/>
-      </w:pPr>
-      <w:r>
-        <w:rPr>
-          <w:rFonts w:ascii="Consolas" w:hAnsi="Consolas"/>
-          <w:sz w:val="19"/>
-        </w:rPr>
-        <w:t>UserId = null</w:t>
-      </w:r>
-      <w:r>
-        <w:t xml:space="preserve"> để tạo mới;</w:t>
-      </w:r>
-    </w:p>
-    <w:p>
-      <w:pPr>
-        <w:pStyle w:val="ListBullet2"/>
-      </w:pPr>
-      <w:r>
-        <w:rPr>
-          <w:rFonts w:ascii="Consolas" w:hAnsi="Consolas"/>
-          <w:sz w:val="19"/>
-        </w:rPr>
-        <w:t>ObjectAutoId</w:t>
-      </w:r>
-      <w:r>
-        <w:t>: mã nhân viên (</w:t>
-      </w:r>
-      <w:r>
-        <w:rPr>
-          <w:rFonts w:ascii="Consolas" w:hAnsi="Consolas"/>
-          <w:sz w:val="19"/>
-        </w:rPr>
-        <w:t>PUBOBJECT</w:t>
-      </w:r>
-      <w:r>
-        <w:t>), bắt buộc;</w:t>
-      </w:r>
-    </w:p>
-    <w:p>
-      <w:pPr>
-        <w:pStyle w:val="ListBullet2"/>
-      </w:pPr>
-      <w:r>
-        <w:rPr>
-          <w:rFonts w:ascii="Consolas" w:hAnsi="Consolas"/>
-          <w:sz w:val="19"/>
-        </w:rPr>
-        <w:t>UserName</w:t>
-      </w:r>
-      <w:r>
-        <w:t xml:space="preserve">, </w:t>
-      </w:r>
-      <w:r>
-        <w:rPr>
-          <w:rFonts w:ascii="Consolas" w:hAnsi="Consolas"/>
-          <w:sz w:val="19"/>
-        </w:rPr>
-        <w:t>Password</w:t>
-      </w:r>
-      <w:r>
-        <w:t xml:space="preserve">, </w:t>
-      </w:r>
-      <w:r>
-        <w:rPr>
-          <w:rFonts w:ascii="Consolas" w:hAnsi="Consolas"/>
-          <w:sz w:val="19"/>
-        </w:rPr>
-        <w:t>IsActive=true</w:t>
-      </w:r>
-      <w:r>
-        <w:t>;</w:t>
-      </w:r>
-    </w:p>
-    <w:p>
-      <w:pPr>
-        <w:pStyle w:val="ListBullet2"/>
-      </w:pPr>
-      <w:r>
-        <w:rPr>
-          <w:rFonts w:ascii="Consolas" w:hAnsi="Consolas"/>
-          <w:sz w:val="19"/>
-        </w:rPr>
-        <w:t>OrgAutoId</w:t>
-      </w:r>
-      <w:r>
-        <w:t>;</w:t>
-      </w:r>
-    </w:p>
-    <w:p>
-      <w:pPr>
-        <w:pStyle w:val="ListBullet2"/>
-      </w:pPr>
-      <w:r>
-        <w:rPr>
-          <w:rFonts w:ascii="Consolas" w:hAnsi="Consolas"/>
-          <w:sz w:val="19"/>
-        </w:rPr>
-        <w:t>GroupId</w:t>
-      </w:r>
-      <w:r>
-        <w:t xml:space="preserve">: nhóm trong </w:t>
-      </w:r>
-      <w:r>
-        <w:rPr>
-          <w:rFonts w:ascii="Consolas" w:hAnsi="Consolas"/>
-          <w:sz w:val="19"/>
-        </w:rPr>
-        <w:t>dbo.UserGroup</w:t>
-      </w:r>
-      <w:r>
-        <w:t>.</w:t>
-      </w:r>
-    </w:p>
-    <w:p>
-      <w:pPr>
-        <w:pStyle w:val="ListBullet"/>
-      </w:pPr>
-      <w:r>
-        <w:rPr>
-          <w:b/>
-        </w:rPr>
-        <w:t>Gửi SO:</w:t>
-      </w:r>
-      <w:r>
-        <w:t xml:space="preserve"> </w:t>
-      </w:r>
-      <w:r>
-        <w:rPr>
-          <w:rFonts w:ascii="Consolas" w:hAnsi="Consolas"/>
-          <w:sz w:val="19"/>
-        </w:rPr>
-        <w:t>LogisticsSalesPushController</w:t>
-      </w:r>
-      <w:r>
-        <w:t xml:space="preserve"> chỉ nhận người có </w:t>
-      </w:r>
-      <w:r>
-        <w:rPr>
-          <w:rFonts w:ascii="Consolas" w:hAnsi="Consolas"/>
-          <w:sz w:val="19"/>
-        </w:rPr>
-        <w:t>UserId</w:t>
-      </w:r>
-      <w:r>
-        <w:t xml:space="preserve"> nằm trong </w:t>
-      </w:r>
-      <w:r>
-        <w:rPr>
-          <w:rFonts w:ascii="Consolas" w:hAnsi="Consolas"/>
-          <w:sz w:val="19"/>
-        </w:rPr>
-        <w:t>LogisticsSalesPush:AllowedUserIds</w:t>
-      </w:r>
-      <w:r>
-        <w:t xml:space="preserve">. Danh sách rỗng thì ai cũng bị 403. Bản </w:t>
-      </w:r>
-      <w:r>
-        <w:rPr>
-          <w:rFonts w:ascii="Consolas" w:hAnsi="Consolas"/>
-          <w:sz w:val="19"/>
-        </w:rPr>
-        <w:t>laos</w:t>
-      </w:r>
-      <w:r>
-        <w:t xml:space="preserve"> hiện có </w:t>
-      </w:r>
-      <w:r>
-        <w:rPr>
-          <w:rFonts w:ascii="Consolas" w:hAnsi="Consolas"/>
-          <w:sz w:val="19"/>
-        </w:rPr>
-        <w:t>[846]</w:t>
-      </w:r>
-      <w:r>
-        <w:t>.</w:t>
-      </w:r>
-    </w:p>
-    <w:p>
-      <w:pPr>
-        <w:pStyle w:val="ListBullet"/>
-      </w:pPr>
-      <w:r>
-        <w:rPr>
-          <w:b/>
-        </w:rPr>
-        <w:t>Phiếu thu chi, tạo khách / nhà cung cấp / nhân viên, công nợ khách:</w:t>
-      </w:r>
-      <w:r>
-        <w:t xml:space="preserve"> chỉ cần token hợp lệ, không xét quyền theo chức năng. Phiếu ghi người lập là </w:t>
-      </w:r>
-      <w:r>
-        <w:rPr>
-          <w:rFonts w:ascii="Consolas" w:hAnsi="Consolas"/>
-          <w:sz w:val="19"/>
-        </w:rPr>
-        <w:t>ObjectId</w:t>
-      </w:r>
-      <w:r>
-        <w:t xml:space="preserve"> của token.</w:t>
-      </w:r>
-    </w:p>
-    <w:p>
-      <w:pPr>
-        <w:jc w:val="both"/>
-      </w:pPr>
-      <w:r>
-        <w:t>Các bước:</w:t>
-      </w:r>
-    </w:p>
-    <w:p>
-      <w:pPr>
-        <w:pStyle w:val="ListNumber"/>
-      </w:pPr>
-      <w:r>
-        <w:t xml:space="preserve">Tạo (hoặc chọn) một </w:t>
-      </w:r>
-      <w:r>
-        <w:rPr>
-          <w:b/>
-        </w:rPr>
-        <w:t>nhân viên</w:t>
-      </w:r>
-      <w:r>
-        <w:t xml:space="preserve"> tên ví dụ "EPL Logistics (tích hợp)", thuộc chi nhánh </w:t>
-      </w:r>
-      <w:r>
-        <w:rPr>
-          <w:b/>
-        </w:rPr>
-        <w:t>1368</w:t>
-      </w:r>
-      <w:r>
-        <w:t xml:space="preserve"> (Logistics).</w:t>
-      </w:r>
-    </w:p>
-    <w:p>
-      <w:pPr>
-        <w:pStyle w:val="ListNumber"/>
-      </w:pPr>
-      <w:r>
-        <w:t xml:space="preserve">Gọi </w:t>
-      </w:r>
-      <w:r>
-        <w:rPr>
-          <w:rFonts w:ascii="Consolas" w:hAnsi="Consolas"/>
-          <w:sz w:val="19"/>
-        </w:rPr>
-        <w:t>account/upsert</w:t>
-      </w:r>
-      <w:r>
-        <w:t xml:space="preserve"> tạo tài khoản cho nhân viên đó, ví dụ </w:t>
-      </w:r>
-      <w:r>
-        <w:rPr>
-          <w:rFonts w:ascii="Consolas" w:hAnsi="Consolas"/>
-          <w:sz w:val="19"/>
-        </w:rPr>
-        <w:t>UserName = epl_logistics</w:t>
-      </w:r>
-      <w:r>
-        <w:t>, mật khẩu dài.</w:t>
-      </w:r>
-    </w:p>
-    <w:p>
-      <w:pPr>
-        <w:pStyle w:val="ListNumber"/>
-      </w:pPr>
-      <w:r>
-        <w:t xml:space="preserve">Lấy </w:t>
-      </w:r>
-      <w:r>
-        <w:rPr>
-          <w:rFonts w:ascii="Consolas" w:hAnsi="Consolas"/>
-          <w:sz w:val="19"/>
-        </w:rPr>
-        <w:t>UserId</w:t>
-      </w:r>
-      <w:r>
-        <w:t xml:space="preserve">: </w:t>
-      </w:r>
-      <w:r>
-        <w:rPr>
-          <w:rFonts w:ascii="Consolas" w:hAnsi="Consolas"/>
-          <w:sz w:val="19"/>
-        </w:rPr>
-        <w:t>POST /api/v1/hr/employees/account-lookups {UserName}</w:t>
-      </w:r>
-      <w:r>
-        <w:t xml:space="preserve">, hoặc đọc claim </w:t>
-      </w:r>
-      <w:r>
-        <w:rPr>
-          <w:rFonts w:ascii="Consolas" w:hAnsi="Consolas"/>
-          <w:sz w:val="19"/>
-        </w:rPr>
-        <w:t>UserId</w:t>
-      </w:r>
-      <w:r>
-        <w:t xml:space="preserve"> trong token sau khi đăng nhập thử.</w:t>
-      </w:r>
-    </w:p>
-    <w:p>
-      <w:pPr>
-        <w:pStyle w:val="ListNumber"/>
-      </w:pPr>
-      <w:r>
-        <w:t>Trong cấu hình bản host (</w:t>
-      </w:r>
-      <w:r>
-        <w:rPr>
-          <w:rFonts w:ascii="Consolas" w:hAnsi="Consolas"/>
-          <w:sz w:val="19"/>
-        </w:rPr>
-        <w:t>appsettings.&lt;Env&gt;.json</w:t>
-      </w:r>
-      <w:r>
-        <w:t xml:space="preserve">, tệp không đưa lên git), thêm </w:t>
-      </w:r>
-      <w:r>
-        <w:rPr>
-          <w:rFonts w:ascii="Consolas" w:hAnsi="Consolas"/>
-          <w:sz w:val="19"/>
-        </w:rPr>
-        <w:t>UserId</w:t>
-      </w:r>
-      <w:r>
-        <w:t xml:space="preserve"> đó vào </w:t>
-      </w:r>
-      <w:r>
-        <w:rPr>
-          <w:rFonts w:ascii="Consolas" w:hAnsi="Consolas"/>
-          <w:sz w:val="19"/>
-        </w:rPr>
-        <w:t>LogisticsSalesPush:AllowedUserIds</w:t>
-      </w:r>
-      <w:r>
-        <w:t xml:space="preserve"> (giữ </w:t>
-      </w:r>
-      <w:r>
-        <w:rPr>
-          <w:rFonts w:ascii="Consolas" w:hAnsi="Consolas"/>
-          <w:sz w:val="19"/>
-        </w:rPr>
-        <w:t>846</w:t>
-      </w:r>
-      <w:r>
-        <w:t xml:space="preserve"> nếu còn cần), </w:t>
-      </w:r>
-      <w:r>
-        <w:rPr>
-          <w:rFonts w:ascii="Consolas" w:hAnsi="Consolas"/>
-          <w:sz w:val="19"/>
-        </w:rPr>
-        <w:t>Enabled=true</w:t>
-      </w:r>
-      <w:r>
-        <w:t>. Khởi động lại API.</w:t>
-      </w:r>
-    </w:p>
-    <w:p>
-      <w:pPr>
-        <w:pStyle w:val="ListNumber"/>
-      </w:pPr>
-      <w:r>
-        <w:t xml:space="preserve">Bên trang điều xe, trong tệp </w:t>
-      </w:r>
-      <w:r>
-        <w:rPr>
-          <w:rFonts w:ascii="Consolas" w:hAnsi="Consolas"/>
-          <w:sz w:val="19"/>
-        </w:rPr>
-        <w:t>.env</w:t>
-      </w:r>
-      <w:r>
-        <w:t xml:space="preserve"> của máy chủ (không đưa lên git):</w:t>
-      </w:r>
-    </w:p>
-    <w:p>
-      <w:pPr>
-        <w:pStyle w:val="ListBullet2"/>
-      </w:pPr>
-      <w:r>
-        <w:rPr>
-          <w:rFonts w:ascii="Consolas" w:hAnsi="Consolas"/>
-          <w:sz w:val="19"/>
-        </w:rPr>
-        <w:t>QLSX_USERNAME=epl_logistics</w:t>
-      </w:r>
-    </w:p>
-    <w:p>
-      <w:pPr>
-        <w:pStyle w:val="ListBullet2"/>
-      </w:pPr>
-      <w:r>
-        <w:rPr>
-          <w:rFonts w:ascii="Consolas" w:hAnsi="Consolas"/>
-          <w:sz w:val="19"/>
-        </w:rPr>
-        <w:t>QLSX_PASSWORD=&lt;mật khẩu&gt;</w:t>
-      </w:r>
-    </w:p>
-    <w:p>
-      <w:pPr>
-        <w:pStyle w:val="ListBullet2"/>
-      </w:pPr>
-      <w:r>
-        <w:rPr>
-          <w:rFonts w:ascii="Consolas" w:hAnsi="Consolas"/>
-          <w:sz w:val="19"/>
-        </w:rPr>
-        <w:t>QLSX_ORG_ID=1368</w:t>
-      </w:r>
-    </w:p>
-    <w:p>
-      <w:pPr>
-        <w:jc w:val="both"/>
-      </w:pPr>
-      <w:r>
-        <w:t xml:space="preserve">Xoá </w:t>
-      </w:r>
-      <w:r>
-        <w:rPr>
-          <w:rFonts w:ascii="Consolas" w:hAnsi="Consolas"/>
-          <w:sz w:val="19"/>
-        </w:rPr>
-        <w:t>QLSX_ACCESS_TOKEN</w:t>
-      </w:r>
-      <w:r>
-        <w:t xml:space="preserve"> nếu có, vì biến đó được ưu tiên trước. Khởi động lại.</w:t>
-      </w:r>
-    </w:p>
-    <w:p>
-      <w:pPr>
-        <w:pStyle w:val="ListNumber"/>
-      </w:pPr>
-      <w:r>
-        <w:t>Từ đó bên em tự đăng nhập, nhớ token, đăng nhập lại khi token còn dưới 5 phút. Bị 401 cũng đăng nhập lại ngay.</w:t>
-      </w:r>
-    </w:p>
-    <w:p>
-      <w:pPr>
-        <w:jc w:val="both"/>
-      </w:pPr>
-      <w:r>
-        <w:t>Bên em chưa tự tạo tài khoản: đây là tài khoản đăng nhập vào sổ kế toán của anh, mật khẩu phải do anh hoặc chủ dự án giữ.</w:t>
+        <w:t>AllowedUserIds</w:t>
+      </w:r>
+      <w:r>
+        <w:t xml:space="preserve"> của cấu hình host. Khác DB thì tạo lại theo 6 bước trên.</w:t>
       </w:r>
     </w:p>
     <w:p>
@@ -33498,6 +33999,30 @@
       </w:r>
       <w:r>
         <w:t xml:space="preserve"> trong gói bàn giao DO (mục 10). Có đường này thì lúc khoá phiếu xe thuê bên em gửi luôn, mở khoá thì gửi đảo.</w:t>
+      </w:r>
+    </w:p>
+    <w:p>
+      <w:pPr>
+        <w:jc w:val="both"/>
+      </w:pPr>
+      <w:r>
+        <w:rPr>
+          <w:b/>
+        </w:rPr>
+        <w:t>Trạng thái 01/10:</w:t>
+      </w:r>
+      <w:r>
+        <w:t xml:space="preserve"> chủ dự án cho bên em làm luôn. Bên em đang chờ được đọc cấu trúc sổ cái: hoặc chủ dự án cấp quyền đọc DB cho công cụ của bên em, hoặc anh gửi định nghĩa các thủ tục kể trên. Có một trong hai thì bên em viết đường API này trong nhánh </w:t>
+      </w:r>
+      <w:r>
+        <w:rPr>
+          <w:rFonts w:ascii="Consolas" w:hAnsi="Consolas"/>
+          <w:sz w:val="19"/>
+        </w:rPr>
+        <w:t>feat/HonTunedaHai</w:t>
+      </w:r>
+      <w:r>
+        <w:t xml:space="preserve"> và ghi vào đây để anh review.</w:t>
       </w:r>
     </w:p>
     <w:sectPr>

</xml_diff>

<commit_message>
Bàn giao DO: tham số q tìm theo chữ cho màn Vụ việc bên anh Tune; 8011 đọc danh mục tài khoản từ API ở máy
- GET /api/handover/delivery-orders?q=…: mã DO, số phiếu, mã / tên khách, số xe, biển đầu kéo; total sau lọc; trả data.q
- thu_ban_giao: 11 chỗ kiểm cho q; KHOA_BAN_GIAO_TEP để chạy trên khoá có sẵn (không tạo lại khoá)
- hợp đồng 12.8.2 / 12.9.2 / 11, bảng đổi link; tổng hợp bàn giao

Co-Authored-By: Claude Opus 5.5 (1M context) <noreply@anthropic.com>
</commit_message>
<xml_diff>
--- a/DOCS/word/HOP_DONG_API_KE_TOAN_ANH_TUNE.docx
+++ b/DOCS/word/HOP_DONG_API_KE_TOAN_ANH_TUNE.docx
@@ -18438,7 +18438,46 @@
         <w:t>kiem/thu_ban_giao.py</w:t>
       </w:r>
       <w:r>
-        <w:t xml:space="preserve"> — 32 chỗ kiểm cho hai đường bàn giao DO (12.8), gồm các khoá màn "Vụ việc" đọc.</w:t>
+        <w:t xml:space="preserve"> — 32 chỗ kiểm cho hai đường bàn giao DO (12.8), gồm các khoá màn "Vụ việc" đọc; </w:t>
+      </w:r>
+      <w:r>
+        <w:rPr>
+          <w:b/>
+        </w:rPr>
+        <w:t>thêm 01/10 11 chỗ cho `q`</w:t>
+      </w:r>
+      <w:r>
+        <w:t xml:space="preserve"> (sáu ô tìm, </w:t>
+      </w:r>
+      <w:r>
+        <w:rPr>
+          <w:rFonts w:ascii="Consolas" w:hAnsi="Consolas"/>
+          <w:sz w:val="19"/>
+        </w:rPr>
+        <w:t>total</w:t>
+      </w:r>
+      <w:r>
+        <w:t xml:space="preserve"> sau lọc, phân trang khi tìm, </w:t>
+      </w:r>
+      <w:r>
+        <w:rPr>
+          <w:rFonts w:ascii="Consolas" w:hAnsi="Consolas"/>
+          <w:sz w:val="19"/>
+        </w:rPr>
+        <w:t>%</w:t>
+      </w:r>
+      <w:r>
+        <w:t xml:space="preserve"> không là ký tự đại diện, quá 200 ký tự → 422). Đặt </w:t>
+      </w:r>
+      <w:r>
+        <w:rPr>
+          <w:rFonts w:ascii="Consolas" w:hAnsi="Consolas"/>
+          <w:sz w:val="19"/>
+        </w:rPr>
+        <w:t>KHOA_BAN_GIAO_TEP=&lt;tệp khoá&gt;</w:t>
+      </w:r>
+      <w:r>
+        <w:t xml:space="preserve"> thì bài dùng khoá có sẵn, không tạo lại — chạy được trên máy thử dùng chung DB mà không làm hỏng khoá máy kia đang cầm.</w:t>
       </w:r>
     </w:p>
     <w:p>
@@ -23551,6 +23590,141 @@
                 <w:rFonts w:ascii="Consolas" w:hAnsi="Consolas"/>
                 <w:sz w:val="19"/>
               </w:rPr>
+              <w:t>q</w:t>
+            </w:r>
+          </w:p>
+        </w:tc>
+        <w:tc>
+          <w:tcPr>
+            <w:tcW w:type="dxa" w:w="2880"/>
+          </w:tcPr>
+          <w:p>
+            <w:r/>
+            <w:r>
+              <w:t>chuỗi ≤ 200 ký tự</w:t>
+            </w:r>
+          </w:p>
+        </w:tc>
+        <w:tc>
+          <w:tcPr>
+            <w:tcW w:type="dxa" w:w="2880"/>
+          </w:tcPr>
+          <w:p>
+            <w:r/>
+            <w:r>
+              <w:t xml:space="preserve">(thêm 01/10) </w:t>
+            </w:r>
+            <w:r>
+              <w:rPr>
+                <w:b/>
+              </w:rPr>
+              <w:t>tìm theo chữ trên toàn bộ DO</w:t>
+            </w:r>
+            <w:r>
+              <w:t xml:space="preserve">, không phân biệt hoa thường, khớp một phần của: </w:t>
+            </w:r>
+            <w:r>
+              <w:rPr>
+                <w:rFonts w:ascii="Consolas" w:hAnsi="Consolas"/>
+                <w:sz w:val="19"/>
+              </w:rPr>
+              <w:t>do_id</w:t>
+            </w:r>
+            <w:r>
+              <w:t xml:space="preserve">, </w:t>
+            </w:r>
+            <w:r>
+              <w:rPr>
+                <w:rFonts w:ascii="Consolas" w:hAnsi="Consolas"/>
+                <w:sz w:val="19"/>
+              </w:rPr>
+              <w:t>doc_no</w:t>
+            </w:r>
+            <w:r>
+              <w:t xml:space="preserve"> (số phiếu), </w:t>
+            </w:r>
+            <w:r>
+              <w:rPr>
+                <w:rFonts w:ascii="Consolas" w:hAnsi="Consolas"/>
+                <w:sz w:val="19"/>
+              </w:rPr>
+              <w:t>customer_id</w:t>
+            </w:r>
+            <w:r>
+              <w:t xml:space="preserve"> (mã khách bên anh), </w:t>
+            </w:r>
+            <w:r>
+              <w:rPr>
+                <w:rFonts w:ascii="Consolas" w:hAnsi="Consolas"/>
+                <w:sz w:val="19"/>
+              </w:rPr>
+              <w:t>customer_name</w:t>
+            </w:r>
+            <w:r>
+              <w:t xml:space="preserve">, </w:t>
+            </w:r>
+            <w:r>
+              <w:rPr>
+                <w:rFonts w:ascii="Consolas" w:hAnsi="Consolas"/>
+                <w:sz w:val="19"/>
+              </w:rPr>
+              <w:t>truck_no</w:t>
+            </w:r>
+            <w:r>
+              <w:t xml:space="preserve"> (số xe), </w:t>
+            </w:r>
+            <w:r>
+              <w:rPr>
+                <w:rFonts w:ascii="Consolas" w:hAnsi="Consolas"/>
+                <w:sz w:val="19"/>
+              </w:rPr>
+              <w:t>plate_head</w:t>
+            </w:r>
+            <w:r>
+              <w:t xml:space="preserve"> (biển đầu kéo) — đúng sáu ô màn "Vụ việc" tìm. </w:t>
+            </w:r>
+            <w:r>
+              <w:rPr>
+                <w:rFonts w:ascii="Consolas" w:hAnsi="Consolas"/>
+                <w:sz w:val="19"/>
+              </w:rPr>
+              <w:t>%</w:t>
+            </w:r>
+            <w:r>
+              <w:t xml:space="preserve"> và </w:t>
+            </w:r>
+            <w:r>
+              <w:rPr>
+                <w:rFonts w:ascii="Consolas" w:hAnsi="Consolas"/>
+                <w:sz w:val="19"/>
+              </w:rPr>
+              <w:t>_</w:t>
+            </w:r>
+            <w:r>
+              <w:t xml:space="preserve"> là chữ thường, không phải ký tự đại diện. Cắt dấu cách hai đầu; rỗng = không lọc. Dài hơn 200 → 422 </w:t>
+            </w:r>
+            <w:r>
+              <w:rPr>
+                <w:rFonts w:ascii="Consolas" w:hAnsi="Consolas"/>
+                <w:sz w:val="19"/>
+              </w:rPr>
+              <w:t>TU_KHOA_DAI</w:t>
+            </w:r>
+          </w:p>
+        </w:tc>
+      </w:tr>
+      <w:tr>
+        <w:tc>
+          <w:tcPr>
+            <w:tcW w:type="dxa" w:w="2880"/>
+          </w:tcPr>
+          <w:p>
+            <w:r/>
+            <w:r>
+              <w:rPr>
+                <w:rFonts w:ascii="Consolas" w:hAnsi="Consolas"/>
+                <w:sz w:val="19"/>
+              </w:rPr>
               <w:t>page</w:t>
             </w:r>
           </w:p>
@@ -23684,7 +23858,61 @@
         <w:t>total</w:t>
       </w:r>
       <w:r>
-        <w:t xml:space="preserve"> là tổng thật sau khi lọc (không phải tổng chưa lọc).</w:t>
+        <w:t xml:space="preserve"> là tổng thật sau khi lọc (không phải tổng chưa lọc), </w:t>
+      </w:r>
+      <w:r>
+        <w:rPr>
+          <w:b/>
+        </w:rPr>
+        <w:t>kể cả lọc theo `q`</w:t>
+      </w:r>
+      <w:r>
+        <w:t xml:space="preserve">; </w:t>
+      </w:r>
+      <w:r>
+        <w:rPr>
+          <w:rFonts w:ascii="Consolas" w:hAnsi="Consolas"/>
+          <w:sz w:val="19"/>
+        </w:rPr>
+        <w:t>page</w:t>
+      </w:r>
+      <w:r>
+        <w:t xml:space="preserve"> / </w:t>
+      </w:r>
+      <w:r>
+        <w:rPr>
+          <w:rFonts w:ascii="Consolas" w:hAnsi="Consolas"/>
+          <w:sz w:val="19"/>
+        </w:rPr>
+        <w:t>page_size</w:t>
+      </w:r>
+      <w:r>
+        <w:t xml:space="preserve"> phân trang trên kết quả đã lọc.</w:t>
+      </w:r>
+    </w:p>
+    <w:p>
+      <w:pPr>
+        <w:pStyle w:val="ListBullet"/>
+      </w:pPr>
+      <w:r>
+        <w:rPr>
+          <w:rFonts w:ascii="Consolas" w:hAnsi="Consolas"/>
+          <w:sz w:val="19"/>
+        </w:rPr>
+        <w:t>data.q</w:t>
+      </w:r>
+      <w:r>
+        <w:t xml:space="preserve"> trả lại đúng chữ đã dùng để lọc (</w:t>
+      </w:r>
+      <w:r>
+        <w:rPr>
+          <w:rFonts w:ascii="Consolas" w:hAnsi="Consolas"/>
+          <w:sz w:val="19"/>
+        </w:rPr>
+        <w:t>null</w:t>
+      </w:r>
+      <w:r>
+        <w:t xml:space="preserve"> khi không lọc). Hệ anh dựa vào khoá này để biết trang điều xe đã tìm hộ; bản cũ không có khoá này thì hệ anh tự lọc trong trang đã tải (12.9.2).</w:t>
       </w:r>
     </w:p>
     <w:p>
@@ -23900,7 +24128,7 @@
           <w:rFonts w:ascii="Consolas" w:hAnsi="Consolas"/>
           <w:sz w:val="18"/>
         </w:rPr>
-        <w:t>"total": 13, "page": 1, "page_size": 50}}</w:t>
+        <w:t>"total": 13, "page": 1, "page_size": 50, "q": null}}</w:t>
       </w:r>
     </w:p>
     <w:p/>
@@ -28732,43 +28960,144 @@
         <w:pStyle w:val="ListBullet"/>
       </w:pPr>
       <w:r>
+        <w:t>~~</w:t>
+      </w:r>
+      <w:r>
         <w:rPr>
           <w:b/>
         </w:rPr>
         <w:t>Tìm kiếm chỉ trong trang đang xem.</w:t>
       </w:r>
       <w:r>
-        <w:t xml:space="preserve"> Danh sách của anh lọc </w:t>
-      </w:r>
-      <w:r>
-        <w:rPr>
-          <w:rFonts w:ascii="Consolas" w:hAnsi="Consolas"/>
-          <w:sz w:val="19"/>
-        </w:rPr>
-        <w:t>status = "delivered"</w:t>
-      </w:r>
-      <w:r>
-        <w:t xml:space="preserve"> rồi tìm theo </w:t>
-      </w:r>
-      <w:r>
-        <w:rPr>
-          <w:rFonts w:ascii="Consolas" w:hAnsi="Consolas"/>
-          <w:sz w:val="19"/>
-        </w:rPr>
-        <w:t>do_id</w:t>
-      </w:r>
-      <w:r>
-        <w:t xml:space="preserve">, </w:t>
-      </w:r>
-      <w:r>
-        <w:rPr>
-          <w:rFonts w:ascii="Consolas" w:hAnsi="Consolas"/>
-          <w:sz w:val="19"/>
-        </w:rPr>
-        <w:t>customer_id</w:t>
-      </w:r>
-      <w:r>
-        <w:t xml:space="preserve"> trong trang hiện tại (</w:t>
+        <w:t xml:space="preserve">~~ — </w:t>
+      </w:r>
+      <w:r>
+        <w:rPr>
+          <w:b/>
+        </w:rPr>
+        <w:t>đã sửa 01/10</w:t>
+      </w:r>
+      <w:r>
+        <w:t xml:space="preserve"> (nhánh </w:t>
+      </w:r>
+      <w:r>
+        <w:rPr>
+          <w:rFonts w:ascii="Consolas" w:hAnsi="Consolas"/>
+          <w:sz w:val="19"/>
+        </w:rPr>
+        <w:t>feat/HonTunedaHai</w:t>
+      </w:r>
+      <w:r>
+        <w:t xml:space="preserve">, chưa commit): có </w:t>
+      </w:r>
+      <w:r>
+        <w:rPr>
+          <w:rFonts w:ascii="Consolas" w:hAnsi="Consolas"/>
+          <w:sz w:val="19"/>
+        </w:rPr>
+        <w:t>keyword</w:t>
+      </w:r>
+      <w:r>
+        <w:t xml:space="preserve"> thì </w:t>
+      </w:r>
+      <w:r>
+        <w:rPr>
+          <w:rFonts w:ascii="Consolas" w:hAnsi="Consolas"/>
+          <w:sz w:val="19"/>
+        </w:rPr>
+        <w:t>CashVoucherReferenceController</w:t>
+      </w:r>
+      <w:r>
+        <w:t xml:space="preserve"> gửi </w:t>
+      </w:r>
+      <w:r>
+        <w:rPr>
+          <w:rFonts w:ascii="Consolas" w:hAnsi="Consolas"/>
+          <w:sz w:val="19"/>
+        </w:rPr>
+        <w:t>q</w:t>
+      </w:r>
+      <w:r>
+        <w:t xml:space="preserve"> cùng </w:t>
+      </w:r>
+      <w:r>
+        <w:rPr>
+          <w:rFonts w:ascii="Consolas" w:hAnsi="Consolas"/>
+          <w:sz w:val="19"/>
+        </w:rPr>
+        <w:t>page</w:t>
+      </w:r>
+      <w:r>
+        <w:t xml:space="preserve"> / </w:t>
+      </w:r>
+      <w:r>
+        <w:rPr>
+          <w:rFonts w:ascii="Consolas" w:hAnsi="Consolas"/>
+          <w:sz w:val="19"/>
+        </w:rPr>
+        <w:t>page_size</w:t>
+      </w:r>
+      <w:r>
+        <w:t xml:space="preserve"> sang trang điều xe (12.8.2), nên tìm trên </w:t>
+      </w:r>
+      <w:r>
+        <w:rPr>
+          <w:b/>
+        </w:rPr>
+        <w:t>toàn bộ</w:t>
+      </w:r>
+      <w:r>
+        <w:t xml:space="preserve"> DO, </w:t>
+      </w:r>
+      <w:r>
+        <w:rPr>
+          <w:rFonts w:ascii="Consolas" w:hAnsi="Consolas"/>
+          <w:sz w:val="19"/>
+        </w:rPr>
+        <w:t>Total</w:t>
+      </w:r>
+      <w:r>
+        <w:t xml:space="preserve"> / </w:t>
+      </w:r>
+      <w:r>
+        <w:rPr>
+          <w:rFonts w:ascii="Consolas" w:hAnsi="Consolas"/>
+          <w:sz w:val="19"/>
+        </w:rPr>
+        <w:t>HasMore</w:t>
+      </w:r>
+      <w:r>
+        <w:t xml:space="preserve"> đúng sau lọc, </w:t>
+      </w:r>
+      <w:r>
+        <w:rPr>
+          <w:rFonts w:ascii="Consolas" w:hAnsi="Consolas"/>
+          <w:sz w:val="19"/>
+        </w:rPr>
+        <w:t>SearchScope = ALL</w:t>
+      </w:r>
+      <w:r>
+        <w:t xml:space="preserve">. Nguồn chưa biết </w:t>
+      </w:r>
+      <w:r>
+        <w:rPr>
+          <w:rFonts w:ascii="Consolas" w:hAnsi="Consolas"/>
+          <w:sz w:val="19"/>
+        </w:rPr>
+        <w:t>q</w:t>
+      </w:r>
+      <w:r>
+        <w:t xml:space="preserve"> (không trả lại </w:t>
+      </w:r>
+      <w:r>
+        <w:rPr>
+          <w:rFonts w:ascii="Consolas" w:hAnsi="Consolas"/>
+          <w:sz w:val="19"/>
+        </w:rPr>
+        <w:t>data.q</w:t>
+      </w:r>
+      <w:r>
+        <w:t>, ví dụ EPL_System 1506) thì vẫn lọc trong trang đã tải như cũ (</w:t>
       </w:r>
       <w:r>
         <w:rPr>
@@ -28778,7 +29107,7 @@
         <w:t>SearchScope = CURRENT_PAGE</w:t>
       </w:r>
       <w:r>
-        <w:t>), không tìm trên toàn bộ DO.</w:t>
+        <w:t>).</w:t>
       </w:r>
     </w:p>
     <w:p>
@@ -32517,6 +32846,16 @@
               </w:rPr>
               <w:t>QLSX_BASE_URL</w:t>
             </w:r>
+            <w:r>
+              <w:t xml:space="preserve">, </w:t>
+            </w:r>
+            <w:r>
+              <w:rPr>
+                <w:rFonts w:ascii="Consolas" w:hAnsi="Consolas"/>
+                <w:sz w:val="19"/>
+              </w:rPr>
+              <w:t>EPL_ACC_CODE_API</w:t>
+            </w:r>
           </w:p>
         </w:tc>
         <w:tc>
@@ -32526,6 +32865,9 @@
           <w:p>
             <w:r/>
             <w:r>
+              <w:t xml:space="preserve">cả hai </w:t>
+            </w:r>
+            <w:r>
               <w:rPr>
                 <w:rFonts w:ascii="Consolas" w:hAnsi="Consolas"/>
                 <w:sz w:val="19"/>
@@ -32533,7 +32875,7 @@
               <w:t>http://127.0.0.1:5090</w:t>
             </w:r>
             <w:r>
-              <w:t xml:space="preserve"> (API ở máy)</w:t>
+              <w:t xml:space="preserve"> (API ở máy): gửi SO, phiếu chi, đối tượng, công nợ và danh mục tài khoản đều đi vòng trong máy</w:t>
             </w:r>
           </w:p>
         </w:tc>

</xml_diff>

<commit_message>
Chặn ghi nợ hai lần: DO đã có hoá đơn / đã thu ở trang kế toán tạm thì không gửi SO; trùng số phiếu báo 409
- gui_tune.chan_trang_tam: xem trước và gửi SO đều báo DA_HOA_DON_TRANG_TAM (409), không gọi sang hệ kế toán
  (rà 01/10: khách ນາງ ວັນນາ hết nợ ở trang tạm mà hệ anh Tune còn SO thử 1.676,90 USD)
- lập phiếu: hai người lưu cùng lúc cùng số → 409 TRUNG_SO thay vì 500 (thử 4 lần song song: 1 × 200, 3 × 409)
- thu_tao_so_that bỏ qua DO đã có hoá đơn ở trang tạm; hợp đồng 12.11.1 ghi luật và hai SO thử

Co-Authored-By: Claude Opus 5.5 (1M context) <noreply@anthropic.com>
</commit_message>
<xml_diff>
--- a/DOCS/word/HOP_DONG_API_KE_TOAN_ANH_TUNE.docx
+++ b/DOCS/word/HOP_DONG_API_KE_TOAN_ANH_TUNE.docx
@@ -31062,6 +31062,94 @@
       </w:r>
       <w:r>
         <w:t xml:space="preserve"> (T4-0442-09/EPL, ນາງ ວັນນາ, 1.676,9 USD); công nợ khách có ngay bên anh.</w:t>
+      </w:r>
+    </w:p>
+    <w:p>
+      <w:pPr>
+        <w:pStyle w:val="ListBullet"/>
+      </w:pPr>
+      <w:r>
+        <w:rPr>
+          <w:b/>
+        </w:rPr>
+        <w:t>Chặn ghi nợ hai lần (thêm chiều 01/10):</w:t>
+      </w:r>
+      <w:r>
+        <w:t xml:space="preserve"> DO đã </w:t>
+      </w:r>
+      <w:r>
+        <w:rPr>
+          <w:b/>
+        </w:rPr>
+        <w:t>xuất hoá đơn hoặc đã thu ở trang kế toán tạm</w:t>
+      </w:r>
+      <w:r>
+        <w:t xml:space="preserve"> thì bên em không gửi SO nữa, vì công nợ của DO đó đã nằm bên trang tạm. Xem trước và gửi đều báo </w:t>
+      </w:r>
+      <w:r>
+        <w:rPr>
+          <w:rFonts w:ascii="Consolas" w:hAnsi="Consolas"/>
+          <w:sz w:val="19"/>
+        </w:rPr>
+        <w:t>DA_HOA_DON_TRANG_TAM</w:t>
+      </w:r>
+      <w:r>
+        <w:t xml:space="preserve"> (409), không gọi sang bên anh. Muốn gửi thì huỷ hoá đơn bên trang tạm, hoặc đối soát với kế toán, trước.</w:t>
+      </w:r>
+    </w:p>
+    <w:p>
+      <w:pPr>
+        <w:pStyle w:val="ListBullet2"/>
+      </w:pPr>
+      <w:r>
+        <w:t xml:space="preserve">Lý do: lúc rà, khách ນາງ ວັນນາ đã hết nợ ở trang tạm mà hệ anh vẫn còn SO </w:t>
+      </w:r>
+      <w:r>
+        <w:rPr>
+          <w:rFonts w:ascii="Consolas" w:hAnsi="Consolas"/>
+          <w:sz w:val="19"/>
+        </w:rPr>
+        <w:t>TK-20261001-000163</w:t>
+      </w:r>
+      <w:r>
+        <w:t xml:space="preserve"> 1.676,90 USD.</w:t>
+      </w:r>
+    </w:p>
+    <w:p>
+      <w:pPr>
+        <w:pStyle w:val="ListBullet2"/>
+      </w:pPr>
+      <w:r>
+        <w:t xml:space="preserve">Hai SO </w:t>
+      </w:r>
+      <w:r>
+        <w:rPr>
+          <w:rFonts w:ascii="Consolas" w:hAnsi="Consolas"/>
+          <w:sz w:val="19"/>
+        </w:rPr>
+        <w:t>…162</w:t>
+      </w:r>
+      <w:r>
+        <w:t xml:space="preserve"> và </w:t>
+      </w:r>
+      <w:r>
+        <w:rPr>
+          <w:rFonts w:ascii="Consolas" w:hAnsi="Consolas"/>
+          <w:sz w:val="19"/>
+        </w:rPr>
+        <w:t>…163</w:t>
+      </w:r>
+      <w:r>
+        <w:t xml:space="preserve"> là </w:t>
+      </w:r>
+      <w:r>
+        <w:rPr>
+          <w:b/>
+        </w:rPr>
+        <w:t>SO thử</w:t>
+      </w:r>
+      <w:r>
+        <w:t xml:space="preserve"> trên DB demo anh đã sao lưu. Anh bỏ qua, hoặc huỷ, khi đối soát.</w:t>
       </w:r>
     </w:p>
     <w:p>

</xml_diff>

<commit_message>
Tài liệu bàn giao anh Tune: giao ước bút toán theo b9227aa / 875a0cf (Entries, ST 13, gỡ, mất phản hồi), các bước triển khai bút toán, việc còn lại cần quyền host
Co-Authored-By: Claude Opus 5.5 (1M context) <noreply@anthropic.com>
</commit_message>
<xml_diff>
--- a/DOCS/word/HOP_DONG_API_KE_TOAN_ANH_TUNE.docx
+++ b/DOCS/word/HOP_DONG_API_KE_TOAN_ANH_TUNE.docx
@@ -24,7 +24,7 @@
         <w:rPr>
           <w:b/>
         </w:rPr>
-        <w:t>v2.5 · 01/10/2026</w:t>
+        <w:t>v2.6 · 01/10/2026</w:t>
       </w:r>
       <w:r>
         <w:t xml:space="preserve"> (lịch sử các bản trước tra bằng Git). Bên soạn: trang điều xe </w:t>
@@ -161,7 +161,45 @@
         <w:t>bút toán chờ gửi</w:t>
       </w:r>
       <w:r>
-        <w:t xml:space="preserve"> ở trang điều xe (màn "Bút toán chờ gửi"), chờ API bút toán (mục 8, 12.12.4).</w:t>
+        <w:t xml:space="preserve"> ở trang điều xe (màn "Bút toán chờ gửi"), gửi sang </w:t>
+      </w:r>
+      <w:r>
+        <w:rPr>
+          <w:b/>
+        </w:rPr>
+        <w:t>API bút toán tổng hợp</w:t>
+      </w:r>
+      <w:r>
+        <w:t xml:space="preserve"> bên anh (</w:t>
+      </w:r>
+      <w:r>
+        <w:rPr>
+          <w:rFonts w:ascii="Consolas" w:hAnsi="Consolas"/>
+          <w:sz w:val="19"/>
+        </w:rPr>
+        <w:t>b9227aa</w:t>
+      </w:r>
+      <w:r>
+        <w:t xml:space="preserve">) khi bật cờ </w:t>
+      </w:r>
+      <w:r>
+        <w:rPr>
+          <w:rFonts w:ascii="Consolas" w:hAnsi="Consolas"/>
+          <w:sz w:val="19"/>
+        </w:rPr>
+        <w:t>QLSX_GUI_BUT_TOAN</w:t>
+      </w:r>
+      <w:r>
+        <w:t xml:space="preserve"> — API và đầu gửi đã có, </w:t>
+      </w:r>
+      <w:r>
+        <w:rPr>
+          <w:b/>
+        </w:rPr>
+        <w:t>chưa chạy trên DB</w:t>
+      </w:r>
+      <w:r>
+        <w:t>: chờ áp script (mục 8, 12.12.4).</w:t>
       </w:r>
     </w:p>
     <w:p>
@@ -327,7 +365,7 @@
           <w:rFonts w:ascii="Consolas" w:hAnsi="Consolas"/>
           <w:sz w:val="19"/>
         </w:rPr>
-        <w:t>feat/HonTunedaHai@ae0e7f6</w:t>
+        <w:t>feat/HonTunedaHai@b9227aa</w:t>
       </w:r>
       <w:r>
         <w:t xml:space="preserve">, WEB </w:t>
@@ -337,7 +375,7 @@
           <w:rFonts w:ascii="Consolas" w:hAnsi="Consolas"/>
           <w:sz w:val="19"/>
         </w:rPr>
-        <w:t>feat/hontunedhai_Laos@77bcb0a1</w:t>
+        <w:t>feat/hontunedhai_Laos@7d168744</w:t>
       </w:r>
       <w:r>
         <w:t xml:space="preserve"> (12.9). Trong đó: nguồn DO đọc cấu hình </w:t>
@@ -369,7 +407,16 @@
         <w:t>tự tính quy đổi từng dòng và tổng header</w:t>
       </w:r>
       <w:r>
-        <w:t xml:space="preserve"> phiếu thu chi; nhật ký kiểm toán che mật khẩu; WEB không đổi loại phiếu ngầm. Trang điều xe </w:t>
+        <w:t xml:space="preserve"> phiếu thu chi; nhật ký kiểm toán và log WEB che mật khẩu; </w:t>
+      </w:r>
+      <w:r>
+        <w:rPr>
+          <w:b/>
+        </w:rPr>
+        <w:t>API bút toán tổng hợp</w:t>
+      </w:r>
+      <w:r>
+        <w:t xml:space="preserve"> (12.12.4); WEB không đổi loại phiếu ngầm, không gán ngầm tiền tệ. Trang điều xe </w:t>
       </w:r>
       <w:r>
         <w:rPr>
@@ -399,7 +446,27 @@
         <w:t>938b007</w:t>
       </w:r>
       <w:r>
-        <w:t xml:space="preserve"> (dọn lớp tạm); kho tạm </w:t>
+        <w:t xml:space="preserve"> (dọn lớp tạm), </w:t>
+      </w:r>
+      <w:r>
+        <w:rPr>
+          <w:rFonts w:ascii="Consolas" w:hAnsi="Consolas"/>
+          <w:sz w:val="19"/>
+        </w:rPr>
+        <w:t>a938301</w:t>
+      </w:r>
+      <w:r>
+        <w:t xml:space="preserve">, </w:t>
+      </w:r>
+      <w:r>
+        <w:rPr>
+          <w:rFonts w:ascii="Consolas" w:hAnsi="Consolas"/>
+          <w:sz w:val="19"/>
+        </w:rPr>
+        <w:t>875a0cf</w:t>
+      </w:r>
+      <w:r>
+        <w:t xml:space="preserve"> (gửi bút toán); kho tạm </w:t>
       </w:r>
       <w:r>
         <w:rPr>
@@ -993,7 +1060,27 @@
               <w:t>bút toán chờ gửi</w:t>
             </w:r>
             <w:r>
-              <w:t xml:space="preserve"> giữ ở trang điều xe, đủ hai vế; gửi khi có API bút toán (mục 8, 12.12.4 — bên EPL làm, đang làm)</w:t>
+              <w:t xml:space="preserve"> giữ ở trang điều xe, đủ hai vế; gửi qua </w:t>
+            </w:r>
+            <w:r>
+              <w:rPr>
+                <w:rFonts w:ascii="Consolas" w:hAnsi="Consolas"/>
+                <w:sz w:val="19"/>
+              </w:rPr>
+              <w:t>integrations/logistics/journal-entries</w:t>
+            </w:r>
+            <w:r>
+              <w:t xml:space="preserve"> bên anh (12.12.4) — API đã có (</w:t>
+            </w:r>
+            <w:r>
+              <w:rPr>
+                <w:rFonts w:ascii="Consolas" w:hAnsi="Consolas"/>
+                <w:sz w:val="19"/>
+              </w:rPr>
+              <w:t>b9227aa</w:t>
+            </w:r>
+            <w:r>
+              <w:t>), chờ áp script DB rồi bật cờ</w:t>
             </w:r>
           </w:p>
         </w:tc>
@@ -3890,7 +3977,7 @@
         <w:pStyle w:val="ListBullet"/>
       </w:pPr>
       <w:r>
-        <w:t>khoản không qua tiền → bút toán chờ gửi ở LAO, chờ API bút toán (mục 8, 12.12.4).</w:t>
+        <w:t>khoản không qua tiền → bút toán chờ gửi ở LAO, gửi qua API bút toán tổng hợp bên anh khi bật cờ (mục 8, 12.12.4).</w:t>
       </w:r>
     </w:p>
     <w:p>
@@ -13400,6 +13487,24 @@
     </w:p>
     <w:p>
       <w:pPr>
+        <w:jc w:val="both"/>
+      </w:pPr>
+      <w:r>
+        <w:t xml:space="preserve">| </w:t>
+      </w:r>
+      <w:r>
+        <w:rPr>
+          <w:rFonts w:ascii="Consolas" w:hAnsi="Consolas"/>
+          <w:sz w:val="19"/>
+        </w:rPr>
+        <w:t>ban_chu_xe</w:t>
+      </w:r>
+      <w:r>
+        <w:t xml:space="preserve"> | phiếu chi trả chủ xe có trừ hàng quầy đã chi | Nợ 4022 / Có 707, theo giá bán | mã phiếu bán (kho tạm) |</w:t>
+      </w:r>
+    </w:p>
+    <w:p>
+      <w:pPr>
         <w:pStyle w:val="ListBullet2"/>
       </w:pPr>
       <w:r>
@@ -13441,6 +13546,16 @@
         <w:t>EPLLAO-&lt;nguồn&gt;-&lt;mã nguồn&gt;</w:t>
       </w:r>
       <w:r>
+        <w:t xml:space="preserve">; bản đã gỡ mà nguồn ghi lại thì phiên mới </w:t>
+      </w:r>
+      <w:r>
+        <w:rPr>
+          <w:rFonts w:ascii="Consolas" w:hAnsi="Consolas"/>
+          <w:sz w:val="19"/>
+        </w:rPr>
+        <w:t>…-2</w:t>
+      </w:r>
+      <w:r>
         <w:t>.</w:t>
       </w:r>
     </w:p>
@@ -13479,7 +13594,16 @@
         <w:t>huy</w:t>
       </w:r>
       <w:r>
-        <w:t>. Mở khoá phiếu: bản chưa gửi bị huỷ, khoá lại ghi theo số mới; bản đã gửi đánh "cần đảo", chờ bút toán đảo.</w:t>
+        <w:t xml:space="preserve">. Mở khoá phiếu: bản chưa gửi bị huỷ, khoá lại ghi theo số mới; bản đã gửi thì gửi </w:t>
+      </w:r>
+      <w:r>
+        <w:rPr>
+          <w:b/>
+        </w:rPr>
+        <w:t>gỡ</w:t>
+      </w:r>
+      <w:r>
+        <w:t xml:space="preserve"> sang bên anh (chưa gỡ được thì "chờ đảo").</w:t>
       </w:r>
     </w:p>
     <w:p>
@@ -13487,26 +13611,46 @@
         <w:pStyle w:val="ListBullet2"/>
       </w:pPr>
       <w:r>
-        <w:t xml:space="preserve">Hệ anh </w:t>
+        <w:t xml:space="preserve">Đường nhận bên anh: </w:t>
+      </w:r>
+      <w:r>
+        <w:rPr>
+          <w:rFonts w:ascii="Consolas" w:hAnsi="Consolas"/>
+          <w:sz w:val="19"/>
+        </w:rPr>
+        <w:t>integrations/logistics/journal-entries</w:t>
+      </w:r>
+      <w:r>
+        <w:t xml:space="preserve"> (</w:t>
+      </w:r>
+      <w:r>
+        <w:rPr>
+          <w:rFonts w:ascii="Consolas" w:hAnsi="Consolas"/>
+          <w:sz w:val="19"/>
+        </w:rPr>
+        <w:t>b9227aa</w:t>
+      </w:r>
+      <w:r>
+        <w:t xml:space="preserve">, 12.12.4) — </w:t>
       </w:r>
       <w:r>
         <w:rPr>
           <w:b/>
         </w:rPr>
-        <w:t>chưa có đường nhận</w:t>
-      </w:r>
-      <w:r>
-        <w:t xml:space="preserve"> (12.12.4). Có đường thì bên em gửi các bản </w:t>
-      </w:r>
-      <w:r>
-        <w:rPr>
-          <w:rFonts w:ascii="Consolas" w:hAnsi="Consolas"/>
-          <w:sz w:val="19"/>
-        </w:rPr>
-        <w:t>cho_gui</w:t>
-      </w:r>
-      <w:r>
-        <w:t>, không mất khoản nào trong lúc chờ.</w:t>
+        <w:t>chưa chạy trên DB</w:t>
+      </w:r>
+      <w:r>
+        <w:t xml:space="preserve"> (chờ áp script). Cờ gửi </w:t>
+      </w:r>
+      <w:r>
+        <w:rPr>
+          <w:rFonts w:ascii="Consolas" w:hAnsi="Consolas"/>
+          <w:sz w:val="19"/>
+        </w:rPr>
+        <w:t>QLSX_GUI_BUT_TOAN</w:t>
+      </w:r>
+      <w:r>
+        <w:t xml:space="preserve"> đang tắt: các bản nằm "chờ gửi", không mất khoản nào.</w:t>
       </w:r>
     </w:p>
     <w:p>
@@ -13655,7 +13799,7 @@
         <w:t>thue_xe</w:t>
       </w:r>
       <w:r>
-        <w:t xml:space="preserve"> lúc khoá phiếu, chờ API bút toán (bên EPL làm, đang làm).</w:t>
+        <w:t xml:space="preserve"> lúc khoá phiếu; gửi qua API bút toán tổng hợp bên anh khi bật cờ (12.12.4).</w:t>
       </w:r>
     </w:p>
     <w:p>
@@ -14122,7 +14266,7 @@
         <w:t>delete</w:t>
       </w:r>
       <w:r>
-        <w:t xml:space="preserve">); đã ghi sổ thì không xoá, không sửa, báo đối soát. Bút toán chờ đã gửi thì đánh "cần đảo", chờ đường </w:t>
+        <w:t xml:space="preserve">); đã ghi sổ thì không xoá, không sửa, báo đối soát. Bút toán chờ đã gửi thì gửi </w:t>
       </w:r>
       <w:r>
         <w:rPr>
@@ -14132,7 +14276,7 @@
         <w:t>…/journal-entries/reverse</w:t>
       </w:r>
       <w:r>
-        <w:t xml:space="preserve"> (12.12.4).</w:t>
+        <w:t xml:space="preserve"> (gỡ ghi sổ + xoá chứng từ bên anh); bị chặn thì "chờ đảo" (12.12.4).</w:t>
       </w:r>
     </w:p>
     <w:p>
@@ -14397,7 +14541,7 @@
                 <w:rFonts w:ascii="Consolas" w:hAnsi="Consolas"/>
                 <w:sz w:val="19"/>
               </w:rPr>
-              <w:t>ae0e7f6</w:t>
+              <w:t>b9227aa</w:t>
             </w:r>
             <w:r>
               <w:t xml:space="preserve">, </w:t>
@@ -14407,7 +14551,7 @@
                 <w:rFonts w:ascii="Consolas" w:hAnsi="Consolas"/>
                 <w:sz w:val="19"/>
               </w:rPr>
-              <w:t>77bcb0a1</w:t>
+              <w:t>7d168744</w:t>
             </w:r>
             <w:r>
               <w:t xml:space="preserve"> (12.9)</w:t>
@@ -14674,16 +14818,98 @@
           <w:p>
             <w:r/>
             <w:r>
-              <w:t>bên EPL làm (</w:t>
-            </w:r>
-            <w:r>
               <w:rPr>
                 <w:b/>
               </w:rPr>
-              <w:t>đang làm</w:t>
-            </w:r>
-            <w:r>
-              <w:t>)</w:t>
+              <w:t>đã làm</w:t>
+            </w:r>
+            <w:r>
+              <w:t xml:space="preserve"> (</w:t>
+            </w:r>
+            <w:r>
+              <w:rPr>
+                <w:rFonts w:ascii="Consolas" w:hAnsi="Consolas"/>
+                <w:sz w:val="19"/>
+              </w:rPr>
+              <w:t>b9227aa</w:t>
+            </w:r>
+            <w:r>
+              <w:t xml:space="preserve">) — </w:t>
+            </w:r>
+            <w:r>
+              <w:rPr>
+                <w:b/>
+              </w:rPr>
+              <w:t>chưa chạy trên DB</w:t>
+            </w:r>
+            <w:r>
+              <w:t xml:space="preserve">: script chưa áp DB demo (chủ dự án tự chạy); DB host </w:t>
+            </w:r>
+            <w:r>
+              <w:rPr>
+                <w:b/>
+              </w:rPr>
+              <w:t>cần quyền host</w:t>
+            </w:r>
+          </w:p>
+        </w:tc>
+      </w:tr>
+      <w:tr>
+        <w:tc>
+          <w:tcPr>
+            <w:tcW w:type="dxa" w:w="4320"/>
+          </w:tcPr>
+          <w:p>
+            <w:r/>
+            <w:r>
+              <w:t>Gửi bút toán chờ sang API đó; gỡ khi nguồn bị huỷ; giữ hai sổ không lệch khi mất phản hồi</w:t>
+            </w:r>
+          </w:p>
+        </w:tc>
+        <w:tc>
+          <w:tcPr>
+            <w:tcW w:type="dxa" w:w="4320"/>
+          </w:tcPr>
+          <w:p>
+            <w:r/>
+            <w:r>
+              <w:rPr>
+                <w:b/>
+              </w:rPr>
+              <w:t>đã làm</w:t>
+            </w:r>
+            <w:r>
+              <w:t xml:space="preserve"> (</w:t>
+            </w:r>
+            <w:r>
+              <w:rPr>
+                <w:rFonts w:ascii="Consolas" w:hAnsi="Consolas"/>
+                <w:sz w:val="19"/>
+              </w:rPr>
+              <w:t>a938301</w:t>
+            </w:r>
+            <w:r>
+              <w:t xml:space="preserve">, </w:t>
+            </w:r>
+            <w:r>
+              <w:rPr>
+                <w:rFonts w:ascii="Consolas" w:hAnsi="Consolas"/>
+                <w:sz w:val="19"/>
+              </w:rPr>
+              <w:t>875a0cf</w:t>
+            </w:r>
+            <w:r>
+              <w:t xml:space="preserve">), cờ </w:t>
+            </w:r>
+            <w:r>
+              <w:rPr>
+                <w:rFonts w:ascii="Consolas" w:hAnsi="Consolas"/>
+                <w:sz w:val="19"/>
+              </w:rPr>
+              <w:t>QLSX_GUI_BUT_TOAN</w:t>
+            </w:r>
+            <w:r>
+              <w:t xml:space="preserve"> tắt tới khi áp script</w:t>
             </w:r>
           </w:p>
         </w:tc>
@@ -15346,7 +15572,7 @@
         <w:t>Bút toán đảo</w:t>
       </w:r>
       <w:r>
-        <w:t xml:space="preserve"> khi huỷ: khuôn tờ huỷ (tham chiếu mã gốc)? Bên em đề nghị </w:t>
+        <w:t xml:space="preserve"> khi huỷ — đã có lời đáp trong mã: </w:t>
       </w:r>
       <w:r>
         <w:rPr>
@@ -15356,7 +15582,7 @@
         <w:t>…/journal-entries/reverse { "SourceRef" }</w:t>
       </w:r>
       <w:r>
-        <w:t xml:space="preserve"> (12.12.4).</w:t>
+        <w:t xml:space="preserve"> gỡ ghi sổ và xoá chứng từ tổng hợp bằng thủ tục legacy, không tạo tờ đảo riêng; chứng từ đã khoá / đã ghi sổ chính thức thì 409, kế toán gỡ trong QLSX (12.12.4).</w:t>
       </w:r>
     </w:p>
     <w:p>
@@ -15426,7 +15652,7 @@
         <w:t>Ghi nhận chi phí không qua tiền</w:t>
       </w:r>
       <w:r>
-        <w:t xml:space="preserve"> (lỗ hổng 1, 4): tài khoản đã chốt — thuê xe 621/4022, ghi nợ nhà cung cấp 625 · 614 / 4021, quyết toán tạm ứng 625/1601; bên em giữ thành bút toán chờ. Còn lại: </w:t>
+        <w:t xml:space="preserve"> (lỗ hổng 1, 4): tài khoản đã chốt — thuê xe 621/4022, ghi nợ nhà cung cấp 625 · 614 / 4021, quyết toán tạm ứng 625/1601; bên em giữ thành bút toán chờ. </w:t>
       </w:r>
       <w:r>
         <w:rPr>
@@ -15435,7 +15661,17 @@
         <w:t>API bút toán</w:t>
       </w:r>
       <w:r>
-        <w:t xml:space="preserve"> (12.12.4, bên EPL làm, đang làm) và cách ghi </w:t>
+        <w:t xml:space="preserve"> đã có (</w:t>
+      </w:r>
+      <w:r>
+        <w:rPr>
+          <w:rFonts w:ascii="Consolas" w:hAnsi="Consolas"/>
+          <w:sz w:val="19"/>
+        </w:rPr>
+        <w:t>b9227aa</w:t>
+      </w:r>
+      <w:r>
+        <w:t xml:space="preserve">, 12.12.4), chờ áp script. Còn lại cách ghi </w:t>
       </w:r>
       <w:r>
         <w:rPr>
@@ -15739,6 +15975,50 @@
       </w:r>
       <w:r>
         <w:t>.</w:t>
+      </w:r>
+    </w:p>
+    <w:p>
+      <w:pPr>
+        <w:pStyle w:val="ListBullet"/>
+      </w:pPr>
+      <w:r>
+        <w:rPr>
+          <w:rFonts w:ascii="Consolas" w:hAnsi="Consolas"/>
+          <w:sz w:val="19"/>
+        </w:rPr>
+        <w:t>kiem/thu_gui_but_toan.py</w:t>
+      </w:r>
+      <w:r>
+        <w:t xml:space="preserve"> — gửi bút toán sang </w:t>
+      </w:r>
+      <w:r>
+        <w:rPr>
+          <w:b/>
+        </w:rPr>
+        <w:t>máy giả</w:t>
+      </w:r>
+      <w:r>
+        <w:t xml:space="preserve"> theo giao ước </w:t>
+      </w:r>
+      <w:r>
+        <w:rPr>
+          <w:rFonts w:ascii="Consolas" w:hAnsi="Consolas"/>
+          <w:sz w:val="19"/>
+        </w:rPr>
+        <w:t>b9227aa</w:t>
+      </w:r>
+      <w:r>
+        <w:t xml:space="preserve"> (201, ST 13, </w:t>
+      </w:r>
+      <w:r>
+        <w:rPr>
+          <w:rFonts w:ascii="Consolas" w:hAnsi="Consolas"/>
+          <w:sz w:val="19"/>
+        </w:rPr>
+        <w:t>ErrorDetail</w:t>
+      </w:r>
+      <w:r>
+        <w:t>, 409 khác số, gỡ lần hai, mất phản hồi); không gọi API thật, không chạy trên máy thật 8010 / 8020.</w:t>
       </w:r>
     </w:p>
     <w:p>
@@ -17568,31 +17848,94 @@
             <w:r/>
             <w:r>
               <w:rPr>
+                <w:rFonts w:ascii="Consolas" w:hAnsi="Consolas"/>
+                <w:sz w:val="19"/>
+              </w:rPr>
+              <w:t>POST /api/v1/integrations/logistics/journal-entries</w:t>
+            </w:r>
+            <w:r>
+              <w:t xml:space="preserve"> (+ </w:t>
+            </w:r>
+            <w:r>
+              <w:rPr>
+                <w:rFonts w:ascii="Consolas" w:hAnsi="Consolas"/>
+                <w:sz w:val="19"/>
+              </w:rPr>
+              <w:t>/reverse</w:t>
+            </w:r>
+            <w:r>
+              <w:t xml:space="preserve">, </w:t>
+            </w:r>
+            <w:r>
+              <w:rPr>
+                <w:rFonts w:ascii="Consolas" w:hAnsi="Consolas"/>
+                <w:sz w:val="19"/>
+              </w:rPr>
+              <w:t>GET /{SourceRef}</w:t>
+            </w:r>
+            <w:r>
+              <w:t xml:space="preserve">), </w:t>
+            </w:r>
+            <w:r>
+              <w:rPr>
+                <w:rFonts w:ascii="Consolas" w:hAnsi="Consolas"/>
+                <w:sz w:val="19"/>
+              </w:rPr>
+              <w:t>Idempotency-Key</w:t>
+            </w:r>
+            <w:r>
+              <w:t xml:space="preserve"> = SourceRef (</w:t>
+            </w:r>
+            <w:r>
+              <w:rPr>
+                <w:rFonts w:ascii="Consolas" w:hAnsi="Consolas"/>
+                <w:sz w:val="19"/>
+              </w:rPr>
+              <w:t>b9227aa</w:t>
+            </w:r>
+            <w:r>
+              <w:t>)</w:t>
+            </w:r>
+          </w:p>
+        </w:tc>
+        <w:tc>
+          <w:tcPr>
+            <w:tcW w:type="dxa" w:w="2160"/>
+          </w:tcPr>
+          <w:p>
+            <w:r/>
+            <w:r>
+              <w:t xml:space="preserve">bên em gửi bút toán chờ (mục 8) khi bật cờ </w:t>
+            </w:r>
+            <w:r>
+              <w:rPr>
+                <w:rFonts w:ascii="Consolas" w:hAnsi="Consolas"/>
+                <w:sz w:val="19"/>
+              </w:rPr>
+              <w:t>QLSX_GUI_BUT_TOAN</w:t>
+            </w:r>
+            <w:r>
+              <w:t>; gỡ khi nguồn bị huỷ</w:t>
+            </w:r>
+          </w:p>
+        </w:tc>
+        <w:tc>
+          <w:tcPr>
+            <w:tcW w:type="dxa" w:w="2160"/>
+          </w:tcPr>
+          <w:p>
+            <w:r/>
+            <w:r>
+              <w:t xml:space="preserve">API và đầu gửi đã có; </w:t>
+            </w:r>
+            <w:r>
+              <w:rPr>
                 <w:b/>
               </w:rPr>
-              <w:t>chưa có</w:t>
-            </w:r>
-          </w:p>
-        </w:tc>
-        <w:tc>
-          <w:tcPr>
-            <w:tcW w:type="dxa" w:w="2160"/>
-          </w:tcPr>
-          <w:p>
-            <w:r/>
-            <w:r>
-              <w:t>bên em giữ bút toán chờ (mục 8)</w:t>
-            </w:r>
-          </w:p>
-        </w:tc>
-        <w:tc>
-          <w:tcPr>
-            <w:tcW w:type="dxa" w:w="2160"/>
-          </w:tcPr>
-          <w:p>
-            <w:r/>
-            <w:r>
-              <w:t>API bút toán (12.12.4): bên EPL làm (đang làm)</w:t>
+              <w:t>chưa chạy trên DB</w:t>
+            </w:r>
+            <w:r>
+              <w:t xml:space="preserve"> — chờ áp script (12.12.4)</w:t>
             </w:r>
           </w:p>
         </w:tc>
@@ -20826,10 +21169,30 @@
               <w:rPr>
                 <w:b/>
               </w:rPr>
-              <w:t>API bút toán tổng hợp</w:t>
-            </w:r>
-            <w:r>
-              <w:t xml:space="preserve"> nhận bút toán chờ (mục 8, 12.12.4)</w:t>
+              <w:t>Bút toán tổng hợp</w:t>
+            </w:r>
+            <w:r>
+              <w:t xml:space="preserve"> nhận bút toán chờ (mục 8, 12.12.4): API đã có (</w:t>
+            </w:r>
+            <w:r>
+              <w:rPr>
+                <w:rFonts w:ascii="Consolas" w:hAnsi="Consolas"/>
+                <w:sz w:val="19"/>
+              </w:rPr>
+              <w:t>b9227aa</w:t>
+            </w:r>
+            <w:r>
+              <w:t xml:space="preserve">); áp script </w:t>
+            </w:r>
+            <w:r>
+              <w:rPr>
+                <w:rFonts w:ascii="Consolas" w:hAnsi="Consolas"/>
+                <w:sz w:val="19"/>
+              </w:rPr>
+              <w:t>20261001_logistics_journal_entry.sql</w:t>
+            </w:r>
+            <w:r>
+              <w:t>, rồi cấu hình, bật cờ, gọi thử</w:t>
             </w:r>
           </w:p>
         </w:tc>
@@ -20840,7 +21203,25 @@
           <w:p>
             <w:r/>
             <w:r>
-              <w:t>bên EPL làm (đang làm)</w:t>
+              <w:t xml:space="preserve">áp script DB demo: </w:t>
+            </w:r>
+            <w:r>
+              <w:rPr>
+                <w:b/>
+              </w:rPr>
+              <w:t>chủ dự án tự chạy</w:t>
+            </w:r>
+            <w:r>
+              <w:t xml:space="preserve">; DB host: </w:t>
+            </w:r>
+            <w:r>
+              <w:rPr>
+                <w:b/>
+              </w:rPr>
+              <w:t>cần quyền host</w:t>
+            </w:r>
+            <w:r>
+              <w:t>; bật cờ, gọi thử: bên EPL</w:t>
             </w:r>
           </w:p>
         </w:tc>
@@ -20880,7 +21261,7 @@
               <w:t>LogisticsSource</w:t>
             </w:r>
             <w:r>
-              <w:t xml:space="preserve"> (bắt buộc) và </w:t>
+              <w:t xml:space="preserve"> (bắt buộc), </w:t>
             </w:r>
             <w:r>
               <w:rPr>
@@ -20890,7 +21271,17 @@
               <w:t>LogisticsSalesPush:AllowedUserIds</w:t>
             </w:r>
             <w:r>
-              <w:t xml:space="preserve"> (12.12.2); kho tạm có </w:t>
+              <w:t xml:space="preserve"> (12.12.2) và </w:t>
+            </w:r>
+            <w:r>
+              <w:rPr>
+                <w:rFonts w:ascii="Consolas" w:hAnsi="Consolas"/>
+                <w:sz w:val="19"/>
+              </w:rPr>
+              <w:t>LogisticsJournalEntry</w:t>
+            </w:r>
+            <w:r>
+              <w:t xml:space="preserve"> (12.12.4); kho tạm có </w:t>
             </w:r>
             <w:r>
               <w:rPr>
@@ -21133,7 +21524,27 @@
               <w:t>ed5aa0e</w:t>
             </w:r>
             <w:r>
-              <w:t>): xoá / che, cân nhắc đổi mật khẩu</w:t>
+              <w:t xml:space="preserve">): chạy script che </w:t>
+            </w:r>
+            <w:r>
+              <w:rPr>
+                <w:rFonts w:ascii="Consolas" w:hAnsi="Consolas"/>
+                <w:sz w:val="19"/>
+              </w:rPr>
+              <w:t>20261001_audit_redact_secrets.sql</w:t>
+            </w:r>
+            <w:r>
+              <w:t xml:space="preserve"> (</w:t>
+            </w:r>
+            <w:r>
+              <w:rPr>
+                <w:rFonts w:ascii="Consolas" w:hAnsi="Consolas"/>
+                <w:sz w:val="19"/>
+              </w:rPr>
+              <w:t>e2ef52f</w:t>
+            </w:r>
+            <w:r>
+              <w:t>), cân nhắc đổi mật khẩu</w:t>
             </w:r>
           </w:p>
         </w:tc>
@@ -24570,7 +24981,7 @@
         <w:t>thue_xe</w:t>
       </w:r>
       <w:r>
-        <w:t xml:space="preserve"> lúc khoá phiếu, chờ API bút toán (bên EPL làm, đang làm). Phí và trừ quá tải chưa có bút toán riêng.</w:t>
+        <w:t xml:space="preserve"> lúc khoá phiếu, gửi qua API bút toán tổng hợp bên anh khi bật cờ (12.12.4). Phí và trừ quá tải chưa có bút toán riêng.</w:t>
       </w:r>
     </w:p>
     <w:p>
@@ -26199,7 +26610,7 @@
                 <w:rFonts w:ascii="Consolas" w:hAnsi="Consolas"/>
                 <w:sz w:val="19"/>
               </w:rPr>
-              <w:t>ae0e7f6</w:t>
+              <w:t>b9227aa</w:t>
             </w:r>
           </w:p>
         </w:tc>
@@ -26246,7 +26657,7 @@
                 <w:rFonts w:ascii="Consolas" w:hAnsi="Consolas"/>
                 <w:sz w:val="19"/>
               </w:rPr>
-              <w:t>77bcb0a1</w:t>
+              <w:t>7d168744</w:t>
             </w:r>
           </w:p>
         </w:tc>
@@ -26267,7 +26678,36 @@
         <w:t>sửa thẳng</w:t>
       </w:r>
       <w:r>
-        <w:t xml:space="preserve"> source của anh; "bên mình với anh Tune giờ là một", nên các việc trên source bên EPL làm luôn. Bên em thử bằng API và WEB chạy ở máy, trên DB demo Lào anh đã sao lưu; không chạy migration, không sửa procedure, không mở cấu hình bí mật vào tài liệu. Chưa push nhánh nào lên GitHub. Tài liệu hiện trạng phía anh: </w:t>
+        <w:t xml:space="preserve"> source của anh; "bên mình với anh Tune giờ là một", nên các việc trên source bên EPL làm luôn. Bên em thử bằng API và WEB chạy ở máy, trên DB demo Lào anh đã sao lưu; không tự chạy migration, không sửa thủ tục có sẵn, không mở cấu hình bí mật vào tài liệu. Hai script mới (</w:t>
+      </w:r>
+      <w:r>
+        <w:rPr>
+          <w:rFonts w:ascii="Consolas" w:hAnsi="Consolas"/>
+          <w:sz w:val="19"/>
+        </w:rPr>
+        <w:t>e2ef52f</w:t>
+      </w:r>
+      <w:r>
+        <w:t xml:space="preserve"> che audit cũ, </w:t>
+      </w:r>
+      <w:r>
+        <w:rPr>
+          <w:rFonts w:ascii="Consolas" w:hAnsi="Consolas"/>
+          <w:sz w:val="19"/>
+        </w:rPr>
+        <w:t>b9227aa</w:t>
+      </w:r>
+      <w:r>
+        <w:t xml:space="preserve"> thêm ba thủ tục bút toán) </w:t>
+      </w:r>
+      <w:r>
+        <w:rPr>
+          <w:b/>
+        </w:rPr>
+        <w:t>chưa chạy</w:t>
+      </w:r>
+      <w:r>
+        <w:t xml:space="preserve"> ở DB nào. Chưa push nhánh nào lên GitHub. Tài liệu hiện trạng phía anh: </w:t>
       </w:r>
       <w:r>
         <w:rPr>
@@ -26763,6 +27203,234 @@
             </w:r>
             <w:r>
               <w:t>; hình thức không rõ thì chặn lưu; modal Vụ việc thoát ký tự cả DEAL / QUOTE</w:t>
+            </w:r>
+          </w:p>
+        </w:tc>
+      </w:tr>
+      <w:tr>
+        <w:tc>
+          <w:tcPr>
+            <w:tcW w:type="dxa" w:w="4320"/>
+          </w:tcPr>
+          <w:p>
+            <w:r/>
+            <w:r>
+              <w:rPr>
+                <w:rFonts w:ascii="Consolas" w:hAnsi="Consolas"/>
+                <w:sz w:val="19"/>
+              </w:rPr>
+              <w:t>e2ef52f</w:t>
+            </w:r>
+          </w:p>
+        </w:tc>
+        <w:tc>
+          <w:tcPr>
+            <w:tcW w:type="dxa" w:w="4320"/>
+          </w:tcPr>
+          <w:p>
+            <w:r/>
+            <w:r>
+              <w:t xml:space="preserve">script </w:t>
+            </w:r>
+            <w:r>
+              <w:rPr>
+                <w:rFonts w:ascii="Consolas" w:hAnsi="Consolas"/>
+                <w:sz w:val="19"/>
+              </w:rPr>
+              <w:t>20261001_audit_redact_secrets.sql</w:t>
+            </w:r>
+            <w:r>
+              <w:t xml:space="preserve">: che mật khẩu / token / khoá trong dòng audit cũ (UPDATE dữ liệu; trong tệp </w:t>
+            </w:r>
+            <w:r>
+              <w:rPr>
+                <w:rFonts w:ascii="Consolas" w:hAnsi="Consolas"/>
+                <w:sz w:val="19"/>
+              </w:rPr>
+              <w:t>@Apply</w:t>
+            </w:r>
+            <w:r>
+              <w:t xml:space="preserve"> mặc định 1, đặt 0 để chỉ xem) — chạy lúc triển khai</w:t>
+            </w:r>
+          </w:p>
+        </w:tc>
+      </w:tr>
+      <w:tr>
+        <w:tc>
+          <w:tcPr>
+            <w:tcW w:type="dxa" w:w="4320"/>
+          </w:tcPr>
+          <w:p>
+            <w:r/>
+            <w:r>
+              <w:rPr>
+                <w:rFonts w:ascii="Consolas" w:hAnsi="Consolas"/>
+                <w:sz w:val="19"/>
+              </w:rPr>
+              <w:t>0d4eed9</w:t>
+            </w:r>
+          </w:p>
+        </w:tc>
+        <w:tc>
+          <w:tcPr>
+            <w:tcW w:type="dxa" w:w="4320"/>
+          </w:tcPr>
+          <w:p>
+            <w:r/>
+            <w:r>
+              <w:t xml:space="preserve">nhật ký kiểm toán che thêm trường </w:t>
+            </w:r>
+            <w:r>
+              <w:rPr>
+                <w:rFonts w:ascii="Consolas" w:hAnsi="Consolas"/>
+                <w:sz w:val="19"/>
+              </w:rPr>
+              <w:t>jwt</w:t>
+            </w:r>
+            <w:r>
+              <w:t xml:space="preserve">, </w:t>
+            </w:r>
+            <w:r>
+              <w:rPr>
+                <w:rFonts w:ascii="Consolas" w:hAnsi="Consolas"/>
+                <w:sz w:val="19"/>
+              </w:rPr>
+              <w:t>cookie</w:t>
+            </w:r>
+          </w:p>
+        </w:tc>
+      </w:tr>
+      <w:tr>
+        <w:tc>
+          <w:tcPr>
+            <w:tcW w:type="dxa" w:w="4320"/>
+          </w:tcPr>
+          <w:p>
+            <w:r/>
+            <w:r>
+              <w:t xml:space="preserve">WEB </w:t>
+            </w:r>
+            <w:r>
+              <w:rPr>
+                <w:rFonts w:ascii="Consolas" w:hAnsi="Consolas"/>
+                <w:sz w:val="19"/>
+              </w:rPr>
+              <w:t>fce78c52</w:t>
+            </w:r>
+          </w:p>
+        </w:tc>
+        <w:tc>
+          <w:tcPr>
+            <w:tcW w:type="dxa" w:w="4320"/>
+          </w:tcPr>
+          <w:p>
+            <w:r/>
+            <w:r>
+              <w:t xml:space="preserve">tiền tệ ngoài danh mục giữ đúng mã, phiếu chỉ xem; phiếu mới thiếu tiền tệ chặn lưu; công nợ xem trước theo tỷ giá header; tab </w:t>
+            </w:r>
+            <w:r>
+              <w:rPr>
+                <w:b/>
+              </w:rPr>
+              <w:t>Tài khoản</w:t>
+            </w:r>
+            <w:r>
+              <w:t xml:space="preserve"> ở hồ sơ nhân viên</w:t>
+            </w:r>
+          </w:p>
+        </w:tc>
+      </w:tr>
+      <w:tr>
+        <w:tc>
+          <w:tcPr>
+            <w:tcW w:type="dxa" w:w="4320"/>
+          </w:tcPr>
+          <w:p>
+            <w:r/>
+            <w:r>
+              <w:t xml:space="preserve">WEB </w:t>
+            </w:r>
+            <w:r>
+              <w:rPr>
+                <w:rFonts w:ascii="Consolas" w:hAnsi="Consolas"/>
+                <w:sz w:val="19"/>
+              </w:rPr>
+              <w:t>7d168744</w:t>
+            </w:r>
+          </w:p>
+        </w:tc>
+        <w:tc>
+          <w:tcPr>
+            <w:tcW w:type="dxa" w:w="4320"/>
+          </w:tcPr>
+          <w:p>
+            <w:r/>
+            <w:r>
+              <w:t xml:space="preserve">log WEB che mật khẩu / token / khoá / jwt / cookie; không in </w:t>
+            </w:r>
+            <w:r>
+              <w:rPr>
+                <w:rFonts w:ascii="Consolas" w:hAnsi="Consolas"/>
+                <w:sz w:val="19"/>
+              </w:rPr>
+              <w:t>Authorization</w:t>
+            </w:r>
+            <w:r>
+              <w:t xml:space="preserve"> vào log</w:t>
+            </w:r>
+          </w:p>
+        </w:tc>
+      </w:tr>
+      <w:tr>
+        <w:tc>
+          <w:tcPr>
+            <w:tcW w:type="dxa" w:w="4320"/>
+          </w:tcPr>
+          <w:p>
+            <w:r/>
+            <w:r>
+              <w:rPr>
+                <w:rFonts w:ascii="Consolas" w:hAnsi="Consolas"/>
+                <w:sz w:val="19"/>
+              </w:rPr>
+              <w:t>b9227aa</w:t>
+            </w:r>
+          </w:p>
+        </w:tc>
+        <w:tc>
+          <w:tcPr>
+            <w:tcW w:type="dxa" w:w="4320"/>
+          </w:tcPr>
+          <w:p>
+            <w:r/>
+            <w:r>
+              <w:rPr>
+                <w:b/>
+              </w:rPr>
+              <w:t>API bút toán tổng hợp</w:t>
+            </w:r>
+            <w:r>
+              <w:t xml:space="preserve"> </w:t>
+            </w:r>
+            <w:r>
+              <w:rPr>
+                <w:rFonts w:ascii="Consolas" w:hAnsi="Consolas"/>
+                <w:sz w:val="19"/>
+              </w:rPr>
+              <w:t>integrations/logistics/journal-entries</w:t>
+            </w:r>
+            <w:r>
+              <w:t xml:space="preserve"> (tạo + ghi sổ tạm, gỡ, đọc lại) + script </w:t>
+            </w:r>
+            <w:r>
+              <w:rPr>
+                <w:rFonts w:ascii="Consolas" w:hAnsi="Consolas"/>
+                <w:sz w:val="19"/>
+              </w:rPr>
+              <w:t>20261001_logistics_journal_entry.sql</w:t>
+            </w:r>
+            <w:r>
+              <w:t xml:space="preserve"> (chưa áp) — 12.12.4</w:t>
             </w:r>
           </w:p>
         </w:tc>
@@ -29218,7 +29886,37 @@
         <w:t>ed5aa0e</w:t>
       </w:r>
       <w:r>
-        <w:t xml:space="preserve">); dòng audit cũ có thể còn mật khẩu dạng chữ thường: xoá / che, cân nhắc đổi mật khẩu — </w:t>
+        <w:t xml:space="preserve">, </w:t>
+      </w:r>
+      <w:r>
+        <w:rPr>
+          <w:rFonts w:ascii="Consolas" w:hAnsi="Consolas"/>
+          <w:sz w:val="19"/>
+        </w:rPr>
+        <w:t>0d4eed9</w:t>
+      </w:r>
+      <w:r>
+        <w:t xml:space="preserve">); dòng audit cũ có thể còn mật khẩu dạng chữ thường: chạy script che </w:t>
+      </w:r>
+      <w:r>
+        <w:rPr>
+          <w:rFonts w:ascii="Consolas" w:hAnsi="Consolas"/>
+          <w:sz w:val="19"/>
+        </w:rPr>
+        <w:t>20261001_audit_redact_secrets.sql</w:t>
+      </w:r>
+      <w:r>
+        <w:t xml:space="preserve"> (</w:t>
+      </w:r>
+      <w:r>
+        <w:rPr>
+          <w:rFonts w:ascii="Consolas" w:hAnsi="Consolas"/>
+          <w:sz w:val="19"/>
+        </w:rPr>
+        <w:t>e2ef52f</w:t>
+      </w:r>
+      <w:r>
+        <w:t xml:space="preserve">) trên DB host, cân nhắc đổi mật khẩu — </w:t>
       </w:r>
       <w:r>
         <w:rPr>
@@ -30939,7 +31637,7 @@
         <w:t>hire.acc_code = "621/4022"</w:t>
       </w:r>
       <w:r>
-        <w:t xml:space="preserve">. Hệ anh chưa có API bút toán tổng hợp nên bên em giữ khoản này thành </w:t>
+        <w:t xml:space="preserve">. Bên em ghi khoản này thành </w:t>
       </w:r>
       <w:r>
         <w:rPr>
@@ -30958,7 +31656,7 @@
         <w:t>thue_xe</w:t>
       </w:r>
       <w:r>
-        <w:t xml:space="preserve">; phần </w:t>
+        <w:t xml:space="preserve"> và gửi qua API bút toán tổng hợp bên anh khi bật cờ (12.12.4); phần </w:t>
       </w:r>
       <w:r>
         <w:rPr>
@@ -31302,7 +32000,7 @@
               <w:rPr>
                 <w:b/>
               </w:rPr>
-              <w:t>API bút toán</w:t>
+              <w:t>Bút toán</w:t>
             </w:r>
             <w:r>
               <w:t xml:space="preserve"> cho thuê xe </w:t>
@@ -31325,7 +32023,55 @@
           <w:p>
             <w:r/>
             <w:r>
-              <w:t>source chưa có chứng từ bút toán tổng hợp; bên em giữ bút toán chờ; đề nghị đường API ở 12.12.4</w:t>
+              <w:t xml:space="preserve">API </w:t>
+            </w:r>
+            <w:r>
+              <w:rPr>
+                <w:b/>
+              </w:rPr>
+              <w:t>đã có</w:t>
+            </w:r>
+            <w:r>
+              <w:t xml:space="preserve"> (</w:t>
+            </w:r>
+            <w:r>
+              <w:rPr>
+                <w:rFonts w:ascii="Consolas" w:hAnsi="Consolas"/>
+                <w:sz w:val="19"/>
+              </w:rPr>
+              <w:t>b9227aa</w:t>
+            </w:r>
+            <w:r>
+              <w:t>), đầu gửi đã có (</w:t>
+            </w:r>
+            <w:r>
+              <w:rPr>
+                <w:rFonts w:ascii="Consolas" w:hAnsi="Consolas"/>
+                <w:sz w:val="19"/>
+              </w:rPr>
+              <w:t>875a0cf</w:t>
+            </w:r>
+            <w:r>
+              <w:t xml:space="preserve">); </w:t>
+            </w:r>
+            <w:r>
+              <w:rPr>
+                <w:b/>
+              </w:rPr>
+              <w:t>chưa chạy trên DB</w:t>
+            </w:r>
+            <w:r>
+              <w:t xml:space="preserve">: chờ áp script </w:t>
+            </w:r>
+            <w:r>
+              <w:rPr>
+                <w:rFonts w:ascii="Consolas" w:hAnsi="Consolas"/>
+                <w:sz w:val="19"/>
+              </w:rPr>
+              <w:t>20261001_logistics_journal_entry.sql</w:t>
+            </w:r>
+            <w:r>
+              <w:t xml:space="preserve"> (12.12.4)</w:t>
             </w:r>
           </w:p>
         </w:tc>
@@ -31336,7 +32082,25 @@
           <w:p>
             <w:r/>
             <w:r>
-              <w:t>bên EPL làm (đang làm)</w:t>
+              <w:t xml:space="preserve">áp script DB demo: </w:t>
+            </w:r>
+            <w:r>
+              <w:rPr>
+                <w:b/>
+              </w:rPr>
+              <w:t>chủ dự án</w:t>
+            </w:r>
+            <w:r>
+              <w:t xml:space="preserve">; host: </w:t>
+            </w:r>
+            <w:r>
+              <w:rPr>
+                <w:b/>
+              </w:rPr>
+              <w:t>cần quyền host</w:t>
+            </w:r>
+            <w:r>
+              <w:t>; bật cờ + gọi thử: bên EPL</w:t>
             </w:r>
           </w:p>
         </w:tc>
@@ -33159,7 +33923,17 @@
         <w:t>sp_META_InsertUpdate_USERS</w:t>
       </w:r>
       <w:r>
-        <w:t>). Màn "Tài khoản" ở hồ sơ nhân viên bên Web đang được làm (bên EPL, dùng sau nếu cần); hiện phải gọi API này.</w:t>
+        <w:t>). Hồ sơ nhân viên bên WEB đã có tab "Tài khoản" (</w:t>
+      </w:r>
+      <w:r>
+        <w:rPr>
+          <w:rFonts w:ascii="Consolas" w:hAnsi="Consolas"/>
+          <w:sz w:val="19"/>
+        </w:rPr>
+        <w:t>fce78c52</w:t>
+      </w:r>
+      <w:r>
+        <w:t>) gọi đường này; chưa bấm tạo tài khoản thật.</w:t>
       </w:r>
     </w:p>
     <w:p>
@@ -33509,6 +34283,25 @@
         <w:t>LogisticsSalesPush:AllowedUserIds</w:t>
       </w:r>
       <w:r>
+        <w:t xml:space="preserve"> </w:t>
+      </w:r>
+      <w:r>
+        <w:rPr>
+          <w:b/>
+        </w:rPr>
+        <w:t>và</w:t>
+      </w:r>
+      <w:r>
+        <w:t xml:space="preserve"> </w:t>
+      </w:r>
+      <w:r>
+        <w:rPr>
+          <w:rFonts w:ascii="Consolas" w:hAnsi="Consolas"/>
+          <w:sz w:val="19"/>
+        </w:rPr>
+        <w:t>LogisticsJournalEntry:AllowedUserIds</w:t>
+      </w:r>
+      <w:r>
         <w:t xml:space="preserve"> (giữ </w:t>
       </w:r>
       <w:r>
@@ -33529,7 +34322,7 @@
         <w:t>Enabled=true</w:t>
       </w:r>
       <w:r>
-        <w:t>. Khởi động lại API.</w:t>
+        <w:t>. Cấu hình đọc lại mỗi lần gọi, không cần khởi động lại API.</w:t>
       </w:r>
     </w:p>
     <w:p>
@@ -33651,7 +34444,17 @@
         <w:t>chưa có tài khoản dùng được</w:t>
       </w:r>
       <w:r>
-        <w:t xml:space="preserve">. Màn "Tài khoản" ở hồ sơ nhân viên bên WEB đang được làm (dùng sau nếu cần). Khi làm: tạo tài khoản theo các bước trên (mật khẩu ≤ 20 ký tự, gán </w:t>
+        <w:t>. Tab "Tài khoản" ở hồ sơ nhân viên bên WEB đã có (</w:t>
+      </w:r>
+      <w:r>
+        <w:rPr>
+          <w:rFonts w:ascii="Consolas" w:hAnsi="Consolas"/>
+          <w:sz w:val="19"/>
+        </w:rPr>
+        <w:t>fce78c52</w:t>
+      </w:r>
+      <w:r>
+        <w:t xml:space="preserve">), dùng khi cần. Khi làm: tạo tài khoản theo các bước trên (mật khẩu ≤ 20 ký tự, gán </w:t>
       </w:r>
       <w:r>
         <w:rPr>
@@ -33698,7 +34501,7 @@
         <w:pStyle w:val="Heading3"/>
       </w:pPr>
       <w:r>
-        <w:t>12.12.4. Bút toán không qua tiền — API bút toán (chưa có bên anh)</w:t>
+        <w:t>12.12.4. Bút toán không qua tiền — API bút toán tổng hợp bên anh (`b9227aa`) và đầu gửi bên em (`875a0cf`)</w:t>
       </w:r>
     </w:p>
     <w:p>
@@ -33706,7 +34509,10 @@
         <w:jc w:val="both"/>
       </w:pPr>
       <w:r>
-        <w:t>Chủ dự án đã cho bên em làm đường này trong source của anh. Bên em chưa viết được, vì:</w:t>
+        <w:rPr>
+          <w:b/>
+        </w:rPr>
+        <w:t>Trạng thái 01/10:</w:t>
       </w:r>
     </w:p>
     <w:p>
@@ -33714,16 +34520,53 @@
         <w:pStyle w:val="ListBullet"/>
       </w:pPr>
       <w:r>
-        <w:t xml:space="preserve">Trong source </w:t>
-      </w:r>
-      <w:r>
         <w:rPr>
           <w:b/>
         </w:rPr>
-        <w:t>chưa có chứng từ "bút toán tổng hợp"</w:t>
-      </w:r>
-      <w:r>
-        <w:t xml:space="preserve"> (không qua tiền), cả API lẫn Web.</w:t>
+        <w:t>API bên anh đã có</w:t>
+      </w:r>
+      <w:r>
+        <w:t xml:space="preserve"> trong source: </w:t>
+      </w:r>
+      <w:r>
+        <w:rPr>
+          <w:rFonts w:ascii="Consolas" w:hAnsi="Consolas"/>
+          <w:sz w:val="19"/>
+        </w:rPr>
+        <w:t>GLS-QLSX-APIs</w:t>
+      </w:r>
+      <w:r>
+        <w:t xml:space="preserve"> </w:t>
+      </w:r>
+      <w:r>
+        <w:rPr>
+          <w:rFonts w:ascii="Consolas" w:hAnsi="Consolas"/>
+          <w:sz w:val="19"/>
+        </w:rPr>
+        <w:t>feat/HonTunedaHai@b9227aa</w:t>
+      </w:r>
+      <w:r>
+        <w:t xml:space="preserve"> (</w:t>
+      </w:r>
+      <w:r>
+        <w:rPr>
+          <w:rFonts w:ascii="Consolas" w:hAnsi="Consolas"/>
+          <w:sz w:val="19"/>
+        </w:rPr>
+        <w:t>LogisticsJournalEntryController</w:t>
+      </w:r>
+      <w:r>
+        <w:t xml:space="preserve">). Mô tả đầy đủ (khuôn ghi sổ, mã lỗi, bất biến): tài liệu của anh </w:t>
+      </w:r>
+      <w:r>
+        <w:rPr>
+          <w:rFonts w:ascii="Consolas" w:hAnsi="Consolas"/>
+          <w:sz w:val="19"/>
+        </w:rPr>
+        <w:t>PHIEU-THU-CHI-DEMOLAO-TONG-HOP.md</w:t>
+      </w:r>
+      <w:r>
+        <w:t xml:space="preserve"> mục 16.9.</w:t>
       </w:r>
     </w:p>
     <w:p>
@@ -33731,37 +34574,35 @@
         <w:pStyle w:val="ListBullet"/>
       </w:pPr>
       <w:r>
-        <w:t xml:space="preserve">Sổ cái bên anh đi qua </w:t>
-      </w:r>
-      <w:r>
-        <w:rPr>
-          <w:rFonts w:ascii="Consolas" w:hAnsi="Consolas"/>
-          <w:sz w:val="19"/>
-        </w:rPr>
-        <w:t>PUBDOCUMENT</w:t>
-      </w:r>
-      <w:r>
-        <w:t xml:space="preserve"> + </w:t>
-      </w:r>
-      <w:r>
-        <w:rPr>
-          <w:rFonts w:ascii="Consolas" w:hAnsi="Consolas"/>
-          <w:sz w:val="19"/>
-        </w:rPr>
-        <w:t>PUBENTRY</w:t>
-      </w:r>
-      <w:r>
-        <w:t xml:space="preserve"> rồi thủ tục </w:t>
-      </w:r>
-      <w:r>
-        <w:rPr>
-          <w:rFonts w:ascii="Consolas" w:hAnsi="Consolas"/>
-          <w:sz w:val="19"/>
-        </w:rPr>
-        <w:t>sp_PostTing_GeneralLedger</w:t>
-      </w:r>
-      <w:r>
-        <w:t>. Định nghĩa các thủ tục này chỉ nằm trong DB, không có trong repo.</w:t>
+        <w:t xml:space="preserve">Script </w:t>
+      </w:r>
+      <w:r>
+        <w:rPr>
+          <w:rFonts w:ascii="Consolas" w:hAnsi="Consolas"/>
+          <w:sz w:val="19"/>
+        </w:rPr>
+        <w:t>Backend.API/Database/Scripts/20261001_logistics_journal_entry.sql</w:t>
+      </w:r>
+      <w:r>
+        <w:t xml:space="preserve"> </w:t>
+      </w:r>
+      <w:r>
+        <w:rPr>
+          <w:b/>
+        </w:rPr>
+        <w:t>chưa áp</w:t>
+      </w:r>
+      <w:r>
+        <w:t xml:space="preserve"> vào DB demo: lệnh áp từ máy bên em bị bộ an toàn chặn, </w:t>
+      </w:r>
+      <w:r>
+        <w:rPr>
+          <w:b/>
+        </w:rPr>
+        <w:t>chờ chủ dự án tự chạy</w:t>
+      </w:r>
+      <w:r>
+        <w:t>. Chưa có chứng từ nào ghi thật.</w:t>
       </w:r>
     </w:p>
     <w:p>
@@ -33769,17 +34610,76 @@
         <w:pStyle w:val="ListBullet"/>
       </w:pPr>
       <w:r>
-        <w:t>Thủ tục chuyển phiếu tạm sang thật (</w:t>
-      </w:r>
-      <w:r>
-        <w:rPr>
-          <w:rFonts w:ascii="Consolas" w:hAnsi="Consolas"/>
-          <w:sz w:val="19"/>
-        </w:rPr>
-        <w:t>SP_CM_MOVETEMPTOREAL_*</w:t>
-      </w:r>
-      <w:r>
-        <w:t>) là riêng của phiếu thu chi.</w:t>
+        <w:t xml:space="preserve">Cấu hình </w:t>
+      </w:r>
+      <w:r>
+        <w:rPr>
+          <w:rFonts w:ascii="Consolas" w:hAnsi="Consolas"/>
+          <w:sz w:val="19"/>
+        </w:rPr>
+        <w:t>LogisticsJournalEntry</w:t>
+      </w:r>
+      <w:r>
+        <w:t xml:space="preserve"> </w:t>
+      </w:r>
+      <w:r>
+        <w:rPr>
+          <w:b/>
+        </w:rPr>
+        <w:t>đã có</w:t>
+      </w:r>
+      <w:r>
+        <w:t xml:space="preserve"> ở API chạy ở máy (</w:t>
+      </w:r>
+      <w:r>
+        <w:rPr>
+          <w:rFonts w:ascii="Consolas" w:hAnsi="Consolas"/>
+          <w:sz w:val="19"/>
+        </w:rPr>
+        <w:t>Enabled</w:t>
+      </w:r>
+      <w:r>
+        <w:t xml:space="preserve">, </w:t>
+      </w:r>
+      <w:r>
+        <w:rPr>
+          <w:rFonts w:ascii="Consolas" w:hAnsi="Consolas"/>
+          <w:sz w:val="19"/>
+        </w:rPr>
+        <w:t>AllowedUserIds</w:t>
+      </w:r>
+      <w:r>
+        <w:t xml:space="preserve"> 846, </w:t>
+      </w:r>
+      <w:r>
+        <w:rPr>
+          <w:rFonts w:ascii="Consolas" w:hAnsi="Consolas"/>
+          <w:sz w:val="19"/>
+        </w:rPr>
+        <w:t>OrgId</w:t>
+      </w:r>
+      <w:r>
+        <w:t xml:space="preserve"> 1368, </w:t>
+      </w:r>
+      <w:r>
+        <w:rPr>
+          <w:rFonts w:ascii="Consolas" w:hAnsi="Consolas"/>
+          <w:sz w:val="19"/>
+        </w:rPr>
+        <w:t>CountryId</w:t>
+      </w:r>
+      <w:r>
+        <w:t xml:space="preserve"> 11). GET bút toán đang trả 503 </w:t>
+      </w:r>
+      <w:r>
+        <w:rPr>
+          <w:rFonts w:ascii="Consolas" w:hAnsi="Consolas"/>
+          <w:sz w:val="19"/>
+        </w:rPr>
+        <w:t>LOGISTICS_JOURNAL_SCRIPT_REQUIRED</w:t>
+      </w:r>
+      <w:r>
+        <w:t xml:space="preserve"> — đúng, vì chưa áp script.</w:t>
       </w:r>
     </w:p>
     <w:p>
@@ -33787,7 +34687,136 @@
         <w:pStyle w:val="ListBullet"/>
       </w:pPr>
       <w:r>
-        <w:t>Đoán cấu trúc để ghi thẳng vào sổ cái thì rủi ro sai sổ, nên bên em không làm.</w:t>
+        <w:rPr>
+          <w:b/>
+        </w:rPr>
+        <w:t>Đầu gửi bên em đã có</w:t>
+      </w:r>
+      <w:r>
+        <w:t xml:space="preserve">: </w:t>
+      </w:r>
+      <w:r>
+        <w:rPr>
+          <w:rFonts w:ascii="Consolas" w:hAnsi="Consolas"/>
+          <w:sz w:val="19"/>
+        </w:rPr>
+        <w:t>services/gui_but_toan_tune.py</w:t>
+      </w:r>
+      <w:r>
+        <w:t xml:space="preserve">, </w:t>
+      </w:r>
+      <w:r>
+        <w:rPr>
+          <w:rFonts w:ascii="Consolas" w:hAnsi="Consolas"/>
+          <w:sz w:val="19"/>
+        </w:rPr>
+        <w:t>services/but_toan_cho.py</w:t>
+      </w:r>
+      <w:r>
+        <w:t xml:space="preserve"> (</w:t>
+      </w:r>
+      <w:r>
+        <w:rPr>
+          <w:rFonts w:ascii="Consolas" w:hAnsi="Consolas"/>
+          <w:sz w:val="19"/>
+        </w:rPr>
+        <w:t>a938301</w:t>
+      </w:r>
+      <w:r>
+        <w:t xml:space="preserve">, </w:t>
+      </w:r>
+      <w:r>
+        <w:rPr>
+          <w:rFonts w:ascii="Consolas" w:hAnsi="Consolas"/>
+          <w:sz w:val="19"/>
+        </w:rPr>
+        <w:t>875a0cf</w:t>
+      </w:r>
+      <w:r>
+        <w:t xml:space="preserve">). Cờ </w:t>
+      </w:r>
+      <w:r>
+        <w:rPr>
+          <w:rFonts w:ascii="Consolas" w:hAnsi="Consolas"/>
+          <w:sz w:val="19"/>
+        </w:rPr>
+        <w:t>QLSX_GUI_BUT_TOAN</w:t>
+      </w:r>
+      <w:r>
+        <w:t xml:space="preserve"> </w:t>
+      </w:r>
+      <w:r>
+        <w:rPr>
+          <w:b/>
+        </w:rPr>
+        <w:t>tắt</w:t>
+      </w:r>
+      <w:r>
+        <w:t xml:space="preserve">. </w:t>
+      </w:r>
+      <w:r>
+        <w:rPr>
+          <w:rFonts w:ascii="Consolas" w:hAnsi="Consolas"/>
+          <w:sz w:val="19"/>
+        </w:rPr>
+        <w:t>kiem/thu_gui_but_toan.py</w:t>
+      </w:r>
+      <w:r>
+        <w:t xml:space="preserve"> chạy với máy giả theo đúng giao ước dưới đây (không gọi API thật).</w:t>
+      </w:r>
+    </w:p>
+    <w:p>
+      <w:pPr>
+        <w:pStyle w:val="ListBullet"/>
+      </w:pPr>
+      <w:r>
+        <w:t xml:space="preserve">Host </w:t>
+      </w:r>
+      <w:r>
+        <w:rPr>
+          <w:rFonts w:ascii="Consolas" w:hAnsi="Consolas"/>
+          <w:sz w:val="19"/>
+        </w:rPr>
+        <w:t>demo-lao-api</w:t>
+      </w:r>
+      <w:r>
+        <w:t xml:space="preserve">: chưa có code, script, cấu hình — </w:t>
+      </w:r>
+      <w:r>
+        <w:rPr>
+          <w:b/>
+        </w:rPr>
+        <w:t>cần quyền host</w:t>
+      </w:r>
+      <w:r>
+        <w:t>.</w:t>
+      </w:r>
+    </w:p>
+    <w:p>
+      <w:pPr>
+        <w:pStyle w:val="ListBullet"/>
+      </w:pPr>
+      <w:r>
+        <w:t xml:space="preserve">Thứ tự bật: </w:t>
+      </w:r>
+      <w:r>
+        <w:rPr>
+          <w:b/>
+        </w:rPr>
+        <w:t>áp script → cấu hình → bật cờ `QLSX_GUI_BUT_TOAN=1` → gọi thử</w:t>
+      </w:r>
+      <w:r>
+        <w:t xml:space="preserve"> (lệnh và cách đọc kết quả: </w:t>
+      </w:r>
+      <w:r>
+        <w:rPr>
+          <w:rFonts w:ascii="Consolas" w:hAnsi="Consolas"/>
+          <w:sz w:val="19"/>
+        </w:rPr>
+        <w:t>HUONG_DAN_TRIEN_KHAI_ANH_TUNE</w:t>
+      </w:r>
+      <w:r>
+        <w:t xml:space="preserve"> mục 4.6).</w:t>
       </w:r>
     </w:p>
     <w:p>
@@ -33798,29 +34827,1570 @@
         <w:rPr>
           <w:b/>
         </w:rPr>
-        <w:t>Trong lúc chờ:</w:t>
-      </w:r>
-      <w:r>
-        <w:t xml:space="preserve"> bên em giữ mọi khoản không qua tiền thành </w:t>
-      </w:r>
+        <w:t>Nguồn bút toán</w:t>
+      </w:r>
+      <w:r>
+        <w:t xml:space="preserve"> (mục 8; màn "Bút toán chờ gửi", </w:t>
+      </w:r>
+      <w:r>
+        <w:rPr>
+          <w:rFonts w:ascii="Consolas" w:hAnsi="Consolas"/>
+          <w:sz w:val="19"/>
+        </w:rPr>
+        <w:t>GET /api/but-toan-cho</w:t>
+      </w:r>
+      <w:r>
+        <w:t xml:space="preserve">). Một bút toán chờ = một lần gọi = một chứng từ tổng hợp bên anh, </w:t>
+      </w:r>
+      <w:r>
+        <w:rPr>
+          <w:rFonts w:ascii="Consolas" w:hAnsi="Consolas"/>
+          <w:sz w:val="19"/>
+        </w:rPr>
+        <w:t>Entries</w:t>
+      </w:r>
+      <w:r>
+        <w:t xml:space="preserve"> mang đủ các dòng của bản đó:</w:t>
+      </w:r>
+    </w:p>
+    <w:tbl>
+      <w:tblPr>
+        <w:tblStyle w:val="LightGrid-Accent1"/>
+        <w:tblW w:type="auto" w:w="0"/>
+        <w:tblLook w:firstColumn="1" w:firstRow="1" w:lastColumn="0" w:lastRow="0" w:noHBand="0" w:noVBand="1" w:val="04A0"/>
+      </w:tblPr>
+      <w:tblGrid>
+        <w:gridCol w:w="1440"/>
+        <w:gridCol w:w="1440"/>
+        <w:gridCol w:w="1440"/>
+        <w:gridCol w:w="1440"/>
+        <w:gridCol w:w="1440"/>
+        <w:gridCol w:w="1440"/>
+      </w:tblGrid>
+      <w:tr>
+        <w:tc>
+          <w:tcPr>
+            <w:tcW w:type="dxa" w:w="1440"/>
+          </w:tcPr>
+          <w:p>
+            <w:r>
+              <w:rPr>
+                <w:b/>
+              </w:rPr>
+            </w:r>
+            <w:r>
+              <w:rPr>
+                <w:b/>
+              </w:rPr>
+              <w:t>Nguồn</w:t>
+            </w:r>
+          </w:p>
+        </w:tc>
+        <w:tc>
+          <w:tcPr>
+            <w:tcW w:type="dxa" w:w="1440"/>
+          </w:tcPr>
+          <w:p>
+            <w:r>
+              <w:rPr>
+                <w:b/>
+              </w:rPr>
+            </w:r>
+            <w:r>
+              <w:rPr>
+                <w:b/>
+              </w:rPr>
+              <w:t>Sinh lúc</w:t>
+            </w:r>
+          </w:p>
+        </w:tc>
+        <w:tc>
+          <w:tcPr>
+            <w:tcW w:type="dxa" w:w="1440"/>
+          </w:tcPr>
+          <w:p>
+            <w:r>
+              <w:rPr>
+                <w:b/>
+              </w:rPr>
+            </w:r>
+            <w:r>
+              <w:rPr>
+                <w:b/>
+              </w:rPr>
+              <w:t>Định khoản</w:t>
+            </w:r>
+          </w:p>
+        </w:tc>
+        <w:tc>
+          <w:tcPr>
+            <w:tcW w:type="dxa" w:w="1440"/>
+          </w:tcPr>
+          <w:p>
+            <w:r>
+              <w:rPr>
+                <w:b/>
+              </w:rPr>
+            </w:r>
+            <w:r>
+              <w:rPr>
+                <w:b/>
+              </w:rPr>
+              <w:t>Mã nguồn</w:t>
+            </w:r>
+          </w:p>
+        </w:tc>
+        <w:tc>
+          <w:tcPr>
+            <w:tcW w:type="dxa" w:w="1440"/>
+          </w:tcPr>
+          <w:p>
+            <w:r>
+              <w:rPr>
+                <w:b/>
+              </w:rPr>
+            </w:r>
+            <w:r>
+              <w:rPr>
+                <w:b/>
+              </w:rPr>
+              <w:t>Đối tượng dòng (</w:t>
+            </w:r>
+            <w:r>
+              <w:rPr>
+                <w:rFonts w:ascii="Consolas" w:hAnsi="Consolas"/>
+                <w:b/>
+                <w:sz w:val="19"/>
+              </w:rPr>
+              <w:t>ObjectId</w:t>
+            </w:r>
+            <w:r>
+              <w:rPr>
+                <w:b/>
+              </w:rPr>
+              <w:t>)</w:t>
+            </w:r>
+          </w:p>
+        </w:tc>
+        <w:tc>
+          <w:tcPr>
+            <w:tcW w:type="dxa" w:w="1440"/>
+          </w:tcPr>
+          <w:p>
+            <w:r>
+              <w:rPr>
+                <w:b/>
+              </w:rPr>
+            </w:r>
+            <w:r>
+              <w:rPr>
+                <w:b/>
+              </w:rPr>
+              <w:t>Tiền của dòng</w:t>
+            </w:r>
+          </w:p>
+        </w:tc>
+      </w:tr>
+      <w:tr>
+        <w:tc>
+          <w:tcPr>
+            <w:tcW w:type="dxa" w:w="1440"/>
+          </w:tcPr>
+          <w:p>
+            <w:r/>
+            <w:r>
+              <w:rPr>
+                <w:rFonts w:ascii="Consolas" w:hAnsi="Consolas"/>
+                <w:sz w:val="19"/>
+              </w:rPr>
+              <w:t>thue_xe</w:t>
+            </w:r>
+          </w:p>
+        </w:tc>
+        <w:tc>
+          <w:tcPr>
+            <w:tcW w:type="dxa" w:w="1440"/>
+          </w:tcPr>
+          <w:p>
+            <w:r/>
+            <w:r>
+              <w:t>khoá phiếu xe thuê</w:t>
+            </w:r>
+          </w:p>
+        </w:tc>
+        <w:tc>
+          <w:tcPr>
+            <w:tcW w:type="dxa" w:w="1440"/>
+          </w:tcPr>
+          <w:p>
+            <w:r/>
+            <w:r>
+              <w:t>Nợ 621 / Có 4022, bằng tiền thuê (</w:t>
+            </w:r>
+            <w:r>
+              <w:rPr>
+                <w:rFonts w:ascii="Consolas" w:hAnsi="Consolas"/>
+                <w:sz w:val="19"/>
+              </w:rPr>
+              <w:t>hire.amount</w:t>
+            </w:r>
+            <w:r>
+              <w:t>)</w:t>
+            </w:r>
+          </w:p>
+        </w:tc>
+        <w:tc>
+          <w:tcPr>
+            <w:tcW w:type="dxa" w:w="1440"/>
+          </w:tcPr>
+          <w:p>
+            <w:r/>
+            <w:r>
+              <w:rPr>
+                <w:rFonts w:ascii="Consolas" w:hAnsi="Consolas"/>
+                <w:sz w:val="19"/>
+              </w:rPr>
+              <w:t>Trip.id</w:t>
+            </w:r>
+          </w:p>
+        </w:tc>
+        <w:tc>
+          <w:tcPr>
+            <w:tcW w:type="dxa" w:w="1440"/>
+          </w:tcPr>
+          <w:p>
+            <w:r/>
+            <w:r>
+              <w:t xml:space="preserve">chủ xe </w:t>
+            </w:r>
+            <w:r>
+              <w:rPr>
+                <w:rFonts w:ascii="Consolas" w:hAnsi="Consolas"/>
+                <w:sz w:val="19"/>
+              </w:rPr>
+              <w:t>EPLCX-…</w:t>
+            </w:r>
+          </w:p>
+        </w:tc>
+        <w:tc>
+          <w:tcPr>
+            <w:tcW w:type="dxa" w:w="1440"/>
+          </w:tcPr>
+          <w:p>
+            <w:r/>
+            <w:r>
+              <w:t>tiền thuê, theo tiền tệ thuê; tỷ giá khoá trên phiếu</w:t>
+            </w:r>
+          </w:p>
+        </w:tc>
+      </w:tr>
+      <w:tr>
+        <w:tc>
+          <w:tcPr>
+            <w:tcW w:type="dxa" w:w="1440"/>
+          </w:tcPr>
+          <w:p>
+            <w:r/>
+            <w:r>
+              <w:rPr>
+                <w:rFonts w:ascii="Consolas" w:hAnsi="Consolas"/>
+                <w:sz w:val="19"/>
+              </w:rPr>
+              <w:t>no_ncc</w:t>
+            </w:r>
+          </w:p>
+        </w:tc>
+        <w:tc>
+          <w:tcPr>
+            <w:tcW w:type="dxa" w:w="1440"/>
+          </w:tcPr>
+          <w:p>
+            <w:r/>
+            <w:r>
+              <w:t>khoá phiếu có dòng ghi nợ nhà cung cấp</w:t>
+            </w:r>
+          </w:p>
+        </w:tc>
+        <w:tc>
+          <w:tcPr>
+            <w:tcW w:type="dxa" w:w="1440"/>
+          </w:tcPr>
+          <w:p>
+            <w:r/>
+            <w:r>
+              <w:t>Nợ 625 · 614 (xe thuê 4022) / Có 4021, mỗi dòng chi một dòng</w:t>
+            </w:r>
+          </w:p>
+        </w:tc>
+        <w:tc>
+          <w:tcPr>
+            <w:tcW w:type="dxa" w:w="1440"/>
+          </w:tcPr>
+          <w:p>
+            <w:r/>
+            <w:r>
+              <w:rPr>
+                <w:rFonts w:ascii="Consolas" w:hAnsi="Consolas"/>
+                <w:sz w:val="19"/>
+              </w:rPr>
+              <w:t>Trip.id</w:t>
+            </w:r>
+          </w:p>
+        </w:tc>
+        <w:tc>
+          <w:tcPr>
+            <w:tcW w:type="dxa" w:w="1440"/>
+          </w:tcPr>
+          <w:p>
+            <w:r/>
+            <w:r>
+              <w:t xml:space="preserve">nhà cung cấp </w:t>
+            </w:r>
+            <w:r>
+              <w:rPr>
+                <w:rFonts w:ascii="Consolas" w:hAnsi="Consolas"/>
+                <w:sz w:val="19"/>
+              </w:rPr>
+              <w:t>EPLNCC-…</w:t>
+            </w:r>
+            <w:r>
+              <w:t xml:space="preserve"> của dòng; dòng chưa gán nhà cung cấp: xe thuê lấy chủ xe, còn lại </w:t>
+            </w:r>
+            <w:r>
+              <w:rPr>
+                <w:b/>
+              </w:rPr>
+              <w:t>trống</w:t>
+            </w:r>
+          </w:p>
+        </w:tc>
+        <w:tc>
+          <w:tcPr>
+            <w:tcW w:type="dxa" w:w="1440"/>
+          </w:tcPr>
+          <w:p>
+            <w:r/>
+            <w:r>
+              <w:t>quy Kíp theo tỷ giá khoá (</w:t>
+            </w:r>
+            <w:r>
+              <w:rPr>
+                <w:rFonts w:ascii="Consolas" w:hAnsi="Consolas"/>
+                <w:sz w:val="19"/>
+              </w:rPr>
+              <w:t>ExchangeRate</w:t>
+            </w:r>
+            <w:r>
+              <w:t xml:space="preserve"> 1)</w:t>
+            </w:r>
+          </w:p>
+        </w:tc>
+      </w:tr>
+      <w:tr>
+        <w:tc>
+          <w:tcPr>
+            <w:tcW w:type="dxa" w:w="1440"/>
+          </w:tcPr>
+          <w:p>
+            <w:r/>
+            <w:r>
+              <w:rPr>
+                <w:rFonts w:ascii="Consolas" w:hAnsi="Consolas"/>
+                <w:sz w:val="19"/>
+              </w:rPr>
+              <w:t>tat_toan</w:t>
+            </w:r>
+          </w:p>
+        </w:tc>
+        <w:tc>
+          <w:tcPr>
+            <w:tcW w:type="dxa" w:w="1440"/>
+          </w:tcPr>
+          <w:p>
+            <w:r/>
+            <w:r>
+              <w:t>KT Chi phí VC chốt tất toán tài xế (</w:t>
+            </w:r>
+            <w:r>
+              <w:rPr>
+                <w:rFonts w:ascii="Consolas" w:hAnsi="Consolas"/>
+                <w:sz w:val="19"/>
+              </w:rPr>
+              <w:t>QT_TU</w:t>
+            </w:r>
+            <w:r>
+              <w:t>)</w:t>
+            </w:r>
+          </w:p>
+        </w:tc>
+        <w:tc>
+          <w:tcPr>
+            <w:tcW w:type="dxa" w:w="1440"/>
+          </w:tcPr>
+          <w:p>
+            <w:r/>
+            <w:r>
+              <w:t>Nợ 625 / Có 1601, bằng số tài xế đã chi thật</w:t>
+            </w:r>
+          </w:p>
+        </w:tc>
+        <w:tc>
+          <w:tcPr>
+            <w:tcW w:type="dxa" w:w="1440"/>
+          </w:tcPr>
+          <w:p>
+            <w:r/>
+            <w:r>
+              <w:rPr>
+                <w:rFonts w:ascii="Consolas" w:hAnsi="Consolas"/>
+                <w:sz w:val="19"/>
+              </w:rPr>
+              <w:t>&lt;tài xế&gt;:&lt;YYYY-MM&gt;:&lt;mã bản chốt&gt;</w:t>
+            </w:r>
+          </w:p>
+        </w:tc>
+        <w:tc>
+          <w:tcPr>
+            <w:tcW w:type="dxa" w:w="1440"/>
+          </w:tcPr>
+          <w:p>
+            <w:r/>
+            <w:r>
+              <w:t xml:space="preserve">tài xế </w:t>
+            </w:r>
+            <w:r>
+              <w:rPr>
+                <w:rFonts w:ascii="Consolas" w:hAnsi="Consolas"/>
+                <w:sz w:val="19"/>
+              </w:rPr>
+              <w:t>EPLTX-…</w:t>
+            </w:r>
+          </w:p>
+        </w:tc>
+        <w:tc>
+          <w:tcPr>
+            <w:tcW w:type="dxa" w:w="1440"/>
+          </w:tcPr>
+          <w:p>
+            <w:r/>
+            <w:r>
+              <w:t>Kíp</w:t>
+            </w:r>
+          </w:p>
+        </w:tc>
+      </w:tr>
+      <w:tr>
+        <w:tc>
+          <w:tcPr>
+            <w:tcW w:type="dxa" w:w="1440"/>
+          </w:tcPr>
+          <w:p>
+            <w:r/>
+            <w:r>
+              <w:rPr>
+                <w:rFonts w:ascii="Consolas" w:hAnsi="Consolas"/>
+                <w:sz w:val="19"/>
+              </w:rPr>
+              <w:t>ban_chu_xe</w:t>
+            </w:r>
+          </w:p>
+        </w:tc>
+        <w:tc>
+          <w:tcPr>
+            <w:tcW w:type="dxa" w:w="1440"/>
+          </w:tcPr>
+          <w:p>
+            <w:r/>
+            <w:r>
+              <w:t>phiếu chi trả chủ xe có trừ hàng quầy đã chi</w:t>
+            </w:r>
+          </w:p>
+        </w:tc>
+        <w:tc>
+          <w:tcPr>
+            <w:tcW w:type="dxa" w:w="1440"/>
+          </w:tcPr>
+          <w:p>
+            <w:r/>
+            <w:r>
+              <w:t>Nợ 4022 / Có 707, theo giá bán; một phiếu bán một bút toán</w:t>
+            </w:r>
+          </w:p>
+        </w:tc>
+        <w:tc>
+          <w:tcPr>
+            <w:tcW w:type="dxa" w:w="1440"/>
+          </w:tcPr>
+          <w:p>
+            <w:r/>
+            <w:r>
+              <w:t>mã phiếu bán (kho tạm)</w:t>
+            </w:r>
+          </w:p>
+        </w:tc>
+        <w:tc>
+          <w:tcPr>
+            <w:tcW w:type="dxa" w:w="1440"/>
+          </w:tcPr>
+          <w:p>
+            <w:r/>
+            <w:r>
+              <w:t xml:space="preserve">chủ xe </w:t>
+            </w:r>
+            <w:r>
+              <w:rPr>
+                <w:rFonts w:ascii="Consolas" w:hAnsi="Consolas"/>
+                <w:sz w:val="19"/>
+              </w:rPr>
+              <w:t>EPLCX-…</w:t>
+            </w:r>
+          </w:p>
+        </w:tc>
+        <w:tc>
+          <w:tcPr>
+            <w:tcW w:type="dxa" w:w="1440"/>
+          </w:tcPr>
+          <w:p>
+            <w:r/>
+            <w:r>
+              <w:t>tiền phiếu bán; tỷ giá = Kíp quy đổi ÷ nguyên tệ</w:t>
+            </w:r>
+          </w:p>
+        </w:tc>
+      </w:tr>
+    </w:tbl>
+    <w:p/>
+    <w:p>
+      <w:pPr>
+        <w:jc w:val="both"/>
+      </w:pPr>
       <w:r>
         <w:rPr>
           <w:b/>
         </w:rPr>
-        <w:t>bút toán chờ gửi</w:t>
-      </w:r>
-      <w:r>
-        <w:t xml:space="preserve"> ở trang điều xe (mục 8; màn "Bút toán chờ gửi", </w:t>
-      </w:r>
-      <w:r>
-        <w:rPr>
-          <w:rFonts w:ascii="Consolas" w:hAnsi="Consolas"/>
-          <w:sz w:val="19"/>
-        </w:rPr>
-        <w:t>GET /api/but-toan-cho</w:t>
+        <w:t>SourceRef</w:t>
+      </w:r>
+      <w:r>
+        <w:t xml:space="preserve"> = </w:t>
+      </w:r>
+      <w:r>
+        <w:rPr>
+          <w:rFonts w:ascii="Consolas" w:hAnsi="Consolas"/>
+          <w:sz w:val="19"/>
+        </w:rPr>
+        <w:t>EPLLAO-&lt;nguồn&gt;-&lt;mã nguồn&gt;</w:t>
+      </w:r>
+      <w:r>
+        <w:t xml:space="preserve">, cắt 100 ký tự. Bản đã gỡ mà nguồn ghi lại (mở khoá rồi khoá lại) → </w:t>
+      </w:r>
+      <w:r>
+        <w:rPr>
+          <w:b/>
+        </w:rPr>
+        <w:t>phiên mới</w:t>
+      </w:r>
+      <w:r>
+        <w:t xml:space="preserve"> </w:t>
+      </w:r>
+      <w:r>
+        <w:rPr>
+          <w:rFonts w:ascii="Consolas" w:hAnsi="Consolas"/>
+          <w:sz w:val="19"/>
+        </w:rPr>
+        <w:t>…-2</w:t>
+      </w:r>
+      <w:r>
+        <w:t xml:space="preserve">, </w:t>
+      </w:r>
+      <w:r>
+        <w:rPr>
+          <w:rFonts w:ascii="Consolas" w:hAnsi="Consolas"/>
+          <w:sz w:val="19"/>
+        </w:rPr>
+        <w:t>…-3</w:t>
+      </w:r>
+      <w:r>
+        <w:t xml:space="preserve">. Ví dụ </w:t>
+      </w:r>
+      <w:r>
+        <w:rPr>
+          <w:rFonts w:ascii="Consolas" w:hAnsi="Consolas"/>
+          <w:sz w:val="19"/>
+        </w:rPr>
+        <w:t>EPLLAO-thue_xe-662386527e56</w:t>
+      </w:r>
+      <w:r>
+        <w:t xml:space="preserve">, rồi </w:t>
+      </w:r>
+      <w:r>
+        <w:rPr>
+          <w:rFonts w:ascii="Consolas" w:hAnsi="Consolas"/>
+          <w:sz w:val="19"/>
+        </w:rPr>
+        <w:t>EPLLAO-thue_xe-662386527e56-2</w:t>
+      </w:r>
+      <w:r>
+        <w:t>. Đúng luật khoá bên anh (</w:t>
+      </w:r>
+      <w:r>
+        <w:rPr>
+          <w:rFonts w:ascii="Consolas" w:hAnsi="Consolas"/>
+          <w:sz w:val="19"/>
+        </w:rPr>
+        <w:t>[A-Za-z0-9][A-Za-z0-9_.:-]{0,99}</w:t>
+      </w:r>
+      <w:r>
+        <w:t>, phân biệt hoa thường).</w:t>
+      </w:r>
+    </w:p>
+    <w:p>
+      <w:pPr>
+        <w:jc w:val="both"/>
+      </w:pPr>
+      <w:r>
+        <w:rPr>
+          <w:b/>
+        </w:rPr>
+        <w:t>Gửi</w:t>
+      </w:r>
+      <w:r>
+        <w:t xml:space="preserve"> — </w:t>
+      </w:r>
+      <w:r>
+        <w:rPr>
+          <w:rFonts w:ascii="Consolas" w:hAnsi="Consolas"/>
+          <w:sz w:val="19"/>
+        </w:rPr>
+        <w:t>POST /api/v1/integrations/logistics/journal-entries</w:t>
+      </w:r>
+      <w:r>
+        <w:t xml:space="preserve">, header </w:t>
+      </w:r>
+      <w:r>
+        <w:rPr>
+          <w:rFonts w:ascii="Consolas" w:hAnsi="Consolas"/>
+          <w:sz w:val="19"/>
+        </w:rPr>
+        <w:t>Idempotency-Key</w:t>
+      </w:r>
+      <w:r>
+        <w:t xml:space="preserve"> = SourceRef (ID dưới đây minh hoạ):</w:t>
+      </w:r>
+    </w:p>
+    <w:p>
+      <w:pPr>
+        <w:spacing w:after="0"/>
+        <w:ind w:left="360"/>
+      </w:pPr>
+      <w:r>
+        <w:rPr>
+          <w:rFonts w:ascii="Consolas" w:hAnsi="Consolas"/>
+          <w:sz w:val="18"/>
+        </w:rPr>
+        <w:t>{</w:t>
+      </w:r>
+    </w:p>
+    <w:p>
+      <w:pPr>
+        <w:spacing w:after="0"/>
+        <w:ind w:left="360"/>
+      </w:pPr>
+      <w:r>
+        <w:rPr>
+          <w:rFonts w:ascii="Consolas" w:hAnsi="Consolas"/>
+          <w:sz w:val="18"/>
+        </w:rPr>
+        <w:t>"SourceRef": "EPLLAO-thue_xe-662386527e56",</w:t>
+      </w:r>
+    </w:p>
+    <w:p>
+      <w:pPr>
+        <w:spacing w:after="0"/>
+        <w:ind w:left="360"/>
+      </w:pPr>
+      <w:r>
+        <w:rPr>
+          <w:rFonts w:ascii="Consolas" w:hAnsi="Consolas"/>
+          <w:sz w:val="18"/>
+        </w:rPr>
+        <w:t>"DocumentDate": "2026-10-01",</w:t>
+      </w:r>
+    </w:p>
+    <w:p>
+      <w:pPr>
+        <w:spacing w:after="0"/>
+        <w:ind w:left="360"/>
+      </w:pPr>
+      <w:r>
+        <w:rPr>
+          <w:rFonts w:ascii="Consolas" w:hAnsi="Consolas"/>
+          <w:sz w:val="18"/>
+        </w:rPr>
+        <w:t>"CountryId": 11, "OrgId": 1368,</w:t>
+      </w:r>
+    </w:p>
+    <w:p>
+      <w:pPr>
+        <w:spacing w:after="0"/>
+        <w:ind w:left="360"/>
+      </w:pPr>
+      <w:r>
+        <w:rPr>
+          <w:rFonts w:ascii="Consolas" w:hAnsi="Consolas"/>
+          <w:sz w:val="18"/>
+        </w:rPr>
+        <w:t>"Description": "Ghi nhận chi phí thuê xe liên kết phiếu T4-0442-09/EPL (…)",</w:t>
+      </w:r>
+    </w:p>
+    <w:p>
+      <w:pPr>
+        <w:spacing w:after="0"/>
+        <w:ind w:left="360"/>
+      </w:pPr>
+      <w:r>
+        <w:rPr>
+          <w:rFonts w:ascii="Consolas" w:hAnsi="Consolas"/>
+          <w:sz w:val="18"/>
+        </w:rPr>
+        <w:t>"FiciAutoId": 19,</w:t>
+      </w:r>
+    </w:p>
+    <w:p>
+      <w:pPr>
+        <w:spacing w:after="0"/>
+        <w:ind w:left="360"/>
+      </w:pPr>
+      <w:r>
+        <w:rPr>
+          <w:rFonts w:ascii="Consolas" w:hAnsi="Consolas"/>
+          <w:sz w:val="18"/>
+        </w:rPr>
+        <w:t>"Entries": [</w:t>
+      </w:r>
+    </w:p>
+    <w:p>
+      <w:pPr>
+        <w:spacing w:after="0"/>
+        <w:ind w:left="360"/>
+      </w:pPr>
+      <w:r>
+        <w:rPr>
+          <w:rFonts w:ascii="Consolas" w:hAnsi="Consolas"/>
+          <w:sz w:val="18"/>
+        </w:rPr>
+        <w:t>{ "DebitAccount": "621", "CreditAccount": "4022", "Amount": 1350, "ExchangeRate": 21500,</w:t>
+      </w:r>
+    </w:p>
+    <w:p>
+      <w:pPr>
+        <w:spacing w:after="0"/>
+        <w:ind w:left="360"/>
+      </w:pPr>
+      <w:r>
+        <w:rPr>
+          <w:rFonts w:ascii="Consolas" w:hAnsi="Consolas"/>
+          <w:sz w:val="18"/>
+        </w:rPr>
+        <w:t>"CurrencyId": 2, "ObjectId": 1610, "Note": "Chi phí thuê xe liên kết T4-0442-09/EPL · …" }</w:t>
+      </w:r>
+    </w:p>
+    <w:p>
+      <w:pPr>
+        <w:spacing w:after="0"/>
+        <w:ind w:left="360"/>
+      </w:pPr>
+      <w:r>
+        <w:rPr>
+          <w:rFonts w:ascii="Consolas" w:hAnsi="Consolas"/>
+          <w:sz w:val="18"/>
+        </w:rPr>
+        <w:t>]</w:t>
+      </w:r>
+    </w:p>
+    <w:p>
+      <w:pPr>
+        <w:spacing w:after="0"/>
+        <w:ind w:left="360"/>
+      </w:pPr>
+      <w:r>
+        <w:rPr>
+          <w:rFonts w:ascii="Consolas" w:hAnsi="Consolas"/>
+          <w:sz w:val="18"/>
+        </w:rPr>
+        <w:t>}</w:t>
+      </w:r>
+    </w:p>
+    <w:p/>
+    <w:p>
+      <w:pPr>
+        <w:pStyle w:val="ListBullet"/>
+      </w:pPr>
+      <w:r>
+        <w:rPr>
+          <w:rFonts w:ascii="Consolas" w:hAnsi="Consolas"/>
+          <w:sz w:val="19"/>
+        </w:rPr>
+        <w:t>SourceRef</w:t>
+      </w:r>
+      <w:r>
+        <w:t xml:space="preserve">, </w:t>
+      </w:r>
+      <w:r>
+        <w:rPr>
+          <w:rFonts w:ascii="Consolas" w:hAnsi="Consolas"/>
+          <w:sz w:val="19"/>
+        </w:rPr>
+        <w:t>CountryId</w:t>
+      </w:r>
+      <w:r>
+        <w:t xml:space="preserve">, </w:t>
+      </w:r>
+      <w:r>
+        <w:rPr>
+          <w:rFonts w:ascii="Consolas" w:hAnsi="Consolas"/>
+          <w:sz w:val="19"/>
+        </w:rPr>
+        <w:t>OrgId</w:t>
+      </w:r>
+      <w:r>
+        <w:t xml:space="preserve"> trong thân: bên anh </w:t>
+      </w:r>
+      <w:r>
+        <w:rPr>
+          <w:b/>
+        </w:rPr>
+        <w:t>bỏ qua</w:t>
+      </w:r>
+      <w:r>
+        <w:t xml:space="preserve"> — SourceRef lấy ở header, đơn vị / quốc gia lấy ở cấu hình </w:t>
+      </w:r>
+      <w:r>
+        <w:rPr>
+          <w:rFonts w:ascii="Consolas" w:hAnsi="Consolas"/>
+          <w:sz w:val="19"/>
+        </w:rPr>
+        <w:t>LogisticsJournalEntry</w:t>
+      </w:r>
+      <w:r>
+        <w:t xml:space="preserve">. Bên em giữ trong gói để đọc lại cho dễ. </w:t>
+      </w:r>
+      <w:r>
+        <w:rPr>
+          <w:b/>
+        </w:rPr>
+        <w:t>Không có</w:t>
+      </w:r>
+      <w:r>
+        <w:t xml:space="preserve"> </w:t>
+      </w:r>
+      <w:r>
+        <w:rPr>
+          <w:rFonts w:ascii="Consolas" w:hAnsi="Consolas"/>
+          <w:sz w:val="19"/>
+        </w:rPr>
+        <w:t>CostObject</w:t>
+      </w:r>
+      <w:r>
+        <w:t xml:space="preserve"> hay mã DO trong gói; diễn giải đã ghi số phiếu.</w:t>
+      </w:r>
+    </w:p>
+    <w:p>
+      <w:pPr>
+        <w:pStyle w:val="ListBullet"/>
+      </w:pPr>
+      <w:r>
+        <w:rPr>
+          <w:b/>
+        </w:rPr>
+        <w:t>Không gửi `BaseAmount`</w:t>
+      </w:r>
+      <w:r>
+        <w:t xml:space="preserve">: bên anh tự tính </w:t>
+      </w:r>
+      <w:r>
+        <w:rPr>
+          <w:rFonts w:ascii="Consolas" w:hAnsi="Consolas"/>
+          <w:sz w:val="19"/>
+        </w:rPr>
+        <w:t>Round(Amount × ExchangeRate, 5, AwayFromZero)</w:t>
+      </w:r>
+      <w:r>
+        <w:t xml:space="preserve">. Dòng Kíp gửi </w:t>
+      </w:r>
+      <w:r>
+        <w:rPr>
+          <w:rFonts w:ascii="Consolas" w:hAnsi="Consolas"/>
+          <w:sz w:val="19"/>
+        </w:rPr>
+        <w:t>ExchangeRate</w:t>
+      </w:r>
+      <w:r>
+        <w:t xml:space="preserve"> 1. </w:t>
+      </w:r>
+      <w:r>
+        <w:rPr>
+          <w:rFonts w:ascii="Consolas" w:hAnsi="Consolas"/>
+          <w:sz w:val="19"/>
+        </w:rPr>
+        <w:t>CurrencyId</w:t>
+      </w:r>
+      <w:r>
+        <w:t xml:space="preserve"> tra ở </w:t>
+      </w:r>
+      <w:r>
+        <w:rPr>
+          <w:rFonts w:ascii="Consolas" w:hAnsi="Consolas"/>
+          <w:sz w:val="19"/>
+        </w:rPr>
+        <w:t>GetAllCurrency</w:t>
+      </w:r>
+      <w:r>
+        <w:t xml:space="preserve"> (chỉ tiền đang bật; USD tạm </w:t>
+      </w:r>
+      <w:r>
+        <w:rPr>
+          <w:rFonts w:ascii="Consolas" w:hAnsi="Consolas"/>
+          <w:sz w:val="19"/>
+        </w:rPr>
+        <w:t>QLSX_TIEN_USD=2</w:t>
+      </w:r>
+      <w:r>
+        <w:t>).</w:t>
+      </w:r>
+    </w:p>
+    <w:p>
+      <w:pPr>
+        <w:pStyle w:val="ListBullet"/>
+      </w:pPr>
+      <w:r>
+        <w:rPr>
+          <w:rFonts w:ascii="Consolas" w:hAnsi="Consolas"/>
+          <w:sz w:val="19"/>
+        </w:rPr>
+        <w:t>FiciAutoId</w:t>
+      </w:r>
+      <w:r>
+        <w:t>: bên em tra kỳ theo ngày (</w:t>
+      </w:r>
+      <w:r>
+        <w:rPr>
+          <w:rFonts w:ascii="Consolas" w:hAnsi="Consolas"/>
+          <w:sz w:val="19"/>
+        </w:rPr>
+        <w:t>GetFinancyCicle</w:t>
+      </w:r>
+      <w:r>
+        <w:t>). Kỳ đã đóng thì bên em chặn trước (</w:t>
+      </w:r>
+      <w:r>
+        <w:rPr>
+          <w:rFonts w:ascii="Consolas" w:hAnsi="Consolas"/>
+          <w:sz w:val="19"/>
+        </w:rPr>
+        <w:t>KY_DA_DONG</w:t>
+      </w:r>
+      <w:r>
+        <w:t>); không tra được thì bỏ trống để bên anh tự lấy theo ngày. Gửi thì phải khớp kỳ của ngày, lệch là 422.</w:t>
+      </w:r>
+    </w:p>
+    <w:p>
+      <w:pPr>
+        <w:pStyle w:val="ListBullet"/>
+      </w:pPr>
+      <w:r>
+        <w:rPr>
+          <w:rFonts w:ascii="Consolas" w:hAnsi="Consolas"/>
+          <w:sz w:val="19"/>
+        </w:rPr>
+        <w:t>DocumentDate</w:t>
+      </w:r>
+      <w:r>
+        <w:t>: khoá phiếu → ngày khoá; tất toán → ngày cuối kỳ (kỳ chưa hết thì hôm nay); bán chủ xe → ngày bán.</w:t>
+      </w:r>
+    </w:p>
+    <w:p>
+      <w:pPr>
+        <w:pStyle w:val="ListBullet"/>
+      </w:pPr>
+      <w:r>
+        <w:rPr>
+          <w:rFonts w:ascii="Consolas" w:hAnsi="Consolas"/>
+          <w:sz w:val="19"/>
+        </w:rPr>
+        <w:t>Description</w:t>
+      </w:r>
+      <w:r>
+        <w:t xml:space="preserve">, </w:t>
+      </w:r>
+      <w:r>
+        <w:rPr>
+          <w:rFonts w:ascii="Consolas" w:hAnsi="Consolas"/>
+          <w:sz w:val="19"/>
+        </w:rPr>
+        <w:t>Note</w:t>
+      </w:r>
+      <w:r>
+        <w:t xml:space="preserve"> bên em cắt 250 ký tự (bên anh nhận tới 400).</w:t>
+      </w:r>
+    </w:p>
+    <w:p>
+      <w:pPr>
+        <w:pStyle w:val="ListBullet"/>
+      </w:pPr>
+      <w:r>
+        <w:t>Mọi mã Nợ / Có phải có trong danh mục quốc gia 11 và hạch toán được (cùng danh sách ô chọn của phiếu thu chi).</w:t>
+      </w:r>
+    </w:p>
+    <w:p>
+      <w:pPr>
+        <w:jc w:val="both"/>
+      </w:pPr>
+      <w:r>
+        <w:rPr>
+          <w:b/>
+        </w:rPr>
+        <w:t>Kết quả:</w:t>
+      </w:r>
+    </w:p>
+    <w:p>
+      <w:pPr>
+        <w:pStyle w:val="ListBullet"/>
+      </w:pPr>
+      <w:r>
+        <w:t xml:space="preserve">201 </w:t>
+      </w:r>
+      <w:r>
+        <w:rPr>
+          <w:rFonts w:ascii="Consolas" w:hAnsi="Consolas"/>
+          <w:sz w:val="19"/>
+        </w:rPr>
+        <w:t>Result {SourceRef, DocumentId, DocumentNo, StatusId: 13, IsExisting: false}</w:t>
+      </w:r>
+      <w:r>
+        <w:t xml:space="preserve"> — chứng từ tổng hợp (DOTY 12), </w:t>
+      </w:r>
+      <w:r>
+        <w:rPr>
+          <w:b/>
+        </w:rPr>
+        <w:t>ghi sổ tạm</w:t>
+      </w:r>
+      <w:r>
+        <w:t xml:space="preserve">. Bên em ghi </w:t>
+      </w:r>
+      <w:r>
+        <w:rPr>
+          <w:rFonts w:ascii="Consolas" w:hAnsi="Consolas"/>
+          <w:sz w:val="19"/>
+        </w:rPr>
+        <w:t>DocumentId</w:t>
+      </w:r>
+      <w:r>
+        <w:t xml:space="preserve">, </w:t>
+      </w:r>
+      <w:r>
+        <w:rPr>
+          <w:rFonts w:ascii="Consolas" w:hAnsi="Consolas"/>
+          <w:sz w:val="19"/>
+        </w:rPr>
+        <w:t>DocumentNo</w:t>
+      </w:r>
+      <w:r>
+        <w:t xml:space="preserve">, </w:t>
+      </w:r>
+      <w:r>
+        <w:rPr>
+          <w:rFonts w:ascii="Consolas" w:hAnsi="Consolas"/>
+          <w:sz w:val="19"/>
+        </w:rPr>
+        <w:t>StatusId</w:t>
+      </w:r>
+      <w:r>
+        <w:t xml:space="preserve"> lên bản, bản thành "đã gửi".</w:t>
+      </w:r>
+    </w:p>
+    <w:p>
+      <w:pPr>
+        <w:pStyle w:val="ListBullet"/>
+      </w:pPr>
+      <w:r>
+        <w:t xml:space="preserve">Gửi lại cùng SourceRef, cùng nội dung → 200 </w:t>
+      </w:r>
+      <w:r>
+        <w:rPr>
+          <w:rFonts w:ascii="Consolas" w:hAnsi="Consolas"/>
+          <w:sz w:val="19"/>
+        </w:rPr>
+        <w:t>IsExisting: true</w:t>
+      </w:r>
+      <w:r>
+        <w:t xml:space="preserve">, cùng </w:t>
+      </w:r>
+      <w:r>
+        <w:rPr>
+          <w:rFonts w:ascii="Consolas" w:hAnsi="Consolas"/>
+          <w:sz w:val="19"/>
+        </w:rPr>
+        <w:t>DocumentId</w:t>
+      </w:r>
+      <w:r>
+        <w:t xml:space="preserve"> — không ghi hai lần.</w:t>
+      </w:r>
+    </w:p>
+    <w:p>
+      <w:pPr>
+        <w:pStyle w:val="ListBullet"/>
+      </w:pPr>
+      <w:r>
+        <w:t>Kế toán ghi sổ chính thức (12) trong QLSX thì từ đó bên em không gỡ được nữa (409).</w:t>
+      </w:r>
+    </w:p>
+    <w:p>
+      <w:pPr>
+        <w:jc w:val="both"/>
+      </w:pPr>
+      <w:r>
+        <w:rPr>
+          <w:b/>
+        </w:rPr>
+        <w:t>Gỡ</w:t>
+      </w:r>
+      <w:r>
+        <w:t xml:space="preserve"> — </w:t>
+      </w:r>
+      <w:r>
+        <w:rPr>
+          <w:rFonts w:ascii="Consolas" w:hAnsi="Consolas"/>
+          <w:sz w:val="19"/>
+        </w:rPr>
+        <w:t>POST …/journal-entries/reverse</w:t>
+      </w:r>
+      <w:r>
+        <w:t xml:space="preserve">, thân </w:t>
+      </w:r>
+      <w:r>
+        <w:rPr>
+          <w:rFonts w:ascii="Consolas" w:hAnsi="Consolas"/>
+          <w:sz w:val="19"/>
+        </w:rPr>
+        <w:t>{"SourceRef": "…"}</w:t>
+      </w:r>
+      <w:r>
+        <w:t xml:space="preserve"> (header </w:t>
+      </w:r>
+      <w:r>
+        <w:rPr>
+          <w:rFonts w:ascii="Consolas" w:hAnsi="Consolas"/>
+          <w:sz w:val="19"/>
+        </w:rPr>
+        <w:t>Idempotency-Key</w:t>
+      </w:r>
+      <w:r>
+        <w:t xml:space="preserve"> bên em gửi kèm </w:t>
+      </w:r>
+      <w:r>
+        <w:rPr>
+          <w:rFonts w:ascii="Consolas" w:hAnsi="Consolas"/>
+          <w:sz w:val="19"/>
+        </w:rPr>
+        <w:t>&lt;SourceRef&gt;:dao</w:t>
+      </w:r>
+      <w:r>
+        <w:t>, bên anh bỏ qua). Gửi khi nguồn bị huỷ: mở khoá phiếu, xoá phiếu, bỏ chốt tất toán.</w:t>
+      </w:r>
+    </w:p>
+    <w:p>
+      <w:pPr>
+        <w:pStyle w:val="ListBullet"/>
+      </w:pPr>
+      <w:r>
+        <w:t xml:space="preserve">200 </w:t>
+      </w:r>
+      <w:r>
+        <w:rPr>
+          <w:rFonts w:ascii="Consolas" w:hAnsi="Consolas"/>
+          <w:sz w:val="19"/>
+        </w:rPr>
+        <w:t>Reversed: true</w:t>
+      </w:r>
+      <w:r>
+        <w:t xml:space="preserve"> → bản thành "huỷ".</w:t>
+      </w:r>
+    </w:p>
+    <w:p>
+      <w:pPr>
+        <w:pStyle w:val="ListBullet"/>
+      </w:pPr>
+      <w:r>
+        <w:t xml:space="preserve">200 </w:t>
+      </w:r>
+      <w:r>
+        <w:rPr>
+          <w:rFonts w:ascii="Consolas" w:hAnsi="Consolas"/>
+          <w:sz w:val="19"/>
+        </w:rPr>
+        <w:t>Reversed: false</w:t>
+      </w:r>
+      <w:r>
+        <w:t xml:space="preserve"> </w:t>
+      </w:r>
+      <w:r>
+        <w:rPr>
+          <w:b/>
+        </w:rPr>
+        <w:t>và</w:t>
+      </w:r>
+      <w:r>
+        <w:t xml:space="preserve"> </w:t>
+      </w:r>
+      <w:r>
+        <w:rPr>
+          <w:rFonts w:ascii="Consolas" w:hAnsi="Consolas"/>
+          <w:sz w:val="19"/>
+        </w:rPr>
+        <w:t>DocumentId: null</w:t>
+      </w:r>
+      <w:r>
+        <w:t xml:space="preserve"> → bên anh không còn chứng từ đang hoạt động (lần gỡ trước đã xong mà mất phản hồi) → bên em </w:t>
+      </w:r>
+      <w:r>
+        <w:rPr>
+          <w:b/>
+        </w:rPr>
+        <w:t>coi như đã gỡ</w:t>
+      </w:r>
+      <w:r>
+        <w:t>, bản thành "huỷ".</w:t>
+      </w:r>
+    </w:p>
+    <w:p>
+      <w:pPr>
+        <w:pStyle w:val="ListBullet"/>
+      </w:pPr>
+      <w:r>
+        <w:t xml:space="preserve">409 </w:t>
+      </w:r>
+      <w:r>
+        <w:rPr>
+          <w:rFonts w:ascii="Consolas" w:hAnsi="Consolas"/>
+          <w:sz w:val="19"/>
+        </w:rPr>
+        <w:t>LOGISTICS_JOURNAL_52515</w:t>
+      </w:r>
+      <w:r>
+        <w:t xml:space="preserve"> (chứng từ đã khoá / đã ghi sổ chính thức) hoặc </w:t>
+      </w:r>
+      <w:r>
+        <w:rPr>
+          <w:rFonts w:ascii="Consolas" w:hAnsi="Consolas"/>
+          <w:sz w:val="19"/>
+        </w:rPr>
+        <w:t>52516</w:t>
+      </w:r>
+      <w:r>
+        <w:t xml:space="preserve"> (thủ tục xoá không gỡ được, đã rollback) → bản giữ "đã gửi", đánh </w:t>
+      </w:r>
+      <w:r>
+        <w:rPr>
+          <w:b/>
+        </w:rPr>
+        <w:t>chờ đảo</w:t>
+      </w:r>
+      <w:r>
+        <w:t xml:space="preserve">, câu lỗi hiện trên màn; </w:t>
+      </w:r>
+      <w:r>
+        <w:rPr>
+          <w:b/>
+        </w:rPr>
+        <w:t>Gửi hết</w:t>
+      </w:r>
+      <w:r>
+        <w:t xml:space="preserve"> thử lại sau khi kế toán xử lý.</w:t>
+      </w:r>
+    </w:p>
+    <w:p>
+      <w:pPr>
+        <w:pStyle w:val="ListBullet"/>
+      </w:pPr>
+      <w:r>
+        <w:t>Gỡ = gỡ ghi sổ + xoá chứng từ bằng thủ tục legacy (</w:t>
+      </w:r>
+      <w:r>
+        <w:rPr>
+          <w:rFonts w:ascii="Consolas" w:hAnsi="Consolas"/>
+          <w:sz w:val="19"/>
+        </w:rPr>
+        <w:t>sp_GL_Delete_GENERALLEDGER</w:t>
+      </w:r>
+      <w:r>
+        <w:t xml:space="preserve"> → </w:t>
+      </w:r>
+      <w:r>
+        <w:rPr>
+          <w:rFonts w:ascii="Consolas" w:hAnsi="Consolas"/>
+          <w:sz w:val="19"/>
+        </w:rPr>
+        <w:t>sp_GL_Delete_GLBusiness</w:t>
+      </w:r>
+      <w:r>
+        <w:t xml:space="preserve">), </w:t>
+      </w:r>
+      <w:r>
+        <w:rPr>
+          <w:b/>
+        </w:rPr>
+        <w:t>không</w:t>
+      </w:r>
+      <w:r>
+        <w:t xml:space="preserve"> tạo chứng từ đảo riêng (câu hỏi 10.7).</w:t>
+      </w:r>
+    </w:p>
+    <w:p>
+      <w:pPr>
+        <w:pStyle w:val="ListBullet"/>
+      </w:pPr>
+      <w:r>
+        <w:t xml:space="preserve">Nguồn ghi lại sau khi đã gỡ → phiên mới </w:t>
+      </w:r>
+      <w:r>
+        <w:rPr>
+          <w:rFonts w:ascii="Consolas" w:hAnsi="Consolas"/>
+          <w:sz w:val="19"/>
+        </w:rPr>
+        <w:t>…-2</w:t>
+      </w:r>
+      <w:r>
+        <w:t>. Bên anh cũng cho POST lại cùng SourceRef sau khi gỡ; bên em vẫn dùng phiên mới để hai lần ghi không trùng mã.</w:t>
+      </w:r>
+    </w:p>
+    <w:p>
+      <w:pPr>
+        <w:jc w:val="both"/>
+      </w:pPr>
+      <w:r>
+        <w:rPr>
+          <w:b/>
+        </w:rPr>
+        <w:t>Đọc lại</w:t>
+      </w:r>
+      <w:r>
+        <w:t xml:space="preserve"> — </w:t>
+      </w:r>
+      <w:r>
+        <w:rPr>
+          <w:rFonts w:ascii="Consolas" w:hAnsi="Consolas"/>
+          <w:sz w:val="19"/>
+        </w:rPr>
+        <w:t>GET …/journal-entries/{SourceRef}</w:t>
+      </w:r>
+      <w:r>
+        <w:t xml:space="preserve">: 200 kèm </w:t>
+      </w:r>
+      <w:r>
+        <w:rPr>
+          <w:rFonts w:ascii="Consolas" w:hAnsi="Consolas"/>
+          <w:sz w:val="19"/>
+        </w:rPr>
+        <w:t>DocumentId</w:t>
+      </w:r>
+      <w:r>
+        <w:t xml:space="preserve">, </w:t>
+      </w:r>
+      <w:r>
+        <w:rPr>
+          <w:rFonts w:ascii="Consolas" w:hAnsi="Consolas"/>
+          <w:sz w:val="19"/>
+        </w:rPr>
+        <w:t>DocumentNo</w:t>
+      </w:r>
+      <w:r>
+        <w:t xml:space="preserve">, </w:t>
+      </w:r>
+      <w:r>
+        <w:rPr>
+          <w:rFonts w:ascii="Consolas" w:hAnsi="Consolas"/>
+          <w:sz w:val="19"/>
+        </w:rPr>
+        <w:t>StatusId</w:t>
+      </w:r>
+      <w:r>
+        <w:t xml:space="preserve"> và các dòng; 404 </w:t>
+      </w:r>
+      <w:r>
+        <w:rPr>
+          <w:rFonts w:ascii="Consolas" w:hAnsi="Consolas"/>
+          <w:sz w:val="19"/>
+        </w:rPr>
+        <w:t>JOURNAL_ENTRY_NOT_FOUND</w:t>
+      </w:r>
+      <w:r>
+        <w:t xml:space="preserve"> khi không có (kể cả đã gỡ). Nút </w:t>
+      </w:r>
+      <w:r>
+        <w:rPr>
+          <w:b/>
+        </w:rPr>
+        <w:t>Cập nhật</w:t>
+      </w:r>
+      <w:r>
+        <w:t xml:space="preserve"> dùng đường này để đọc lại trạng thái (13 → 12 khi kế toán ghi chính thức).</w:t>
+      </w:r>
+    </w:p>
+    <w:p>
+      <w:pPr>
+        <w:jc w:val="both"/>
+      </w:pPr>
+      <w:r>
+        <w:rPr>
+          <w:b/>
+        </w:rPr>
+        <w:t>Mất phản hồi — bên em giữ cho hai sổ không lệch</w:t>
+      </w:r>
+      <w:r>
+        <w:t xml:space="preserve"> (</w:t>
+      </w:r>
+      <w:r>
+        <w:rPr>
+          <w:rFonts w:ascii="Consolas" w:hAnsi="Consolas"/>
+          <w:sz w:val="19"/>
+        </w:rPr>
+        <w:t>875a0cf</w:t>
       </w:r>
       <w:r>
         <w:t>):</w:t>
+      </w:r>
+    </w:p>
+    <w:p>
+      <w:pPr>
+        <w:pStyle w:val="ListNumber"/>
+      </w:pPr>
+      <w:r>
+        <w:rPr>
+          <w:b/>
+        </w:rPr>
+        <w:t>Lần gửi trước chưa rõ</w:t>
+      </w:r>
+      <w:r>
+        <w:t xml:space="preserve"> (mất mạng, hết giờ, HTTP 5xx): lần gửi sau </w:t>
+      </w:r>
+      <w:r>
+        <w:rPr>
+          <w:b/>
+        </w:rPr>
+        <w:t>GET trước</w:t>
+      </w:r>
+      <w:r>
+        <w:t>. Bên anh đã có chứng từ thì nhận số đó, không POST nữa.</w:t>
+      </w:r>
+    </w:p>
+    <w:p>
+      <w:pPr>
+        <w:pStyle w:val="ListNumber"/>
+      </w:pPr>
+      <w:r>
+        <w:rPr>
+          <w:b/>
+        </w:rPr>
+        <w:t>Mở khoá / bỏ một bản "chờ gửi" mà lần gửi trước chưa rõ</w:t>
+      </w:r>
+      <w:r>
+        <w:t xml:space="preserve"> (cờ đang bật): GET trước. Bên anh có chứng từ thì bản đó thành "đã gửi" rồi </w:t>
+      </w:r>
+      <w:r>
+        <w:rPr>
+          <w:b/>
+        </w:rPr>
+        <w:t>gỡ</w:t>
+      </w:r>
+      <w:r>
+        <w:t xml:space="preserve"> ngay — không để sót chứng từ bên anh. GET không được thì vẫn bỏ ở bên em, mã lỗi cũ giữ trên bản để đối soát.</w:t>
+      </w:r>
+    </w:p>
+    <w:p>
+      <w:pPr>
+        <w:pStyle w:val="ListNumber"/>
+      </w:pPr>
+      <w:r>
+        <w:rPr>
+          <w:b/>
+        </w:rPr>
+        <w:t>409 `LOGISTICS_JOURNAL_52512`</w:t>
+      </w:r>
+      <w:r>
+        <w:t xml:space="preserve"> — bên anh đã có chứng từ cùng SourceRef nhưng khác số (từ một lần gửi mất phản hồi, rồi nguồn đổi số): bên em </w:t>
+      </w:r>
+      <w:r>
+        <w:rPr>
+          <w:b/>
+        </w:rPr>
+        <w:t>tự gỡ chứng từ cũ</w:t>
+      </w:r>
+      <w:r>
+        <w:t xml:space="preserve"> rồi POST lại </w:t>
+      </w:r>
+      <w:r>
+        <w:rPr>
+          <w:b/>
+        </w:rPr>
+        <w:t>cùng SourceRef</w:t>
+      </w:r>
+      <w:r>
+        <w:t xml:space="preserve"> với bản đúng. Gỡ bị chặn (đã ghi sổ chính thức) thì báo lỗi, kế toán xử lý.</w:t>
+      </w:r>
+    </w:p>
+    <w:p>
+      <w:pPr>
+        <w:jc w:val="both"/>
+      </w:pPr>
+      <w:r>
+        <w:rPr>
+          <w:b/>
+        </w:rPr>
+        <w:t>Lỗi bên em đọc.</w:t>
+      </w:r>
+      <w:r>
+        <w:t xml:space="preserve"> Thân </w:t>
+      </w:r>
+      <w:r>
+        <w:rPr>
+          <w:rFonts w:ascii="Consolas" w:hAnsi="Consolas"/>
+          <w:sz w:val="19"/>
+        </w:rPr>
+        <w:t>{Success, Code, Message, Result, ErrorDetail: {ErrorCode, InvalidAccounts, Errors, TraceId}}</w:t>
+      </w:r>
+      <w:r>
+        <w:t xml:space="preserve">; đọc cả khi HTTP 200 mà </w:t>
+      </w:r>
+      <w:r>
+        <w:rPr>
+          <w:rFonts w:ascii="Consolas" w:hAnsi="Consolas"/>
+          <w:sz w:val="19"/>
+        </w:rPr>
+        <w:t>Success: false</w:t>
+      </w:r>
+      <w:r>
+        <w:t xml:space="preserve">. Mã lỗi đọc ở </w:t>
+      </w:r>
+      <w:r>
+        <w:rPr>
+          <w:rFonts w:ascii="Consolas" w:hAnsi="Consolas"/>
+          <w:sz w:val="19"/>
+        </w:rPr>
+        <w:t>ErrorDetail.ErrorCode</w:t>
+      </w:r>
+      <w:r>
+        <w:t xml:space="preserve">, danh sách mã tài khoản sai ở </w:t>
+      </w:r>
+      <w:r>
+        <w:rPr>
+          <w:rFonts w:ascii="Consolas" w:hAnsi="Consolas"/>
+          <w:sz w:val="19"/>
+        </w:rPr>
+        <w:t>ErrorDetail.InvalidAccounts</w:t>
+      </w:r>
+      <w:r>
+        <w:t>.</w:t>
       </w:r>
     </w:p>
     <w:tbl>
@@ -33849,7 +36419,7 @@
               <w:rPr>
                 <w:b/>
               </w:rPr>
-              <w:t>Nguồn</w:t>
+              <w:t>Bên anh trả</w:t>
             </w:r>
           </w:p>
         </w:tc>
@@ -33867,7 +36437,7 @@
               <w:rPr>
                 <w:b/>
               </w:rPr>
-              <w:t>Sinh lúc</w:t>
+              <w:t>Bên em ghi trên bản</w:t>
             </w:r>
           </w:p>
         </w:tc>
@@ -33885,7 +36455,7 @@
               <w:rPr>
                 <w:b/>
               </w:rPr>
-              <w:t>Định khoản</w:t>
+              <w:t>Bên em làm</w:t>
             </w:r>
           </w:p>
         </w:tc>
@@ -33898,11 +36468,14 @@
           <w:p>
             <w:r/>
             <w:r>
-              <w:rPr>
-                <w:rFonts w:ascii="Consolas" w:hAnsi="Consolas"/>
-                <w:sz w:val="19"/>
-              </w:rPr>
-              <w:t>thue_xe</w:t>
+              <w:t xml:space="preserve">400 </w:t>
+            </w:r>
+            <w:r>
+              <w:rPr>
+                <w:rFonts w:ascii="Consolas" w:hAnsi="Consolas"/>
+                <w:sz w:val="19"/>
+              </w:rPr>
+              <w:t>INVALID_ACCOUNTS</w:t>
             </w:r>
           </w:p>
         </w:tc>
@@ -33913,7 +36486,14 @@
           <w:p>
             <w:r/>
             <w:r>
-              <w:t>khoá phiếu xe thuê</w:t>
+              <w:rPr>
+                <w:rFonts w:ascii="Consolas" w:hAnsi="Consolas"/>
+                <w:sz w:val="19"/>
+              </w:rPr>
+              <w:t>TAI_KHOAN_SAI</w:t>
+            </w:r>
+            <w:r>
+              <w:t xml:space="preserve"> kèm danh sách mã</w:t>
             </w:r>
           </w:p>
         </w:tc>
@@ -33924,14 +36504,7 @@
           <w:p>
             <w:r/>
             <w:r>
-              <w:t xml:space="preserve">Nợ 621 / Có 4022, bằng </w:t>
-            </w:r>
-            <w:r>
-              <w:rPr>
-                <w:rFonts w:ascii="Consolas" w:hAnsi="Consolas"/>
-                <w:sz w:val="19"/>
-              </w:rPr>
-              <w:t>hire.amount</w:t>
+              <w:t>giữ "chờ gửi"; mở mã rồi Gửi lại</w:t>
             </w:r>
           </w:p>
         </w:tc>
@@ -33944,11 +36517,14 @@
           <w:p>
             <w:r/>
             <w:r>
-              <w:rPr>
-                <w:rFonts w:ascii="Consolas" w:hAnsi="Consolas"/>
-                <w:sz w:val="19"/>
-              </w:rPr>
-              <w:t>no_ncc</w:t>
+              <w:t xml:space="preserve">409 </w:t>
+            </w:r>
+            <w:r>
+              <w:rPr>
+                <w:rFonts w:ascii="Consolas" w:hAnsi="Consolas"/>
+                <w:sz w:val="19"/>
+              </w:rPr>
+              <w:t>LOGISTICS_JOURNAL_52512</w:t>
             </w:r>
           </w:p>
         </w:tc>
@@ -33959,7 +36535,14 @@
           <w:p>
             <w:r/>
             <w:r>
-              <w:t>khoá phiếu có dòng ghi nợ nhà cung cấp</w:t>
+              <w:t xml:space="preserve">tự gỡ rồi gửi lại; không xong thì </w:t>
+            </w:r>
+            <w:r>
+              <w:rPr>
+                <w:rFonts w:ascii="Consolas" w:hAnsi="Consolas"/>
+                <w:sz w:val="19"/>
+              </w:rPr>
+              <w:t>KHAC_NOI_DUNG</w:t>
             </w:r>
           </w:p>
         </w:tc>
@@ -33970,7 +36553,7 @@
           <w:p>
             <w:r/>
             <w:r>
-              <w:t>Nợ 625 · 614 (xe thuê 4022) / Có 4021</w:t>
+              <w:t>kế toán kiểm chứng từ cùng SourceRef</w:t>
             </w:r>
           </w:p>
         </w:tc>
@@ -33983,11 +36566,14 @@
           <w:p>
             <w:r/>
             <w:r>
-              <w:rPr>
-                <w:rFonts w:ascii="Consolas" w:hAnsi="Consolas"/>
-                <w:sz w:val="19"/>
-              </w:rPr>
-              <w:t>tat_toan</w:t>
+              <w:t xml:space="preserve">400 / 409 / 422 khác, hoặc HTTP 200 </w:t>
+            </w:r>
+            <w:r>
+              <w:rPr>
+                <w:rFonts w:ascii="Consolas" w:hAnsi="Consolas"/>
+                <w:sz w:val="19"/>
+              </w:rPr>
+              <w:t>Success: false</w:t>
             </w:r>
           </w:p>
         </w:tc>
@@ -33998,7 +36584,14 @@
           <w:p>
             <w:r/>
             <w:r>
-              <w:t>chốt tất toán tài xế</w:t>
+              <w:rPr>
+                <w:rFonts w:ascii="Consolas" w:hAnsi="Consolas"/>
+                <w:sz w:val="19"/>
+              </w:rPr>
+              <w:t>BEN_KE_TOAN_TU_CHOI</w:t>
+            </w:r>
+            <w:r>
+              <w:t xml:space="preserve"> kèm câu của anh</w:t>
             </w:r>
           </w:p>
         </w:tc>
@@ -34009,17 +36602,7 @@
           <w:p>
             <w:r/>
             <w:r>
-              <w:t>Nợ 625 / Có 1601 (</w:t>
-            </w:r>
-            <w:r>
-              <w:rPr>
-                <w:rFonts w:ascii="Consolas" w:hAnsi="Consolas"/>
-                <w:sz w:val="19"/>
-              </w:rPr>
-              <w:t>QT_TU</w:t>
-            </w:r>
-            <w:r>
-              <w:t>)</w:t>
+              <w:t>giữ "chờ gửi"; sửa theo câu rồi Gửi lại</w:t>
             </w:r>
           </w:p>
         </w:tc>
@@ -34032,11 +36615,7 @@
           <w:p>
             <w:r/>
             <w:r>
-              <w:rPr>
-                <w:rFonts w:ascii="Consolas" w:hAnsi="Consolas"/>
-                <w:sz w:val="19"/>
-              </w:rPr>
-              <w:t>ban_chu_xe</w:t>
+              <w:t>HTTP 5xx (503 chưa áp script, chưa cấu hình, lỗi DB, đang xử lý cùng SourceRef)</w:t>
             </w:r>
           </w:p>
         </w:tc>
@@ -34047,7 +36626,14 @@
           <w:p>
             <w:r/>
             <w:r>
-              <w:t>phiếu chi trả chủ xe có trừ hàng quầy đã chi</w:t>
+              <w:rPr>
+                <w:rFonts w:ascii="Consolas" w:hAnsi="Consolas"/>
+                <w:sz w:val="19"/>
+              </w:rPr>
+              <w:t>HTTP_5XX</w:t>
+            </w:r>
+            <w:r>
+              <w:t xml:space="preserve"> — chưa rõ</w:t>
             </w:r>
           </w:p>
         </w:tc>
@@ -34058,7 +36644,152 @@
           <w:p>
             <w:r/>
             <w:r>
-              <w:t>Nợ 4022 / Có 707, theo giá bán; một phiếu bán một bút toán</w:t>
+              <w:t>lần sau GET trước</w:t>
+            </w:r>
+          </w:p>
+        </w:tc>
+      </w:tr>
+      <w:tr>
+        <w:tc>
+          <w:tcPr>
+            <w:tcW w:type="dxa" w:w="2880"/>
+          </w:tcPr>
+          <w:p>
+            <w:r/>
+            <w:r>
+              <w:t>mất mạng, hết giờ (30 giây; tự gửi lúc khoá chờ 8 giây)</w:t>
+            </w:r>
+          </w:p>
+        </w:tc>
+        <w:tc>
+          <w:tcPr>
+            <w:tcW w:type="dxa" w:w="2880"/>
+          </w:tcPr>
+          <w:p>
+            <w:r/>
+            <w:r>
+              <w:rPr>
+                <w:rFonts w:ascii="Consolas" w:hAnsi="Consolas"/>
+                <w:sz w:val="19"/>
+              </w:rPr>
+              <w:t>KHONG_GOI_DUOC</w:t>
+            </w:r>
+            <w:r>
+              <w:t xml:space="preserve"> — chưa rõ</w:t>
+            </w:r>
+          </w:p>
+        </w:tc>
+        <w:tc>
+          <w:tcPr>
+            <w:tcW w:type="dxa" w:w="2880"/>
+          </w:tcPr>
+          <w:p>
+            <w:r/>
+            <w:r>
+              <w:t xml:space="preserve">lần sau GET trước; </w:t>
+            </w:r>
+            <w:r>
+              <w:rPr>
+                <w:b/>
+              </w:rPr>
+              <w:t>Gửi hết</w:t>
+            </w:r>
+            <w:r>
+              <w:t xml:space="preserve"> dừng</w:t>
+            </w:r>
+          </w:p>
+        </w:tc>
+      </w:tr>
+      <w:tr>
+        <w:tc>
+          <w:tcPr>
+            <w:tcW w:type="dxa" w:w="2880"/>
+          </w:tcPr>
+          <w:p>
+            <w:r/>
+            <w:r>
+              <w:t>401</w:t>
+            </w:r>
+          </w:p>
+        </w:tc>
+        <w:tc>
+          <w:tcPr>
+            <w:tcW w:type="dxa" w:w="2880"/>
+          </w:tcPr>
+          <w:p>
+            <w:r/>
+            <w:r>
+              <w:rPr>
+                <w:rFonts w:ascii="Consolas" w:hAnsi="Consolas"/>
+                <w:sz w:val="19"/>
+              </w:rPr>
+              <w:t>QLSX_TOKEN_HET_HAN</w:t>
+            </w:r>
+          </w:p>
+        </w:tc>
+        <w:tc>
+          <w:tcPr>
+            <w:tcW w:type="dxa" w:w="2880"/>
+          </w:tcPr>
+          <w:p>
+            <w:r/>
+            <w:r>
+              <w:t>bỏ token nhớ, lần sau đăng nhập lại</w:t>
+            </w:r>
+          </w:p>
+        </w:tc>
+      </w:tr>
+      <w:tr>
+        <w:tc>
+          <w:tcPr>
+            <w:tcW w:type="dxa" w:w="2880"/>
+          </w:tcPr>
+          <w:p>
+            <w:r/>
+            <w:r>
+              <w:t>404 khi gửi</w:t>
+            </w:r>
+          </w:p>
+        </w:tc>
+        <w:tc>
+          <w:tcPr>
+            <w:tcW w:type="dxa" w:w="2880"/>
+          </w:tcPr>
+          <w:p>
+            <w:r/>
+            <w:r>
+              <w:rPr>
+                <w:rFonts w:ascii="Consolas" w:hAnsi="Consolas"/>
+                <w:sz w:val="19"/>
+              </w:rPr>
+              <w:t>KHONG_CO_DUONG</w:t>
+            </w:r>
+            <w:r>
+              <w:t xml:space="preserve"> — API chưa có </w:t>
+            </w:r>
+            <w:r>
+              <w:rPr>
+                <w:rFonts w:ascii="Consolas" w:hAnsi="Consolas"/>
+                <w:sz w:val="19"/>
+              </w:rPr>
+              <w:t>b9227aa</w:t>
+            </w:r>
+          </w:p>
+        </w:tc>
+        <w:tc>
+          <w:tcPr>
+            <w:tcW w:type="dxa" w:w="2880"/>
+          </w:tcPr>
+          <w:p>
+            <w:r/>
+            <w:r>
+              <w:rPr>
+                <w:b/>
+              </w:rPr>
+              <w:t>Gửi hết</w:t>
+            </w:r>
+            <w:r>
+              <w:t xml:space="preserve"> dừng</w:t>
             </w:r>
           </w:p>
         </w:tc>
@@ -34070,182 +36801,120 @@
         <w:jc w:val="both"/>
       </w:pPr>
       <w:r>
+        <w:t xml:space="preserve">Từ khi bật cờ: khoá phiếu, chốt tất toán, trả chủ xe có hàng quầy là </w:t>
+      </w:r>
+      <w:r>
         <w:rPr>
           <w:b/>
         </w:rPr>
-        <w:t>Đề nghị</w:t>
-      </w:r>
-      <w:r>
-        <w:t xml:space="preserve"> — bên EPL viết trong nhánh </w:t>
-      </w:r>
-      <w:r>
-        <w:rPr>
-          <w:rFonts w:ascii="Consolas" w:hAnsi="Consolas"/>
-          <w:sz w:val="19"/>
-        </w:rPr>
-        <w:t>feat/HonTunedaHai</w:t>
-      </w:r>
-      <w:r>
-        <w:t xml:space="preserve"> (đang làm), cần đọc định nghĩa thủ tục ghi chứng từ kế toán khác (</w:t>
-      </w:r>
-      <w:r>
-        <w:rPr>
-          <w:rFonts w:ascii="Consolas" w:hAnsi="Consolas"/>
-          <w:sz w:val="19"/>
-        </w:rPr>
-        <w:t>DOC_OFSYSTEM</w:t>
-      </w:r>
-      <w:r>
-        <w:t xml:space="preserve"> / loại chứng từ, thủ tục chuyển tạm sang thật):</w:t>
-      </w:r>
-    </w:p>
-    <w:p>
-      <w:pPr>
-        <w:spacing w:after="0"/>
-        <w:ind w:left="360"/>
-      </w:pPr>
-      <w:r>
-        <w:rPr>
-          <w:rFonts w:ascii="Consolas" w:hAnsi="Consolas"/>
-          <w:sz w:val="18"/>
-        </w:rPr>
-        <w:t>POST /api/v1/integrations/logistics/journal-entries        (Idempotency-Key = SourceRef)</w:t>
-      </w:r>
-    </w:p>
-    <w:p>
-      <w:pPr>
-        <w:spacing w:after="0"/>
-        <w:ind w:left="360"/>
-      </w:pPr>
-      <w:r>
-        <w:rPr>
-          <w:rFonts w:ascii="Consolas" w:hAnsi="Consolas"/>
-          <w:sz w:val="18"/>
-        </w:rPr>
-        <w:t>{</w:t>
-      </w:r>
-    </w:p>
-    <w:p>
-      <w:pPr>
-        <w:spacing w:after="0"/>
-        <w:ind w:left="360"/>
-      </w:pPr>
-      <w:r>
-        <w:rPr>
-          <w:rFonts w:ascii="Consolas" w:hAnsi="Consolas"/>
-          <w:sz w:val="18"/>
-        </w:rPr>
-        <w:t>"SourceRef": "EPLLAO-&lt;nguồn&gt;-&lt;mã nguồn&gt;",     // ví dụ EPLLAO-thue_xe-&lt;Trip.id&gt;; gửi lại không ghi hai lần</w:t>
-      </w:r>
-    </w:p>
-    <w:p>
-      <w:pPr>
-        <w:spacing w:after="0"/>
-        <w:ind w:left="360"/>
-      </w:pPr>
-      <w:r>
-        <w:rPr>
-          <w:rFonts w:ascii="Consolas" w:hAnsi="Consolas"/>
-          <w:sz w:val="18"/>
-        </w:rPr>
-        <w:t>"DocumentDate": "2026-10-01", "CountryId": 11, "OrgId": 1368,</w:t>
-      </w:r>
-    </w:p>
-    <w:p>
-      <w:pPr>
-        <w:spacing w:after="0"/>
-        <w:ind w:left="360"/>
-      </w:pPr>
-      <w:r>
-        <w:rPr>
-          <w:rFonts w:ascii="Consolas" w:hAnsi="Consolas"/>
-          <w:sz w:val="18"/>
-        </w:rPr>
-        <w:t>"Description": "Chi phí thuê xe liên kết T4-0442-09/EPL",</w:t>
-      </w:r>
-    </w:p>
-    <w:p>
-      <w:pPr>
-        <w:spacing w:after="0"/>
-        <w:ind w:left="360"/>
-      </w:pPr>
-      <w:r>
-        <w:rPr>
-          <w:rFonts w:ascii="Consolas" w:hAnsi="Consolas"/>
-          <w:sz w:val="18"/>
-        </w:rPr>
-        <w:t>"Lines": [{ "DebitAccount": "621", "CreditAccount": "4022", "Amount": 28940400,</w:t>
-      </w:r>
-    </w:p>
-    <w:p>
-      <w:pPr>
-        <w:spacing w:after="0"/>
-        <w:ind w:left="360"/>
-      </w:pPr>
-      <w:r>
-        <w:rPr>
-          <w:rFonts w:ascii="Consolas" w:hAnsi="Consolas"/>
-          <w:sz w:val="18"/>
-        </w:rPr>
-        <w:t>"CurrencyId": 26, "ObjectId": "&lt;ObjectId nhà cung cấp EPLCX-…&gt;", "CostObject": "&lt;mã DO&gt;" }]</w:t>
-      </w:r>
-    </w:p>
-    <w:p>
-      <w:pPr>
-        <w:spacing w:after="0"/>
-        <w:ind w:left="360"/>
-      </w:pPr>
-      <w:r>
-        <w:rPr>
-          <w:rFonts w:ascii="Consolas" w:hAnsi="Consolas"/>
-          <w:sz w:val="18"/>
-        </w:rPr>
-        <w:t>}</w:t>
-      </w:r>
-    </w:p>
-    <w:p>
-      <w:pPr>
-        <w:spacing w:after="0"/>
-        <w:ind w:left="360"/>
-      </w:pPr>
-      <w:r>
-        <w:rPr>
-          <w:rFonts w:ascii="Consolas" w:hAnsi="Consolas"/>
-          <w:sz w:val="18"/>
-        </w:rPr>
-        <w:t>→ { "DocumentId", "DocumentNo", "Status": 12 }</w:t>
-      </w:r>
-    </w:p>
-    <w:p>
-      <w:pPr>
-        <w:spacing w:after="0"/>
-        <w:ind w:left="360"/>
-      </w:pPr>
-      <w:r>
-        <w:rPr>
-          <w:rFonts w:ascii="Consolas" w:hAnsi="Consolas"/>
-          <w:sz w:val="18"/>
-        </w:rPr>
-        <w:t>POST /api/v1/integrations/logistics/journal-entries/reverse  { "SourceRef" }   // khi bên em mở khoá phiếu / bỏ chốt</w:t>
-      </w:r>
-    </w:p>
-    <w:p/>
+        <w:t>tự gửi</w:t>
+      </w:r>
+      <w:r>
+        <w:t xml:space="preserve">; hỏng thì giữ "chờ gửi", không chặn việc khoá. Nút </w:t>
+      </w:r>
+      <w:r>
+        <w:rPr>
+          <w:b/>
+        </w:rPr>
+        <w:t>Gửi</w:t>
+      </w:r>
+      <w:r>
+        <w:t xml:space="preserve"> (một bản), </w:t>
+      </w:r>
+      <w:r>
+        <w:rPr>
+          <w:b/>
+        </w:rPr>
+        <w:t>Gửi hết</w:t>
+      </w:r>
+      <w:r>
+        <w:t xml:space="preserve"> (mọi bản chờ gửi, cũ trước, và mọi bản chờ đảo), </w:t>
+      </w:r>
+      <w:r>
+        <w:rPr>
+          <w:b/>
+        </w:rPr>
+        <w:t>Cập nhật</w:t>
+      </w:r>
+      <w:r>
+        <w:t xml:space="preserve"> — vai KT Thu/Chi VC, KT Chi phí VC, Sếp.</w:t>
+      </w:r>
+    </w:p>
+    <w:p>
+      <w:pPr>
+        <w:jc w:val="both"/>
+      </w:pPr>
+      <w:r>
+        <w:rPr>
+          <w:b/>
+        </w:rPr>
+        <w:t>Điểm còn mở:</w:t>
+      </w:r>
+    </w:p>
     <w:p>
       <w:pPr>
         <w:pStyle w:val="ListBullet"/>
       </w:pPr>
       <w:r>
-        <w:t xml:space="preserve">Một bút toán chờ là một lần gọi; </w:t>
-      </w:r>
-      <w:r>
-        <w:rPr>
-          <w:rFonts w:ascii="Consolas" w:hAnsi="Consolas"/>
-          <w:sz w:val="19"/>
-        </w:rPr>
-        <w:t>Lines</w:t>
-      </w:r>
-      <w:r>
-        <w:t xml:space="preserve"> mang đủ các dòng của bản đó, mỗi dòng đúng tiền tệ của dòng.</w:t>
+        <w:t xml:space="preserve">Dòng </w:t>
+      </w:r>
+      <w:r>
+        <w:rPr>
+          <w:rFonts w:ascii="Consolas" w:hAnsi="Consolas"/>
+          <w:sz w:val="19"/>
+        </w:rPr>
+        <w:t>no_ncc</w:t>
+      </w:r>
+      <w:r>
+        <w:t xml:space="preserve"> chưa gán nhà cung cấp gửi </w:t>
+      </w:r>
+      <w:r>
+        <w:rPr>
+          <w:rFonts w:ascii="Consolas" w:hAnsi="Consolas"/>
+          <w:sz w:val="19"/>
+        </w:rPr>
+        <w:t>ObjectId</w:t>
+      </w:r>
+      <w:r>
+        <w:t xml:space="preserve"> trống. Diagnostics D4 của script cho thấy </w:t>
+      </w:r>
+      <w:r>
+        <w:rPr>
+          <w:rFonts w:ascii="Consolas" w:hAnsi="Consolas"/>
+          <w:sz w:val="19"/>
+        </w:rPr>
+        <w:t>PUBENTRY.OBJ_AUTOID</w:t>
+      </w:r>
+      <w:r>
+        <w:t xml:space="preserve"> </w:t>
+      </w:r>
+      <w:r>
+        <w:rPr>
+          <w:b/>
+        </w:rPr>
+        <w:t>không</w:t>
+      </w:r>
+      <w:r>
+        <w:t xml:space="preserve"> cho NULL thì bên anh trả 422 </w:t>
+      </w:r>
+      <w:r>
+        <w:rPr>
+          <w:rFonts w:ascii="Consolas" w:hAnsi="Consolas"/>
+          <w:sz w:val="19"/>
+        </w:rPr>
+        <w:t>LOGISTICS_JOURNAL_52507</w:t>
+      </w:r>
+      <w:r>
+        <w:t xml:space="preserve">, cả bút toán của phiếu đó không ghi — </w:t>
+      </w:r>
+      <w:r>
+        <w:rPr>
+          <w:b/>
+        </w:rPr>
+        <w:t>cần quyết sau khi áp script</w:t>
+      </w:r>
+      <w:r>
+        <w:t xml:space="preserve"> (bắt gán nhà cung cấp trước khi khoá, hoặc chốt một đối tượng mặc định).</w:t>
       </w:r>
     </w:p>
     <w:p>
@@ -34253,31 +36922,139 @@
         <w:pStyle w:val="ListBullet"/>
       </w:pPr>
       <w:r>
-        <w:t xml:space="preserve">Có đường này thì bên em gửi các bản </w:t>
-      </w:r>
-      <w:r>
-        <w:rPr>
-          <w:rFonts w:ascii="Consolas" w:hAnsi="Consolas"/>
-          <w:sz w:val="19"/>
-        </w:rPr>
-        <w:t>cho_gui</w:t>
-      </w:r>
-      <w:r>
-        <w:t>; mở khoá phiếu đã gửi thì gửi đảo.</w:t>
-      </w:r>
-    </w:p>
-    <w:p>
-      <w:pPr>
-        <w:jc w:val="both"/>
-      </w:pPr>
+        <w:t xml:space="preserve">Đầu gửi coi HTTP 404 khi </w:t>
+      </w:r>
       <w:r>
         <w:rPr>
           <w:b/>
         </w:rPr>
-        <w:t>Trạng thái 01/10:</w:t>
-      </w:r>
-      <w:r>
-        <w:t xml:space="preserve"> chờ đọc được cấu trúc sổ cái — chủ dự án cấp quyền đọc DB cho công cụ của bên em, hoặc anh gửi định nghĩa các thủ tục kể trên.</w:t>
+        <w:t>gỡ</w:t>
+      </w:r>
+      <w:r>
+        <w:t xml:space="preserve"> là "bên anh không còn chứng từ". Với API </w:t>
+      </w:r>
+      <w:r>
+        <w:rPr>
+          <w:rFonts w:ascii="Consolas" w:hAnsi="Consolas"/>
+          <w:sz w:val="19"/>
+        </w:rPr>
+        <w:t>b9227aa</w:t>
+      </w:r>
+      <w:r>
+        <w:t xml:space="preserve"> gỡ không bao giờ trả 404 (thiếu chứng từ là </w:t>
+      </w:r>
+      <w:r>
+        <w:rPr>
+          <w:rFonts w:ascii="Consolas" w:hAnsi="Consolas"/>
+          <w:sz w:val="19"/>
+        </w:rPr>
+        <w:t>Reversed: false</w:t>
+      </w:r>
+      <w:r>
+        <w:t xml:space="preserve">), nên 404 chỉ có khi trỏ API cũ — </w:t>
+      </w:r>
+      <w:r>
+        <w:rPr>
+          <w:b/>
+        </w:rPr>
+        <w:t>đừng bật cờ</w:t>
+      </w:r>
+      <w:r>
+        <w:t xml:space="preserve"> trên máy còn trỏ API chưa có </w:t>
+      </w:r>
+      <w:r>
+        <w:rPr>
+          <w:rFonts w:ascii="Consolas" w:hAnsi="Consolas"/>
+          <w:sz w:val="19"/>
+        </w:rPr>
+        <w:t>b9227aa</w:t>
+      </w:r>
+      <w:r>
+        <w:t>.</w:t>
+      </w:r>
+    </w:p>
+    <w:p>
+      <w:pPr>
+        <w:pStyle w:val="ListBullet"/>
+      </w:pPr>
+      <w:r>
+        <w:t xml:space="preserve">HTTP 200 </w:t>
+      </w:r>
+      <w:r>
+        <w:rPr>
+          <w:rFonts w:ascii="Consolas" w:hAnsi="Consolas"/>
+          <w:sz w:val="19"/>
+        </w:rPr>
+        <w:t>Success: false</w:t>
+      </w:r>
+      <w:r>
+        <w:t xml:space="preserve">, </w:t>
+      </w:r>
+      <w:r>
+        <w:rPr>
+          <w:rFonts w:ascii="Consolas" w:hAnsi="Consolas"/>
+          <w:sz w:val="19"/>
+        </w:rPr>
+        <w:t>Code: 500</w:t>
+      </w:r>
+      <w:r>
+        <w:t xml:space="preserve"> (lỗi chưa bắt bên anh) được xếp </w:t>
+      </w:r>
+      <w:r>
+        <w:rPr>
+          <w:rFonts w:ascii="Consolas" w:hAnsi="Consolas"/>
+          <w:sz w:val="19"/>
+        </w:rPr>
+        <w:t>BEN_KE_TOAN_TU_CHOI</w:t>
+      </w:r>
+      <w:r>
+        <w:t>, không phải "chưa rõ": bỏ bản lúc đó thì không GET trước. Gửi lại vẫn an toàn nhờ cùng SourceRef.</w:t>
+      </w:r>
+    </w:p>
+    <w:p>
+      <w:pPr>
+        <w:pStyle w:val="ListBullet"/>
+      </w:pPr>
+      <w:r>
+        <w:t xml:space="preserve">403 </w:t>
+      </w:r>
+      <w:r>
+        <w:rPr>
+          <w:rFonts w:ascii="Consolas" w:hAnsi="Consolas"/>
+          <w:sz w:val="19"/>
+        </w:rPr>
+        <w:t>LOGISTICS_JOURNAL_FORBIDDEN</w:t>
+      </w:r>
+      <w:r>
+        <w:t xml:space="preserve"> ("Tài khoản này không được gọi tích hợp bút toán.") bị xếp </w:t>
+      </w:r>
+      <w:r>
+        <w:rPr>
+          <w:rFonts w:ascii="Consolas" w:hAnsi="Consolas"/>
+          <w:sz w:val="19"/>
+        </w:rPr>
+        <w:t>TAI_KHOAN_SAI</w:t>
+      </w:r>
+      <w:r>
+        <w:t xml:space="preserve"> vì câu có chữ "tài khoản" — câu hiện ra vẫn đúng.</w:t>
+      </w:r>
+    </w:p>
+    <w:p>
+      <w:pPr>
+        <w:pStyle w:val="ListBullet"/>
+      </w:pPr>
+      <w:r>
+        <w:t xml:space="preserve">Phí 2 % và trừ quá tải xe thuê chưa có bút toán (anh Khampla chốt); </w:t>
+      </w:r>
+      <w:r>
+        <w:rPr>
+          <w:rFonts w:ascii="Consolas" w:hAnsi="Consolas"/>
+          <w:sz w:val="19"/>
+        </w:rPr>
+        <w:t>625/4201</w:t>
+      </w:r>
+      <w:r>
+        <w:t xml:space="preserve"> chưa có nguồn (câu hỏi 10.10).</w:t>
       </w:r>
     </w:p>
     <w:sectPr>

</xml_diff>

<commit_message>
Tài liệu bàn giao anh Tune: thu tiền khách của SO đi đường công nợ (TKN → CMR 17, Nợ 1011/1021 / Có 1211), không phải CMR 15; hai lỗi hộp thu nợ đang sửa
Co-Authored-By: Claude Opus 5.5 (1M context) <noreply@anthropic.com>
</commit_message>
<xml_diff>
--- a/DOCS/word/HOP_DONG_API_KE_TOAN_ANH_TUNE.docx
+++ b/DOCS/word/HOP_DONG_API_KE_TOAN_ANH_TUNE.docx
@@ -1104,7 +1104,25 @@
           <w:p>
             <w:r/>
             <w:r>
-              <w:t>việc của hệ anh, từ SO; trang điều xe chỉ đọc "đã thu" (12.11.2)</w:t>
+              <w:t xml:space="preserve">việc của hệ anh, từ SO. Thu tiền: màn </w:t>
+            </w:r>
+            <w:r>
+              <w:rPr>
+                <w:b/>
+              </w:rPr>
+              <w:t>Chi tiết công nợ khách hàng → Tạo phiếu thu → Xác nhận thu nợ</w:t>
+            </w:r>
+            <w:r>
+              <w:t xml:space="preserve"> (TKN) → phiếu thu CMR 17 "Thu khác", Nợ 1021 / Có 1211 — </w:t>
+            </w:r>
+            <w:r>
+              <w:rPr>
+                <w:b/>
+              </w:rPr>
+              <w:t>không</w:t>
+            </w:r>
+            <w:r>
+              <w:t xml:space="preserve"> phải phiếu "Thu công nợ" (15). Trang điều xe chỉ đọc "đã thu" (12.11.2)</w:t>
             </w:r>
           </w:p>
         </w:tc>
@@ -18151,7 +18169,7 @@
               <w:t>Thu tiền khách</w:t>
             </w:r>
             <w:r>
-              <w:t xml:space="preserve"> (hoá đơn, phiếu thu)</w:t>
+              <w:t xml:space="preserve"> của SO</w:t>
             </w:r>
           </w:p>
         </w:tc>
@@ -18162,6 +18180,86 @@
           <w:p>
             <w:r/>
             <w:r>
+              <w:t xml:space="preserve">WEB </w:t>
+            </w:r>
+            <w:r>
+              <w:rPr>
+                <w:b/>
+              </w:rPr>
+              <w:t>Chi tiết công nợ khách hàng → Tạo phiếu thu → Xác nhận thu nợ</w:t>
+            </w:r>
+            <w:r>
+              <w:t xml:space="preserve"> → </w:t>
+            </w:r>
+            <w:r>
+              <w:rPr>
+                <w:rFonts w:ascii="Consolas" w:hAnsi="Consolas"/>
+                <w:sz w:val="19"/>
+              </w:rPr>
+              <w:t>POST /api/v1/sales/debt/collection-upsert</w:t>
+            </w:r>
+            <w:r>
+              <w:t xml:space="preserve"> (</w:t>
+            </w:r>
+            <w:r>
+              <w:rPr>
+                <w:rFonts w:ascii="Consolas" w:hAnsi="Consolas"/>
+                <w:sz w:val="19"/>
+              </w:rPr>
+              <w:t>DocumentType = "TKN"</w:t>
+            </w:r>
+            <w:r>
+              <w:t xml:space="preserve">, theo </w:t>
+            </w:r>
+            <w:r>
+              <w:rPr>
+                <w:rFonts w:ascii="Consolas" w:hAnsi="Consolas"/>
+                <w:sz w:val="19"/>
+              </w:rPr>
+              <w:t>RetkAutoId</w:t>
+            </w:r>
+            <w:r>
+              <w:t xml:space="preserve"> của SO) → phiếu thu nợ RES </w:t>
+            </w:r>
+            <w:r>
+              <w:rPr>
+                <w:rFonts w:ascii="Consolas" w:hAnsi="Consolas"/>
+                <w:sz w:val="19"/>
+              </w:rPr>
+              <w:t>4-TKN-1368-2-…</w:t>
+            </w:r>
+            <w:r>
+              <w:t xml:space="preserve"> + phiếu thu </w:t>
+            </w:r>
+            <w:r>
+              <w:rPr>
+                <w:b/>
+              </w:rPr>
+              <w:t>CMR 17 "Thu khác"</w:t>
+            </w:r>
+            <w:r>
+              <w:t xml:space="preserve"> </w:t>
+            </w:r>
+            <w:r>
+              <w:rPr>
+                <w:rFonts w:ascii="Consolas" w:hAnsi="Consolas"/>
+                <w:sz w:val="19"/>
+              </w:rPr>
+              <w:t>4-1368-TK-…</w:t>
+            </w:r>
+            <w:r>
+              <w:t xml:space="preserve">, Nợ 1021 (hoặc 1011) / Có 1211. </w:t>
+            </w:r>
+            <w:r>
+              <w:rPr>
+                <w:b/>
+              </w:rPr>
+              <w:t>Không</w:t>
+            </w:r>
+            <w:r>
+              <w:t xml:space="preserve"> qua </w:t>
+            </w:r>
+            <w:r>
               <w:rPr>
                 <w:rFonts w:ascii="Consolas" w:hAnsi="Consolas"/>
                 <w:sz w:val="19"/>
@@ -18169,47 +18267,7 @@
               <w:t>save-and-commit</w:t>
             </w:r>
             <w:r>
-              <w:t xml:space="preserve"> </w:t>
-            </w:r>
-            <w:r>
-              <w:rPr>
-                <w:rFonts w:ascii="Consolas" w:hAnsi="Consolas"/>
-                <w:sz w:val="19"/>
-              </w:rPr>
-              <w:t>VoucherType = "CMR"</w:t>
-            </w:r>
-            <w:r>
-              <w:t xml:space="preserve"> với </w:t>
-            </w:r>
-            <w:r>
-              <w:rPr>
-                <w:rFonts w:ascii="Consolas" w:hAnsi="Consolas"/>
-                <w:sz w:val="19"/>
-              </w:rPr>
-              <w:t>Relations[{SourceType: "DEP", SourceDocumentIds}]</w:t>
-            </w:r>
-            <w:r>
-              <w:t xml:space="preserve"> · hoặc </w:t>
-            </w:r>
-            <w:r>
-              <w:rPr>
-                <w:rFonts w:ascii="Consolas" w:hAnsi="Consolas"/>
-                <w:sz w:val="19"/>
-              </w:rPr>
-              <w:t>POST /api/v1/sales/debt/collection-upsert</w:t>
-            </w:r>
-            <w:r>
-              <w:t xml:space="preserve"> theo </w:t>
-            </w:r>
-            <w:r>
-              <w:rPr>
-                <w:rFonts w:ascii="Consolas" w:hAnsi="Consolas"/>
-                <w:sz w:val="19"/>
-              </w:rPr>
-              <w:t>RetkAutoId</w:t>
-            </w:r>
-            <w:r>
-              <w:t xml:space="preserve"> của SO</w:t>
+              <w:t xml:space="preserve"> CMR 15 "Thu công nợ": tìm công nợ SO ở đó ra 0 dòng</w:t>
             </w:r>
           </w:p>
         </w:tc>
@@ -18237,7 +18295,7 @@
           <w:p>
             <w:r/>
             <w:r>
-              <w:t>—</w:t>
+              <w:t>KB-AZ đi thật 01/10. Hai lỗi: hộp Tạo phiếu thu chỉ có tài khoản nội tệ, tỷ giá cứng 1 → SO USD ghi thành Kíp (UI-4 đang sửa); mọi SO cùng mã phiếu bán "Demo EPL-2-261001000" (UI-4 đang tìm nguồn)</w:t>
             </w:r>
           </w:p>
         </w:tc>
@@ -31221,6 +31279,281 @@
       </w:r>
       <w:r>
         <w:t>: thu tiền, hoá đơn làm ở hệ anh.</w:t>
+      </w:r>
+    </w:p>
+    <w:p>
+      <w:pPr>
+        <w:pStyle w:val="ListBullet"/>
+      </w:pPr>
+      <w:r>
+        <w:rPr>
+          <w:b/>
+        </w:rPr>
+        <w:t>Kế toán bên anh thu tiền SO</w:t>
+      </w:r>
+      <w:r>
+        <w:t xml:space="preserve"> ở WEB </w:t>
+      </w:r>
+      <w:r>
+        <w:rPr>
+          <w:b/>
+        </w:rPr>
+        <w:t>Chi tiết công nợ khách hàng</w:t>
+      </w:r>
+      <w:r>
+        <w:t xml:space="preserve"> (</w:t>
+      </w:r>
+      <w:r>
+        <w:rPr>
+          <w:rFonts w:ascii="Consolas" w:hAnsi="Consolas"/>
+          <w:sz w:val="19"/>
+        </w:rPr>
+        <w:t>/DebtCollection/CustomerDetail</w:t>
+      </w:r>
+      <w:r>
+        <w:t xml:space="preserve">) → </w:t>
+      </w:r>
+      <w:r>
+        <w:rPr>
+          <w:b/>
+        </w:rPr>
+        <w:t>Tạo phiếu thu</w:t>
+      </w:r>
+      <w:r>
+        <w:t xml:space="preserve"> → </w:t>
+      </w:r>
+      <w:r>
+        <w:rPr>
+          <w:b/>
+        </w:rPr>
+        <w:t>Xác nhận thu nợ</w:t>
+      </w:r>
+      <w:r>
+        <w:t xml:space="preserve"> → </w:t>
+      </w:r>
+      <w:r>
+        <w:rPr>
+          <w:rFonts w:ascii="Consolas" w:hAnsi="Consolas"/>
+          <w:sz w:val="19"/>
+        </w:rPr>
+        <w:t>POST /api/v1/sales/debt/collection-upsert</w:t>
+      </w:r>
+      <w:r>
+        <w:t xml:space="preserve"> (</w:t>
+      </w:r>
+      <w:r>
+        <w:rPr>
+          <w:rFonts w:ascii="Consolas" w:hAnsi="Consolas"/>
+          <w:sz w:val="19"/>
+        </w:rPr>
+        <w:t>DocumentType = "TKN"</w:t>
+      </w:r>
+      <w:r>
+        <w:t xml:space="preserve">) → </w:t>
+      </w:r>
+      <w:r>
+        <w:rPr>
+          <w:rFonts w:ascii="Consolas" w:hAnsi="Consolas"/>
+          <w:sz w:val="19"/>
+        </w:rPr>
+        <w:t>sp_RES_CreateDebtCollection_COUNTRY</w:t>
+      </w:r>
+      <w:r>
+        <w:t xml:space="preserve">: phiếu thu nợ RES (số dạng </w:t>
+      </w:r>
+      <w:r>
+        <w:rPr>
+          <w:rFonts w:ascii="Consolas" w:hAnsi="Consolas"/>
+          <w:sz w:val="19"/>
+        </w:rPr>
+        <w:t>4-TKN-1368-2-261001-0001</w:t>
+      </w:r>
+      <w:r>
+        <w:t xml:space="preserve">), trừ dư nợ </w:t>
+      </w:r>
+      <w:r>
+        <w:rPr>
+          <w:rFonts w:ascii="Consolas" w:hAnsi="Consolas"/>
+          <w:sz w:val="19"/>
+        </w:rPr>
+        <w:t>RESCUSTOMERSDEBT</w:t>
+      </w:r>
+      <w:r>
+        <w:t xml:space="preserve"> của đúng </w:t>
+      </w:r>
+      <w:r>
+        <w:rPr>
+          <w:rFonts w:ascii="Consolas" w:hAnsi="Consolas"/>
+          <w:sz w:val="19"/>
+        </w:rPr>
+        <w:t>RetkAutoId</w:t>
+      </w:r>
+      <w:r>
+        <w:t xml:space="preserve">, và sinh </w:t>
+      </w:r>
+      <w:r>
+        <w:rPr>
+          <w:b/>
+        </w:rPr>
+        <w:t>phiếu thu CMR 17 "Thu khác"</w:t>
+      </w:r>
+      <w:r>
+        <w:t xml:space="preserve"> chưa ghi sổ (</w:t>
+      </w:r>
+      <w:r>
+        <w:rPr>
+          <w:rFonts w:ascii="Consolas" w:hAnsi="Consolas"/>
+          <w:sz w:val="19"/>
+        </w:rPr>
+        <w:t>ST_AUTOID</w:t>
+      </w:r>
+      <w:r>
+        <w:t xml:space="preserve"> 1; số </w:t>
+      </w:r>
+      <w:r>
+        <w:rPr>
+          <w:rFonts w:ascii="Consolas" w:hAnsi="Consolas"/>
+          <w:sz w:val="19"/>
+        </w:rPr>
+        <w:t>&lt;CounterId&gt;-&lt;số DOTY 17&gt;</w:t>
+      </w:r>
+      <w:r>
+        <w:t xml:space="preserve">, dạng </w:t>
+      </w:r>
+      <w:r>
+        <w:rPr>
+          <w:rFonts w:ascii="Consolas" w:hAnsi="Consolas"/>
+          <w:sz w:val="19"/>
+        </w:rPr>
+        <w:t>4-1368-TK-261001-00009</w:t>
+      </w:r>
+      <w:r>
+        <w:t>), một dòng Nợ tài khoản tiền theo vai (</w:t>
+      </w:r>
+      <w:r>
+        <w:rPr>
+          <w:rFonts w:ascii="Consolas" w:hAnsi="Consolas"/>
+          <w:sz w:val="19"/>
+        </w:rPr>
+        <w:t>BANK_LOCAL</w:t>
+      </w:r>
+      <w:r>
+        <w:t xml:space="preserve"> → 1021, </w:t>
+      </w:r>
+      <w:r>
+        <w:rPr>
+          <w:rFonts w:ascii="Consolas" w:hAnsi="Consolas"/>
+          <w:sz w:val="19"/>
+        </w:rPr>
+        <w:t>CASH_LOCAL</w:t>
+      </w:r>
+      <w:r>
+        <w:t xml:space="preserve"> → 1011) / Có tài khoản vai </w:t>
+      </w:r>
+      <w:r>
+        <w:rPr>
+          <w:rFonts w:ascii="Consolas" w:hAnsi="Consolas"/>
+          <w:sz w:val="19"/>
+        </w:rPr>
+        <w:t>CUSTOMER_GOODS</w:t>
+      </w:r>
+      <w:r>
+        <w:t xml:space="preserve"> (1211). Không dùng phiếu thu "Thu công nợ" (CMR 15): công nợ SO không hiện ở đó (0 dòng).</w:t>
+      </w:r>
+    </w:p>
+    <w:p>
+      <w:pPr>
+        <w:pStyle w:val="ListBullet"/>
+      </w:pPr>
+      <w:r>
+        <w:t xml:space="preserve">Hai lỗi đã thấy khi đi thật luồng này (01/10): (1) hộp </w:t>
+      </w:r>
+      <w:r>
+        <w:rPr>
+          <w:b/>
+        </w:rPr>
+        <w:t>Tạo phiếu thu</w:t>
+      </w:r>
+      <w:r>
+        <w:t xml:space="preserve"> chỉ có tài khoản tiền </w:t>
+      </w:r>
+      <w:r>
+        <w:rPr>
+          <w:b/>
+        </w:rPr>
+        <w:t>nội tệ</w:t>
+      </w:r>
+      <w:r>
+        <w:t xml:space="preserve"> (</w:t>
+      </w:r>
+      <w:r>
+        <w:rPr>
+          <w:rFonts w:ascii="Consolas" w:hAnsi="Consolas"/>
+          <w:sz w:val="19"/>
+        </w:rPr>
+        <w:t>CASH_LOCAL</w:t>
+      </w:r>
+      <w:r>
+        <w:t xml:space="preserve">, </w:t>
+      </w:r>
+      <w:r>
+        <w:rPr>
+          <w:rFonts w:ascii="Consolas" w:hAnsi="Consolas"/>
+          <w:sz w:val="19"/>
+        </w:rPr>
+        <w:t>BANK_LOCAL</w:t>
+      </w:r>
+      <w:r>
+        <w:t xml:space="preserve">) và gửi tỷ giá cứng </w:t>
+      </w:r>
+      <w:r>
+        <w:rPr>
+          <w:rFonts w:ascii="Consolas" w:hAnsi="Consolas"/>
+          <w:sz w:val="19"/>
+        </w:rPr>
+        <w:t>rate: 1</w:t>
+      </w:r>
+      <w:r>
+        <w:t xml:space="preserve">, </w:t>
+      </w:r>
+      <w:r>
+        <w:rPr>
+          <w:rFonts w:ascii="Consolas" w:hAnsi="Consolas"/>
+          <w:sz w:val="19"/>
+        </w:rPr>
+        <w:t>amount = amountCur</w:t>
+      </w:r>
+      <w:r>
+        <w:t xml:space="preserve"> (</w:t>
+      </w:r>
+      <w:r>
+        <w:rPr>
+          <w:rFonts w:ascii="Consolas" w:hAnsi="Consolas"/>
+          <w:sz w:val="19"/>
+        </w:rPr>
+        <w:t>debtCollectionCustomerDetail.js</w:t>
+      </w:r>
+      <w:r>
+        <w:t xml:space="preserve">), nên SO USD bị ghi số USD thành Kíp — đang sửa (UI-4); (2) mọi SO tạo từ trang điều xe mang </w:t>
+      </w:r>
+      <w:r>
+        <w:rPr>
+          <w:b/>
+        </w:rPr>
+        <w:t>cùng một mã phiếu bán</w:t>
+      </w:r>
+      <w:r>
+        <w:t xml:space="preserve"> (</w:t>
+      </w:r>
+      <w:r>
+        <w:rPr>
+          <w:rFonts w:ascii="Consolas" w:hAnsi="Consolas"/>
+          <w:sz w:val="19"/>
+        </w:rPr>
+        <w:t>RETK_CODE</w:t>
+      </w:r>
+      <w:r>
+        <w:t>) "Demo EPL-2-261001000" — đang tìm nguồn (UI-4).</w:t>
       </w:r>
     </w:p>
     <w:p>

</xml_diff>

<commit_message>
Bút toán xuất kho cho chuyến (chủ dự án duyệt 01/10): xuất nội bộ xe nhà 625·614/1371, xuất bán xe thuê 4022/707 + 607/1371
- but_toan_cho: nguồn xuat_noi_bo / xuat_ban, một lần xuất (TripExpense.stock_move_id) một bút toán, ngày chứng từ = ngày xuất thật;
  ghi lúc khoá phiếu (giá bán có sau khi kiểm mục III / V, Có 707 khớp số trừ chủ xe), mở khoá / xoá phiếu thì huỷ hoặc gỡ
- Giá vốn = giá bình quân kho lúc xuất (đã chép về dòng phiếu); chỉ acct / expacct / admin thấy; không trùng ban_chu_xe (bán ở quầy)
- Màn Bút toán chờ: tên nguồn và nhãn loại khoản ba tiếng; kiem/thu_but_toan_xuat_kho.py (mới); thu_gui_but_toan so ngày chứng từ với hôm nay
- Hợp đồng / tài liệu nối anh Tune: bảng nguồn 12.12.4 và 1.6

Co-Authored-By: Claude Opus 5.5 (1M context) <noreply@anthropic.com>
</commit_message>
<xml_diff>
--- a/DOCS/word/HOP_DONG_API_KE_TOAN_ANH_TUNE.docx
+++ b/DOCS/word/HOP_DONG_API_KE_TOAN_ANH_TUNE.docx
@@ -1043,7 +1043,16 @@
               <w:t>Khoản không qua tiền</w:t>
             </w:r>
             <w:r>
-              <w:t>: chi phí thuê xe 621/4022, ghi nợ nhà cung cấp 625 · 614 / 4021, quyết toán tạm ứng 625/1601, hàng bán cho chủ xe 4022/707</w:t>
+              <w:t xml:space="preserve">: chi phí thuê xe 621/4022, ghi nợ nhà cung cấp 625 · 614 / 4021, quyết toán tạm ứng 625/1601, hàng bán cho chủ xe 4022/707, </w:t>
+            </w:r>
+            <w:r>
+              <w:rPr>
+                <w:b/>
+              </w:rPr>
+              <w:t>xuất kho cho chuyến</w:t>
+            </w:r>
+            <w:r>
+              <w:t xml:space="preserve"> (xe nhà 625 · 614 / 1371 giá vốn; xe thuê 4022/707 giá bán + 607/1371 giá vốn)</w:t>
             </w:r>
           </w:p>
         </w:tc>
@@ -8081,7 +8090,7 @@
           <w:p>
             <w:r/>
             <w:r>
-              <w:t>xe nhà 625/1371 · xe thuê: xem lỗ hổng 2</w:t>
+              <w:t>xe nhà 625/1371 · xe thuê 4022/707 (giá bán) + 607/1371 (giá vốn) — ghi lúc khoá phiếu (bước 7)</w:t>
             </w:r>
           </w:p>
         </w:tc>
@@ -8092,7 +8101,24 @@
           <w:p>
             <w:r/>
             <w:r>
-              <w:t>kho</w:t>
+              <w:t xml:space="preserve">kho; bút toán sang anh qua bút toán chờ </w:t>
+            </w:r>
+            <w:r>
+              <w:rPr>
+                <w:rFonts w:ascii="Consolas" w:hAnsi="Consolas"/>
+                <w:sz w:val="19"/>
+              </w:rPr>
+              <w:t>xuat_noi_bo</w:t>
+            </w:r>
+            <w:r>
+              <w:t xml:space="preserve"> / </w:t>
+            </w:r>
+            <w:r>
+              <w:rPr>
+                <w:rFonts w:ascii="Consolas" w:hAnsi="Consolas"/>
+                <w:sz w:val="19"/>
+              </w:rPr>
+              <w:t>xuat_ban</w:t>
             </w:r>
           </w:p>
         </w:tc>
@@ -8283,7 +8309,36 @@
               <w:t>bút toán chờ</w:t>
             </w:r>
             <w:r>
-              <w:t xml:space="preserve"> 625 · 614 / 4021 (mục 8)</w:t>
+              <w:t xml:space="preserve"> 625 · 614 / 4021; mỗi lần xuất kho dầu / phụ tùng cho chuyến ghi </w:t>
+            </w:r>
+            <w:r>
+              <w:rPr>
+                <w:b/>
+              </w:rPr>
+              <w:t>bút toán chờ</w:t>
+            </w:r>
+            <w:r>
+              <w:t xml:space="preserve"> </w:t>
+            </w:r>
+            <w:r>
+              <w:rPr>
+                <w:rFonts w:ascii="Consolas" w:hAnsi="Consolas"/>
+                <w:sz w:val="19"/>
+              </w:rPr>
+              <w:t>xuat_noi_bo</w:t>
+            </w:r>
+            <w:r>
+              <w:t xml:space="preserve"> (xe nhà) / </w:t>
+            </w:r>
+            <w:r>
+              <w:rPr>
+                <w:rFonts w:ascii="Consolas" w:hAnsi="Consolas"/>
+                <w:sz w:val="19"/>
+              </w:rPr>
+              <w:t>xuat_ban</w:t>
+            </w:r>
+            <w:r>
+              <w:t xml:space="preserve"> (xe thuê) (mục 8, 12.12.4)</w:t>
             </w:r>
           </w:p>
         </w:tc>
@@ -13523,6 +13578,62 @@
     </w:p>
     <w:p>
       <w:pPr>
+        <w:jc w:val="both"/>
+      </w:pPr>
+      <w:r>
+        <w:t xml:space="preserve">| </w:t>
+      </w:r>
+      <w:r>
+        <w:rPr>
+          <w:rFonts w:ascii="Consolas" w:hAnsi="Consolas"/>
+          <w:sz w:val="19"/>
+        </w:rPr>
+        <w:t>xuat_noi_bo</w:t>
+      </w:r>
+      <w:r>
+        <w:t xml:space="preserve"> | khoá phiếu xe nhà có dầu / phụ tùng kho đã rời kho | xuất nội bộ: dầu Nợ 625 / Có 1371 · phụ tùng Nợ 614 / Có 1371, theo giá vốn bình quân kho | </w:t>
+      </w:r>
+      <w:r>
+        <w:rPr>
+          <w:rFonts w:ascii="Consolas" w:hAnsi="Consolas"/>
+          <w:sz w:val="19"/>
+        </w:rPr>
+        <w:t>dau:</w:t>
+      </w:r>
+      <w:r>
+        <w:t xml:space="preserve"> · </w:t>
+      </w:r>
+      <w:r>
+        <w:rPr>
+          <w:rFonts w:ascii="Consolas" w:hAnsi="Consolas"/>
+          <w:sz w:val="19"/>
+        </w:rPr>
+        <w:t>pt:&lt;mã lần xuất&gt;</w:t>
+      </w:r>
+      <w:r>
+        <w:t xml:space="preserve"> |</w:t>
+      </w:r>
+    </w:p>
+    <w:p>
+      <w:pPr>
+        <w:jc w:val="both"/>
+      </w:pPr>
+      <w:r>
+        <w:t xml:space="preserve">| </w:t>
+      </w:r>
+      <w:r>
+        <w:rPr>
+          <w:rFonts w:ascii="Consolas" w:hAnsi="Consolas"/>
+          <w:sz w:val="19"/>
+        </w:rPr>
+        <w:t>xuat_ban</w:t>
+      </w:r>
+      <w:r>
+        <w:t xml:space="preserve"> | khoá phiếu xe thuê (EPL ứng) có dầu / phụ tùng kho đã rời kho | xuất bán cho chủ xe: Nợ 4022 / Có 707 theo giá bán + Nợ 607 / Có 1371 theo giá vốn | như trên |</w:t>
+      </w:r>
+    </w:p>
+    <w:p>
+      <w:pPr>
         <w:pStyle w:val="ListBullet2"/>
       </w:pPr>
       <w:r>
@@ -13956,16 +14067,36 @@
         <w:t>Nợ 4022 / Có 707</w:t>
       </w:r>
       <w:r>
-        <w:t xml:space="preserve"> theo giá bán, một phiếu bán một bút toán. Dầu / phụ tùng xuất cho xe thuê trên phiếu (mục III, V) theo giá bán: cách ghi </w:t>
+        <w:t xml:space="preserve"> theo giá bán, một phiếu bán một bút toán. Dầu / phụ tùng kho xuất cho chuyến trên phiếu (mục III, V): </w:t>
       </w:r>
       <w:r>
         <w:rPr>
           <w:b/>
         </w:rPr>
-        <w:t>đang chốt</w:t>
-      </w:r>
-      <w:r>
-        <w:t xml:space="preserve"> (câu hỏi 10.9).</w:t>
+        <w:t>chủ dự án chốt 01/10</w:t>
+      </w:r>
+      <w:r>
+        <w:t xml:space="preserve"> ("xuất dầu là xuất nội bộ và còn là xuất bán") — lúc khoá phiếu, mỗi lần xuất kho thành một bút toán chờ: xe nhà </w:t>
+      </w:r>
+      <w:r>
+        <w:rPr>
+          <w:rFonts w:ascii="Consolas" w:hAnsi="Consolas"/>
+          <w:sz w:val="19"/>
+        </w:rPr>
+        <w:t>xuat_noi_bo</w:t>
+      </w:r>
+      <w:r>
+        <w:t xml:space="preserve"> (625 · 614 / 1371 theo giá vốn), xe thuê EPL ứng </w:t>
+      </w:r>
+      <w:r>
+        <w:rPr>
+          <w:rFonts w:ascii="Consolas" w:hAnsi="Consolas"/>
+          <w:sz w:val="19"/>
+        </w:rPr>
+        <w:t>xuat_ban</w:t>
+      </w:r>
+      <w:r>
+        <w:t xml:space="preserve"> (4022/707 theo giá bán + 607/1371 theo giá vốn), xe thuê chủ xe tự trả không có (12.12.4).</w:t>
       </w:r>
     </w:p>
     <w:p>
@@ -15149,7 +15280,7 @@
           <w:p>
             <w:r/>
             <w:r>
-              <w:t>Dầu / phụ tùng xuất cho xe thuê theo giá bán trên phiếu (lỗ hổng 2)</w:t>
+              <w:t>Dầu / phụ tùng kho xuất cho chuyến (lỗ hổng 2): xuất nội bộ / xuất bán cho chủ xe</w:t>
             </w:r>
           </w:p>
         </w:tc>
@@ -15163,10 +15294,30 @@
               <w:rPr>
                 <w:b/>
               </w:rPr>
-              <w:t>đang chốt</w:t>
-            </w:r>
-            <w:r>
-              <w:t xml:space="preserve"> (câu hỏi 10.9)</w:t>
+              <w:t>đã làm</w:t>
+            </w:r>
+            <w:r>
+              <w:t xml:space="preserve"> — bút toán chờ </w:t>
+            </w:r>
+            <w:r>
+              <w:rPr>
+                <w:rFonts w:ascii="Consolas" w:hAnsi="Consolas"/>
+                <w:sz w:val="19"/>
+              </w:rPr>
+              <w:t>xuat_noi_bo</w:t>
+            </w:r>
+            <w:r>
+              <w:t xml:space="preserve">, </w:t>
+            </w:r>
+            <w:r>
+              <w:rPr>
+                <w:rFonts w:ascii="Consolas" w:hAnsi="Consolas"/>
+                <w:sz w:val="19"/>
+              </w:rPr>
+              <w:t>xuat_ban</w:t>
+            </w:r>
+            <w:r>
+              <w:t xml:space="preserve"> lúc khoá phiếu (12.12.4); gửi sang anh khi bật cờ</w:t>
             </w:r>
           </w:p>
         </w:tc>
@@ -15647,16 +15798,65 @@
         <w:t>ban_chu_xe</w:t>
       </w:r>
       <w:r>
-        <w:t xml:space="preserve"> 4022/707 khi trả chủ xe; dầu / phụ tùng xuất cho xe thuê trên phiếu (mục III, V) — </w:t>
+        <w:t xml:space="preserve"> 4022/707 khi trả chủ xe; dầu / phụ tùng kho xuất cho chuyến trên phiếu (mục III, V) — </w:t>
       </w:r>
       <w:r>
         <w:rPr>
           <w:b/>
         </w:rPr>
-        <w:t>đang chốt</w:t>
-      </w:r>
-      <w:r>
-        <w:t>.</w:t>
+        <w:t>đã chốt 01/10</w:t>
+      </w:r>
+      <w:r>
+        <w:t xml:space="preserve">, bút toán chờ </w:t>
+      </w:r>
+      <w:r>
+        <w:rPr>
+          <w:rFonts w:ascii="Consolas" w:hAnsi="Consolas"/>
+          <w:sz w:val="19"/>
+        </w:rPr>
+        <w:t>xuat_noi_bo</w:t>
+      </w:r>
+      <w:r>
+        <w:t xml:space="preserve"> / </w:t>
+      </w:r>
+      <w:r>
+        <w:rPr>
+          <w:rFonts w:ascii="Consolas" w:hAnsi="Consolas"/>
+          <w:sz w:val="19"/>
+        </w:rPr>
+        <w:t>xuat_ban</w:t>
+      </w:r>
+      <w:r>
+        <w:t xml:space="preserve"> (12.12.4). Còn hỏi anh Khampla: nếu sau này tờ kho của hệ anh Toàn (</w:t>
+      </w:r>
+      <w:r>
+        <w:rPr>
+          <w:rFonts w:ascii="Consolas" w:hAnsi="Consolas"/>
+          <w:sz w:val="19"/>
+        </w:rPr>
+        <w:t>PXK_NL</w:t>
+      </w:r>
+      <w:r>
+        <w:t xml:space="preserve">, </w:t>
+      </w:r>
+      <w:r>
+        <w:rPr>
+          <w:rFonts w:ascii="Consolas" w:hAnsi="Consolas"/>
+          <w:sz w:val="19"/>
+        </w:rPr>
+        <w:t>PXK_PT</w:t>
+      </w:r>
+      <w:r>
+        <w:t xml:space="preserve"> có định khoản) cũng vào sổ anh (câu hỏi 10.11) thì vế Có 1371 phải chọn </w:t>
+      </w:r>
+      <w:r>
+        <w:rPr>
+          <w:b/>
+        </w:rPr>
+        <w:t>một</w:t>
+      </w:r>
+      <w:r>
+        <w:t xml:space="preserve"> nơi ghi — không ghi cả hai.</w:t>
       </w:r>
     </w:p>
     <w:p>
@@ -35691,6 +35891,234 @@
           </w:p>
         </w:tc>
       </w:tr>
+      <w:tr>
+        <w:tc>
+          <w:tcPr>
+            <w:tcW w:type="dxa" w:w="1440"/>
+          </w:tcPr>
+          <w:p>
+            <w:r/>
+            <w:r>
+              <w:rPr>
+                <w:rFonts w:ascii="Consolas" w:hAnsi="Consolas"/>
+                <w:sz w:val="19"/>
+              </w:rPr>
+              <w:t>xuat_noi_bo</w:t>
+            </w:r>
+          </w:p>
+        </w:tc>
+        <w:tc>
+          <w:tcPr>
+            <w:tcW w:type="dxa" w:w="1440"/>
+          </w:tcPr>
+          <w:p>
+            <w:r/>
+            <w:r>
+              <w:t xml:space="preserve">khoá phiếu </w:t>
+            </w:r>
+            <w:r>
+              <w:rPr>
+                <w:b/>
+              </w:rPr>
+              <w:t>xe nhà</w:t>
+            </w:r>
+            <w:r>
+              <w:t xml:space="preserve"> có dầu kho (mục III, đã cấp theo phiếu đề nghị) / phụ tùng kho (mục V) đã rời kho</w:t>
+            </w:r>
+          </w:p>
+        </w:tc>
+        <w:tc>
+          <w:tcPr>
+            <w:tcW w:type="dxa" w:w="1440"/>
+          </w:tcPr>
+          <w:p>
+            <w:r/>
+            <w:r>
+              <w:rPr>
+                <w:b/>
+              </w:rPr>
+              <w:t>Xuất nội bộ</w:t>
+            </w:r>
+            <w:r>
+              <w:t>: dầu Nợ 625 / Có 1371 · phụ tùng Nợ 614 / Có 1371, mỗi dòng chi một dòng</w:t>
+            </w:r>
+          </w:p>
+        </w:tc>
+        <w:tc>
+          <w:tcPr>
+            <w:tcW w:type="dxa" w:w="1440"/>
+          </w:tcPr>
+          <w:p>
+            <w:r/>
+            <w:r>
+              <w:rPr>
+                <w:rFonts w:ascii="Consolas" w:hAnsi="Consolas"/>
+                <w:sz w:val="19"/>
+              </w:rPr>
+              <w:t>dau:&lt;mã lần xuất&gt;</w:t>
+            </w:r>
+            <w:r>
+              <w:t xml:space="preserve"> · </w:t>
+            </w:r>
+            <w:r>
+              <w:rPr>
+                <w:rFonts w:ascii="Consolas" w:hAnsi="Consolas"/>
+                <w:sz w:val="19"/>
+              </w:rPr>
+              <w:t>pt:&lt;mã lần xuất&gt;</w:t>
+            </w:r>
+            <w:r>
+              <w:t xml:space="preserve"> (dòng sổ kho bên kho tạm) — </w:t>
+            </w:r>
+            <w:r>
+              <w:rPr>
+                <w:b/>
+              </w:rPr>
+              <w:t>một lần xuất một bút toán</w:t>
+            </w:r>
+          </w:p>
+        </w:tc>
+        <w:tc>
+          <w:tcPr>
+            <w:tcW w:type="dxa" w:w="1440"/>
+          </w:tcPr>
+          <w:p>
+            <w:r/>
+            <w:r>
+              <w:rPr>
+                <w:b/>
+              </w:rPr>
+              <w:t>trống</w:t>
+            </w:r>
+            <w:r>
+              <w:t xml:space="preserve"> (hàng của mình, không ai nợ)</w:t>
+            </w:r>
+          </w:p>
+        </w:tc>
+        <w:tc>
+          <w:tcPr>
+            <w:tcW w:type="dxa" w:w="1440"/>
+          </w:tcPr>
+          <w:p>
+            <w:r/>
+            <w:r>
+              <w:t>giá vốn = số lượng × giá bình quân của kho lúc xuất, Kíp</w:t>
+            </w:r>
+          </w:p>
+        </w:tc>
+      </w:tr>
+      <w:tr>
+        <w:tc>
+          <w:tcPr>
+            <w:tcW w:type="dxa" w:w="1440"/>
+          </w:tcPr>
+          <w:p>
+            <w:r/>
+            <w:r>
+              <w:rPr>
+                <w:rFonts w:ascii="Consolas" w:hAnsi="Consolas"/>
+                <w:sz w:val="19"/>
+              </w:rPr>
+              <w:t>xuat_ban</w:t>
+            </w:r>
+          </w:p>
+        </w:tc>
+        <w:tc>
+          <w:tcPr>
+            <w:tcW w:type="dxa" w:w="1440"/>
+          </w:tcPr>
+          <w:p>
+            <w:r/>
+            <w:r>
+              <w:t xml:space="preserve">khoá phiếu </w:t>
+            </w:r>
+            <w:r>
+              <w:rPr>
+                <w:b/>
+              </w:rPr>
+              <w:t>xe thuê, EPL ứng</w:t>
+            </w:r>
+            <w:r>
+              <w:t xml:space="preserve"> có dầu / phụ tùng kho đã rời kho</w:t>
+            </w:r>
+          </w:p>
+        </w:tc>
+        <w:tc>
+          <w:tcPr>
+            <w:tcW w:type="dxa" w:w="1440"/>
+          </w:tcPr>
+          <w:p>
+            <w:r/>
+            <w:r>
+              <w:rPr>
+                <w:b/>
+              </w:rPr>
+              <w:t>Xuất bán cho chủ xe</w:t>
+            </w:r>
+            <w:r>
+              <w:t xml:space="preserve">, hai dòng cho mỗi dòng chi: Nợ 4022 / Có 707 theo </w:t>
+            </w:r>
+            <w:r>
+              <w:rPr>
+                <w:b/>
+              </w:rPr>
+              <w:t>giá bán</w:t>
+            </w:r>
+            <w:r>
+              <w:t xml:space="preserve"> + Nợ 607 / Có 1371 theo </w:t>
+            </w:r>
+            <w:r>
+              <w:rPr>
+                <w:b/>
+              </w:rPr>
+              <w:t>giá vốn</w:t>
+            </w:r>
+          </w:p>
+        </w:tc>
+        <w:tc>
+          <w:tcPr>
+            <w:tcW w:type="dxa" w:w="1440"/>
+          </w:tcPr>
+          <w:p>
+            <w:r/>
+            <w:r>
+              <w:t>như trên</w:t>
+            </w:r>
+          </w:p>
+        </w:tc>
+        <w:tc>
+          <w:tcPr>
+            <w:tcW w:type="dxa" w:w="1440"/>
+          </w:tcPr>
+          <w:p>
+            <w:r/>
+            <w:r>
+              <w:t xml:space="preserve">dòng 4022/707: chủ xe </w:t>
+            </w:r>
+            <w:r>
+              <w:rPr>
+                <w:rFonts w:ascii="Consolas" w:hAnsi="Consolas"/>
+                <w:sz w:val="19"/>
+              </w:rPr>
+              <w:t>EPLCX-…</w:t>
+            </w:r>
+            <w:r>
+              <w:t>; dòng 607/1371: trống</w:t>
+            </w:r>
+          </w:p>
+        </w:tc>
+        <w:tc>
+          <w:tcPr>
+            <w:tcW w:type="dxa" w:w="1440"/>
+          </w:tcPr>
+          <w:p>
+            <w:r/>
+            <w:r>
+              <w:t>giá bán = số trừ vào tiền trả chủ xe; giá vốn như trên; Kíp</w:t>
+            </w:r>
+          </w:p>
+        </w:tc>
+      </w:tr>
     </w:tbl>
     <w:p/>
     <w:p>
@@ -35701,6 +36129,245 @@
         <w:rPr>
           <w:b/>
         </w:rPr>
+        <w:t>Xuất kho cho chuyến</w:t>
+      </w:r>
+      <w:r>
+        <w:t xml:space="preserve"> (</w:t>
+      </w:r>
+      <w:r>
+        <w:rPr>
+          <w:rFonts w:ascii="Consolas" w:hAnsi="Consolas"/>
+          <w:sz w:val="19"/>
+        </w:rPr>
+        <w:t>xuat_noi_bo</w:t>
+      </w:r>
+      <w:r>
+        <w:t xml:space="preserve">, </w:t>
+      </w:r>
+      <w:r>
+        <w:rPr>
+          <w:rFonts w:ascii="Consolas" w:hAnsi="Consolas"/>
+          <w:sz w:val="19"/>
+        </w:rPr>
+        <w:t>xuat_ban</w:t>
+      </w:r>
+      <w:r>
+        <w:t xml:space="preserve"> — chủ dự án 01/10: "xuất dầu là xuất nội bộ và còn là xuất bán"):</w:t>
+      </w:r>
+    </w:p>
+    <w:p>
+      <w:pPr>
+        <w:pStyle w:val="ListBullet"/>
+      </w:pPr>
+      <w:r>
+        <w:t xml:space="preserve">Chỉ dòng </w:t>
+      </w:r>
+      <w:r>
+        <w:rPr>
+          <w:b/>
+        </w:rPr>
+        <w:t>đã rời kho</w:t>
+      </w:r>
+      <w:r>
+        <w:t>: dầu kho thủ kho đã cấp theo phiếu đề nghị (lần cấp ở kho tạm), phụ tùng kho đã xuất lúc khai sự cố. Dòng kho còn trên phiếu mà chưa xuất thì chưa có bút toán.</w:t>
+      </w:r>
+    </w:p>
+    <w:p>
+      <w:pPr>
+        <w:pStyle w:val="ListBullet"/>
+      </w:pPr>
+      <w:r>
+        <w:rPr>
+          <w:b/>
+        </w:rPr>
+        <w:t>Xe thuê, chủ xe tự trả</w:t>
+      </w:r>
+      <w:r>
+        <w:t xml:space="preserve"> (</w:t>
+      </w:r>
+      <w:r>
+        <w:rPr>
+          <w:rFonts w:ascii="Consolas" w:hAnsi="Consolas"/>
+          <w:sz w:val="19"/>
+        </w:rPr>
+        <w:t>paid_by_epl = false</w:t>
+      </w:r>
+      <w:r>
+        <w:t>): không có bút toán, kể cả khi phụ tùng đã rời kho.</w:t>
+      </w:r>
+    </w:p>
+    <w:p>
+      <w:pPr>
+        <w:pStyle w:val="ListBullet"/>
+      </w:pPr>
+      <w:r>
+        <w:rPr>
+          <w:b/>
+        </w:rPr>
+        <w:t>Giá vốn</w:t>
+      </w:r>
+      <w:r>
+        <w:t xml:space="preserve">: giá bình quân của đúng kho </w:t>
+      </w:r>
+      <w:r>
+        <w:rPr>
+          <w:b/>
+        </w:rPr>
+        <w:t>lúc xuất</w:t>
+      </w:r>
+      <w:r>
+        <w:t>, do kho tạm tính (anh Khampla C5.3) và trả về lúc cấp dầu / xuất phụ tùng; trang điều xe ghi lên dòng chi (</w:t>
+      </w:r>
+      <w:r>
+        <w:rPr>
+          <w:rFonts w:ascii="Consolas" w:hAnsi="Consolas"/>
+          <w:sz w:val="19"/>
+        </w:rPr>
+        <w:t>unit_price</w:t>
+      </w:r>
+      <w:r>
+        <w:t xml:space="preserve">), sau đó không sửa được. </w:t>
+      </w:r>
+      <w:r>
+        <w:rPr>
+          <w:b/>
+        </w:rPr>
+        <w:t>Giá bán</w:t>
+      </w:r>
+      <w:r>
+        <w:t>: KT kho xăng dầu gõ ở mục III, KT Chi phí gõ ở mục V; chưa gõ thì tiền trừ chủ xe tạm theo giá vốn và dòng 4022/707 ghi đúng số đó, kèm chữ "chưa có giá bán".</w:t>
+      </w:r>
+    </w:p>
+    <w:p>
+      <w:pPr>
+        <w:pStyle w:val="ListBullet"/>
+      </w:pPr>
+      <w:r>
+        <w:rPr>
+          <w:b/>
+        </w:rPr>
+        <w:t>Ghi lúc khoá phiếu</w:t>
+      </w:r>
+      <w:r>
+        <w:t xml:space="preserve">, không lúc xuất: giá bán chỉ có sau khi kiểm mục (sau lúc xuất), còn tiền trả chủ xe tính từ phiếu đã khoá — ghi lúc khoá thì Có 707 đúng bằng số trừ vào tiền trả. Mở khoá / xoá phiếu thì huỷ hoặc gỡ cùng </w:t>
+      </w:r>
+      <w:r>
+        <w:rPr>
+          <w:rFonts w:ascii="Consolas" w:hAnsi="Consolas"/>
+          <w:sz w:val="19"/>
+        </w:rPr>
+        <w:t>thue_xe</w:t>
+      </w:r>
+      <w:r>
+        <w:t xml:space="preserve">, </w:t>
+      </w:r>
+      <w:r>
+        <w:rPr>
+          <w:rFonts w:ascii="Consolas" w:hAnsi="Consolas"/>
+          <w:sz w:val="19"/>
+        </w:rPr>
+        <w:t>no_ncc</w:t>
+      </w:r>
+      <w:r>
+        <w:t>.</w:t>
+      </w:r>
+    </w:p>
+    <w:p>
+      <w:pPr>
+        <w:pStyle w:val="ListBullet"/>
+      </w:pPr>
+      <w:r>
+        <w:rPr>
+          <w:b/>
+        </w:rPr>
+        <w:t>Không trùng `ban_chu_xe`</w:t>
+      </w:r>
+      <w:r>
+        <w:t xml:space="preserve">: </w:t>
+      </w:r>
+      <w:r>
+        <w:rPr>
+          <w:rFonts w:ascii="Consolas" w:hAnsi="Consolas"/>
+          <w:sz w:val="19"/>
+        </w:rPr>
+        <w:t>ban_chu_xe</w:t>
+      </w:r>
+      <w:r>
+        <w:t xml:space="preserve"> là phiếu </w:t>
+      </w:r>
+      <w:r>
+        <w:rPr>
+          <w:b/>
+        </w:rPr>
+        <w:t>bán ở quầy</w:t>
+      </w:r>
+      <w:r>
+        <w:t xml:space="preserve"> của kho tạm, trừ riêng vào đề nghị trả (12.11.3); </w:t>
+      </w:r>
+      <w:r>
+        <w:rPr>
+          <w:rFonts w:ascii="Consolas" w:hAnsi="Consolas"/>
+          <w:sz w:val="19"/>
+        </w:rPr>
+        <w:t>xuat_ban</w:t>
+      </w:r>
+      <w:r>
+        <w:t xml:space="preserve"> là dòng kho </w:t>
+      </w:r>
+      <w:r>
+        <w:rPr>
+          <w:b/>
+        </w:rPr>
+        <w:t>trên phiếu xuất xe</w:t>
+      </w:r>
+      <w:r>
+        <w:t>, trừ qua "EPL đã ứng". Hai nguồn không bao giờ chung một khoản.</w:t>
+      </w:r>
+    </w:p>
+    <w:p>
+      <w:pPr>
+        <w:pStyle w:val="ListBullet"/>
+      </w:pPr>
+      <w:r>
+        <w:t xml:space="preserve">Dòng kho mang mã người dùng tự chọn có vế Có 4021 thì đã nằm trong </w:t>
+      </w:r>
+      <w:r>
+        <w:rPr>
+          <w:rFonts w:ascii="Consolas" w:hAnsi="Consolas"/>
+          <w:sz w:val="19"/>
+        </w:rPr>
+        <w:t>no_ncc</w:t>
+      </w:r>
+      <w:r>
+        <w:t xml:space="preserve"> — không lặp ở đây.</w:t>
+      </w:r>
+    </w:p>
+    <w:p>
+      <w:pPr>
+        <w:pStyle w:val="ListBullet"/>
+      </w:pPr>
+      <w:r>
+        <w:t>Ghi chú dòng (</w:t>
+      </w:r>
+      <w:r>
+        <w:rPr>
+          <w:rFonts w:ascii="Consolas" w:hAnsi="Consolas"/>
+          <w:sz w:val="19"/>
+        </w:rPr>
+        <w:t>Note</w:t>
+      </w:r>
+      <w:r>
+        <w:t>) và diễn giải ghi rõ bằng chữ "Xuất nội bộ" / "Xuất bán cho chủ xe — doanh thu / giá vốn", số lượng, đơn giá, số DO, số phiếu đề nghị xuất kho.</w:t>
+      </w:r>
+    </w:p>
+    <w:p>
+      <w:pPr>
+        <w:jc w:val="both"/>
+      </w:pPr>
+      <w:r>
+        <w:rPr>
+          <w:b/>
+        </w:rPr>
         <w:t>SourceRef</w:t>
       </w:r>
       <w:r>
@@ -35761,6 +36428,16 @@
           <w:sz w:val="19"/>
         </w:rPr>
         <w:t>EPLLAO-thue_xe-662386527e56-2</w:t>
+      </w:r>
+      <w:r>
+        <w:t xml:space="preserve">; xuất kho </w:t>
+      </w:r>
+      <w:r>
+        <w:rPr>
+          <w:rFonts w:ascii="Consolas" w:hAnsi="Consolas"/>
+          <w:sz w:val="19"/>
+        </w:rPr>
+        <w:t>EPLLAO-xuat_ban-dau:f90d299c071e</w:t>
       </w:r>
       <w:r>
         <w:t>. Đúng luật khoá bên anh (</w:t>
@@ -36138,7 +36815,16 @@
         <w:t>DocumentDate</w:t>
       </w:r>
       <w:r>
-        <w:t>: khoá phiếu → ngày khoá; tất toán → ngày cuối kỳ (kỳ chưa hết thì hôm nay); bán chủ xe → ngày bán.</w:t>
+        <w:t xml:space="preserve">: khoá phiếu → ngày khoá; </w:t>
+      </w:r>
+      <w:r>
+        <w:rPr>
+          <w:b/>
+        </w:rPr>
+        <w:t>xuất kho cho chuyến → ngày xuất thật</w:t>
+      </w:r>
+      <w:r>
+        <w:t xml:space="preserve"> (ngày cấp dầu / ngày lấy phụ tùng; dòng cũ không tìm được thì ngày xe đi); tất toán → ngày cuối kỳ (kỳ chưa hết thì hôm nay); bán chủ xe → ngày bán.</w:t>
       </w:r>
     </w:p>
     <w:p>
@@ -37388,6 +38074,112 @@
       </w:r>
       <w:r>
         <w:t xml:space="preserve"> chưa có nguồn (câu hỏi 10.10).</w:t>
+      </w:r>
+    </w:p>
+    <w:p>
+      <w:pPr>
+        <w:pStyle w:val="ListBullet"/>
+      </w:pPr>
+      <w:r>
+        <w:rPr>
+          <w:b/>
+        </w:rPr>
+        <w:t>Xuất kho cho chuyến</w:t>
+      </w:r>
+      <w:r>
+        <w:t xml:space="preserve"> (</w:t>
+      </w:r>
+      <w:r>
+        <w:rPr>
+          <w:rFonts w:ascii="Consolas" w:hAnsi="Consolas"/>
+          <w:sz w:val="19"/>
+        </w:rPr>
+        <w:t>xuat_noi_bo</w:t>
+      </w:r>
+      <w:r>
+        <w:t xml:space="preserve">, </w:t>
+      </w:r>
+      <w:r>
+        <w:rPr>
+          <w:rFonts w:ascii="Consolas" w:hAnsi="Consolas"/>
+          <w:sz w:val="19"/>
+        </w:rPr>
+        <w:t>xuat_ban</w:t>
+      </w:r>
+      <w:r>
+        <w:t xml:space="preserve">): tờ kho </w:t>
+      </w:r>
+      <w:r>
+        <w:rPr>
+          <w:rFonts w:ascii="Consolas" w:hAnsi="Consolas"/>
+          <w:sz w:val="19"/>
+        </w:rPr>
+        <w:t>PXK_NL</w:t>
+      </w:r>
+      <w:r>
+        <w:t xml:space="preserve"> / </w:t>
+      </w:r>
+      <w:r>
+        <w:rPr>
+          <w:rFonts w:ascii="Consolas" w:hAnsi="Consolas"/>
+          <w:sz w:val="19"/>
+        </w:rPr>
+        <w:t>PXK_PT</w:t>
+      </w:r>
+      <w:r>
+        <w:t xml:space="preserve"> ở kho tạm (sau là hệ anh Toàn) cũng mang định khoản (xe thuê ghi 4022/1371 theo giá vốn — luật cũ). Hiện tờ đó </w:t>
+      </w:r>
+      <w:r>
+        <w:rPr>
+          <w:b/>
+        </w:rPr>
+        <w:t>không</w:t>
+      </w:r>
+      <w:r>
+        <w:t xml:space="preserve"> sang sổ anh; nếu sau này có đường đưa tờ kho vào sổ anh (câu hỏi 10.11) thì vế Có 1371 phải ghi ở </w:t>
+      </w:r>
+      <w:r>
+        <w:rPr>
+          <w:b/>
+        </w:rPr>
+        <w:t>một</w:t>
+      </w:r>
+      <w:r>
+        <w:t xml:space="preserve"> nơi — chờ anh Khampla / chủ dự án chọn.</w:t>
+      </w:r>
+    </w:p>
+    <w:p>
+      <w:pPr>
+        <w:pStyle w:val="ListBullet"/>
+      </w:pPr>
+      <w:r>
+        <w:t xml:space="preserve">Cấp dầu </w:t>
+      </w:r>
+      <w:r>
+        <w:rPr>
+          <w:b/>
+        </w:rPr>
+        <w:t>lệch số duyệt</w:t>
+      </w:r>
+      <w:r>
+        <w:t xml:space="preserve"> khi một tờ đề nghị gồm </w:t>
+      </w:r>
+      <w:r>
+        <w:rPr>
+          <w:b/>
+        </w:rPr>
+        <w:t>nhiều dòng</w:t>
+      </w:r>
+      <w:r>
+        <w:t xml:space="preserve"> cùng kho: dòng trên phiếu giữ số lít cũ (chỉ phiếu một dòng mới ghi theo số cấp thật), nên bút toán theo số lít trên phiếu — đúng số trừ chủ xe, có thể lệch số lít kho tạm đã xuất.</w:t>
+      </w:r>
+    </w:p>
+    <w:p>
+      <w:pPr>
+        <w:pStyle w:val="ListBullet"/>
+      </w:pPr>
+      <w:r>
+        <w:t>Phụ tùng kho khai với "chủ xe tự trả" vẫn rời kho nhưng không có bút toán (theo bảng chốt 01/10) — giá vốn phần đó chưa ghi ở đâu; cần chủ dự án xác nhận.</w:t>
       </w:r>
     </w:p>
     <w:sectPr>

</xml_diff>

<commit_message>
Xuất kho cho xe thuê luôn là xuất bán; chặn khoá khi thiếu giá bán; sau khoá không sửa được số làm lệch bút toán (chủ dự án chốt 02/10)
- Dòng lấy kho EPL của xe thuê không được "chủ xe tự trả": 422 KHO_XE_THUE_XUAT_BAN ở lập / sửa phiếu, gõ giá, tổ sửa lấy phụ tùng kho
  (kho không bị trừ); dòng cũ còn "tự trả" thì chặn khoá kèm cách sửa
- Khoá phiếu: 409 THIEU_GIA_BAN khi dòng xuất bán (mục III / V) chưa có giá bán — câu nói mục, dòng, ai gõ
- Sau khoá: mọi thay đổi làm lệch dòng kho, ghi nợ NCC hay bút toán xuất kho → 409 DA_KHOA (kể cả Sếp); lưu lại đúng số cũ được
- Câu lỗi máy chủ gửi loi / loi_lo / loi_en, chung.js hiện theo tiếng đang xem
- Tài liệu bàn giao: bút toán đã chạy thật trên DB demo 02/10 (GL021020263…267), @Apply audit mặc định 0, LaoAccountsWrite, hai nguồn xuất kho

Co-Authored-By: Claude Opus 5.5 (1M context) <noreply@anthropic.com>
</commit_message>
<xml_diff>
--- a/DOCS/word/HOP_DONG_API_KE_TOAN_ANH_TUNE.docx
+++ b/DOCS/word/HOP_DONG_API_KE_TOAN_ANH_TUNE.docx
@@ -196,10 +196,50 @@
         <w:rPr>
           <w:b/>
         </w:rPr>
-        <w:t>chưa chạy trên DB</w:t>
-      </w:r>
-      <w:r>
-        <w:t>: chờ áp script (mục 8, 12.12.4).</w:t>
+        <w:t>đã chạy thật trên DB demo 02/10</w:t>
+      </w:r>
+      <w:r>
+        <w:t xml:space="preserve"> (chủ dự án áp script; phiếu thử qua máy thử trang điều xe: thuê xe </w:t>
+      </w:r>
+      <w:r>
+        <w:rPr>
+          <w:rFonts w:ascii="Consolas" w:hAnsi="Consolas"/>
+          <w:sz w:val="19"/>
+        </w:rPr>
+        <w:t>GL021020263</w:t>
+      </w:r>
+      <w:r>
+        <w:t xml:space="preserve"> / </w:t>
+      </w:r>
+      <w:r>
+        <w:rPr>
+          <w:rFonts w:ascii="Consolas" w:hAnsi="Consolas"/>
+          <w:sz w:val="19"/>
+        </w:rPr>
+        <w:t>GL021020264</w:t>
+      </w:r>
+      <w:r>
+        <w:t xml:space="preserve">, xuất kho </w:t>
+      </w:r>
+      <w:r>
+        <w:rPr>
+          <w:rFonts w:ascii="Consolas" w:hAnsi="Consolas"/>
+          <w:sz w:val="19"/>
+        </w:rPr>
+        <w:t>GL021020265</w:t>
+      </w:r>
+      <w:r>
+        <w:t xml:space="preserve"> · </w:t>
+      </w:r>
+      <w:r>
+        <w:rPr>
+          <w:rFonts w:ascii="Consolas" w:hAnsi="Consolas"/>
+          <w:sz w:val="19"/>
+        </w:rPr>
+        <w:t>GL021020267</w:t>
+      </w:r>
+      <w:r>
+        <w:t>, ST 13; mở khoá gỡ sạch, GET 404); host chưa áp (mục 8, 12.12.4).</w:t>
       </w:r>
     </w:p>
     <w:p>
@@ -1089,7 +1129,7 @@
               <w:t>b9227aa</w:t>
             </w:r>
             <w:r>
-              <w:t>), chờ áp script DB rồi bật cờ</w:t>
+              <w:t>), script đã áp DB demo và chạy thật 02/10; host: áp script rồi bật cờ</w:t>
             </w:r>
           </w:p>
         </w:tc>
@@ -13766,10 +13806,50 @@
         <w:rPr>
           <w:b/>
         </w:rPr>
-        <w:t>chưa chạy trên DB</w:t>
-      </w:r>
-      <w:r>
-        <w:t xml:space="preserve"> (chờ áp script). Cờ gửi </w:t>
+        <w:t>đã chạy thật trên DB demo 02/10</w:t>
+      </w:r>
+      <w:r>
+        <w:t xml:space="preserve"> (chủ dự án áp script; phiếu thử qua máy thử trang điều xe: thuê xe </w:t>
+      </w:r>
+      <w:r>
+        <w:rPr>
+          <w:rFonts w:ascii="Consolas" w:hAnsi="Consolas"/>
+          <w:sz w:val="19"/>
+        </w:rPr>
+        <w:t>GL021020263</w:t>
+      </w:r>
+      <w:r>
+        <w:t xml:space="preserve"> / </w:t>
+      </w:r>
+      <w:r>
+        <w:rPr>
+          <w:rFonts w:ascii="Consolas" w:hAnsi="Consolas"/>
+          <w:sz w:val="19"/>
+        </w:rPr>
+        <w:t>GL021020264</w:t>
+      </w:r>
+      <w:r>
+        <w:t xml:space="preserve">, xuất kho </w:t>
+      </w:r>
+      <w:r>
+        <w:rPr>
+          <w:rFonts w:ascii="Consolas" w:hAnsi="Consolas"/>
+          <w:sz w:val="19"/>
+        </w:rPr>
+        <w:t>GL021020265</w:t>
+      </w:r>
+      <w:r>
+        <w:t xml:space="preserve"> · </w:t>
+      </w:r>
+      <w:r>
+        <w:rPr>
+          <w:rFonts w:ascii="Consolas" w:hAnsi="Consolas"/>
+          <w:sz w:val="19"/>
+        </w:rPr>
+        <w:t>GL021020267</w:t>
+      </w:r>
+      <w:r>
+        <w:t xml:space="preserve">, ST 13; mở khoá gỡ sạch, GET 404); host chưa áp. Cờ gửi </w:t>
       </w:r>
       <w:r>
         <w:rPr>
@@ -13779,7 +13859,7 @@
         <w:t>QLSX_GUI_BUT_TOAN</w:t>
       </w:r>
       <w:r>
-        <w:t xml:space="preserve"> đang tắt: các bản nằm "chờ gửi", không mất khoản nào.</w:t>
+        <w:t xml:space="preserve"> chỉ bật trên máy thử lúc chạy lượt thật; máy chưa bật thì các bản nằm "chờ gửi", không mất khoản nào.</w:t>
       </w:r>
     </w:p>
     <w:p>
@@ -14086,7 +14166,7 @@
         <w:t>xuat_noi_bo</w:t>
       </w:r>
       <w:r>
-        <w:t xml:space="preserve"> (625 · 614 / 1371 theo giá vốn), xe thuê EPL ứng </w:t>
+        <w:t xml:space="preserve"> (625 · 614 / 1371 theo giá vốn), xe thuê </w:t>
       </w:r>
       <w:r>
         <w:rPr>
@@ -14096,7 +14176,7 @@
         <w:t>xuat_ban</w:t>
       </w:r>
       <w:r>
-        <w:t xml:space="preserve"> (4022/707 theo giá bán + 607/1371 theo giá vốn), xe thuê chủ xe tự trả không có (12.12.4).</w:t>
+        <w:t xml:space="preserve"> (4022/707 theo giá bán + 607/1371 theo giá vốn) — lấy kho EPL cho xe thuê luôn là xuất bán, không có "chủ xe tự trả"; thiếu giá bán thì không khoá được (12.12.4).</w:t>
       </w:r>
     </w:p>
     <w:p>
@@ -14989,10 +15069,50 @@
               <w:rPr>
                 <w:b/>
               </w:rPr>
-              <w:t>chưa chạy trên DB</w:t>
-            </w:r>
-            <w:r>
-              <w:t xml:space="preserve">: script chưa áp DB demo (chủ dự án tự chạy); DB host </w:t>
+              <w:t>đã chạy thật trên DB demo 02/10</w:t>
+            </w:r>
+            <w:r>
+              <w:t xml:space="preserve"> (chủ dự án áp script; phiếu thử qua máy thử trang điều xe: thuê xe </w:t>
+            </w:r>
+            <w:r>
+              <w:rPr>
+                <w:rFonts w:ascii="Consolas" w:hAnsi="Consolas"/>
+                <w:sz w:val="19"/>
+              </w:rPr>
+              <w:t>GL021020263</w:t>
+            </w:r>
+            <w:r>
+              <w:t xml:space="preserve"> / </w:t>
+            </w:r>
+            <w:r>
+              <w:rPr>
+                <w:rFonts w:ascii="Consolas" w:hAnsi="Consolas"/>
+                <w:sz w:val="19"/>
+              </w:rPr>
+              <w:t>GL021020264</w:t>
+            </w:r>
+            <w:r>
+              <w:t xml:space="preserve">, xuất kho </w:t>
+            </w:r>
+            <w:r>
+              <w:rPr>
+                <w:rFonts w:ascii="Consolas" w:hAnsi="Consolas"/>
+                <w:sz w:val="19"/>
+              </w:rPr>
+              <w:t>GL021020265</w:t>
+            </w:r>
+            <w:r>
+              <w:t xml:space="preserve"> · </w:t>
+            </w:r>
+            <w:r>
+              <w:rPr>
+                <w:rFonts w:ascii="Consolas" w:hAnsi="Consolas"/>
+                <w:sz w:val="19"/>
+              </w:rPr>
+              <w:t>GL021020267</w:t>
+            </w:r>
+            <w:r>
+              <w:t xml:space="preserve">, ST 13; mở khoá gỡ sạch, GET 404); DB host </w:t>
             </w:r>
             <w:r>
               <w:rPr>
@@ -15889,7 +16009,7 @@
         <w:t>b9227aa</w:t>
       </w:r>
       <w:r>
-        <w:t xml:space="preserve">, 12.12.4), chờ áp script. Còn lại cách ghi </w:t>
+        <w:t xml:space="preserve">, 12.12.4), đã chạy thật trên DB demo 02/10 (cả xuất kho cho chuyến). Còn lại cách ghi </w:t>
       </w:r>
       <w:r>
         <w:rPr>
@@ -18150,10 +18270,10 @@
               <w:rPr>
                 <w:b/>
               </w:rPr>
-              <w:t>chưa chạy trên DB</w:t>
-            </w:r>
-            <w:r>
-              <w:t xml:space="preserve"> — chờ áp script (12.12.4)</w:t>
+              <w:t>chạy thật trên DB demo 02/10</w:t>
+            </w:r>
+            <w:r>
+              <w:t>, host chưa áp (12.12.4)</w:t>
             </w:r>
           </w:p>
         </w:tc>
@@ -27498,7 +27618,17 @@
               <w:t>20261001_audit_redact_secrets.sql</w:t>
             </w:r>
             <w:r>
-              <w:t xml:space="preserve">: che mật khẩu / token / khoá trong dòng audit cũ (UPDATE dữ liệu; trong tệp </w:t>
+              <w:t xml:space="preserve">: che mật khẩu / token / khoá trong dòng audit cũ (UPDATE dữ liệu; từ </w:t>
+            </w:r>
+            <w:r>
+              <w:rPr>
+                <w:rFonts w:ascii="Consolas" w:hAnsi="Consolas"/>
+                <w:sz w:val="19"/>
+              </w:rPr>
+              <w:t>2b4e274</w:t>
+            </w:r>
+            <w:r>
+              <w:t xml:space="preserve"> trong tệp </w:t>
             </w:r>
             <w:r>
               <w:rPr>
@@ -27508,7 +27638,16 @@
               <w:t>@Apply</w:t>
             </w:r>
             <w:r>
-              <w:t xml:space="preserve"> mặc định 1, đặt 0 để chỉ xem) — chạy lúc triển khai</w:t>
+              <w:t xml:space="preserve"> mặc định </w:t>
+            </w:r>
+            <w:r>
+              <w:rPr>
+                <w:b/>
+              </w:rPr>
+              <w:t>0</w:t>
+            </w:r>
+            <w:r>
+              <w:t xml:space="preserve"> — chỉ chẩn đoán; lưu kết quả chẩn đoán rồi sửa thành 1 để che) — chạy lúc triển khai</w:t>
             </w:r>
           </w:p>
         </w:tc>
@@ -27688,7 +27827,7 @@
               <w:t>20261001_logistics_journal_entry.sql</w:t>
             </w:r>
             <w:r>
-              <w:t xml:space="preserve"> (chưa áp) — 12.12.4</w:t>
+              <w:t xml:space="preserve"> (đã áp DB demo 02/10; host chưa) — 12.12.4</w:t>
             </w:r>
           </w:p>
         </w:tc>
@@ -32591,10 +32730,10 @@
               <w:rPr>
                 <w:b/>
               </w:rPr>
-              <w:t>chưa chạy trên DB</w:t>
-            </w:r>
-            <w:r>
-              <w:t xml:space="preserve">: chờ áp script </w:t>
+              <w:t>đã chạy thật trên DB demo 02/10</w:t>
+            </w:r>
+            <w:r>
+              <w:t xml:space="preserve"> (script </w:t>
             </w:r>
             <w:r>
               <w:rPr>
@@ -32604,7 +32743,17 @@
               <w:t>20261001_logistics_journal_entry.sql</w:t>
             </w:r>
             <w:r>
-              <w:t xml:space="preserve"> (12.12.4)</w:t>
+              <w:t xml:space="preserve"> đã áp; chứng từ thử </w:t>
+            </w:r>
+            <w:r>
+              <w:rPr>
+                <w:rFonts w:ascii="Consolas" w:hAnsi="Consolas"/>
+                <w:sz w:val="19"/>
+              </w:rPr>
+              <w:t>GL0210202xx</w:t>
+            </w:r>
+            <w:r>
+              <w:t>, gỡ sạch — 12.12.4)</w:t>
             </w:r>
           </w:p>
         </w:tc>
@@ -32615,25 +32764,16 @@
           <w:p>
             <w:r/>
             <w:r>
-              <w:t xml:space="preserve">áp script DB demo: </w:t>
+              <w:t xml:space="preserve">host: </w:t>
             </w:r>
             <w:r>
               <w:rPr>
                 <w:b/>
               </w:rPr>
-              <w:t>chủ dự án</w:t>
-            </w:r>
-            <w:r>
-              <w:t xml:space="preserve">; host: </w:t>
-            </w:r>
-            <w:r>
-              <w:rPr>
-                <w:b/>
-              </w:rPr>
               <w:t>cần quyền host</w:t>
             </w:r>
             <w:r>
-              <w:t>; bật cờ + gọi thử: bên EPL</w:t>
+              <w:t>; bật cờ ở máy dùng thật: chủ dự án quyết</w:t>
             </w:r>
           </w:p>
         </w:tc>
@@ -35045,7 +35185,7 @@
         <w:rPr>
           <w:b/>
         </w:rPr>
-        <w:t>Trạng thái 01/10:</w:t>
+        <w:t>Trạng thái 02/10:</w:t>
       </w:r>
     </w:p>
     <w:p>
@@ -35123,19 +35263,96 @@
         <w:rPr>
           <w:b/>
         </w:rPr>
-        <w:t>chưa áp</w:t>
-      </w:r>
-      <w:r>
-        <w:t xml:space="preserve"> vào DB demo: lệnh áp từ máy bên em bị bộ an toàn chặn, </w:t>
+        <w:t>đã áp</w:t>
+      </w:r>
+      <w:r>
+        <w:t xml:space="preserve"> vào DB demo (chủ dự án chạy, 02/10). </w:t>
       </w:r>
       <w:r>
         <w:rPr>
           <w:b/>
         </w:rPr>
-        <w:t>chờ chủ dự án tự chạy</w:t>
-      </w:r>
-      <w:r>
-        <w:t>. Chưa có chứng từ nào ghi thật.</w:t>
+        <w:t>Đã chạy thật</w:t>
+      </w:r>
+      <w:r>
+        <w:t xml:space="preserve"> qua máy thử trang điều xe với phiếu thử: thuê xe </w:t>
+      </w:r>
+      <w:r>
+        <w:rPr>
+          <w:rFonts w:ascii="Consolas" w:hAnsi="Consolas"/>
+          <w:sz w:val="19"/>
+        </w:rPr>
+        <w:t>GL021020263</w:t>
+      </w:r>
+      <w:r>
+        <w:t xml:space="preserve"> / </w:t>
+      </w:r>
+      <w:r>
+        <w:rPr>
+          <w:rFonts w:ascii="Consolas" w:hAnsi="Consolas"/>
+          <w:sz w:val="19"/>
+        </w:rPr>
+        <w:t>GL021020264</w:t>
+      </w:r>
+      <w:r>
+        <w:t xml:space="preserve">; xuất kho — xe nhà </w:t>
+      </w:r>
+      <w:r>
+        <w:rPr>
+          <w:rFonts w:ascii="Consolas" w:hAnsi="Consolas"/>
+          <w:sz w:val="19"/>
+        </w:rPr>
+        <w:t>GL021020265</w:t>
+      </w:r>
+      <w:r>
+        <w:t xml:space="preserve"> </w:t>
+      </w:r>
+      <w:r>
+        <w:rPr>
+          <w:i/>
+        </w:rPr>
+        <w:t>Nợ 625 / Có 1371</w:t>
+      </w:r>
+      <w:r>
+        <w:t xml:space="preserve"> 1.590.000 LAK, xe thuê </w:t>
+      </w:r>
+      <w:r>
+        <w:rPr>
+          <w:rFonts w:ascii="Consolas" w:hAnsi="Consolas"/>
+          <w:sz w:val="19"/>
+        </w:rPr>
+        <w:t>GL021020267</w:t>
+      </w:r>
+      <w:r>
+        <w:t xml:space="preserve"> </w:t>
+      </w:r>
+      <w:r>
+        <w:rPr>
+          <w:i/>
+        </w:rPr>
+        <w:t>Nợ 4022 / Có 707</w:t>
+      </w:r>
+      <w:r>
+        <w:t xml:space="preserve"> 1.400.000 LAK (ObjectId chủ xe 1606) + </w:t>
+      </w:r>
+      <w:r>
+        <w:rPr>
+          <w:i/>
+        </w:rPr>
+        <w:t>Nợ 607 / Có 1371</w:t>
+      </w:r>
+      <w:r>
+        <w:t xml:space="preserve"> 1.272.000 LAK; ST 13. Mở khoá → gỡ sạch, GET trả 404 </w:t>
+      </w:r>
+      <w:r>
+        <w:rPr>
+          <w:rFonts w:ascii="Consolas" w:hAnsi="Consolas"/>
+          <w:sz w:val="19"/>
+        </w:rPr>
+        <w:t>JOURNAL_ENTRY_NOT_FOUND</w:t>
+      </w:r>
+      <w:r>
+        <w:t>; không còn chứng từ thử nào trên DB demo.</w:t>
       </w:r>
     </w:p>
     <w:p>
@@ -35202,17 +35419,7 @@
         <w:t>CountryId</w:t>
       </w:r>
       <w:r>
-        <w:t xml:space="preserve"> 11). GET bút toán đang trả 503 </w:t>
-      </w:r>
-      <w:r>
-        <w:rPr>
-          <w:rFonts w:ascii="Consolas" w:hAnsi="Consolas"/>
-          <w:sz w:val="19"/>
-        </w:rPr>
-        <w:t>LOGISTICS_JOURNAL_SCRIPT_REQUIRED</w:t>
-      </w:r>
-      <w:r>
-        <w:t xml:space="preserve"> — đúng, vì chưa áp script.</w:t>
+        <w:t xml:space="preserve"> 11).</w:t>
       </w:r>
     </w:p>
     <w:p>
@@ -35276,16 +35483,7 @@
         <w:t>QLSX_GUI_BUT_TOAN</w:t>
       </w:r>
       <w:r>
-        <w:t xml:space="preserve"> </w:t>
-      </w:r>
-      <w:r>
-        <w:rPr>
-          <w:b/>
-        </w:rPr>
-        <w:t>tắt</w:t>
-      </w:r>
-      <w:r>
-        <w:t xml:space="preserve">. </w:t>
+        <w:t xml:space="preserve"> bật trên máy thử lúc chạy lượt thật; máy dùng thật bật khi chủ dự án quyết. </w:t>
       </w:r>
       <w:r>
         <w:rPr>
@@ -35293,6 +35491,16 @@
           <w:sz w:val="19"/>
         </w:rPr>
         <w:t>kiem/thu_gui_but_toan.py</w:t>
+      </w:r>
+      <w:r>
+        <w:t xml:space="preserve">, </w:t>
+      </w:r>
+      <w:r>
+        <w:rPr>
+          <w:rFonts w:ascii="Consolas" w:hAnsi="Consolas"/>
+          <w:sz w:val="19"/>
+        </w:rPr>
+        <w:t>kiem/thu_but_toan_xuat_kho.py</w:t>
       </w:r>
       <w:r>
         <w:t xml:space="preserve"> chạy với máy giả theo đúng giao ước dưới đây (không gọi API thật).</w:t>
@@ -36036,10 +36244,19 @@
               <w:rPr>
                 <w:b/>
               </w:rPr>
-              <w:t>xe thuê, EPL ứng</w:t>
-            </w:r>
-            <w:r>
-              <w:t xml:space="preserve"> có dầu / phụ tùng kho đã rời kho</w:t>
+              <w:t>xe thuê</w:t>
+            </w:r>
+            <w:r>
+              <w:t xml:space="preserve"> có dầu / phụ tùng kho đã rời kho (lấy kho EPL cho xe thuê </w:t>
+            </w:r>
+            <w:r>
+              <w:rPr>
+                <w:b/>
+              </w:rPr>
+              <w:t>luôn</w:t>
+            </w:r>
+            <w:r>
+              <w:t xml:space="preserve"> là xuất bán)</w:t>
             </w:r>
           </w:p>
         </w:tc>
@@ -36180,10 +36397,10 @@
         <w:rPr>
           <w:b/>
         </w:rPr>
-        <w:t>Xe thuê, chủ xe tự trả</w:t>
-      </w:r>
-      <w:r>
-        <w:t xml:space="preserve"> (</w:t>
+        <w:t>Xe thuê: dầu / phụ tùng lấy kho EPL luôn là xuất bán</w:t>
+      </w:r>
+      <w:r>
+        <w:t xml:space="preserve"> (chủ dự án 30/09, nhắc lại 02/10) — không có "chủ xe tự trả" (</w:t>
       </w:r>
       <w:r>
         <w:rPr>
@@ -36193,7 +36410,55 @@
         <w:t>paid_by_epl = false</w:t>
       </w:r>
       <w:r>
-        <w:t>): không có bút toán, kể cả khi phụ tùng đã rời kho.</w:t>
+        <w:t xml:space="preserve">) cho dòng kho: lập / sửa dòng, lấy phụ tùng kho như vậy → 422 </w:t>
+      </w:r>
+      <w:r>
+        <w:rPr>
+          <w:rFonts w:ascii="Consolas" w:hAnsi="Consolas"/>
+          <w:sz w:val="19"/>
+        </w:rPr>
+        <w:t>KHO_XE_THUE_XUAT_BAN</w:t>
+      </w:r>
+      <w:r>
+        <w:t xml:space="preserve">. Chủ xe trả tiền ngay thì đi </w:t>
+      </w:r>
+      <w:r>
+        <w:rPr>
+          <w:b/>
+        </w:rPr>
+        <w:t>quầy bán hàng</w:t>
+      </w:r>
+      <w:r>
+        <w:t xml:space="preserve"> (phiếu bán kho tạm → </w:t>
+      </w:r>
+      <w:r>
+        <w:rPr>
+          <w:rFonts w:ascii="Consolas" w:hAnsi="Consolas"/>
+          <w:sz w:val="19"/>
+        </w:rPr>
+        <w:t>ban_chu_xe</w:t>
+      </w:r>
+      <w:r>
+        <w:t xml:space="preserve">). Dòng cũ còn ghi "chủ xe tự trả": </w:t>
+      </w:r>
+      <w:r>
+        <w:rPr>
+          <w:b/>
+        </w:rPr>
+        <w:t>khoá phiếu bị chặn</w:t>
+      </w:r>
+      <w:r>
+        <w:t xml:space="preserve"> (409 </w:t>
+      </w:r>
+      <w:r>
+        <w:rPr>
+          <w:rFonts w:ascii="Consolas" w:hAnsi="Consolas"/>
+          <w:sz w:val="19"/>
+        </w:rPr>
+        <w:t>KHO_XE_THUE_XUAT_BAN</w:t>
+      </w:r>
+      <w:r>
+        <w:t>, câu chỉ cách sửa: bấm "EPL ứng", gõ giá bán) — không tự đổi, vì đổi là đổi số trừ tiền trả chủ xe mà không ai bấm.</w:t>
       </w:r>
     </w:p>
     <w:p>
@@ -36235,7 +36500,26 @@
         <w:t>Giá bán</w:t>
       </w:r>
       <w:r>
-        <w:t>: KT kho xăng dầu gõ ở mục III, KT Chi phí gõ ở mục V; chưa gõ thì tiền trừ chủ xe tạm theo giá vốn và dòng 4022/707 ghi đúng số đó, kèm chữ "chưa có giá bán".</w:t>
+        <w:t xml:space="preserve">: KT kho xăng dầu gõ ở mục III, KT Chi phí gõ ở mục V; </w:t>
+      </w:r>
+      <w:r>
+        <w:rPr>
+          <w:b/>
+        </w:rPr>
+        <w:t>chưa gõ thì không khoá được</w:t>
+      </w:r>
+      <w:r>
+        <w:t xml:space="preserve"> (409 </w:t>
+      </w:r>
+      <w:r>
+        <w:rPr>
+          <w:rFonts w:ascii="Consolas" w:hAnsi="Consolas"/>
+          <w:sz w:val="19"/>
+        </w:rPr>
+        <w:t>THIEU_GIA_BAN</w:t>
+      </w:r>
+      <w:r>
+        <w:t>, câu nói mục nào, dòng nào, ai gõ — chủ dự án 02/10), kiểm mục cũng chặn như vậy.</w:t>
       </w:r>
     </w:p>
     <w:p>
@@ -36270,6 +36554,77 @@
       </w:r>
       <w:r>
         <w:t>.</w:t>
+      </w:r>
+    </w:p>
+    <w:p>
+      <w:pPr>
+        <w:pStyle w:val="ListBullet"/>
+      </w:pPr>
+      <w:r>
+        <w:rPr>
+          <w:b/>
+        </w:rPr>
+        <w:t>Sau khoá</w:t>
+      </w:r>
+      <w:r>
+        <w:t xml:space="preserve"> (02/10): dòng kho và dòng ghi nợ nhà cung cấp đã vào bút toán khoá phiếu </w:t>
+      </w:r>
+      <w:r>
+        <w:rPr>
+          <w:b/>
+        </w:rPr>
+        <w:t>đứng yên</w:t>
+      </w:r>
+      <w:r>
+        <w:t xml:space="preserve"> — sửa giá bán, đơn giá, số lượng, ai trả, thêm / bỏ dòng, cấp thêm dầu hay lấy thêm phụ tùng kho → 409 </w:t>
+      </w:r>
+      <w:r>
+        <w:rPr>
+          <w:rFonts w:ascii="Consolas" w:hAnsi="Consolas"/>
+          <w:sz w:val="19"/>
+        </w:rPr>
+        <w:t>DA_KHOA</w:t>
+      </w:r>
+      <w:r>
+        <w:t>, kể cả KT kho xăng dầu, KT Chi phí và Sếp. Lưu lại đúng số cũ thì được. Muốn sửa: KT Thu/Chi mở khoá (bút toán huỷ / gỡ), sửa, khoá lại (ghi theo số mới).</w:t>
+      </w:r>
+    </w:p>
+    <w:p>
+      <w:pPr>
+        <w:pStyle w:val="ListBullet"/>
+      </w:pPr>
+      <w:r>
+        <w:t>Câu lỗi ba mã trên đủ ba tiếng (</w:t>
+      </w:r>
+      <w:r>
+        <w:rPr>
+          <w:rFonts w:ascii="Consolas" w:hAnsi="Consolas"/>
+          <w:sz w:val="19"/>
+        </w:rPr>
+        <w:t>loi</w:t>
+      </w:r>
+      <w:r>
+        <w:t xml:space="preserve">, </w:t>
+      </w:r>
+      <w:r>
+        <w:rPr>
+          <w:rFonts w:ascii="Consolas" w:hAnsi="Consolas"/>
+          <w:sz w:val="19"/>
+        </w:rPr>
+        <w:t>loi_lo</w:t>
+      </w:r>
+      <w:r>
+        <w:t xml:space="preserve">, </w:t>
+      </w:r>
+      <w:r>
+        <w:rPr>
+          <w:rFonts w:ascii="Consolas" w:hAnsi="Consolas"/>
+          <w:sz w:val="19"/>
+        </w:rPr>
+        <w:t>loi_en</w:t>
+      </w:r>
+      <w:r>
+        <w:t>); màn trang điều xe hiện theo tiếng đang xem.</w:t>
       </w:r>
     </w:p>
     <w:p>
@@ -38179,7 +38534,43 @@
         <w:pStyle w:val="ListBullet"/>
       </w:pPr>
       <w:r>
-        <w:t>Phụ tùng kho khai với "chủ xe tự trả" vẫn rời kho nhưng không có bút toán (theo bảng chốt 01/10) — giá vốn phần đó chưa ghi ở đâu; cần chủ dự án xác nhận.</w:t>
+        <w:t>Tiền thuê xe (</w:t>
+      </w:r>
+      <w:r>
+        <w:rPr>
+          <w:rFonts w:ascii="Consolas" w:hAnsi="Consolas"/>
+          <w:sz w:val="19"/>
+        </w:rPr>
+        <w:t>thue_xe</w:t>
+      </w:r>
+      <w:r>
+        <w:t xml:space="preserve">: giá thuê, phí, ngưỡng tấn) sửa </w:t>
+      </w:r>
+      <w:r>
+        <w:rPr>
+          <w:b/>
+        </w:rPr>
+        <w:t>sau khoá</w:t>
+      </w:r>
+      <w:r>
+        <w:t xml:space="preserve"> chưa chặn như dòng kho / ghi nợ — cùng một lỗ hổng, chờ chủ dự án quyết có chặn không.</w:t>
+      </w:r>
+    </w:p>
+    <w:p>
+      <w:pPr>
+        <w:pStyle w:val="ListBullet"/>
+      </w:pPr>
+      <w:r>
+        <w:t xml:space="preserve">Dầu kho xe thuê </w:t>
+      </w:r>
+      <w:r>
+        <w:rPr>
+          <w:b/>
+        </w:rPr>
+        <w:t>chưa cấp</w:t>
+      </w:r>
+      <w:r>
+        <w:t xml:space="preserve"> lúc khoá vẫn bị trừ vào tiền trả chủ xe (theo giá bán) nhưng chưa có bút toán xuất kho (dầu chưa rời kho) — khoá phiếu chưa chặn trường hợp này.</w:t>
       </w:r>
     </w:p>
     <w:sectPr>

</xml_diff>

<commit_message>
Khoá phiếu: chặn khi dầu kho chưa cấp (DAU_KHO_CHUA_CAP) hay phụ tùng kho chưa rời kho (PT_KHO_CHUA_XUAT); sau khoá không sửa được tiền thuê xe
- Theo chốt 30/09: mọi lần xuất dầu kho phải có phiếu đề nghị đã cấp — tiền trả chủ xe không còn bị trừ dầu chưa xuất
- Dấu khoá thêm tiền thuê hiệu lực (giá, tiền tệ, phí, quá tải, chủ xe): sửa phiếu / báo xe tới (cân cuối) / đổi xe làm lệch → 409 DA_KHOA
- kiem/thu_but_toan_xuat_kho.py nhập trước rồi cấp (kho tạm chặn vượt tồn); hợp đồng 12.12.4 / NOI_API 1.6 theo luật mới

Co-Authored-By: Claude Opus 5.5 (1M context) <noreply@anthropic.com>
</commit_message>
<xml_diff>
--- a/DOCS/word/HOP_DONG_API_KE_TOAN_ANH_TUNE.docx
+++ b/DOCS/word/HOP_DONG_API_KE_TOAN_ANH_TUNE.docx
@@ -36386,7 +36386,45 @@
         <w:t>đã rời kho</w:t>
       </w:r>
       <w:r>
-        <w:t>: dầu kho thủ kho đã cấp theo phiếu đề nghị (lần cấp ở kho tạm), phụ tùng kho đã xuất lúc khai sự cố. Dòng kho còn trên phiếu mà chưa xuất thì chưa có bút toán.</w:t>
+        <w:t xml:space="preserve">: dầu kho thủ kho đã cấp theo phiếu đề nghị (lần cấp ở kho tạm), phụ tùng kho đã xuất lúc khai sự cố. Dòng kho còn trên phiếu mà </w:t>
+      </w:r>
+      <w:r>
+        <w:rPr>
+          <w:b/>
+        </w:rPr>
+        <w:t>chưa rời kho</w:t>
+      </w:r>
+      <w:r>
+        <w:t xml:space="preserve"> thì </w:t>
+      </w:r>
+      <w:r>
+        <w:rPr>
+          <w:b/>
+        </w:rPr>
+        <w:t>không khoá được</w:t>
+      </w:r>
+      <w:r>
+        <w:t xml:space="preserve"> (02/10): dầu mục III chưa cấp theo phiếu đề nghị → 409 </w:t>
+      </w:r>
+      <w:r>
+        <w:rPr>
+          <w:rFonts w:ascii="Consolas" w:hAnsi="Consolas"/>
+          <w:sz w:val="19"/>
+        </w:rPr>
+        <w:t>DAU_KHO_CHUA_CAP</w:t>
+      </w:r>
+      <w:r>
+        <w:t xml:space="preserve"> (xe nhà lẫn xe thuê; câu nói dòng nào, KT kho xăng dầu / thủ kho cấp ở màn Cấp phát); phụ tùng ghi "lấy từ kho" trên bảng mục V mà chưa xuất (phụ tùng chỉ rời kho khi tổ sửa khai «Sửa xe» lấy kho, hoặc duyệt báo hỏng) → 409 </w:t>
+      </w:r>
+      <w:r>
+        <w:rPr>
+          <w:rFonts w:ascii="Consolas" w:hAnsi="Consolas"/>
+          <w:sz w:val="19"/>
+        </w:rPr>
+        <w:t>PT_KHO_CHUA_XUAT</w:t>
+      </w:r>
+      <w:r>
+        <w:t>. Nhờ vậy tiền chi và tiền trừ chủ xe không tính hàng chưa xuất.</w:t>
       </w:r>
     </w:p>
     <w:p>
@@ -36567,7 +36605,7 @@
         <w:t>Sau khoá</w:t>
       </w:r>
       <w:r>
-        <w:t xml:space="preserve"> (02/10): dòng kho và dòng ghi nợ nhà cung cấp đã vào bút toán khoá phiếu </w:t>
+        <w:t xml:space="preserve"> (02/10): những gì đã vào bút toán khoá phiếu </w:t>
       </w:r>
       <w:r>
         <w:rPr>
@@ -36576,7 +36614,7 @@
         <w:t>đứng yên</w:t>
       </w:r>
       <w:r>
-        <w:t xml:space="preserve"> — sửa giá bán, đơn giá, số lượng, ai trả, thêm / bỏ dòng, cấp thêm dầu hay lấy thêm phụ tùng kho → 409 </w:t>
+        <w:t xml:space="preserve"> — tiền thuê xe (giá thuê, tiền tệ thuê, phí, quá tải, cả cân cuối / tỷ giá làm đổi các số đó; so theo số hiệu lực), dòng kho và dòng ghi nợ nhà cung cấp (giá bán, đơn giá, số lượng, ai trả, thêm / bỏ dòng, cấp thêm dầu hay lấy thêm phụ tùng kho, đổi chủ xe) → 409 </w:t>
       </w:r>
       <w:r>
         <w:rPr>
@@ -36586,7 +36624,7 @@
         <w:t>DA_KHOA</w:t>
       </w:r>
       <w:r>
-        <w:t>, kể cả KT kho xăng dầu, KT Chi phí và Sếp. Lưu lại đúng số cũ thì được. Muốn sửa: KT Thu/Chi mở khoá (bút toán huỷ / gỡ), sửa, khoá lại (ghi theo số mới).</w:t>
+        <w:t>, kể cả KT Thu/Chi, KT kho xăng dầu, KT Chi phí và Sếp. Lưu lại đúng số cũ thì được. Muốn sửa: KT Thu/Chi mở khoá (bút toán huỷ / gỡ), sửa, khoá lại (ghi theo số mới).</w:t>
       </w:r>
     </w:p>
     <w:p>
@@ -36594,7 +36632,57 @@
         <w:pStyle w:val="ListBullet"/>
       </w:pPr>
       <w:r>
-        <w:t>Câu lỗi ba mã trên đủ ba tiếng (</w:t>
+        <w:t>Câu lỗi các mã trên (</w:t>
+      </w:r>
+      <w:r>
+        <w:rPr>
+          <w:rFonts w:ascii="Consolas" w:hAnsi="Consolas"/>
+          <w:sz w:val="19"/>
+        </w:rPr>
+        <w:t>KHO_XE_THUE_XUAT_BAN</w:t>
+      </w:r>
+      <w:r>
+        <w:t xml:space="preserve">, </w:t>
+      </w:r>
+      <w:r>
+        <w:rPr>
+          <w:rFonts w:ascii="Consolas" w:hAnsi="Consolas"/>
+          <w:sz w:val="19"/>
+        </w:rPr>
+        <w:t>THIEU_GIA_BAN</w:t>
+      </w:r>
+      <w:r>
+        <w:t xml:space="preserve">, </w:t>
+      </w:r>
+      <w:r>
+        <w:rPr>
+          <w:rFonts w:ascii="Consolas" w:hAnsi="Consolas"/>
+          <w:sz w:val="19"/>
+        </w:rPr>
+        <w:t>DAU_KHO_CHUA_CAP</w:t>
+      </w:r>
+      <w:r>
+        <w:t xml:space="preserve">, </w:t>
+      </w:r>
+      <w:r>
+        <w:rPr>
+          <w:rFonts w:ascii="Consolas" w:hAnsi="Consolas"/>
+          <w:sz w:val="19"/>
+        </w:rPr>
+        <w:t>PT_KHO_CHUA_XUAT</w:t>
+      </w:r>
+      <w:r>
+        <w:t xml:space="preserve">, </w:t>
+      </w:r>
+      <w:r>
+        <w:rPr>
+          <w:rFonts w:ascii="Consolas" w:hAnsi="Consolas"/>
+          <w:sz w:val="19"/>
+        </w:rPr>
+        <w:t>DA_KHOA</w:t>
+      </w:r>
+      <w:r>
+        <w:t>) đủ ba tiếng (</w:t>
       </w:r>
       <w:r>
         <w:rPr>
@@ -38527,50 +38615,6 @@
       </w:r>
       <w:r>
         <w:t xml:space="preserve"> cùng kho: dòng trên phiếu giữ số lít cũ (chỉ phiếu một dòng mới ghi theo số cấp thật), nên bút toán theo số lít trên phiếu — đúng số trừ chủ xe, có thể lệch số lít kho tạm đã xuất.</w:t>
-      </w:r>
-    </w:p>
-    <w:p>
-      <w:pPr>
-        <w:pStyle w:val="ListBullet"/>
-      </w:pPr>
-      <w:r>
-        <w:t>Tiền thuê xe (</w:t>
-      </w:r>
-      <w:r>
-        <w:rPr>
-          <w:rFonts w:ascii="Consolas" w:hAnsi="Consolas"/>
-          <w:sz w:val="19"/>
-        </w:rPr>
-        <w:t>thue_xe</w:t>
-      </w:r>
-      <w:r>
-        <w:t xml:space="preserve">: giá thuê, phí, ngưỡng tấn) sửa </w:t>
-      </w:r>
-      <w:r>
-        <w:rPr>
-          <w:b/>
-        </w:rPr>
-        <w:t>sau khoá</w:t>
-      </w:r>
-      <w:r>
-        <w:t xml:space="preserve"> chưa chặn như dòng kho / ghi nợ — cùng một lỗ hổng, chờ chủ dự án quyết có chặn không.</w:t>
-      </w:r>
-    </w:p>
-    <w:p>
-      <w:pPr>
-        <w:pStyle w:val="ListBullet"/>
-      </w:pPr>
-      <w:r>
-        <w:t xml:space="preserve">Dầu kho xe thuê </w:t>
-      </w:r>
-      <w:r>
-        <w:rPr>
-          <w:b/>
-        </w:rPr>
-        <w:t>chưa cấp</w:t>
-      </w:r>
-      <w:r>
-        <w:t xml:space="preserve"> lúc khoá vẫn bị trừ vào tiền trả chủ xe (theo giá bán) nhưng chưa có bút toán xuất kho (dầu chưa rời kho) — khoá phiếu chưa chặn trường hợp này.</w:t>
       </w:r>
     </w:p>
     <w:sectPr>

</xml_diff>

<commit_message>
Hợp đồng API kế toán (v2.7) + hướng dẫn triển khai anh Tune: lượt chốt 02/10 — sáu script theo thứ tự lên host, cấu hình, menu, kết quả chạy thật trên DB demo
Co-Authored-By: Claude Opus 5.5 (1M context) <noreply@anthropic.com>
</commit_message>
<xml_diff>
--- a/DOCS/word/HOP_DONG_API_KE_TOAN_ANH_TUNE.docx
+++ b/DOCS/word/HOP_DONG_API_KE_TOAN_ANH_TUNE.docx
@@ -24,7 +24,7 @@
         <w:rPr>
           <w:b/>
         </w:rPr>
-        <w:t>v2.6 · 01/10/2026</w:t>
+        <w:t>v2.7 · 02/10/2026</w:t>
       </w:r>
       <w:r>
         <w:t xml:space="preserve"> (lịch sử các bản trước tra bằng Git). Bên soạn: trang điều xe </w:t>
@@ -405,7 +405,7 @@
           <w:rFonts w:ascii="Consolas" w:hAnsi="Consolas"/>
           <w:sz w:val="19"/>
         </w:rPr>
-        <w:t>feat/HonTunedaHai@b9227aa</w:t>
+        <w:t>feat/HonTunedaHai@a8c7014</w:t>
       </w:r>
       <w:r>
         <w:t xml:space="preserve">, WEB </w:t>
@@ -415,7 +415,7 @@
           <w:rFonts w:ascii="Consolas" w:hAnsi="Consolas"/>
           <w:sz w:val="19"/>
         </w:rPr>
-        <w:t>feat/hontunedhai_Laos@7d168744</w:t>
+        <w:t>feat/hontunedhai_Laos@6abe0ad8</w:t>
       </w:r>
       <w:r>
         <w:t xml:space="preserve"> (12.9). Trong đó: nguồn DO đọc cấu hình </w:t>
@@ -456,67 +456,45 @@
         <w:t>API bút toán tổng hợp</w:t>
       </w:r>
       <w:r>
-        <w:t xml:space="preserve"> (12.12.4); WEB không đổi loại phiếu ngầm, không gán ngầm tiền tệ. Trang điều xe </w:t>
-      </w:r>
-      <w:r>
-        <w:rPr>
-          <w:rFonts w:ascii="Consolas" w:hAnsi="Consolas"/>
-          <w:sz w:val="19"/>
-        </w:rPr>
-        <w:t>f85078b</w:t>
-      </w:r>
-      <w:r>
-        <w:t xml:space="preserve">, </w:t>
-      </w:r>
-      <w:r>
-        <w:rPr>
-          <w:rFonts w:ascii="Consolas" w:hAnsi="Consolas"/>
-          <w:sz w:val="19"/>
-        </w:rPr>
-        <w:t>ca7b630</w:t>
-      </w:r>
-      <w:r>
-        <w:t xml:space="preserve">, </w:t>
-      </w:r>
-      <w:r>
-        <w:rPr>
-          <w:rFonts w:ascii="Consolas" w:hAnsi="Consolas"/>
-          <w:sz w:val="19"/>
-        </w:rPr>
-        <w:t>938b007</w:t>
-      </w:r>
-      <w:r>
-        <w:t xml:space="preserve"> (dọn lớp tạm), </w:t>
-      </w:r>
-      <w:r>
-        <w:rPr>
-          <w:rFonts w:ascii="Consolas" w:hAnsi="Consolas"/>
-          <w:sz w:val="19"/>
-        </w:rPr>
-        <w:t>a938301</w:t>
-      </w:r>
-      <w:r>
-        <w:t xml:space="preserve">, </w:t>
-      </w:r>
-      <w:r>
-        <w:rPr>
-          <w:rFonts w:ascii="Consolas" w:hAnsi="Consolas"/>
-          <w:sz w:val="19"/>
-        </w:rPr>
-        <w:t>875a0cf</w:t>
-      </w:r>
-      <w:r>
-        <w:t xml:space="preserve"> (gửi bút toán); kho tạm </w:t>
-      </w:r>
-      <w:r>
-        <w:rPr>
-          <w:rFonts w:ascii="Consolas" w:hAnsi="Consolas"/>
-          <w:sz w:val="19"/>
-        </w:rPr>
-        <w:t>EPL_KETOAN@1d8d91c</w:t>
-      </w:r>
-      <w:r>
-        <w:t xml:space="preserve">. Mã còn đổi nhỏ: chỗ chưa chắc ghi </w:t>
+        <w:t xml:space="preserve"> và màn WEB "Bút toán từ Logistics" (12.12.4); </w:t>
+      </w:r>
+      <w:r>
+        <w:rPr>
+          <w:b/>
+        </w:rPr>
+        <w:t>thu nợ khách ngoại tệ</w:t>
+      </w:r>
+      <w:r>
+        <w:t xml:space="preserve"> và </w:t>
+      </w:r>
+      <w:r>
+        <w:rPr>
+          <w:b/>
+        </w:rPr>
+        <w:t>huỷ phiếu thu nợ</w:t>
+      </w:r>
+      <w:r>
+        <w:t xml:space="preserve"> (12.11.2); gỡ ghi sổ phiếu thu chi đưa trạng thái về 1 (12.9); WEB không đổi loại phiếu ngầm, không gán ngầm tiền tệ. Trang điều xe đến </w:t>
+      </w:r>
+      <w:r>
+        <w:rPr>
+          <w:rFonts w:ascii="Consolas" w:hAnsi="Consolas"/>
+          <w:sz w:val="19"/>
+        </w:rPr>
+        <w:t>2ac74de</w:t>
+      </w:r>
+      <w:r>
+        <w:t xml:space="preserve"> (luật khoá phiếu mới, 12.12.4); kho tạm </w:t>
+      </w:r>
+      <w:r>
+        <w:rPr>
+          <w:rFonts w:ascii="Consolas" w:hAnsi="Consolas"/>
+          <w:sz w:val="19"/>
+        </w:rPr>
+        <w:t>EPL_KETOAN@a1a5955</w:t>
+      </w:r>
+      <w:r>
+        <w:t xml:space="preserve"> (chặn vượt tồn, 12.12.5). Mã còn đổi nhỏ: chỗ chưa chắc ghi </w:t>
       </w:r>
       <w:r>
         <w:rPr>
@@ -1162,7 +1140,7 @@
               <w:t>Chi tiết công nợ khách hàng → Tạo phiếu thu → Xác nhận thu nợ</w:t>
             </w:r>
             <w:r>
-              <w:t xml:space="preserve"> (TKN) → phiếu thu CMR 17 "Thu khác", Nợ 1021 / Có 1211 — </w:t>
+              <w:t xml:space="preserve"> (TKN) → phiếu thu CMR 17 "Thu khác", Nợ tiền (SO ngoại tệ: tài khoản ngoại tệ, tỷ giá ngày thu) / Có 1211 — </w:t>
             </w:r>
             <w:r>
               <w:rPr>
@@ -1171,7 +1149,17 @@
               <w:t>không</w:t>
             </w:r>
             <w:r>
-              <w:t xml:space="preserve"> phải phiếu "Thu công nợ" (15). Trang điều xe chỉ đọc "đã thu" (12.11.2)</w:t>
+              <w:t xml:space="preserve"> phải phiếu "Thu công nợ" (15). Thu nhầm thì huỷ cả cụm qua </w:t>
+            </w:r>
+            <w:r>
+              <w:rPr>
+                <w:rFonts w:ascii="Consolas" w:hAnsi="Consolas"/>
+                <w:sz w:val="19"/>
+              </w:rPr>
+              <w:t>collection-cancel</w:t>
+            </w:r>
+            <w:r>
+              <w:t xml:space="preserve"> (12.11.2). Trang điều xe chỉ đọc "đã thu" (12.11.2)</w:t>
             </w:r>
           </w:p>
         </w:tc>
@@ -14770,7 +14758,7 @@
                 <w:rFonts w:ascii="Consolas" w:hAnsi="Consolas"/>
                 <w:sz w:val="19"/>
               </w:rPr>
-              <w:t>b9227aa</w:t>
+              <w:t>a8c7014</w:t>
             </w:r>
             <w:r>
               <w:t xml:space="preserve">, </w:t>
@@ -14780,10 +14768,10 @@
                 <w:rFonts w:ascii="Consolas" w:hAnsi="Consolas"/>
                 <w:sz w:val="19"/>
               </w:rPr>
-              <w:t>7d168744</w:t>
-            </w:r>
-            <w:r>
-              <w:t xml:space="preserve"> (12.9)</w:t>
+              <w:t>6abe0ad8</w:t>
+            </w:r>
+            <w:r>
+              <w:t xml:space="preserve"> (12.9): thêm thu nợ ngoại tệ, huỷ phiếu thu nợ, gỡ ghi sổ phiếu thu chi, màn Bút toán từ Logistics</w:t>
             </w:r>
           </w:p>
         </w:tc>
@@ -18568,7 +18556,7 @@
               <w:t>4-1368-TK-…</w:t>
             </w:r>
             <w:r>
-              <w:t xml:space="preserve">, Nợ 1021 (hoặc 1011) / Có 1211. </w:t>
+              <w:t xml:space="preserve">, Nợ tiền (1011 / 1021; SO ngoại tệ 1012 / 1022, tỷ giá ngày thu) / Có 1211. </w:t>
             </w:r>
             <w:r>
               <w:rPr>
@@ -18587,7 +18575,14 @@
               <w:t>save-and-commit</w:t>
             </w:r>
             <w:r>
-              <w:t xml:space="preserve"> CMR 15 "Thu công nợ": tìm công nợ SO ở đó ra 0 dòng</w:t>
+              <w:t xml:space="preserve"> CMR 15 "Thu công nợ": tìm công nợ SO ở đó ra 0 dòng. Huỷ: </w:t>
+            </w:r>
+            <w:r>
+              <w:rPr>
+                <w:rFonts w:ascii="Consolas" w:hAnsi="Consolas"/>
+                <w:sz w:val="19"/>
+              </w:rPr>
+              <w:t>POST /api/v1/sales/debt/collection-cancel</w:t>
             </w:r>
           </w:p>
         </w:tc>
@@ -18615,7 +18610,47 @@
           <w:p>
             <w:r/>
             <w:r>
-              <w:t>KB-AZ đi thật 01/10. Hai lỗi: hộp Tạo phiếu thu chỉ có tài khoản nội tệ, tỷ giá cứng 1 → SO USD ghi thành Kíp (UI-4 đang sửa); mọi SO cùng mã phiếu bán "Demo EPL-2-261001000" (UI-4 đang tìm nguồn)</w:t>
+              <w:t xml:space="preserve">chạy (12.11.2): thu nợ ngoại tệ </w:t>
+            </w:r>
+            <w:r>
+              <w:rPr>
+                <w:rFonts w:ascii="Consolas" w:hAnsi="Consolas"/>
+                <w:sz w:val="19"/>
+              </w:rPr>
+              <w:t>3d6f330</w:t>
+            </w:r>
+            <w:r>
+              <w:t xml:space="preserve"> / WEB </w:t>
+            </w:r>
+            <w:r>
+              <w:rPr>
+                <w:rFonts w:ascii="Consolas" w:hAnsi="Consolas"/>
+                <w:sz w:val="19"/>
+              </w:rPr>
+              <w:t>c1a5d231</w:t>
+            </w:r>
+            <w:r>
+              <w:t xml:space="preserve">; huỷ </w:t>
+            </w:r>
+            <w:r>
+              <w:rPr>
+                <w:rFonts w:ascii="Consolas" w:hAnsi="Consolas"/>
+                <w:sz w:val="19"/>
+              </w:rPr>
+              <w:t>66ba289</w:t>
+            </w:r>
+            <w:r>
+              <w:t xml:space="preserve"> → </w:t>
+            </w:r>
+            <w:r>
+              <w:rPr>
+                <w:rFonts w:ascii="Consolas" w:hAnsi="Consolas"/>
+                <w:sz w:val="19"/>
+              </w:rPr>
+              <w:t>97d5a91</w:t>
+            </w:r>
+            <w:r>
+              <w:t>; hai phiếu USD ghi thành Kíp (81423 / 81424) đã huỷ và thu lại 02/10</w:t>
             </w:r>
           </w:p>
         </w:tc>
@@ -26988,7 +27023,7 @@
                 <w:rFonts w:ascii="Consolas" w:hAnsi="Consolas"/>
                 <w:sz w:val="19"/>
               </w:rPr>
-              <w:t>b9227aa</w:t>
+              <w:t>a8c7014</w:t>
             </w:r>
           </w:p>
         </w:tc>
@@ -27035,7 +27070,7 @@
                 <w:rFonts w:ascii="Consolas" w:hAnsi="Consolas"/>
                 <w:sz w:val="19"/>
               </w:rPr>
-              <w:t>7d168744</w:t>
+              <w:t>6abe0ad8</w:t>
             </w:r>
           </w:p>
         </w:tc>
@@ -27056,27 +27091,7 @@
         <w:t>sửa thẳng</w:t>
       </w:r>
       <w:r>
-        <w:t xml:space="preserve"> source của anh; "bên mình với anh Tune giờ là một", nên các việc trên source bên EPL làm luôn. Bên em thử bằng API và WEB chạy ở máy, trên DB demo Lào anh đã sao lưu; không tự chạy migration, không sửa thủ tục có sẵn, không mở cấu hình bí mật vào tài liệu. Hai script mới (</w:t>
-      </w:r>
-      <w:r>
-        <w:rPr>
-          <w:rFonts w:ascii="Consolas" w:hAnsi="Consolas"/>
-          <w:sz w:val="19"/>
-        </w:rPr>
-        <w:t>e2ef52f</w:t>
-      </w:r>
-      <w:r>
-        <w:t xml:space="preserve"> che audit cũ, </w:t>
-      </w:r>
-      <w:r>
-        <w:rPr>
-          <w:rFonts w:ascii="Consolas" w:hAnsi="Consolas"/>
-          <w:sz w:val="19"/>
-        </w:rPr>
-        <w:t>b9227aa</w:t>
-      </w:r>
-      <w:r>
-        <w:t xml:space="preserve"> thêm ba thủ tục bút toán) </w:t>
+        <w:t xml:space="preserve"> source của anh; "bên mình với anh Tune giờ là một", nên các việc trên source bên EPL làm luôn. Bên em thử bằng API và WEB chạy ở máy, trên DB demo Lào anh đã sao lưu; không tự chạy migration, không sửa thủ tục có sẵn, không mở cấu hình bí mật vào tài liệu. Sáu script mới (che audit cũ, bút toán, thu nợ ngoại tệ, huỷ phiếu thu nợ, liệt kê bút toán, gỡ ghi sổ phiếu thu chi): trên DB demo, chủ dự án đã áp các script bút toán, thu nợ ngoại tệ, huỷ phiếu thu nợ, liệt kê bút toán, gỡ ghi sổ ngày 02/10; script che audit </w:t>
       </w:r>
       <w:r>
         <w:rPr>
@@ -27085,7 +27100,17 @@
         <w:t>chưa chạy</w:t>
       </w:r>
       <w:r>
-        <w:t xml:space="preserve"> ở DB nào. Chưa push nhánh nào lên GitHub. Tài liệu hiện trạng phía anh: </w:t>
+        <w:t xml:space="preserve">; DB host chưa có gì — thứ tự áp ở </w:t>
+      </w:r>
+      <w:r>
+        <w:rPr>
+          <w:rFonts w:ascii="Consolas" w:hAnsi="Consolas"/>
+          <w:sz w:val="19"/>
+        </w:rPr>
+        <w:t>HUONG_DAN_TRIEN_KHAI_ANH_TUNE</w:t>
+      </w:r>
+      <w:r>
+        <w:t xml:space="preserve"> mục 4.0. Chưa push nhánh nào lên GitHub. Tài liệu hiện trạng phía anh: </w:t>
       </w:r>
       <w:r>
         <w:rPr>
@@ -27828,6 +27853,368 @@
             </w:r>
             <w:r>
               <w:t xml:space="preserve"> (đã áp DB demo 02/10; host chưa) — 12.12.4</w:t>
+            </w:r>
+          </w:p>
+        </w:tc>
+      </w:tr>
+      <w:tr>
+        <w:tc>
+          <w:tcPr>
+            <w:tcW w:type="dxa" w:w="4320"/>
+          </w:tcPr>
+          <w:p>
+            <w:r/>
+            <w:r>
+              <w:rPr>
+                <w:rFonts w:ascii="Consolas" w:hAnsi="Consolas"/>
+                <w:sz w:val="19"/>
+              </w:rPr>
+              <w:t>c1754d4</w:t>
+            </w:r>
+          </w:p>
+        </w:tc>
+        <w:tc>
+          <w:tcPr>
+            <w:tcW w:type="dxa" w:w="4320"/>
+          </w:tcPr>
+          <w:p>
+            <w:r/>
+            <w:r>
+              <w:t xml:space="preserve">bút toán: chỉ đếm chứng từ có </w:t>
+            </w:r>
+            <w:r>
+              <w:rPr>
+                <w:rFonts w:ascii="Consolas" w:hAnsi="Consolas"/>
+                <w:sz w:val="19"/>
+              </w:rPr>
+              <w:t>GLBUSINESS</w:t>
+            </w:r>
+            <w:r>
+              <w:t xml:space="preserve"> — ghi sổ legacy sinh thêm chứng từ con cùng số, cùng SourceRef (trước đó gửi lại / gỡ đều 409 </w:t>
+            </w:r>
+            <w:r>
+              <w:rPr>
+                <w:rFonts w:ascii="Consolas" w:hAnsi="Consolas"/>
+                <w:sz w:val="19"/>
+              </w:rPr>
+              <w:t>52511</w:t>
+            </w:r>
+            <w:r>
+              <w:t>)</w:t>
+            </w:r>
+          </w:p>
+        </w:tc>
+      </w:tr>
+      <w:tr>
+        <w:tc>
+          <w:tcPr>
+            <w:tcW w:type="dxa" w:w="4320"/>
+          </w:tcPr>
+          <w:p>
+            <w:r/>
+            <w:r>
+              <w:rPr>
+                <w:rFonts w:ascii="Consolas" w:hAnsi="Consolas"/>
+                <w:sz w:val="19"/>
+              </w:rPr>
+              <w:t>3d6f330</w:t>
+            </w:r>
+          </w:p>
+        </w:tc>
+        <w:tc>
+          <w:tcPr>
+            <w:tcW w:type="dxa" w:w="4320"/>
+          </w:tcPr>
+          <w:p>
+            <w:r/>
+            <w:r>
+              <w:rPr>
+                <w:b/>
+              </w:rPr>
+              <w:t>thu nợ khách ngoại tệ</w:t>
+            </w:r>
+            <w:r>
+              <w:t xml:space="preserve">: máy chủ quyết tỷ giá / quy đổi theo loại tiền của khoản nợ; script </w:t>
+            </w:r>
+            <w:r>
+              <w:rPr>
+                <w:rFonts w:ascii="Consolas" w:hAnsi="Consolas"/>
+                <w:sz w:val="19"/>
+              </w:rPr>
+              <w:t>20261001_sales_debt_collection_currency.sql</w:t>
+            </w:r>
+            <w:r>
+              <w:t xml:space="preserve"> (trừ dư nợ theo nguyên tệ) — 12.11.2</w:t>
+            </w:r>
+          </w:p>
+        </w:tc>
+      </w:tr>
+      <w:tr>
+        <w:tc>
+          <w:tcPr>
+            <w:tcW w:type="dxa" w:w="4320"/>
+          </w:tcPr>
+          <w:p>
+            <w:r/>
+            <w:r>
+              <w:t xml:space="preserve">WEB </w:t>
+            </w:r>
+            <w:r>
+              <w:rPr>
+                <w:rFonts w:ascii="Consolas" w:hAnsi="Consolas"/>
+                <w:sz w:val="19"/>
+              </w:rPr>
+              <w:t>c1a5d231</w:t>
+            </w:r>
+          </w:p>
+        </w:tc>
+        <w:tc>
+          <w:tcPr>
+            <w:tcW w:type="dxa" w:w="4320"/>
+          </w:tcPr>
+          <w:p>
+            <w:r/>
+            <w:r>
+              <w:t>thu nợ: khoản ngoại tệ chỉ cho tài khoản ngoại tệ, bắt nhập tỷ giá ngày thu; phiếu thu chi mở lại giữ đúng kỳ; xác nhận bằng hộp chung</w:t>
+            </w:r>
+          </w:p>
+        </w:tc>
+      </w:tr>
+      <w:tr>
+        <w:tc>
+          <w:tcPr>
+            <w:tcW w:type="dxa" w:w="4320"/>
+          </w:tcPr>
+          <w:p>
+            <w:r/>
+            <w:r>
+              <w:rPr>
+                <w:rFonts w:ascii="Consolas" w:hAnsi="Consolas"/>
+                <w:sz w:val="19"/>
+              </w:rPr>
+              <w:t>66ba289</w:t>
+            </w:r>
+            <w:r>
+              <w:t xml:space="preserve">, </w:t>
+            </w:r>
+            <w:r>
+              <w:rPr>
+                <w:rFonts w:ascii="Consolas" w:hAnsi="Consolas"/>
+                <w:sz w:val="19"/>
+              </w:rPr>
+              <w:t>95d58bb</w:t>
+            </w:r>
+            <w:r>
+              <w:t xml:space="preserve">, </w:t>
+            </w:r>
+            <w:r>
+              <w:rPr>
+                <w:rFonts w:ascii="Consolas" w:hAnsi="Consolas"/>
+                <w:sz w:val="19"/>
+              </w:rPr>
+              <w:t>97d5a91</w:t>
+            </w:r>
+          </w:p>
+        </w:tc>
+        <w:tc>
+          <w:tcPr>
+            <w:tcW w:type="dxa" w:w="4320"/>
+          </w:tcPr>
+          <w:p>
+            <w:r/>
+            <w:r>
+              <w:rPr>
+                <w:b/>
+              </w:rPr>
+              <w:t>huỷ phiếu thu nợ</w:t>
+            </w:r>
+            <w:r>
+              <w:t xml:space="preserve"> </w:t>
+            </w:r>
+            <w:r>
+              <w:rPr>
+                <w:rFonts w:ascii="Consolas" w:hAnsi="Consolas"/>
+                <w:sz w:val="19"/>
+              </w:rPr>
+              <w:t>sales/debt/collection-cancel</w:t>
+            </w:r>
+            <w:r>
+              <w:t xml:space="preserve"> + script </w:t>
+            </w:r>
+            <w:r>
+              <w:rPr>
+                <w:rFonts w:ascii="Consolas" w:hAnsi="Consolas"/>
+                <w:sz w:val="19"/>
+              </w:rPr>
+              <w:t>20261002_sales_debt_collection_cancel.sql</w:t>
+            </w:r>
+            <w:r>
+              <w:t xml:space="preserve">; hai bản sửa theo hành vi legacy đo trên DB demo (gỡ sổ không đổi ST; xoá trả </w:t>
+            </w:r>
+            <w:r>
+              <w:rPr>
+                <w:rFonts w:ascii="Consolas" w:hAnsi="Consolas"/>
+                <w:sz w:val="19"/>
+              </w:rPr>
+              <w:t>'2'</w:t>
+            </w:r>
+            <w:r>
+              <w:t xml:space="preserve"> khi ST 12) — 12.11.2</w:t>
+            </w:r>
+          </w:p>
+        </w:tc>
+      </w:tr>
+      <w:tr>
+        <w:tc>
+          <w:tcPr>
+            <w:tcW w:type="dxa" w:w="4320"/>
+          </w:tcPr>
+          <w:p>
+            <w:r/>
+            <w:r>
+              <w:rPr>
+                <w:rFonts w:ascii="Consolas" w:hAnsi="Consolas"/>
+                <w:sz w:val="19"/>
+              </w:rPr>
+              <w:t>6f91fd2</w:t>
+            </w:r>
+            <w:r>
+              <w:t xml:space="preserve">, WEB </w:t>
+            </w:r>
+            <w:r>
+              <w:rPr>
+                <w:rFonts w:ascii="Consolas" w:hAnsi="Consolas"/>
+                <w:sz w:val="19"/>
+              </w:rPr>
+              <w:t>6abe0ad8</w:t>
+            </w:r>
+          </w:p>
+        </w:tc>
+        <w:tc>
+          <w:tcPr>
+            <w:tcW w:type="dxa" w:w="4320"/>
+          </w:tcPr>
+          <w:p>
+            <w:r/>
+            <w:r>
+              <w:rPr>
+                <w:b/>
+              </w:rPr>
+              <w:t>liệt kê bút toán</w:t>
+            </w:r>
+            <w:r>
+              <w:t xml:space="preserve"> </w:t>
+            </w:r>
+            <w:r>
+              <w:rPr>
+                <w:rFonts w:ascii="Consolas" w:hAnsi="Consolas"/>
+                <w:sz w:val="19"/>
+              </w:rPr>
+              <w:t>GET integrations/logistics/journal-entries</w:t>
+            </w:r>
+            <w:r>
+              <w:t xml:space="preserve"> + script </w:t>
+            </w:r>
+            <w:r>
+              <w:rPr>
+                <w:rFonts w:ascii="Consolas" w:hAnsi="Consolas"/>
+                <w:sz w:val="19"/>
+              </w:rPr>
+              <w:t>20261002_logistics_journal_entry_list.sql</w:t>
+            </w:r>
+            <w:r>
+              <w:t xml:space="preserve">; màn WEB "Bút toán từ Logistics" </w:t>
+            </w:r>
+            <w:r>
+              <w:rPr>
+                <w:rFonts w:ascii="Consolas" w:hAnsi="Consolas"/>
+                <w:sz w:val="19"/>
+              </w:rPr>
+              <w:t>/LogisticsJournalEntry/Index</w:t>
+            </w:r>
+            <w:r>
+              <w:t xml:space="preserve"> (chỉ đọc) — 12.12.4</w:t>
+            </w:r>
+          </w:p>
+        </w:tc>
+      </w:tr>
+      <w:tr>
+        <w:tc>
+          <w:tcPr>
+            <w:tcW w:type="dxa" w:w="4320"/>
+          </w:tcPr>
+          <w:p>
+            <w:r/>
+            <w:r>
+              <w:rPr>
+                <w:rFonts w:ascii="Consolas" w:hAnsi="Consolas"/>
+                <w:sz w:val="19"/>
+              </w:rPr>
+              <w:t>a8c7014</w:t>
+            </w:r>
+          </w:p>
+        </w:tc>
+        <w:tc>
+          <w:tcPr>
+            <w:tcW w:type="dxa" w:w="4320"/>
+          </w:tcPr>
+          <w:p>
+            <w:r/>
+            <w:r>
+              <w:rPr>
+                <w:b/>
+              </w:rPr>
+              <w:t>gỡ ghi sổ phiếu thu chi</w:t>
+            </w:r>
+            <w:r>
+              <w:t xml:space="preserve">: </w:t>
+            </w:r>
+            <w:r>
+              <w:rPr>
+                <w:rFonts w:ascii="Consolas" w:hAnsi="Consolas"/>
+                <w:sz w:val="19"/>
+              </w:rPr>
+              <w:t>unpost</w:t>
+            </w:r>
+            <w:r>
+              <w:t xml:space="preserve"> → </w:t>
+            </w:r>
+            <w:r>
+              <w:rPr>
+                <w:rFonts w:ascii="Consolas" w:hAnsi="Consolas"/>
+                <w:sz w:val="19"/>
+              </w:rPr>
+              <w:t>proc_CM_UnpostCashVoucher</w:t>
+            </w:r>
+            <w:r>
+              <w:t xml:space="preserve"> (gỡ sổ cái, ST về 1); </w:t>
+            </w:r>
+            <w:r>
+              <w:rPr>
+                <w:rFonts w:ascii="Consolas" w:hAnsi="Consolas"/>
+                <w:sz w:val="19"/>
+              </w:rPr>
+              <w:t>delete</w:t>
+            </w:r>
+            <w:r>
+              <w:t xml:space="preserve"> đọc mã thủ tục xoá legacy (khác 1 → 409 </w:t>
+            </w:r>
+            <w:r>
+              <w:rPr>
+                <w:rFonts w:ascii="Consolas" w:hAnsi="Consolas"/>
+                <w:sz w:val="19"/>
+              </w:rPr>
+              <w:t>CASH_VOUCHER_DELETE_REFUSED</w:t>
+            </w:r>
+            <w:r>
+              <w:t xml:space="preserve">, rollback); script </w:t>
+            </w:r>
+            <w:r>
+              <w:rPr>
+                <w:rFonts w:ascii="Consolas" w:hAnsi="Consolas"/>
+                <w:sz w:val="19"/>
+              </w:rPr>
+              <w:t>20261002_cm_unpost_cash_voucher.sql</w:t>
             </w:r>
           </w:p>
         </w:tc>
@@ -31805,22 +32192,127 @@
         <w:pStyle w:val="ListBullet"/>
       </w:pPr>
       <w:r>
-        <w:t xml:space="preserve">Hai lỗi đã thấy khi đi thật luồng này (01/10): (1) hộp </w:t>
-      </w:r>
-      <w:r>
         <w:rPr>
           <w:b/>
         </w:rPr>
-        <w:t>Tạo phiếu thu</w:t>
-      </w:r>
-      <w:r>
-        <w:t xml:space="preserve"> chỉ có tài khoản tiền </w:t>
+        <w:t>Thu nợ ngoại tệ</w:t>
+      </w:r>
+      <w:r>
+        <w:t xml:space="preserve"> (API </w:t>
+      </w:r>
+      <w:r>
+        <w:rPr>
+          <w:rFonts w:ascii="Consolas" w:hAnsi="Consolas"/>
+          <w:sz w:val="19"/>
+        </w:rPr>
+        <w:t>3d6f330</w:t>
+      </w:r>
+      <w:r>
+        <w:t xml:space="preserve">, WEB </w:t>
+      </w:r>
+      <w:r>
+        <w:rPr>
+          <w:rFonts w:ascii="Consolas" w:hAnsi="Consolas"/>
+          <w:sz w:val="19"/>
+        </w:rPr>
+        <w:t>c1a5d231</w:t>
+      </w:r>
+      <w:r>
+        <w:t xml:space="preserve">; script </w:t>
+      </w:r>
+      <w:r>
+        <w:rPr>
+          <w:rFonts w:ascii="Consolas" w:hAnsi="Consolas"/>
+          <w:sz w:val="19"/>
+        </w:rPr>
+        <w:t>20261001_sales_debt_collection_currency.sql</w:t>
+      </w:r>
+      <w:r>
+        <w:t xml:space="preserve"> đã áp DB demo 02/10 00:51):</w:t>
+      </w:r>
+    </w:p>
+    <w:p>
+      <w:pPr>
+        <w:pStyle w:val="ListBullet2"/>
+      </w:pPr>
+      <w:r>
+        <w:rPr>
+          <w:rFonts w:ascii="Consolas" w:hAnsi="Consolas"/>
+          <w:sz w:val="19"/>
+        </w:rPr>
+        <w:t>customer-detail</w:t>
+      </w:r>
+      <w:r>
+        <w:t xml:space="preserve">: mỗi dòng nợ có </w:t>
+      </w:r>
+      <w:r>
+        <w:rPr>
+          <w:rFonts w:ascii="Consolas" w:hAnsi="Consolas"/>
+          <w:sz w:val="19"/>
+        </w:rPr>
+        <w:t>LocalCurrencyCode</w:t>
+      </w:r>
+      <w:r>
+        <w:t xml:space="preserve"> / </w:t>
+      </w:r>
+      <w:r>
+        <w:rPr>
+          <w:rFonts w:ascii="Consolas" w:hAnsi="Consolas"/>
+          <w:sz w:val="19"/>
+        </w:rPr>
+        <w:t>IsForeignCurrency</w:t>
+      </w:r>
+      <w:r>
+        <w:t xml:space="preserve"> — nội tệ của SO Logistics suy từ </w:t>
       </w:r>
       <w:r>
         <w:rPr>
           <w:b/>
         </w:rPr>
-        <w:t>nội tệ</w:t>
+        <w:t>tiền chi của DO</w:t>
+      </w:r>
+      <w:r>
+        <w:t xml:space="preserve"> trong gói SO bên em gửi (</w:t>
+      </w:r>
+      <w:r>
+        <w:rPr>
+          <w:rFonts w:ascii="Consolas" w:hAnsi="Consolas"/>
+          <w:sz w:val="19"/>
+        </w:rPr>
+        <w:t>header.currency_chi</w:t>
+      </w:r>
+      <w:r>
+        <w:t>).</w:t>
+      </w:r>
+    </w:p>
+    <w:p>
+      <w:pPr>
+        <w:pStyle w:val="ListBullet2"/>
+      </w:pPr>
+      <w:r>
+        <w:rPr>
+          <w:rFonts w:ascii="Consolas" w:hAnsi="Consolas"/>
+          <w:sz w:val="19"/>
+        </w:rPr>
+        <w:t>collection-upsert</w:t>
+      </w:r>
+      <w:r>
+        <w:t xml:space="preserve">: </w:t>
+      </w:r>
+      <w:r>
+        <w:rPr>
+          <w:b/>
+        </w:rPr>
+        <w:t>máy chủ quyết tỷ giá và quy đổi</w:t>
+      </w:r>
+      <w:r>
+        <w:t xml:space="preserve">. Nợ ngoại tệ (ví dụ SO USD, tiền chi LAK) bắt tài khoản tiền </w:t>
+      </w:r>
+      <w:r>
+        <w:rPr>
+          <w:b/>
+        </w:rPr>
+        <w:t>ngoại tệ</w:t>
       </w:r>
       <w:r>
         <w:t xml:space="preserve"> (</w:t>
@@ -31830,7 +32322,115 @@
           <w:rFonts w:ascii="Consolas" w:hAnsi="Consolas"/>
           <w:sz w:val="19"/>
         </w:rPr>
-        <w:t>CASH_LOCAL</w:t>
+        <w:t>CASH_FOREIGN</w:t>
+      </w:r>
+      <w:r>
+        <w:t xml:space="preserve"> → 1012, </w:t>
+      </w:r>
+      <w:r>
+        <w:rPr>
+          <w:rFonts w:ascii="Consolas" w:hAnsi="Consolas"/>
+          <w:sz w:val="19"/>
+        </w:rPr>
+        <w:t>BANK_FOREIGN</w:t>
+      </w:r>
+      <w:r>
+        <w:t xml:space="preserve"> → 1022) và </w:t>
+      </w:r>
+      <w:r>
+        <w:rPr>
+          <w:b/>
+        </w:rPr>
+        <w:t>tỷ giá ngày thu</w:t>
+      </w:r>
+      <w:r>
+        <w:t xml:space="preserve"> khác 1 do người thu nhập; nợ nội tệ dùng tài khoản nội tệ, tỷ giá 1. </w:t>
+      </w:r>
+      <w:r>
+        <w:rPr>
+          <w:rFonts w:ascii="Consolas" w:hAnsi="Consolas"/>
+          <w:sz w:val="19"/>
+        </w:rPr>
+        <w:t>Amount</w:t>
+      </w:r>
+      <w:r>
+        <w:t xml:space="preserve"> = </w:t>
+      </w:r>
+      <w:r>
+        <w:rPr>
+          <w:rFonts w:ascii="Consolas" w:hAnsi="Consolas"/>
+          <w:sz w:val="19"/>
+        </w:rPr>
+        <w:t>AmountCur × Rate</w:t>
+      </w:r>
+      <w:r>
+        <w:t xml:space="preserve"> (5 số lẻ) do máy chủ tính, trình duyệt không gửi. Dư nợ RES trừ theo </w:t>
+      </w:r>
+      <w:r>
+        <w:rPr>
+          <w:b/>
+        </w:rPr>
+        <w:t>nguyên tệ</w:t>
+      </w:r>
+      <w:r>
+        <w:t>. Sai cặp tài khoản / tỷ giá → 400 có câu.</w:t>
+      </w:r>
+    </w:p>
+    <w:p>
+      <w:pPr>
+        <w:pStyle w:val="ListBullet2"/>
+      </w:pPr>
+      <w:r>
+        <w:t>WEB: hộp Tạo phiếu thu của khoản ngoại tệ chỉ hiện tài khoản ngoại tệ, bắt nhập tỷ giá.</w:t>
+      </w:r>
+    </w:p>
+    <w:p>
+      <w:pPr>
+        <w:pStyle w:val="ListBullet2"/>
+      </w:pPr>
+      <w:r>
+        <w:t>QLSX chưa có bảng tỷ giá ngày; phiếu bán Logistics lưu tỷ giá 1 — tỷ giá ngày thu do kế toán nhập.</w:t>
+      </w:r>
+    </w:p>
+    <w:p>
+      <w:pPr>
+        <w:pStyle w:val="ListBullet"/>
+      </w:pPr>
+      <w:r>
+        <w:rPr>
+          <w:b/>
+        </w:rPr>
+        <w:t>Huỷ phiếu thu nợ</w:t>
+      </w:r>
+      <w:r>
+        <w:t xml:space="preserve"> — </w:t>
+      </w:r>
+      <w:r>
+        <w:rPr>
+          <w:rFonts w:ascii="Consolas" w:hAnsi="Consolas"/>
+          <w:sz w:val="19"/>
+        </w:rPr>
+        <w:t>POST /api/v1/sales/debt/collection-cancel</w:t>
+      </w:r>
+      <w:r>
+        <w:t xml:space="preserve"> (API </w:t>
+      </w:r>
+      <w:r>
+        <w:rPr>
+          <w:rFonts w:ascii="Consolas" w:hAnsi="Consolas"/>
+          <w:sz w:val="19"/>
+        </w:rPr>
+        <w:t>66ba289</w:t>
+      </w:r>
+      <w:r>
+        <w:t xml:space="preserve">, sửa </w:t>
+      </w:r>
+      <w:r>
+        <w:rPr>
+          <w:rFonts w:ascii="Consolas" w:hAnsi="Consolas"/>
+          <w:sz w:val="19"/>
+        </w:rPr>
+        <w:t>95d58bb</w:t>
       </w:r>
       <w:r>
         <w:t xml:space="preserve">, </w:t>
@@ -31840,17 +32440,91 @@
           <w:rFonts w:ascii="Consolas" w:hAnsi="Consolas"/>
           <w:sz w:val="19"/>
         </w:rPr>
-        <w:t>BANK_LOCAL</w:t>
-      </w:r>
-      <w:r>
-        <w:t xml:space="preserve">) và gửi tỷ giá cứng </w:t>
-      </w:r>
-      <w:r>
-        <w:rPr>
-          <w:rFonts w:ascii="Consolas" w:hAnsi="Consolas"/>
-          <w:sz w:val="19"/>
-        </w:rPr>
-        <w:t>rate: 1</w:t>
+        <w:t>97d5a91</w:t>
+      </w:r>
+      <w:r>
+        <w:t xml:space="preserve">; script </w:t>
+      </w:r>
+      <w:r>
+        <w:rPr>
+          <w:rFonts w:ascii="Consolas" w:hAnsi="Consolas"/>
+          <w:sz w:val="19"/>
+        </w:rPr>
+        <w:t>20261002_sales_debt_collection_cancel.sql</w:t>
+      </w:r>
+      <w:r>
+        <w:t xml:space="preserve">). Huỷ </w:t>
+      </w:r>
+      <w:r>
+        <w:rPr>
+          <w:b/>
+        </w:rPr>
+        <w:t>cả cụm</w:t>
+      </w:r>
+      <w:r>
+        <w:t xml:space="preserve"> trong một transaction: gỡ ghi sổ phiếu thu CMR 17, đưa ST về 1, xoá CMR theo đường legacy, trả lại dư nợ đúng số nguyên tệ đã trừ, vô hiệu phiếu thu nợ RES. Bên em </w:t>
+      </w:r>
+      <w:r>
+        <w:rPr>
+          <w:b/>
+        </w:rPr>
+        <w:t>không gọi</w:t>
+      </w:r>
+      <w:r>
+        <w:t xml:space="preserve"> đường này — kế toán bên anh dùng khi thu nhầm (xoá riêng CMR ở màn phiếu thu là sai sổ: dư nợ không về).</w:t>
+      </w:r>
+    </w:p>
+    <w:p>
+      <w:pPr>
+        <w:pStyle w:val="ListBullet2"/>
+      </w:pPr>
+      <w:r>
+        <w:t xml:space="preserve">Thân: </w:t>
+      </w:r>
+      <w:r>
+        <w:rPr>
+          <w:rFonts w:ascii="Consolas" w:hAnsi="Consolas"/>
+          <w:sz w:val="19"/>
+        </w:rPr>
+        <w:t>{"DocumentNo": "4-TKN-1368-2-…" | "DocumentId": &lt;RDO_DOCUMENTID&gt;, "ReceiptDocumentId": &lt;CMR, tuỳ chọn&gt;, "Reason": "…"}</w:t>
+      </w:r>
+      <w:r>
+        <w:t xml:space="preserve"> — </w:t>
+      </w:r>
+      <w:r>
+        <w:rPr>
+          <w:rFonts w:ascii="Consolas" w:hAnsi="Consolas"/>
+          <w:sz w:val="19"/>
+        </w:rPr>
+        <w:t>Reason</w:t>
+      </w:r>
+      <w:r>
+        <w:t xml:space="preserve"> bắt buộc (≤ 500 ký tự, ghi ở nhật ký kiểm toán); gửi </w:t>
+      </w:r>
+      <w:r>
+        <w:rPr>
+          <w:rFonts w:ascii="Consolas" w:hAnsi="Consolas"/>
+          <w:sz w:val="19"/>
+        </w:rPr>
+        <w:t>ReceiptDocumentId</w:t>
+      </w:r>
+      <w:r>
+        <w:t xml:space="preserve"> để chắc huỷ đúng phiếu.</w:t>
+      </w:r>
+    </w:p>
+    <w:p>
+      <w:pPr>
+        <w:pStyle w:val="ListBullet2"/>
+      </w:pPr>
+      <w:r>
+        <w:t xml:space="preserve">Kết quả: </w:t>
+      </w:r>
+      <w:r>
+        <w:rPr>
+          <w:rFonts w:ascii="Consolas" w:hAnsi="Consolas"/>
+          <w:sz w:val="19"/>
+        </w:rPr>
+        <w:t>DocumentId</w:t>
       </w:r>
       <w:r>
         <w:t xml:space="preserve">, </w:t>
@@ -31860,7 +32534,145 @@
           <w:rFonts w:ascii="Consolas" w:hAnsi="Consolas"/>
           <w:sz w:val="19"/>
         </w:rPr>
-        <w:t>amount = amountCur</w:t>
+        <w:t>DocumentNo</w:t>
+      </w:r>
+      <w:r>
+        <w:t xml:space="preserve">, </w:t>
+      </w:r>
+      <w:r>
+        <w:rPr>
+          <w:rFonts w:ascii="Consolas" w:hAnsi="Consolas"/>
+          <w:sz w:val="19"/>
+        </w:rPr>
+        <w:t>ReceiptDocumentId</w:t>
+      </w:r>
+      <w:r>
+        <w:t xml:space="preserve">, </w:t>
+      </w:r>
+      <w:r>
+        <w:rPr>
+          <w:rFonts w:ascii="Consolas" w:hAnsi="Consolas"/>
+          <w:sz w:val="19"/>
+        </w:rPr>
+        <w:t>ReceiptStatusBefore</w:t>
+      </w:r>
+      <w:r>
+        <w:t xml:space="preserve">, </w:t>
+      </w:r>
+      <w:r>
+        <w:rPr>
+          <w:rFonts w:ascii="Consolas" w:hAnsi="Consolas"/>
+          <w:sz w:val="19"/>
+        </w:rPr>
+        <w:t>RestoredAmount</w:t>
+      </w:r>
+      <w:r>
+        <w:t xml:space="preserve">, </w:t>
+      </w:r>
+      <w:r>
+        <w:rPr>
+          <w:rFonts w:ascii="Consolas" w:hAnsi="Consolas"/>
+          <w:sz w:val="19"/>
+        </w:rPr>
+        <w:t>DebtBefore</w:t>
+      </w:r>
+      <w:r>
+        <w:t xml:space="preserve">, </w:t>
+      </w:r>
+      <w:r>
+        <w:rPr>
+          <w:rFonts w:ascii="Consolas" w:hAnsi="Consolas"/>
+          <w:sz w:val="19"/>
+        </w:rPr>
+        <w:t>DebtAfter</w:t>
+      </w:r>
+      <w:r>
+        <w:t xml:space="preserve">, </w:t>
+      </w:r>
+      <w:r>
+        <w:rPr>
+          <w:rFonts w:ascii="Consolas" w:hAnsi="Consolas"/>
+          <w:sz w:val="19"/>
+        </w:rPr>
+        <w:t>AlreadyCancelled</w:t>
+      </w:r>
+      <w:r>
+        <w:t xml:space="preserve"> (gọi lại phiếu đã huỷ → </w:t>
+      </w:r>
+      <w:r>
+        <w:rPr>
+          <w:rFonts w:ascii="Consolas" w:hAnsi="Consolas"/>
+          <w:sz w:val="19"/>
+        </w:rPr>
+        <w:t>true</w:t>
+      </w:r>
+      <w:r>
+        <w:t>, không đổi gì).</w:t>
+      </w:r>
+    </w:p>
+    <w:p>
+      <w:pPr>
+        <w:pStyle w:val="ListBullet2"/>
+      </w:pPr>
+      <w:r>
+        <w:rPr>
+          <w:b/>
+        </w:rPr>
+        <w:t>Quyền:</w:t>
+      </w:r>
+      <w:r>
+        <w:t xml:space="preserve"> mục cấu hình </w:t>
+      </w:r>
+      <w:r>
+        <w:rPr>
+          <w:rFonts w:ascii="Consolas" w:hAnsi="Consolas"/>
+          <w:sz w:val="19"/>
+        </w:rPr>
+        <w:t>SalesDebtCollectionCancel.AllowedUserIds</w:t>
+      </w:r>
+      <w:r>
+        <w:t xml:space="preserve"> (claim </w:t>
+      </w:r>
+      <w:r>
+        <w:rPr>
+          <w:rFonts w:ascii="Consolas" w:hAnsi="Consolas"/>
+          <w:sz w:val="19"/>
+        </w:rPr>
+        <w:t>UserId</w:t>
+      </w:r>
+      <w:r>
+        <w:t xml:space="preserve">). Thiếu mục → 503 </w:t>
+      </w:r>
+      <w:r>
+        <w:rPr>
+          <w:rFonts w:ascii="Consolas" w:hAnsi="Consolas"/>
+          <w:sz w:val="19"/>
+        </w:rPr>
+        <w:t>DEBT_COLLECTION_CANCEL_NOT_CONFIGURED</w:t>
+      </w:r>
+      <w:r>
+        <w:t xml:space="preserve">; ngoài danh sách → 403 </w:t>
+      </w:r>
+      <w:r>
+        <w:rPr>
+          <w:rFonts w:ascii="Consolas" w:hAnsi="Consolas"/>
+          <w:sz w:val="19"/>
+        </w:rPr>
+        <w:t>DEBT_COLLECTION_CANCEL_FORBIDDEN</w:t>
+      </w:r>
+      <w:r>
+        <w:t>.</w:t>
+      </w:r>
+    </w:p>
+    <w:p>
+      <w:pPr>
+        <w:pStyle w:val="ListBullet2"/>
+      </w:pPr>
+      <w:r>
+        <w:rPr>
+          <w:b/>
+        </w:rPr>
+        <w:t>Mã lỗi</w:t>
       </w:r>
       <w:r>
         <w:t xml:space="preserve"> (</w:t>
@@ -31870,16 +32682,294 @@
           <w:rFonts w:ascii="Consolas" w:hAnsi="Consolas"/>
           <w:sz w:val="19"/>
         </w:rPr>
-        <w:t>debtCollectionCustomerDetail.js</w:t>
-      </w:r>
-      <w:r>
-        <w:t xml:space="preserve">), nên SO USD bị ghi số USD thành Kíp — đang sửa (UI-4); (2) mọi SO tạo từ trang điều xe mang </w:t>
-      </w:r>
+        <w:t>ErrorDetail.ErrorCode</w:t>
+      </w:r>
+      <w:r>
+        <w:t xml:space="preserve">) </w:t>
+      </w:r>
+      <w:r>
+        <w:rPr>
+          <w:rFonts w:ascii="Consolas" w:hAnsi="Consolas"/>
+          <w:sz w:val="19"/>
+        </w:rPr>
+        <w:t>DEBT_COLLECTION_CANCEL_52760</w:t>
+      </w:r>
+      <w:r>
+        <w:t xml:space="preserve"> – </w:t>
+      </w:r>
+      <w:r>
+        <w:rPr>
+          <w:rFonts w:ascii="Consolas" w:hAnsi="Consolas"/>
+          <w:sz w:val="19"/>
+        </w:rPr>
+        <w:t>52777</w:t>
+      </w:r>
+      <w:r>
+        <w:t>: 400 đầu vào (</w:t>
+      </w:r>
+      <w:r>
+        <w:rPr>
+          <w:rFonts w:ascii="Consolas" w:hAnsi="Consolas"/>
+          <w:sz w:val="19"/>
+        </w:rPr>
+        <w:t>52760</w:t>
+      </w:r>
+      <w:r>
+        <w:t xml:space="preserve">, </w:t>
+      </w:r>
+      <w:r>
+        <w:rPr>
+          <w:rFonts w:ascii="Consolas" w:hAnsi="Consolas"/>
+          <w:sz w:val="19"/>
+        </w:rPr>
+        <w:t>52763</w:t>
+      </w:r>
+      <w:r>
+        <w:t>); 404 không có phiếu (</w:t>
+      </w:r>
+      <w:r>
+        <w:rPr>
+          <w:rFonts w:ascii="Consolas" w:hAnsi="Consolas"/>
+          <w:sz w:val="19"/>
+        </w:rPr>
+        <w:t>52762</w:t>
+      </w:r>
+      <w:r>
+        <w:t>); 409 phiếu CMR gửi kèm sai (</w:t>
+      </w:r>
+      <w:r>
+        <w:rPr>
+          <w:rFonts w:ascii="Consolas" w:hAnsi="Consolas"/>
+          <w:sz w:val="19"/>
+        </w:rPr>
+        <w:t>52764</w:t>
+      </w:r>
+      <w:r>
+        <w:t>), không / nhiều CMR hoạt động hoặc lệch liên kết (</w:t>
+      </w:r>
+      <w:r>
+        <w:rPr>
+          <w:rFonts w:ascii="Consolas" w:hAnsi="Consolas"/>
+          <w:sz w:val="19"/>
+        </w:rPr>
+        <w:t>52765</w:t>
+      </w:r>
+      <w:r>
+        <w:t xml:space="preserve">, </w:t>
+      </w:r>
+      <w:r>
+        <w:rPr>
+          <w:rFonts w:ascii="Consolas" w:hAnsi="Consolas"/>
+          <w:sz w:val="19"/>
+        </w:rPr>
+        <w:t>52766</w:t>
+      </w:r>
+      <w:r>
+        <w:t xml:space="preserve">, </w:t>
+      </w:r>
+      <w:r>
+        <w:rPr>
+          <w:rFonts w:ascii="Consolas" w:hAnsi="Consolas"/>
+          <w:sz w:val="19"/>
+        </w:rPr>
+        <w:t>52775</w:t>
+      </w:r>
+      <w:r>
+        <w:t>), kỳ đã khoá (</w:t>
+      </w:r>
+      <w:r>
+        <w:rPr>
+          <w:rFonts w:ascii="Consolas" w:hAnsi="Consolas"/>
+          <w:sz w:val="19"/>
+        </w:rPr>
+        <w:t>52767</w:t>
+      </w:r>
+      <w:r>
+        <w:t>), đang huỷ ở phiên khác (</w:t>
+      </w:r>
+      <w:r>
+        <w:rPr>
+          <w:rFonts w:ascii="Consolas" w:hAnsi="Consolas"/>
+          <w:sz w:val="19"/>
+        </w:rPr>
+        <w:t>52769</w:t>
+      </w:r>
+      <w:r>
+        <w:t>), gỡ / xoá / trả nợ / vô hiệu không hoàn tất (</w:t>
+      </w:r>
+      <w:r>
+        <w:rPr>
+          <w:rFonts w:ascii="Consolas" w:hAnsi="Consolas"/>
+          <w:sz w:val="19"/>
+        </w:rPr>
+        <w:t>52770</w:t>
+      </w:r>
+      <w:r>
+        <w:t xml:space="preserve"> – </w:t>
+      </w:r>
+      <w:r>
+        <w:rPr>
+          <w:rFonts w:ascii="Consolas" w:hAnsi="Consolas"/>
+          <w:sz w:val="19"/>
+        </w:rPr>
+        <w:t>52774</w:t>
+      </w:r>
+      <w:r>
+        <w:t xml:space="preserve">, </w:t>
+      </w:r>
+      <w:r>
+        <w:rPr>
+          <w:rFonts w:ascii="Consolas" w:hAnsi="Consolas"/>
+          <w:sz w:val="19"/>
+        </w:rPr>
+        <w:t>52776</w:t>
+      </w:r>
+      <w:r>
+        <w:t>, đã rollback); 422 tỷ giá khác 1 mà không chắc số đã trừ (</w:t>
+      </w:r>
+      <w:r>
+        <w:rPr>
+          <w:rFonts w:ascii="Consolas" w:hAnsi="Consolas"/>
+          <w:sz w:val="19"/>
+        </w:rPr>
+        <w:t>52768</w:t>
+      </w:r>
+      <w:r>
+        <w:t>); 503 thiếu thủ tục nền (</w:t>
+      </w:r>
+      <w:r>
+        <w:rPr>
+          <w:rFonts w:ascii="Consolas" w:hAnsi="Consolas"/>
+          <w:sz w:val="19"/>
+        </w:rPr>
+        <w:t>52761</w:t>
+      </w:r>
+      <w:r>
+        <w:t>) hoặc chưa áp script (</w:t>
+      </w:r>
+      <w:r>
+        <w:rPr>
+          <w:rFonts w:ascii="Consolas" w:hAnsi="Consolas"/>
+          <w:sz w:val="19"/>
+        </w:rPr>
+        <w:t>DEBT_COLLECTION_CANCEL_SCRIPT_REQUIRED</w:t>
+      </w:r>
+      <w:r>
+        <w:t xml:space="preserve">); </w:t>
+      </w:r>
+      <w:r>
+        <w:rPr>
+          <w:rFonts w:ascii="Consolas" w:hAnsi="Consolas"/>
+          <w:sz w:val="19"/>
+        </w:rPr>
+        <w:t>52777</w:t>
+      </w:r>
+      <w:r>
+        <w:t xml:space="preserve"> gọi trong transaction. Bảng đủ: tài liệu của anh mục 16.11.</w:t>
+      </w:r>
+    </w:p>
+    <w:p>
+      <w:pPr>
+        <w:pStyle w:val="ListBullet2"/>
+      </w:pPr>
       <w:r>
         <w:rPr>
           <w:b/>
         </w:rPr>
-        <w:t>cùng một mã phiếu bán</w:t>
+        <w:t>Chạy thật DB demo 02/10:</w:t>
+      </w:r>
+      <w:r>
+        <w:t xml:space="preserve"> huỷ CMR 81423 / 81424 (SO USD ghi thành Kíp trước bản sửa) — phải áp script ba lần (legacy gỡ sổ không đổi </w:t>
+      </w:r>
+      <w:r>
+        <w:rPr>
+          <w:rFonts w:ascii="Consolas" w:hAnsi="Consolas"/>
+          <w:sz w:val="19"/>
+        </w:rPr>
+        <w:t>CMRECEIPT.ST_AUTOID</w:t>
+      </w:r>
+      <w:r>
+        <w:t xml:space="preserve">; </w:t>
+      </w:r>
+      <w:r>
+        <w:rPr>
+          <w:rFonts w:ascii="Consolas" w:hAnsi="Consolas"/>
+          <w:sz w:val="19"/>
+        </w:rPr>
+        <w:t>SP_CMR_DELETEMCMR_CMRECEIPT</w:t>
+      </w:r>
+      <w:r>
+        <w:t xml:space="preserve"> trả </w:t>
+      </w:r>
+      <w:r>
+        <w:rPr>
+          <w:rFonts w:ascii="Consolas" w:hAnsi="Consolas"/>
+          <w:sz w:val="19"/>
+        </w:rPr>
+        <w:t>'2'</w:t>
+      </w:r>
+      <w:r>
+        <w:t xml:space="preserve"> khi ST 12), lần ba thành công; thu lại CMR </w:t>
+      </w:r>
+      <w:r>
+        <w:rPr>
+          <w:rFonts w:ascii="Consolas" w:hAnsi="Consolas"/>
+          <w:sz w:val="19"/>
+        </w:rPr>
+        <w:t>4-1368-TK-261002-00001</w:t>
+      </w:r>
+      <w:r>
+        <w:t xml:space="preserve">, </w:t>
+      </w:r>
+      <w:r>
+        <w:rPr>
+          <w:rFonts w:ascii="Consolas" w:hAnsi="Consolas"/>
+          <w:sz w:val="19"/>
+        </w:rPr>
+        <w:t>…00002</w:t>
+      </w:r>
+      <w:r>
+        <w:t xml:space="preserve"> (Nợ 1012 / Có 1211, tỷ giá 22.000).</w:t>
+      </w:r>
+    </w:p>
+    <w:p>
+      <w:pPr>
+        <w:pStyle w:val="ListBullet2"/>
+      </w:pPr>
+      <w:r>
+        <w:t>Còn mở: khoảng 60 TKN cũ (tháng 7 – 9) đang hoạt động mà không có CMR (chẩn đoán D6) — dữ liệu demo có sẵn, chờ anh Tune quyết; WEB chưa có nút Huỷ.</w:t>
+      </w:r>
+    </w:p>
+    <w:p>
+      <w:pPr>
+        <w:pStyle w:val="ListBullet"/>
+      </w:pPr>
+      <w:r>
+        <w:rPr>
+          <w:rFonts w:ascii="Consolas" w:hAnsi="Consolas"/>
+          <w:sz w:val="19"/>
+        </w:rPr>
+        <w:t>RETK_CODE</w:t>
+      </w:r>
+      <w:r>
+        <w:t xml:space="preserve"> trùng ("Demo EPL-2-261001000" cho mọi SO): </w:t>
+      </w:r>
+      <w:r>
+        <w:rPr>
+          <w:rFonts w:ascii="Consolas" w:hAnsi="Consolas"/>
+          <w:sz w:val="19"/>
+        </w:rPr>
+        <w:t>sp_RES_Create_RESTICKET</w:t>
+      </w:r>
+      <w:r>
+        <w:t xml:space="preserve"> cắt mã 20 ký tự, mã chi nhánh "Demo EPL" dài 8 ký tự — chưa sửa nguồn. Khoá đúng của đơn là </w:t>
+      </w:r>
+      <w:r>
+        <w:rPr>
+          <w:rFonts w:ascii="Consolas" w:hAnsi="Consolas"/>
+          <w:sz w:val="19"/>
+        </w:rPr>
+        <w:t>OrderCode</w:t>
       </w:r>
       <w:r>
         <w:t xml:space="preserve"> (</w:t>
@@ -31889,10 +32979,30 @@
           <w:rFonts w:ascii="Consolas" w:hAnsi="Consolas"/>
           <w:sz w:val="19"/>
         </w:rPr>
+        <w:t>TK-…</w:t>
+      </w:r>
+      <w:r>
+        <w:t xml:space="preserve">); bên em ghép "đã thu" theo </w:t>
+      </w:r>
+      <w:r>
+        <w:rPr>
+          <w:rFonts w:ascii="Consolas" w:hAnsi="Consolas"/>
+          <w:sz w:val="19"/>
+        </w:rPr>
+        <w:t>OrderCode</w:t>
+      </w:r>
+      <w:r>
+        <w:t xml:space="preserve">, không theo </w:t>
+      </w:r>
+      <w:r>
+        <w:rPr>
+          <w:rFonts w:ascii="Consolas" w:hAnsi="Consolas"/>
+          <w:sz w:val="19"/>
+        </w:rPr>
         <w:t>RETK_CODE</w:t>
       </w:r>
       <w:r>
-        <w:t>) "Demo EPL-2-261001000" — đang tìm nguồn (UI-4).</w:t>
+        <w:t>.</w:t>
       </w:r>
     </w:p>
     <w:p>
@@ -35420,6 +36530,79 @@
       </w:r>
       <w:r>
         <w:t xml:space="preserve"> 11).</w:t>
+      </w:r>
+    </w:p>
+    <w:p>
+      <w:pPr>
+        <w:pStyle w:val="ListBullet"/>
+      </w:pPr>
+      <w:r>
+        <w:rPr>
+          <w:b/>
+        </w:rPr>
+        <w:t>Kế toán bên anh xem bút toán</w:t>
+      </w:r>
+      <w:r>
+        <w:t xml:space="preserve"> ở màn WEB </w:t>
+      </w:r>
+      <w:r>
+        <w:rPr>
+          <w:b/>
+        </w:rPr>
+        <w:t>"Bút toán từ Logistics"</w:t>
+      </w:r>
+      <w:r>
+        <w:t xml:space="preserve"> (</w:t>
+      </w:r>
+      <w:r>
+        <w:rPr>
+          <w:rFonts w:ascii="Consolas" w:hAnsi="Consolas"/>
+          <w:sz w:val="19"/>
+        </w:rPr>
+        <w:t>/LogisticsJournalEntry/Index</w:t>
+      </w:r>
+      <w:r>
+        <w:t xml:space="preserve">, chỉ đọc; API </w:t>
+      </w:r>
+      <w:r>
+        <w:rPr>
+          <w:rFonts w:ascii="Consolas" w:hAnsi="Consolas"/>
+          <w:sz w:val="19"/>
+        </w:rPr>
+        <w:t>6f91fd2</w:t>
+      </w:r>
+      <w:r>
+        <w:t xml:space="preserve">, WEB </w:t>
+      </w:r>
+      <w:r>
+        <w:rPr>
+          <w:rFonts w:ascii="Consolas" w:hAnsi="Consolas"/>
+          <w:sz w:val="19"/>
+        </w:rPr>
+        <w:t>6abe0ad8</w:t>
+      </w:r>
+      <w:r>
+        <w:t xml:space="preserve">; script </w:t>
+      </w:r>
+      <w:r>
+        <w:rPr>
+          <w:rFonts w:ascii="Consolas" w:hAnsi="Consolas"/>
+          <w:sz w:val="19"/>
+        </w:rPr>
+        <w:t>20261002_logistics_journal_entry_list.sql</w:t>
+      </w:r>
+      <w:r>
+        <w:t xml:space="preserve"> đã áp DB demo 02/10; menu </w:t>
+      </w:r>
+      <w:r>
+        <w:rPr>
+          <w:rFonts w:ascii="Consolas" w:hAnsi="Consolas"/>
+          <w:sz w:val="19"/>
+        </w:rPr>
+        <w:t>LOGISTICS_JOURNAL_ENTRY</w:t>
+      </w:r>
+      <w:r>
+        <w:t xml:space="preserve"> nhóm Kế toán — DB demo đã thêm, MenuId 154). Đã kiểm thật: danh sách 200, tài khoản anh Tune đăng nhập WEB mở màn được (cổng đọc theo chi nhánh đã gán). Ghi sổ chính thức / gỡ vẫn làm trong QLSX như chứng từ tổng hợp khác.</w:t>
       </w:r>
     </w:p>
     <w:p>
@@ -37687,7 +38870,17 @@
         <w:t>JOURNAL_ENTRY_NOT_FOUND</w:t>
       </w:r>
       <w:r>
-        <w:t xml:space="preserve"> khi không có (kể cả đã gỡ). Nút </w:t>
+        <w:t xml:space="preserve"> khi không có (kể cả đã gỡ, và chứng từ thuộc đơn vị khác </w:t>
+      </w:r>
+      <w:r>
+        <w:rPr>
+          <w:rFonts w:ascii="Consolas" w:hAnsi="Consolas"/>
+          <w:sz w:val="19"/>
+        </w:rPr>
+        <w:t>OrgId</w:t>
+      </w:r>
+      <w:r>
+        <w:t xml:space="preserve">). Nút </w:t>
       </w:r>
       <w:r>
         <w:rPr>
@@ -37707,6 +38900,372 @@
         <w:rPr>
           <w:b/>
         </w:rPr>
+        <w:t>Liệt kê</w:t>
+      </w:r>
+      <w:r>
+        <w:t xml:space="preserve"> (màn WEB bên anh; bên em </w:t>
+      </w:r>
+      <w:r>
+        <w:rPr>
+          <w:b/>
+        </w:rPr>
+        <w:t>không gọi</w:t>
+      </w:r>
+      <w:r>
+        <w:t xml:space="preserve">) — </w:t>
+      </w:r>
+      <w:r>
+        <w:rPr>
+          <w:rFonts w:ascii="Consolas" w:hAnsi="Consolas"/>
+          <w:sz w:val="19"/>
+        </w:rPr>
+        <w:t>GET …/journal-entries?fromDate&amp;toDate&amp;statusId&amp;keyword&amp;pageIndex&amp;pageSize</w:t>
+      </w:r>
+      <w:r>
+        <w:t xml:space="preserve"> (ngày </w:t>
+      </w:r>
+      <w:r>
+        <w:rPr>
+          <w:rFonts w:ascii="Consolas" w:hAnsi="Consolas"/>
+          <w:sz w:val="19"/>
+        </w:rPr>
+        <w:t>yyyy-MM-dd</w:t>
+      </w:r>
+      <w:r>
+        <w:t xml:space="preserve"> gồm hai đầu; </w:t>
+      </w:r>
+      <w:r>
+        <w:rPr>
+          <w:rFonts w:ascii="Consolas" w:hAnsi="Consolas"/>
+          <w:sz w:val="19"/>
+        </w:rPr>
+        <w:t>keyword</w:t>
+      </w:r>
+      <w:r>
+        <w:t xml:space="preserve"> ≤ 100 ký tự tìm trong số chứng từ / SourceRef / diễn giải; </w:t>
+      </w:r>
+      <w:r>
+        <w:rPr>
+          <w:rFonts w:ascii="Consolas" w:hAnsi="Consolas"/>
+          <w:sz w:val="19"/>
+        </w:rPr>
+        <w:t>pageSize</w:t>
+      </w:r>
+      <w:r>
+        <w:t xml:space="preserve"> 1–200, mặc định 20). Chỉ chứng từ SourceRef </w:t>
+      </w:r>
+      <w:r>
+        <w:rPr>
+          <w:rFonts w:ascii="Consolas" w:hAnsi="Consolas"/>
+          <w:sz w:val="19"/>
+        </w:rPr>
+        <w:t>EPLLAO-…</w:t>
+      </w:r>
+      <w:r>
+        <w:t xml:space="preserve"> của đơn vị cấu hình, có </w:t>
+      </w:r>
+      <w:r>
+        <w:rPr>
+          <w:rFonts w:ascii="Consolas" w:hAnsi="Consolas"/>
+          <w:sz w:val="19"/>
+        </w:rPr>
+        <w:t>GLBUSINESS</w:t>
+      </w:r>
+      <w:r>
+        <w:t xml:space="preserve"> (chứng từ con của ghi sổ không hiện), mới nhất trước. </w:t>
+      </w:r>
+      <w:r>
+        <w:rPr>
+          <w:rFonts w:ascii="Consolas" w:hAnsi="Consolas"/>
+          <w:sz w:val="19"/>
+        </w:rPr>
+        <w:t>Result</w:t>
+      </w:r>
+      <w:r>
+        <w:t xml:space="preserve">: </w:t>
+      </w:r>
+      <w:r>
+        <w:rPr>
+          <w:rFonts w:ascii="Consolas" w:hAnsi="Consolas"/>
+          <w:sz w:val="19"/>
+        </w:rPr>
+        <w:t>Items[] {DocumentId, DocumentNo, SourceRef, SourceType, DocumentDate, FiciAutoId, StatusId, IsLocked, Description, LineCount, TotalBaseAmount, CreatedDate}</w:t>
+      </w:r>
+      <w:r>
+        <w:t xml:space="preserve">, </w:t>
+      </w:r>
+      <w:r>
+        <w:rPr>
+          <w:rFonts w:ascii="Consolas" w:hAnsi="Consolas"/>
+          <w:sz w:val="19"/>
+        </w:rPr>
+        <w:t>TotalCount</w:t>
+      </w:r>
+      <w:r>
+        <w:t xml:space="preserve">, </w:t>
+      </w:r>
+      <w:r>
+        <w:rPr>
+          <w:rFonts w:ascii="Consolas" w:hAnsi="Consolas"/>
+          <w:sz w:val="19"/>
+        </w:rPr>
+        <w:t>PageIndex</w:t>
+      </w:r>
+      <w:r>
+        <w:t xml:space="preserve">, </w:t>
+      </w:r>
+      <w:r>
+        <w:rPr>
+          <w:rFonts w:ascii="Consolas" w:hAnsi="Consolas"/>
+          <w:sz w:val="19"/>
+        </w:rPr>
+        <w:t>PageSize</w:t>
+      </w:r>
+      <w:r>
+        <w:t xml:space="preserve">, </w:t>
+      </w:r>
+      <w:r>
+        <w:rPr>
+          <w:rFonts w:ascii="Consolas" w:hAnsi="Consolas"/>
+          <w:sz w:val="19"/>
+        </w:rPr>
+        <w:t>StatusSummary</w:t>
+      </w:r>
+      <w:r>
+        <w:t xml:space="preserve">, </w:t>
+      </w:r>
+      <w:r>
+        <w:rPr>
+          <w:rFonts w:ascii="Consolas" w:hAnsi="Consolas"/>
+          <w:sz w:val="19"/>
+        </w:rPr>
+        <w:t>Currencies</w:t>
+      </w:r>
+      <w:r>
+        <w:t xml:space="preserve">, </w:t>
+      </w:r>
+      <w:r>
+        <w:rPr>
+          <w:rFonts w:ascii="Consolas" w:hAnsi="Consolas"/>
+          <w:sz w:val="19"/>
+        </w:rPr>
+        <w:t>Objects</w:t>
+      </w:r>
+      <w:r>
+        <w:t xml:space="preserve">. </w:t>
+      </w:r>
+      <w:r>
+        <w:rPr>
+          <w:rFonts w:ascii="Consolas" w:hAnsi="Consolas"/>
+          <w:sz w:val="19"/>
+        </w:rPr>
+        <w:t>SourceType</w:t>
+      </w:r>
+      <w:r>
+        <w:t xml:space="preserve"> = đoạn nguồn trong SourceRef (</w:t>
+      </w:r>
+      <w:r>
+        <w:rPr>
+          <w:rFonts w:ascii="Consolas" w:hAnsi="Consolas"/>
+          <w:sz w:val="19"/>
+        </w:rPr>
+        <w:t>thue_xe</w:t>
+      </w:r>
+      <w:r>
+        <w:t xml:space="preserve">, </w:t>
+      </w:r>
+      <w:r>
+        <w:rPr>
+          <w:rFonts w:ascii="Consolas" w:hAnsi="Consolas"/>
+          <w:sz w:val="19"/>
+        </w:rPr>
+        <w:t>no_ncc</w:t>
+      </w:r>
+      <w:r>
+        <w:t xml:space="preserve">, </w:t>
+      </w:r>
+      <w:r>
+        <w:rPr>
+          <w:rFonts w:ascii="Consolas" w:hAnsi="Consolas"/>
+          <w:sz w:val="19"/>
+        </w:rPr>
+        <w:t>xuat_noi_bo</w:t>
+      </w:r>
+      <w:r>
+        <w:t xml:space="preserve">, </w:t>
+      </w:r>
+      <w:r>
+        <w:rPr>
+          <w:rFonts w:ascii="Consolas" w:hAnsi="Consolas"/>
+          <w:sz w:val="19"/>
+        </w:rPr>
+        <w:t>xuat_ban</w:t>
+      </w:r>
+      <w:r>
+        <w:t xml:space="preserve">, </w:t>
+      </w:r>
+      <w:r>
+        <w:rPr>
+          <w:rFonts w:ascii="Consolas" w:hAnsi="Consolas"/>
+          <w:sz w:val="19"/>
+        </w:rPr>
+        <w:t>tat_toan</w:t>
+      </w:r>
+      <w:r>
+        <w:t xml:space="preserve">, </w:t>
+      </w:r>
+      <w:r>
+        <w:rPr>
+          <w:rFonts w:ascii="Consolas" w:hAnsi="Consolas"/>
+          <w:sz w:val="19"/>
+        </w:rPr>
+        <w:t>ban_chu_xe</w:t>
+      </w:r>
+      <w:r>
+        <w:t xml:space="preserve">). Lỗi: 400 </w:t>
+      </w:r>
+      <w:r>
+        <w:rPr>
+          <w:rFonts w:ascii="Consolas" w:hAnsi="Consolas"/>
+          <w:sz w:val="19"/>
+        </w:rPr>
+        <w:t>INVALID_JOURNAL_LIST_QUERY</w:t>
+      </w:r>
+      <w:r>
+        <w:t xml:space="preserve">; 403 </w:t>
+      </w:r>
+      <w:r>
+        <w:rPr>
+          <w:rFonts w:ascii="Consolas" w:hAnsi="Consolas"/>
+          <w:sz w:val="19"/>
+        </w:rPr>
+        <w:t>LOGISTICS_JOURNAL_READ_FORBIDDEN</w:t>
+      </w:r>
+      <w:r>
+        <w:t xml:space="preserve">; 503 </w:t>
+      </w:r>
+      <w:r>
+        <w:rPr>
+          <w:rFonts w:ascii="Consolas" w:hAnsi="Consolas"/>
+          <w:sz w:val="19"/>
+        </w:rPr>
+        <w:t>LOGISTICS_JOURNAL_SCRIPT_REQUIRED</w:t>
+      </w:r>
+      <w:r>
+        <w:t xml:space="preserve"> khi chưa áp </w:t>
+      </w:r>
+      <w:r>
+        <w:rPr>
+          <w:rFonts w:ascii="Consolas" w:hAnsi="Consolas"/>
+          <w:sz w:val="19"/>
+        </w:rPr>
+        <w:t>20261002_logistics_journal_entry_list.sql</w:t>
+      </w:r>
+      <w:r>
+        <w:t>.</w:t>
+      </w:r>
+    </w:p>
+    <w:p>
+      <w:pPr>
+        <w:jc w:val="both"/>
+      </w:pPr>
+      <w:r>
+        <w:rPr>
+          <w:b/>
+        </w:rPr>
+        <w:t>Cổng đọc</w:t>
+      </w:r>
+      <w:r>
+        <w:t xml:space="preserve"> (liệt kê và </w:t>
+      </w:r>
+      <w:r>
+        <w:rPr>
+          <w:rFonts w:ascii="Consolas" w:hAnsi="Consolas"/>
+          <w:sz w:val="19"/>
+        </w:rPr>
+        <w:t>GET {SourceRef}</w:t>
+      </w:r>
+      <w:r>
+        <w:t xml:space="preserve">, từ </w:t>
+      </w:r>
+      <w:r>
+        <w:rPr>
+          <w:rFonts w:ascii="Consolas" w:hAnsi="Consolas"/>
+          <w:sz w:val="19"/>
+        </w:rPr>
+        <w:t>6f91fd2</w:t>
+      </w:r>
+      <w:r>
+        <w:t xml:space="preserve">): được đọc khi </w:t>
+      </w:r>
+      <w:r>
+        <w:rPr>
+          <w:rFonts w:ascii="Consolas" w:hAnsi="Consolas"/>
+          <w:sz w:val="19"/>
+        </w:rPr>
+        <w:t>UserId</w:t>
+      </w:r>
+      <w:r>
+        <w:t xml:space="preserve"> trong </w:t>
+      </w:r>
+      <w:r>
+        <w:rPr>
+          <w:rFonts w:ascii="Consolas" w:hAnsi="Consolas"/>
+          <w:sz w:val="19"/>
+        </w:rPr>
+        <w:t>AllowedUserIds</w:t>
+      </w:r>
+      <w:r>
+        <w:t xml:space="preserve">, </w:t>
+      </w:r>
+      <w:r>
+        <w:rPr>
+          <w:b/>
+        </w:rPr>
+        <w:t>hoặc</w:t>
+      </w:r>
+      <w:r>
+        <w:t xml:space="preserve"> người dùng thuộc đơn vị </w:t>
+      </w:r>
+      <w:r>
+        <w:rPr>
+          <w:rFonts w:ascii="Consolas" w:hAnsi="Consolas"/>
+          <w:sz w:val="19"/>
+        </w:rPr>
+        <w:t>OrgId</w:t>
+      </w:r>
+      <w:r>
+        <w:t xml:space="preserve"> (claim </w:t>
+      </w:r>
+      <w:r>
+        <w:rPr>
+          <w:rFonts w:ascii="Consolas" w:hAnsi="Consolas"/>
+          <w:sz w:val="19"/>
+        </w:rPr>
+        <w:t>BranchId</w:t>
+      </w:r>
+      <w:r>
+        <w:t xml:space="preserve">, hoặc chi nhánh đã gán cho tài khoản). Tạo / gỡ vẫn chỉ cho </w:t>
+      </w:r>
+      <w:r>
+        <w:rPr>
+          <w:rFonts w:ascii="Consolas" w:hAnsi="Consolas"/>
+          <w:sz w:val="19"/>
+        </w:rPr>
+        <w:t>AllowedUserIds</w:t>
+      </w:r>
+      <w:r>
+        <w:t xml:space="preserve"> — token trang điều xe (846) đọc được như cũ.</w:t>
+      </w:r>
+    </w:p>
+    <w:p>
+      <w:pPr>
+        <w:jc w:val="both"/>
+      </w:pPr>
+      <w:r>
+        <w:rPr>
+          <w:b/>
+        </w:rPr>
         <w:t>Mất phản hồi — bên em giữ cho hai sổ không lệch</w:t>
       </w:r>
       <w:r>
@@ -37809,10 +39368,20 @@
         <w:rPr>
           <w:b/>
         </w:rPr>
-        <w:t>Lỗi bên em đọc.</w:t>
-      </w:r>
-      <w:r>
-        <w:t xml:space="preserve"> Thân </w:t>
+        <w:t>Lỗi bên em đọc</w:t>
+      </w:r>
+      <w:r>
+        <w:t xml:space="preserve"> (</w:t>
+      </w:r>
+      <w:r>
+        <w:rPr>
+          <w:rFonts w:ascii="Consolas" w:hAnsi="Consolas"/>
+          <w:sz w:val="19"/>
+        </w:rPr>
+        <w:t>3d4ba03</w:t>
+      </w:r>
+      <w:r>
+        <w:t xml:space="preserve">). Thân </w:t>
       </w:r>
       <w:r>
         <w:rPr>
@@ -37832,7 +39401,27 @@
         <w:t>Success: false</w:t>
       </w:r>
       <w:r>
-        <w:t xml:space="preserve">. Mã lỗi đọc ở </w:t>
+        <w:t xml:space="preserve"> — khi đó xếp theo mã thật ở </w:t>
+      </w:r>
+      <w:r>
+        <w:rPr>
+          <w:rFonts w:ascii="Consolas" w:hAnsi="Consolas"/>
+          <w:sz w:val="19"/>
+        </w:rPr>
+        <w:t>Code</w:t>
+      </w:r>
+      <w:r>
+        <w:t xml:space="preserve"> (lỗi chưa bắt bên anh: </w:t>
+      </w:r>
+      <w:r>
+        <w:rPr>
+          <w:rFonts w:ascii="Consolas" w:hAnsi="Consolas"/>
+          <w:sz w:val="19"/>
+        </w:rPr>
+        <w:t>Code</w:t>
+      </w:r>
+      <w:r>
+        <w:t xml:space="preserve"> 500). Mã lỗi đọc ở </w:t>
       </w:r>
       <w:r>
         <w:rPr>
@@ -37842,14 +39431,14 @@
         <w:t>ErrorDetail.ErrorCode</w:t>
       </w:r>
       <w:r>
-        <w:t xml:space="preserve">, danh sách mã tài khoản sai ở </w:t>
-      </w:r>
-      <w:r>
-        <w:rPr>
-          <w:rFonts w:ascii="Consolas" w:hAnsi="Consolas"/>
-          <w:sz w:val="19"/>
-        </w:rPr>
-        <w:t>ErrorDetail.InvalidAccounts</w:t>
+        <w:t xml:space="preserve">; chỉ đoán theo chữ của câu lỗi khi không có </w:t>
+      </w:r>
+      <w:r>
+        <w:rPr>
+          <w:rFonts w:ascii="Consolas" w:hAnsi="Consolas"/>
+          <w:sz w:val="19"/>
+        </w:rPr>
+        <w:t>ErrorCode</w:t>
       </w:r>
       <w:r>
         <w:t>.</w:t>
@@ -37939,6 +39528,19 @@
               </w:rPr>
               <w:t>INVALID_ACCOUNTS</w:t>
             </w:r>
+            <w:r>
+              <w:t xml:space="preserve"> (</w:t>
+            </w:r>
+            <w:r>
+              <w:rPr>
+                <w:rFonts w:ascii="Consolas" w:hAnsi="Consolas"/>
+                <w:sz w:val="19"/>
+              </w:rPr>
+              <w:t>ErrorDetail.InvalidAccounts</w:t>
+            </w:r>
+            <w:r>
+              <w:t>)</w:t>
+            </w:r>
           </w:p>
         </w:tc>
         <w:tc>
@@ -38028,14 +39630,7 @@
           <w:p>
             <w:r/>
             <w:r>
-              <w:t xml:space="preserve">400 / 409 / 422 khác, hoặc HTTP 200 </w:t>
-            </w:r>
-            <w:r>
-              <w:rPr>
-                <w:rFonts w:ascii="Consolas" w:hAnsi="Consolas"/>
-                <w:sz w:val="19"/>
-              </w:rPr>
-              <w:t>Success: false</w:t>
+              <w:t>400 / 409 / 422 khác</w:t>
             </w:r>
           </w:p>
         </w:tc>
@@ -38077,7 +39672,14 @@
           <w:p>
             <w:r/>
             <w:r>
-              <w:t>HTTP 5xx (503 chưa áp script, chưa cấu hình, lỗi DB, đang xử lý cùng SourceRef)</w:t>
+              <w:t xml:space="preserve">403, hoặc </w:t>
+            </w:r>
+            <w:r>
+              <w:rPr>
+                <w:rFonts w:ascii="Consolas" w:hAnsi="Consolas"/>
+                <w:sz w:val="19"/>
+              </w:rPr>
+              <w:t>LOGISTICS_JOURNAL_FORBIDDEN</w:t>
             </w:r>
           </w:p>
         </w:tc>
@@ -38092,10 +39694,7 @@
                 <w:rFonts w:ascii="Consolas" w:hAnsi="Consolas"/>
                 <w:sz w:val="19"/>
               </w:rPr>
-              <w:t>HTTP_5XX</w:t>
-            </w:r>
-            <w:r>
-              <w:t xml:space="preserve"> — chưa rõ</w:t>
+              <w:t>KHONG_DUOC_PHEP</w:t>
             </w:r>
           </w:p>
         </w:tc>
@@ -38106,7 +39705,30 @@
           <w:p>
             <w:r/>
             <w:r>
-              <w:t>lần sau GET trước</w:t>
+              <w:rPr>
+                <w:b/>
+              </w:rPr>
+              <w:t>Gửi hết</w:t>
+            </w:r>
+            <w:r>
+              <w:t xml:space="preserve"> dừng; nhờ anh thêm </w:t>
+            </w:r>
+            <w:r>
+              <w:rPr>
+                <w:rFonts w:ascii="Consolas" w:hAnsi="Consolas"/>
+                <w:sz w:val="19"/>
+              </w:rPr>
+              <w:t>UserId</w:t>
+            </w:r>
+            <w:r>
+              <w:t xml:space="preserve"> vào </w:t>
+            </w:r>
+            <w:r>
+              <w:rPr>
+                <w:rFonts w:ascii="Consolas" w:hAnsi="Consolas"/>
+                <w:sz w:val="19"/>
+              </w:rPr>
+              <w:t>AllowedUserIds</w:t>
             </w:r>
           </w:p>
         </w:tc>
@@ -38119,7 +39741,34 @@
           <w:p>
             <w:r/>
             <w:r>
-              <w:t>mất mạng, hết giờ (30 giây; tự gửi lúc khoá chờ 8 giây)</w:t>
+              <w:t xml:space="preserve">503 </w:t>
+            </w:r>
+            <w:r>
+              <w:rPr>
+                <w:rFonts w:ascii="Consolas" w:hAnsi="Consolas"/>
+                <w:sz w:val="19"/>
+              </w:rPr>
+              <w:t>LOGISTICS_JOURNAL_DISABLED</w:t>
+            </w:r>
+            <w:r>
+              <w:t xml:space="preserve"> / </w:t>
+            </w:r>
+            <w:r>
+              <w:rPr>
+                <w:rFonts w:ascii="Consolas" w:hAnsi="Consolas"/>
+                <w:sz w:val="19"/>
+              </w:rPr>
+              <w:t>_CONFIG_REQUIRED</w:t>
+            </w:r>
+            <w:r>
+              <w:t xml:space="preserve"> / </w:t>
+            </w:r>
+            <w:r>
+              <w:rPr>
+                <w:rFonts w:ascii="Consolas" w:hAnsi="Consolas"/>
+                <w:sz w:val="19"/>
+              </w:rPr>
+              <w:t>_SCRIPT_REQUIRED</w:t>
             </w:r>
           </w:p>
         </w:tc>
@@ -38134,10 +39783,7 @@
                 <w:rFonts w:ascii="Consolas" w:hAnsi="Consolas"/>
                 <w:sz w:val="19"/>
               </w:rPr>
-              <w:t>KHONG_GOI_DUOC</w:t>
-            </w:r>
-            <w:r>
-              <w:t xml:space="preserve"> — chưa rõ</w:t>
+              <w:t>BEN_DO_CHUA_BAT</w:t>
             </w:r>
           </w:p>
         </w:tc>
@@ -38148,16 +39794,13 @@
           <w:p>
             <w:r/>
             <w:r>
-              <w:t xml:space="preserve">lần sau GET trước; </w:t>
-            </w:r>
-            <w:r>
               <w:rPr>
                 <w:b/>
               </w:rPr>
               <w:t>Gửi hết</w:t>
             </w:r>
             <w:r>
-              <w:t xml:space="preserve"> dừng</w:t>
+              <w:t xml:space="preserve"> dừng ngay; bên anh bật xong thì Gửi hết</w:t>
             </w:r>
           </w:p>
         </w:tc>
@@ -38170,7 +39813,17 @@
           <w:p>
             <w:r/>
             <w:r>
-              <w:t>401</w:t>
+              <w:t xml:space="preserve">HTTP 5xx khác, hoặc HTTP 200 với </w:t>
+            </w:r>
+            <w:r>
+              <w:rPr>
+                <w:rFonts w:ascii="Consolas" w:hAnsi="Consolas"/>
+                <w:sz w:val="19"/>
+              </w:rPr>
+              <w:t>Code</w:t>
+            </w:r>
+            <w:r>
+              <w:t xml:space="preserve"> ≥ 500 (lỗi DB, đang xử lý cùng SourceRef, lỗi chưa bắt)</w:t>
             </w:r>
           </w:p>
         </w:tc>
@@ -38185,7 +39838,10 @@
                 <w:rFonts w:ascii="Consolas" w:hAnsi="Consolas"/>
                 <w:sz w:val="19"/>
               </w:rPr>
-              <w:t>QLSX_TOKEN_HET_HAN</w:t>
+              <w:t>HTTP_5XX</w:t>
+            </w:r>
+            <w:r>
+              <w:t xml:space="preserve"> — chưa rõ</w:t>
             </w:r>
           </w:p>
         </w:tc>
@@ -38196,7 +39852,7 @@
           <w:p>
             <w:r/>
             <w:r>
-              <w:t>bỏ token nhớ, lần sau đăng nhập lại</w:t>
+              <w:t>lần sau GET trước</w:t>
             </w:r>
           </w:p>
         </w:tc>
@@ -38209,7 +39865,7 @@
           <w:p>
             <w:r/>
             <w:r>
-              <w:t>404 khi gửi</w:t>
+              <w:t>mất mạng, hết giờ (30 giây; tự gửi lúc khoá chờ 8 giây)</w:t>
             </w:r>
           </w:p>
         </w:tc>
@@ -38224,10 +39880,125 @@
                 <w:rFonts w:ascii="Consolas" w:hAnsi="Consolas"/>
                 <w:sz w:val="19"/>
               </w:rPr>
+              <w:t>KHONG_GOI_DUOC</w:t>
+            </w:r>
+            <w:r>
+              <w:t xml:space="preserve"> — chưa rõ</w:t>
+            </w:r>
+          </w:p>
+        </w:tc>
+        <w:tc>
+          <w:tcPr>
+            <w:tcW w:type="dxa" w:w="2880"/>
+          </w:tcPr>
+          <w:p>
+            <w:r/>
+            <w:r>
+              <w:t xml:space="preserve">lần sau GET trước; </w:t>
+            </w:r>
+            <w:r>
+              <w:rPr>
+                <w:b/>
+              </w:rPr>
+              <w:t>Gửi hết</w:t>
+            </w:r>
+            <w:r>
+              <w:t xml:space="preserve"> dừng</w:t>
+            </w:r>
+          </w:p>
+        </w:tc>
+      </w:tr>
+      <w:tr>
+        <w:tc>
+          <w:tcPr>
+            <w:tcW w:type="dxa" w:w="2880"/>
+          </w:tcPr>
+          <w:p>
+            <w:r/>
+            <w:r>
+              <w:t>401</w:t>
+            </w:r>
+          </w:p>
+        </w:tc>
+        <w:tc>
+          <w:tcPr>
+            <w:tcW w:type="dxa" w:w="2880"/>
+          </w:tcPr>
+          <w:p>
+            <w:r/>
+            <w:r>
+              <w:rPr>
+                <w:rFonts w:ascii="Consolas" w:hAnsi="Consolas"/>
+                <w:sz w:val="19"/>
+              </w:rPr>
+              <w:t>QLSX_TOKEN_HET_HAN</w:t>
+            </w:r>
+          </w:p>
+        </w:tc>
+        <w:tc>
+          <w:tcPr>
+            <w:tcW w:type="dxa" w:w="2880"/>
+          </w:tcPr>
+          <w:p>
+            <w:r/>
+            <w:r>
+              <w:t xml:space="preserve">bỏ token nhớ, lần sau đăng nhập lại; </w:t>
+            </w:r>
+            <w:r>
+              <w:rPr>
+                <w:b/>
+              </w:rPr>
+              <w:t>Gửi hết</w:t>
+            </w:r>
+            <w:r>
+              <w:t xml:space="preserve"> dừng</w:t>
+            </w:r>
+          </w:p>
+        </w:tc>
+      </w:tr>
+      <w:tr>
+        <w:tc>
+          <w:tcPr>
+            <w:tcW w:type="dxa" w:w="2880"/>
+          </w:tcPr>
+          <w:p>
+            <w:r/>
+            <w:r>
+              <w:t xml:space="preserve">404 khi gửi, khi gỡ, hoặc GET 404 </w:t>
+            </w:r>
+            <w:r>
+              <w:rPr>
+                <w:b/>
+              </w:rPr>
+              <w:t>không</w:t>
+            </w:r>
+            <w:r>
+              <w:t xml:space="preserve"> kèm </w:t>
+            </w:r>
+            <w:r>
+              <w:rPr>
+                <w:rFonts w:ascii="Consolas" w:hAnsi="Consolas"/>
+                <w:sz w:val="19"/>
+              </w:rPr>
+              <w:t>JOURNAL_ENTRY_NOT_FOUND</w:t>
+            </w:r>
+          </w:p>
+        </w:tc>
+        <w:tc>
+          <w:tcPr>
+            <w:tcW w:type="dxa" w:w="2880"/>
+          </w:tcPr>
+          <w:p>
+            <w:r/>
+            <w:r>
+              <w:rPr>
+                <w:rFonts w:ascii="Consolas" w:hAnsi="Consolas"/>
+                <w:sz w:val="19"/>
+              </w:rPr>
               <w:t>KHONG_CO_DUONG</w:t>
             </w:r>
             <w:r>
-              <w:t xml:space="preserve"> — API chưa có </w:t>
+              <w:t xml:space="preserve"> — API chưa có đường (bản trước </w:t>
             </w:r>
             <w:r>
               <w:rPr>
@@ -38236,6 +40007,9 @@
               </w:rPr>
               <w:t>b9227aa</w:t>
             </w:r>
+            <w:r>
+              <w:t>)</w:t>
+            </w:r>
           </w:p>
         </w:tc>
         <w:tc>
@@ -38251,7 +40025,16 @@
               <w:t>Gửi hết</w:t>
             </w:r>
             <w:r>
-              <w:t xml:space="preserve"> dừng</w:t>
+              <w:t xml:space="preserve"> dừng; gỡ </w:t>
+            </w:r>
+            <w:r>
+              <w:rPr>
+                <w:b/>
+              </w:rPr>
+              <w:t>không</w:t>
+            </w:r>
+            <w:r>
+              <w:t xml:space="preserve"> bị coi là đã gỡ</w:t>
             </w:r>
           </w:p>
         </w:tc>
@@ -38263,6 +40046,34 @@
         <w:jc w:val="both"/>
       </w:pPr>
       <w:r>
+        <w:t xml:space="preserve">GET chỉ được coi là "bên anh không có chứng từ" khi 404 kèm </w:t>
+      </w:r>
+      <w:r>
+        <w:rPr>
+          <w:rFonts w:ascii="Consolas" w:hAnsi="Consolas"/>
+          <w:sz w:val="19"/>
+        </w:rPr>
+        <w:t>ErrorCode</w:t>
+      </w:r>
+      <w:r>
+        <w:t xml:space="preserve"> </w:t>
+      </w:r>
+      <w:r>
+        <w:rPr>
+          <w:rFonts w:ascii="Consolas" w:hAnsi="Consolas"/>
+          <w:sz w:val="19"/>
+        </w:rPr>
+        <w:t>JOURNAL_ENTRY_NOT_FOUND</w:t>
+      </w:r>
+      <w:r>
+        <w:t>.</w:t>
+      </w:r>
+    </w:p>
+    <w:p>
+      <w:pPr>
+        <w:jc w:val="both"/>
+      </w:pPr>
+      <w:r>
         <w:t xml:space="preserve">Từ khi bật cờ: khoá phiếu, chốt tất toán, trả chủ xe có hàng quầy là </w:t>
       </w:r>
       <w:r>
@@ -38338,7 +40149,7 @@
         <w:t>ObjectId</w:t>
       </w:r>
       <w:r>
-        <w:t xml:space="preserve"> trống. Diagnostics D4 của script cho thấy </w:t>
+        <w:t xml:space="preserve"> trống: DB demo cho NULL ở </w:t>
       </w:r>
       <w:r>
         <w:rPr>
@@ -38348,35 +40159,145 @@
         <w:t>PUBENTRY.OBJ_AUTOID</w:t>
       </w:r>
       <w:r>
-        <w:t xml:space="preserve"> </w:t>
-      </w:r>
+        <w:t xml:space="preserve"> (chẩn đoán D4, 02/10) nên ghi được; DB host phải đọc lại D4 — không cho NULL thì bên anh trả 422 </w:t>
+      </w:r>
+      <w:r>
+        <w:rPr>
+          <w:rFonts w:ascii="Consolas" w:hAnsi="Consolas"/>
+          <w:sz w:val="19"/>
+        </w:rPr>
+        <w:t>LOGISTICS_JOURNAL_52507</w:t>
+      </w:r>
+      <w:r>
+        <w:t>, cần quyết cách xử lý.</w:t>
+      </w:r>
+    </w:p>
+    <w:p>
+      <w:pPr>
+        <w:pStyle w:val="ListBullet"/>
+      </w:pPr>
+      <w:r>
+        <w:t xml:space="preserve">Bút toán thử trên DB demo </w:t>
+      </w:r>
+      <w:r>
+        <w:rPr>
+          <w:rFonts w:ascii="Consolas" w:hAnsi="Consolas"/>
+          <w:sz w:val="19"/>
+        </w:rPr>
+        <w:t>GL021020262</w:t>
+      </w:r>
+      <w:r>
+        <w:t xml:space="preserve"> – </w:t>
+      </w:r>
+      <w:r>
+        <w:rPr>
+          <w:rFonts w:ascii="Consolas" w:hAnsi="Consolas"/>
+          <w:sz w:val="19"/>
+        </w:rPr>
+        <w:t>267</w:t>
+      </w:r>
+      <w:r>
+        <w:t xml:space="preserve"> đã gỡ sạch; chưa thử ca kế toán ghi sổ chính thức (ST 12) rồi bên em gỡ (phải 409 </w:t>
+      </w:r>
+      <w:r>
+        <w:rPr>
+          <w:rFonts w:ascii="Consolas" w:hAnsi="Consolas"/>
+          <w:sz w:val="19"/>
+        </w:rPr>
+        <w:t>52515</w:t>
+      </w:r>
+      <w:r>
+        <w:t>, bản thành "chờ đảo").</w:t>
+      </w:r>
+    </w:p>
+    <w:p>
+      <w:pPr>
+        <w:pStyle w:val="ListBullet"/>
+      </w:pPr>
+      <w:r>
+        <w:t xml:space="preserve">Phí 2 % và trừ quá tải xe thuê chưa có bút toán (anh Khampla chốt); </w:t>
+      </w:r>
+      <w:r>
+        <w:rPr>
+          <w:rFonts w:ascii="Consolas" w:hAnsi="Consolas"/>
+          <w:sz w:val="19"/>
+        </w:rPr>
+        <w:t>625/4201</w:t>
+      </w:r>
+      <w:r>
+        <w:t xml:space="preserve"> chưa có nguồn (câu hỏi 10.10).</w:t>
+      </w:r>
+    </w:p>
+    <w:p>
+      <w:pPr>
+        <w:pStyle w:val="ListBullet"/>
+      </w:pPr>
       <w:r>
         <w:rPr>
           <w:b/>
         </w:rPr>
+        <w:t>Xuất kho cho chuyến</w:t>
+      </w:r>
+      <w:r>
+        <w:t xml:space="preserve"> (</w:t>
+      </w:r>
+      <w:r>
+        <w:rPr>
+          <w:rFonts w:ascii="Consolas" w:hAnsi="Consolas"/>
+          <w:sz w:val="19"/>
+        </w:rPr>
+        <w:t>xuat_noi_bo</w:t>
+      </w:r>
+      <w:r>
+        <w:t xml:space="preserve">, </w:t>
+      </w:r>
+      <w:r>
+        <w:rPr>
+          <w:rFonts w:ascii="Consolas" w:hAnsi="Consolas"/>
+          <w:sz w:val="19"/>
+        </w:rPr>
+        <w:t>xuat_ban</w:t>
+      </w:r>
+      <w:r>
+        <w:t xml:space="preserve">): tờ kho </w:t>
+      </w:r>
+      <w:r>
+        <w:rPr>
+          <w:rFonts w:ascii="Consolas" w:hAnsi="Consolas"/>
+          <w:sz w:val="19"/>
+        </w:rPr>
+        <w:t>PXK_NL</w:t>
+      </w:r>
+      <w:r>
+        <w:t xml:space="preserve"> / </w:t>
+      </w:r>
+      <w:r>
+        <w:rPr>
+          <w:rFonts w:ascii="Consolas" w:hAnsi="Consolas"/>
+          <w:sz w:val="19"/>
+        </w:rPr>
+        <w:t>PXK_PT</w:t>
+      </w:r>
+      <w:r>
+        <w:t xml:space="preserve"> ở kho tạm (sau là hệ anh Toàn) cũng mang định khoản (xe thuê ghi 4022/1371 theo giá vốn — luật cũ). Hiện tờ đó </w:t>
+      </w:r>
+      <w:r>
+        <w:rPr>
+          <w:b/>
+        </w:rPr>
         <w:t>không</w:t>
       </w:r>
       <w:r>
-        <w:t xml:space="preserve"> cho NULL thì bên anh trả 422 </w:t>
-      </w:r>
-      <w:r>
-        <w:rPr>
-          <w:rFonts w:ascii="Consolas" w:hAnsi="Consolas"/>
-          <w:sz w:val="19"/>
-        </w:rPr>
-        <w:t>LOGISTICS_JOURNAL_52507</w:t>
-      </w:r>
-      <w:r>
-        <w:t xml:space="preserve">, cả bút toán của phiếu đó không ghi — </w:t>
+        <w:t xml:space="preserve"> sang sổ anh; nếu sau này có đường đưa tờ kho vào sổ anh (câu hỏi 10.11) thì vế Có 1371 phải ghi ở </w:t>
       </w:r>
       <w:r>
         <w:rPr>
           <w:b/>
         </w:rPr>
-        <w:t>cần quyết sau khi áp script</w:t>
-      </w:r>
-      <w:r>
-        <w:t xml:space="preserve"> (bắt gán nhà cung cấp trước khi khoá, hoặc chốt một đối tượng mặc định).</w:t>
+        <w:t>một</w:t>
+      </w:r>
+      <w:r>
+        <w:t xml:space="preserve"> nơi — chờ anh Khampla / chủ dự án chọn.</w:t>
       </w:r>
     </w:p>
     <w:p>
@@ -38384,55 +40305,60 @@
         <w:pStyle w:val="ListBullet"/>
       </w:pPr>
       <w:r>
-        <w:t xml:space="preserve">Đầu gửi coi HTTP 404 khi </w:t>
+        <w:t xml:space="preserve">Cấp dầu </w:t>
       </w:r>
       <w:r>
         <w:rPr>
           <w:b/>
         </w:rPr>
-        <w:t>gỡ</w:t>
-      </w:r>
-      <w:r>
-        <w:t xml:space="preserve"> là "bên anh không còn chứng từ". Với API </w:t>
-      </w:r>
-      <w:r>
-        <w:rPr>
-          <w:rFonts w:ascii="Consolas" w:hAnsi="Consolas"/>
-          <w:sz w:val="19"/>
-        </w:rPr>
-        <w:t>b9227aa</w:t>
-      </w:r>
-      <w:r>
-        <w:t xml:space="preserve"> gỡ không bao giờ trả 404 (thiếu chứng từ là </w:t>
-      </w:r>
-      <w:r>
-        <w:rPr>
-          <w:rFonts w:ascii="Consolas" w:hAnsi="Consolas"/>
-          <w:sz w:val="19"/>
-        </w:rPr>
-        <w:t>Reversed: false</w:t>
-      </w:r>
-      <w:r>
-        <w:t xml:space="preserve">), nên 404 chỉ có khi trỏ API cũ — </w:t>
+        <w:t>lệch số duyệt</w:t>
+      </w:r>
+      <w:r>
+        <w:t xml:space="preserve"> khi một tờ đề nghị gồm </w:t>
       </w:r>
       <w:r>
         <w:rPr>
           <w:b/>
         </w:rPr>
-        <w:t>đừng bật cờ</w:t>
-      </w:r>
-      <w:r>
-        <w:t xml:space="preserve"> trên máy còn trỏ API chưa có </w:t>
-      </w:r>
-      <w:r>
-        <w:rPr>
-          <w:rFonts w:ascii="Consolas" w:hAnsi="Consolas"/>
-          <w:sz w:val="19"/>
-        </w:rPr>
-        <w:t>b9227aa</w:t>
-      </w:r>
-      <w:r>
-        <w:t>.</w:t>
+        <w:t>nhiều dòng</w:t>
+      </w:r>
+      <w:r>
+        <w:t xml:space="preserve"> cùng kho: dòng trên phiếu giữ số lít cũ (chỉ phiếu một dòng mới ghi theo số cấp thật), nên bút toán theo số lít trên phiếu — đúng số trừ chủ xe, có thể lệch số lít kho tạm đã xuất.</w:t>
+      </w:r>
+    </w:p>
+    <w:p>
+      <w:pPr>
+        <w:pStyle w:val="Heading3"/>
+      </w:pPr>
+      <w:r>
+        <w:t>12.12.5. Kho tạm chặn vượt tồn — `VUOT_TON` (kho tạm `09ae236`, trang điều xe `d7cb27d`)</w:t>
+      </w:r>
+    </w:p>
+    <w:p>
+      <w:pPr>
+        <w:jc w:val="both"/>
+      </w:pPr>
+      <w:r>
+        <w:t xml:space="preserve">Chủ dự án duyệt 01/10: </w:t>
+      </w:r>
+      <w:r>
+        <w:rPr>
+          <w:b/>
+        </w:rPr>
+        <w:t>tồn đi theo chứng từ</w:t>
+      </w:r>
+      <w:r>
+        <w:t xml:space="preserve">. Kho tạm </w:t>
+      </w:r>
+      <w:r>
+        <w:rPr>
+          <w:rFonts w:ascii="Consolas" w:hAnsi="Consolas"/>
+          <w:sz w:val="19"/>
+        </w:rPr>
+        <w:t>EPL_KETOAN</w:t>
+      </w:r>
+      <w:r>
+        <w:t xml:space="preserve"> (cổng 8030, tới khi nối hệ kho anh Toàn) nay chặn ở máy chủ mọi đường làm giảm tồn quá số đang có:</w:t>
       </w:r>
     </w:p>
     <w:p>
@@ -38440,37 +40366,7 @@
         <w:pStyle w:val="ListBullet"/>
       </w:pPr>
       <w:r>
-        <w:t xml:space="preserve">HTTP 200 </w:t>
-      </w:r>
-      <w:r>
-        <w:rPr>
-          <w:rFonts w:ascii="Consolas" w:hAnsi="Consolas"/>
-          <w:sz w:val="19"/>
-        </w:rPr>
-        <w:t>Success: false</w:t>
-      </w:r>
-      <w:r>
-        <w:t xml:space="preserve">, </w:t>
-      </w:r>
-      <w:r>
-        <w:rPr>
-          <w:rFonts w:ascii="Consolas" w:hAnsi="Consolas"/>
-          <w:sz w:val="19"/>
-        </w:rPr>
-        <w:t>Code: 500</w:t>
-      </w:r>
-      <w:r>
-        <w:t xml:space="preserve"> (lỗi chưa bắt bên anh) được xếp </w:t>
-      </w:r>
-      <w:r>
-        <w:rPr>
-          <w:rFonts w:ascii="Consolas" w:hAnsi="Consolas"/>
-          <w:sz w:val="19"/>
-        </w:rPr>
-        <w:t>BEN_KE_TOAN_TU_CHOI</w:t>
-      </w:r>
-      <w:r>
-        <w:t>, không phải "chưa rõ": bỏ bản lúc đó thì không GET trước. Gửi lại vẫn an toàn nhờ cùng SourceRef.</w:t>
+        <w:t>cấp dầu theo phiếu đề nghị / QR (trước không chặn — vì vậy kho Thà Bốc từng âm), xuất dầu tay, chuyển kho, xoá dòng nhập / phiếu chuyển làm âm;</w:t>
       </w:r>
     </w:p>
     <w:p>
@@ -38478,56 +40374,60 @@
         <w:pStyle w:val="ListBullet"/>
       </w:pPr>
       <w:r>
-        <w:t xml:space="preserve">403 </w:t>
-      </w:r>
-      <w:r>
-        <w:rPr>
-          <w:rFonts w:ascii="Consolas" w:hAnsi="Consolas"/>
-          <w:sz w:val="19"/>
-        </w:rPr>
-        <w:t>LOGISTICS_JOURNAL_FORBIDDEN</w:t>
-      </w:r>
-      <w:r>
-        <w:t xml:space="preserve"> ("Tài khoản này không được gọi tích hợp bút toán.") bị xếp </w:t>
-      </w:r>
-      <w:r>
-        <w:rPr>
-          <w:rFonts w:ascii="Consolas" w:hAnsi="Consolas"/>
-          <w:sz w:val="19"/>
-        </w:rPr>
-        <w:t>TAI_KHOAN_SAI</w:t>
-      </w:r>
-      <w:r>
-        <w:t xml:space="preserve"> vì câu có chữ "tài khoản" — câu hiện ra vẫn đúng.</w:t>
-      </w:r>
-    </w:p>
-    <w:p>
-      <w:pPr>
-        <w:pStyle w:val="ListBullet"/>
-      </w:pPr>
-      <w:r>
-        <w:t xml:space="preserve">Phí 2 % và trừ quá tải xe thuê chưa có bút toán (anh Khampla chốt); </w:t>
-      </w:r>
-      <w:r>
-        <w:rPr>
-          <w:rFonts w:ascii="Consolas" w:hAnsi="Consolas"/>
-          <w:sz w:val="19"/>
-        </w:rPr>
-        <w:t>625/4201</w:t>
-      </w:r>
-      <w:r>
-        <w:t xml:space="preserve"> chưa có nguồn (câu hỏi 10.10).</w:t>
-      </w:r>
-    </w:p>
-    <w:p>
-      <w:pPr>
-        <w:pStyle w:val="ListBullet"/>
-      </w:pPr>
+        <w:t>bán quầy dầu và phụ tùng, xuất phụ tùng (mục V, lệnh sửa chữa), lô quặng.</w:t>
+      </w:r>
+    </w:p>
+    <w:p>
+      <w:pPr>
+        <w:jc w:val="both"/>
+      </w:pPr>
+      <w:r>
+        <w:t>Máy chủ khoá dòng tồn (</w:t>
+      </w:r>
+      <w:r>
+        <w:rPr>
+          <w:rFonts w:ascii="Consolas" w:hAnsi="Consolas"/>
+          <w:sz w:val="19"/>
+        </w:rPr>
+        <w:t>SELECT … FOR UPDATE</w:t>
+      </w:r>
+      <w:r>
+        <w:t xml:space="preserve">) rồi mới đọc tồn, nên hai lần cấp cùng lúc chỉ một lần lọt. Vượt tồn → </w:t>
+      </w:r>
       <w:r>
         <w:rPr>
           <w:b/>
         </w:rPr>
-        <w:t>Xuất kho cho chuyến</w:t>
+        <w:t>409 `VUOT_TON`</w:t>
+      </w:r>
+      <w:r>
+        <w:t xml:space="preserve"> kèm </w:t>
+      </w:r>
+      <w:r>
+        <w:rPr>
+          <w:rFonts w:ascii="Consolas" w:hAnsi="Consolas"/>
+          <w:sz w:val="19"/>
+        </w:rPr>
+        <w:t>tham</w:t>
+      </w:r>
+      <w:r>
+        <w:t xml:space="preserve"> (kho, tồn còn, số định lấy, đơn vị, việc — </w:t>
+      </w:r>
+      <w:r>
+        <w:rPr>
+          <w:b/>
+        </w:rPr>
+        <w:t>không</w:t>
+      </w:r>
+      <w:r>
+        <w:t xml:space="preserve"> có giá). Trang điều xe gọi kho tạm giữ nguyên </w:t>
+      </w:r>
+      <w:r>
+        <w:rPr>
+          <w:rFonts w:ascii="Consolas" w:hAnsi="Consolas"/>
+          <w:sz w:val="19"/>
+        </w:rPr>
+        <w:t>tham</w:t>
       </w:r>
       <w:r>
         <w:t xml:space="preserve"> (</w:t>
@@ -38537,10 +40437,38 @@
           <w:rFonts w:ascii="Consolas" w:hAnsi="Consolas"/>
           <w:sz w:val="19"/>
         </w:rPr>
+        <w:t>d7cb27d</w:t>
+      </w:r>
+      <w:r>
+        <w:t>), màn Cấp phát bên kho tạm dịch câu ba tiếng.</w:t>
+      </w:r>
+    </w:p>
+    <w:p>
+      <w:pPr>
+        <w:jc w:val="both"/>
+      </w:pPr>
+      <w:r>
+        <w:t>Ảnh hưởng tới hệ anh: dầu kho chưa cấp được thì phiếu không khoá được (</w:t>
+      </w:r>
+      <w:r>
+        <w:rPr>
+          <w:rFonts w:ascii="Consolas" w:hAnsi="Consolas"/>
+          <w:sz w:val="19"/>
+        </w:rPr>
+        <w:t>DAU_KHO_CHUA_CAP</w:t>
+      </w:r>
+      <w:r>
+        <w:t xml:space="preserve">, 12.12.4) — bút toán </w:t>
+      </w:r>
+      <w:r>
+        <w:rPr>
+          <w:rFonts w:ascii="Consolas" w:hAnsi="Consolas"/>
+          <w:sz w:val="19"/>
+        </w:rPr>
         <w:t>xuat_noi_bo</w:t>
       </w:r>
       <w:r>
-        <w:t xml:space="preserve">, </w:t>
+        <w:t xml:space="preserve"> / </w:t>
       </w:r>
       <w:r>
         <w:rPr>
@@ -38550,71 +40478,26 @@
         <w:t>xuat_ban</w:t>
       </w:r>
       <w:r>
-        <w:t xml:space="preserve">): tờ kho </w:t>
-      </w:r>
-      <w:r>
-        <w:rPr>
-          <w:rFonts w:ascii="Consolas" w:hAnsi="Consolas"/>
-          <w:sz w:val="19"/>
-        </w:rPr>
-        <w:t>PXK_NL</w:t>
-      </w:r>
-      <w:r>
-        <w:t xml:space="preserve"> / </w:t>
-      </w:r>
-      <w:r>
-        <w:rPr>
-          <w:rFonts w:ascii="Consolas" w:hAnsi="Consolas"/>
-          <w:sz w:val="19"/>
-        </w:rPr>
-        <w:t>PXK_PT</w:t>
-      </w:r>
-      <w:r>
-        <w:t xml:space="preserve"> ở kho tạm (sau là hệ anh Toàn) cũng mang định khoản (xe thuê ghi 4022/1371 theo giá vốn — luật cũ). Hiện tờ đó </w:t>
+        <w:t xml:space="preserve"> chỉ có khi hàng đã thật sự rời kho, không ghi theo số âm. </w:t>
       </w:r>
       <w:r>
         <w:rPr>
           <w:b/>
         </w:rPr>
-        <w:t>không</w:t>
-      </w:r>
-      <w:r>
-        <w:t xml:space="preserve"> sang sổ anh; nếu sau này có đường đưa tờ kho vào sổ anh (câu hỏi 10.11) thì vế Có 1371 phải ghi ở </w:t>
-      </w:r>
-      <w:r>
-        <w:rPr>
-          <w:b/>
-        </w:rPr>
-        <w:t>một</w:t>
-      </w:r>
-      <w:r>
-        <w:t xml:space="preserve"> nơi — chờ anh Khampla / chủ dự án chọn.</w:t>
-      </w:r>
-    </w:p>
-    <w:p>
-      <w:pPr>
-        <w:pStyle w:val="ListBullet"/>
-      </w:pPr>
-      <w:r>
-        <w:t xml:space="preserve">Cấp dầu </w:t>
-      </w:r>
-      <w:r>
-        <w:rPr>
-          <w:b/>
-        </w:rPr>
-        <w:t>lệch số duyệt</w:t>
-      </w:r>
-      <w:r>
-        <w:t xml:space="preserve"> khi một tờ đề nghị gồm </w:t>
-      </w:r>
-      <w:r>
-        <w:rPr>
-          <w:b/>
-        </w:rPr>
-        <w:t>nhiều dòng</w:t>
-      </w:r>
-      <w:r>
-        <w:t xml:space="preserve"> cùng kho: dòng trên phiếu giữ số lít cũ (chỉ phiếu một dòng mới ghi theo số cấp thật), nên bút toán theo số lít trên phiếu — đúng số trừ chủ xe, có thể lệch số lít kho tạm đã xuất.</w:t>
+        <w:t>Trước khi đưa kho tạm bản này lên máy thật</w:t>
+      </w:r>
+      <w:r>
+        <w:t>: kiểm tồn thật từng kho (dầu, phụ tùng) có âm không — kho đang âm thì mọi lần cấp tiếp theo bị chặn tới khi nhập bù hoặc kiểm kê (</w:t>
+      </w:r>
+      <w:r>
+        <w:rPr>
+          <w:rFonts w:ascii="Consolas" w:hAnsi="Consolas"/>
+          <w:sz w:val="19"/>
+        </w:rPr>
+        <w:t>HUONG_DAN_TRIEN_KHAI_ANH_TUNE</w:t>
+      </w:r>
+      <w:r>
+        <w:t xml:space="preserve"> mục 1.5).</w:t>
       </w:r>
     </w:p>
     <w:sectPr>

</xml_diff>